<commit_message>
feat: GE-SO-R34 agrega secciones 2 (requisitos acceso general) y 3 (certificados alto riesgo)
Co-Authored-By: Claude Sonnet 4.6 <noreply@anthropic.com>
Claude-Session: https://claude.ai/code/session_01Mu84mNMmRhshwom6voaTeY
</commit_message>
<xml_diff>
--- a/GE-SO-R34_Rev05_Autorizacion_Ingreso_Contratistas.docx
+++ b/GE-SO-R34_Rev05_Autorizacion_Ingreso_Contratistas.docx
@@ -1496,6 +1496,1864 @@
                 <w:szCs w:val="18"/>
               </w:rPr>
               <w:t xml:space="preserve"/>
+            </w:r>
+          </w:p>
+        </w:tc>
+      </w:tr>
+    </w:tbl>
+    <w:p>
+      <w:pPr>
+        <w:spacing w:after="0" w:before="80"/>
+      </w:pPr>
+    </w:p>
+    <w:tbl>
+      <w:tblPr>
+        <w:tblW w:type="dxa" w:w="10800"/>
+        <w:tblBorders>
+          <w:top w:val="single" w:color="auto" w:sz="4"/>
+          <w:left w:val="single" w:color="auto" w:sz="4"/>
+          <w:bottom w:val="single" w:color="auto" w:sz="4"/>
+          <w:right w:val="single" w:color="auto" w:sz="4"/>
+          <w:insideH w:val="single" w:color="auto" w:sz="4"/>
+          <w:insideV w:val="single" w:color="auto" w:sz="4"/>
+        </w:tblBorders>
+      </w:tblPr>
+      <w:tblGrid>
+        <w:gridCol w:w="10800"/>
+      </w:tblGrid>
+      <w:tr>
+        <w:tc>
+          <w:tcPr>
+            <w:tcW w:type="dxa" w:w="10800"/>
+            <w:gridSpan w:val="1"/>
+            <w:tcBorders>
+              <w:top w:val="single" w:color="000000" w:sz="8"/>
+              <w:left w:val="single" w:color="000000" w:sz="8"/>
+              <w:bottom w:val="single" w:color="000000" w:sz="8"/>
+              <w:right w:val="single" w:color="000000" w:sz="8"/>
+            </w:tcBorders>
+            <w:shd w:fill="1A3A6B" w:val="clear"/>
+            <w:vAlign w:val="center"/>
+          </w:tcPr>
+          <w:p>
+            <w:pPr>
+              <w:spacing w:after="60" w:before="60"/>
+              <w:jc w:val="center"/>
+            </w:pPr>
+            <w:r>
+              <w:rPr>
+                <w:rFonts w:ascii="Arial" w:cs="Arial" w:eastAsia="Arial" w:hAnsi="Arial"/>
+                <w:b/>
+                <w:bCs/>
+                <w:color w:val="FFFFFF"/>
+                <w:sz w:val="19"/>
+                <w:szCs w:val="19"/>
+              </w:rPr>
+              <w:t xml:space="preserve">2.  VERIFICACIÓN DE REQUISITOS DE ACCESO GENERAL</w:t>
+            </w:r>
+          </w:p>
+        </w:tc>
+      </w:tr>
+    </w:tbl>
+    <w:tbl>
+      <w:tblPr>
+        <w:tblW w:type="dxa" w:w="10800"/>
+        <w:tblBorders>
+          <w:top w:val="single" w:color="auto" w:sz="4"/>
+          <w:left w:val="single" w:color="auto" w:sz="4"/>
+          <w:bottom w:val="single" w:color="auto" w:sz="4"/>
+          <w:right w:val="single" w:color="auto" w:sz="4"/>
+          <w:insideH w:val="single" w:color="auto" w:sz="4"/>
+          <w:insideV w:val="single" w:color="auto" w:sz="4"/>
+        </w:tblBorders>
+      </w:tblPr>
+      <w:tblGrid>
+        <w:gridCol w:w="400"/>
+        <w:gridCol w:w="2800"/>
+        <w:gridCol w:w="1800"/>
+        <w:gridCol w:w="1600"/>
+        <w:gridCol w:w="4200"/>
+      </w:tblGrid>
+      <w:tr>
+        <w:tc>
+          <w:tcPr>
+            <w:tcW w:type="dxa" w:w="400"/>
+            <w:gridSpan w:val="1"/>
+            <w:tcBorders>
+              <w:top w:val="single" w:color="000000" w:sz="4"/>
+              <w:left w:val="single" w:color="000000" w:sz="4"/>
+              <w:bottom w:val="single" w:color="000000" w:sz="4"/>
+              <w:right w:val="single" w:color="000000" w:sz="4"/>
+            </w:tcBorders>
+            <w:shd w:fill="2E6DB4" w:val="clear"/>
+            <w:vAlign w:val="center"/>
+          </w:tcPr>
+          <w:p>
+            <w:pPr>
+              <w:spacing w:after="50" w:before="50"/>
+              <w:jc w:val="center"/>
+            </w:pPr>
+            <w:r>
+              <w:rPr>
+                <w:rFonts w:ascii="Arial" w:cs="Arial" w:eastAsia="Arial" w:hAnsi="Arial"/>
+                <w:b/>
+                <w:bCs/>
+                <w:color w:val="FFFFFF"/>
+                <w:sz w:val="18"/>
+                <w:szCs w:val="18"/>
+              </w:rPr>
+              <w:t xml:space="preserve">#</w:t>
+            </w:r>
+          </w:p>
+        </w:tc>
+        <w:tc>
+          <w:tcPr>
+            <w:tcW w:type="dxa" w:w="2800"/>
+            <w:gridSpan w:val="1"/>
+            <w:tcBorders>
+              <w:top w:val="single" w:color="000000" w:sz="4"/>
+              <w:left w:val="single" w:color="000000" w:sz="4"/>
+              <w:bottom w:val="single" w:color="000000" w:sz="4"/>
+              <w:right w:val="single" w:color="000000" w:sz="4"/>
+            </w:tcBorders>
+            <w:shd w:fill="2E6DB4" w:val="clear"/>
+            <w:vAlign w:val="center"/>
+          </w:tcPr>
+          <w:p>
+            <w:pPr>
+              <w:spacing w:after="50" w:before="50"/>
+              <w:jc w:val="center"/>
+            </w:pPr>
+            <w:r>
+              <w:rPr>
+                <w:rFonts w:ascii="Arial" w:cs="Arial" w:eastAsia="Arial" w:hAnsi="Arial"/>
+                <w:b/>
+                <w:bCs/>
+                <w:color w:val="FFFFFF"/>
+                <w:sz w:val="18"/>
+                <w:szCs w:val="18"/>
+              </w:rPr>
+              <w:t xml:space="preserve">REQUISITO</w:t>
+            </w:r>
+          </w:p>
+        </w:tc>
+        <w:tc>
+          <w:tcPr>
+            <w:tcW w:type="dxa" w:w="1800"/>
+            <w:gridSpan w:val="1"/>
+            <w:tcBorders>
+              <w:top w:val="single" w:color="000000" w:sz="4"/>
+              <w:left w:val="single" w:color="000000" w:sz="4"/>
+              <w:bottom w:val="single" w:color="000000" w:sz="4"/>
+              <w:right w:val="single" w:color="000000" w:sz="4"/>
+            </w:tcBorders>
+            <w:shd w:fill="2E6DB4" w:val="clear"/>
+            <w:vAlign w:val="center"/>
+          </w:tcPr>
+          <w:p>
+            <w:pPr>
+              <w:spacing w:after="50" w:before="50"/>
+              <w:jc w:val="center"/>
+            </w:pPr>
+            <w:r>
+              <w:rPr>
+                <w:rFonts w:ascii="Arial" w:cs="Arial" w:eastAsia="Arial" w:hAnsi="Arial"/>
+                <w:b/>
+                <w:bCs/>
+                <w:color w:val="FFFFFF"/>
+                <w:sz w:val="18"/>
+                <w:szCs w:val="18"/>
+              </w:rPr>
+              <w:t xml:space="preserve">DETALLE /
+VIGENCIA</w:t>
+            </w:r>
+          </w:p>
+        </w:tc>
+        <w:tc>
+          <w:tcPr>
+            <w:tcW w:type="dxa" w:w="1600"/>
+            <w:gridSpan w:val="1"/>
+            <w:tcBorders>
+              <w:top w:val="single" w:color="000000" w:sz="4"/>
+              <w:left w:val="single" w:color="000000" w:sz="4"/>
+              <w:bottom w:val="single" w:color="000000" w:sz="4"/>
+              <w:right w:val="single" w:color="000000" w:sz="4"/>
+            </w:tcBorders>
+            <w:shd w:fill="2E6DB4" w:val="clear"/>
+            <w:vAlign w:val="center"/>
+          </w:tcPr>
+          <w:p>
+            <w:pPr>
+              <w:spacing w:after="50" w:before="50"/>
+              <w:jc w:val="center"/>
+            </w:pPr>
+            <w:r>
+              <w:rPr>
+                <w:rFonts w:ascii="Arial" w:cs="Arial" w:eastAsia="Arial" w:hAnsi="Arial"/>
+                <w:b/>
+                <w:bCs/>
+                <w:color w:val="FFFFFF"/>
+                <w:sz w:val="18"/>
+                <w:szCs w:val="18"/>
+              </w:rPr>
+              <w:t xml:space="preserve">FECHA /
+ESTADO</w:t>
+            </w:r>
+          </w:p>
+        </w:tc>
+        <w:tc>
+          <w:tcPr>
+            <w:tcW w:type="dxa" w:w="4200"/>
+            <w:gridSpan w:val="1"/>
+            <w:tcBorders>
+              <w:top w:val="single" w:color="000000" w:sz="4"/>
+              <w:left w:val="single" w:color="000000" w:sz="4"/>
+              <w:bottom w:val="single" w:color="000000" w:sz="4"/>
+              <w:right w:val="single" w:color="000000" w:sz="4"/>
+            </w:tcBorders>
+            <w:shd w:fill="2E6DB4" w:val="clear"/>
+            <w:vAlign w:val="center"/>
+          </w:tcPr>
+          <w:p>
+            <w:pPr>
+              <w:spacing w:after="50" w:before="50"/>
+              <w:jc w:val="center"/>
+            </w:pPr>
+            <w:r>
+              <w:rPr>
+                <w:rFonts w:ascii="Arial" w:cs="Arial" w:eastAsia="Arial" w:hAnsi="Arial"/>
+                <w:b/>
+                <w:bCs/>
+                <w:color w:val="FFFFFF"/>
+                <w:sz w:val="18"/>
+                <w:szCs w:val="18"/>
+              </w:rPr>
+              <w:t xml:space="preserve">OBSERVACIONES</w:t>
+            </w:r>
+          </w:p>
+        </w:tc>
+      </w:tr>
+      <w:tr>
+        <w:tc>
+          <w:tcPr>
+            <w:tcW w:type="dxa" w:w="400"/>
+            <w:gridSpan w:val="1"/>
+            <w:tcBorders>
+              <w:top w:val="single" w:color="000000" w:sz="4"/>
+              <w:left w:val="single" w:color="000000" w:sz="4"/>
+              <w:bottom w:val="single" w:color="000000" w:sz="4"/>
+              <w:right w:val="single" w:color="000000" w:sz="4"/>
+            </w:tcBorders>
+            <w:shd w:fill="EBF5FB" w:val="clear"/>
+            <w:vAlign w:val="center"/>
+          </w:tcPr>
+          <w:p>
+            <w:pPr>
+              <w:spacing w:after="60" w:before="60"/>
+              <w:jc w:val="center"/>
+            </w:pPr>
+            <w:r>
+              <w:rPr>
+                <w:rFonts w:ascii="Arial" w:cs="Arial" w:eastAsia="Arial" w:hAnsi="Arial"/>
+                <w:b/>
+                <w:bCs/>
+                <w:color w:val="000000"/>
+                <w:sz w:val="18"/>
+                <w:szCs w:val="18"/>
+              </w:rPr>
+              <w:t xml:space="preserve">1</w:t>
+            </w:r>
+          </w:p>
+        </w:tc>
+        <w:tc>
+          <w:tcPr>
+            <w:tcW w:type="dxa" w:w="2800"/>
+            <w:gridSpan w:val="1"/>
+            <w:tcBorders>
+              <w:top w:val="single" w:color="000000" w:sz="4"/>
+              <w:left w:val="single" w:color="000000" w:sz="4"/>
+              <w:bottom w:val="single" w:color="000000" w:sz="4"/>
+              <w:right w:val="single" w:color="000000" w:sz="4"/>
+            </w:tcBorders>
+            <w:vAlign w:val="center"/>
+          </w:tcPr>
+          <w:p>
+            <w:pPr>
+              <w:spacing w:after="60" w:before="60"/>
+              <w:jc w:val="left"/>
+            </w:pPr>
+            <w:r>
+              <w:rPr>
+                <w:rFonts w:ascii="Arial" w:cs="Arial" w:eastAsia="Arial" w:hAnsi="Arial"/>
+                <w:b/>
+                <w:bCs/>
+                <w:color w:val="000000"/>
+                <w:sz w:val="18"/>
+                <w:szCs w:val="18"/>
+              </w:rPr>
+              <w:t xml:space="preserve">Inducción de Seguridad Plantabal</w:t>
+            </w:r>
+          </w:p>
+        </w:tc>
+        <w:tc>
+          <w:tcPr>
+            <w:tcW w:type="dxa" w:w="1800"/>
+            <w:gridSpan w:val="1"/>
+            <w:tcBorders>
+              <w:top w:val="single" w:color="000000" w:sz="4"/>
+              <w:left w:val="single" w:color="000000" w:sz="4"/>
+              <w:bottom w:val="single" w:color="000000" w:sz="4"/>
+              <w:right w:val="single" w:color="000000" w:sz="4"/>
+            </w:tcBorders>
+            <w:vAlign w:val="center"/>
+          </w:tcPr>
+          <w:p>
+            <w:pPr>
+              <w:spacing w:after="60" w:before="60"/>
+              <w:jc w:val="left"/>
+            </w:pPr>
+            <w:r>
+              <w:rPr>
+                <w:rFonts w:ascii="Arial" w:cs="Arial" w:eastAsia="Arial" w:hAnsi="Arial"/>
+                <w:color w:val="000000"/>
+                <w:sz w:val="17"/>
+                <w:szCs w:val="17"/>
+              </w:rPr>
+              <w:t xml:space="preserve">1 año desde la recepción</w:t>
+            </w:r>
+          </w:p>
+        </w:tc>
+        <w:tc>
+          <w:tcPr>
+            <w:tcW w:type="dxa" w:w="1600"/>
+            <w:gridSpan w:val="1"/>
+            <w:tcBorders>
+              <w:top w:val="single" w:color="000000" w:sz="4"/>
+              <w:left w:val="single" w:color="000000" w:sz="4"/>
+              <w:bottom w:val="single" w:color="000000" w:sz="4"/>
+              <w:right w:val="single" w:color="000000" w:sz="4"/>
+            </w:tcBorders>
+            <w:vAlign w:val="center"/>
+          </w:tcPr>
+          <w:p>
+            <w:pPr>
+              <w:spacing w:after="60" w:before="60"/>
+              <w:jc w:val="center"/>
+            </w:pPr>
+            <w:r>
+              <w:rPr>
+                <w:rFonts w:ascii="Arial" w:cs="Arial" w:eastAsia="Arial" w:hAnsi="Arial"/>
+                <w:color w:val="000000"/>
+                <w:sz w:val="17"/>
+                <w:szCs w:val="17"/>
+              </w:rPr>
+              <w:t xml:space="preserve">__/__/____</w:t>
+            </w:r>
+          </w:p>
+        </w:tc>
+        <w:tc>
+          <w:tcPr>
+            <w:tcW w:type="dxa" w:w="4200"/>
+            <w:gridSpan w:val="1"/>
+            <w:tcBorders>
+              <w:top w:val="single" w:color="000000" w:sz="4"/>
+              <w:left w:val="single" w:color="000000" w:sz="4"/>
+              <w:bottom w:val="single" w:color="000000" w:sz="4"/>
+              <w:right w:val="single" w:color="000000" w:sz="4"/>
+            </w:tcBorders>
+            <w:vAlign w:val="center"/>
+          </w:tcPr>
+          <w:p>
+            <w:pPr>
+              <w:spacing w:after="50" w:before="50"/>
+              <w:jc w:val="left"/>
+            </w:pPr>
+            <w:r>
+              <w:rPr>
+                <w:rFonts w:ascii="Arial" w:cs="Arial" w:eastAsia="Arial" w:hAnsi="Arial"/>
+                <w:color w:val="000000"/>
+                <w:sz w:val="18"/>
+                <w:szCs w:val="18"/>
+              </w:rPr>
+              <w:t xml:space="preserve"/>
+            </w:r>
+          </w:p>
+        </w:tc>
+      </w:tr>
+      <w:tr>
+        <w:tc>
+          <w:tcPr>
+            <w:tcW w:type="dxa" w:w="400"/>
+            <w:gridSpan w:val="1"/>
+            <w:tcBorders>
+              <w:top w:val="single" w:color="000000" w:sz="4"/>
+              <w:left w:val="single" w:color="000000" w:sz="4"/>
+              <w:bottom w:val="single" w:color="000000" w:sz="4"/>
+              <w:right w:val="single" w:color="000000" w:sz="4"/>
+            </w:tcBorders>
+            <w:shd w:fill="EBF5FB" w:val="clear"/>
+            <w:vAlign w:val="center"/>
+          </w:tcPr>
+          <w:p>
+            <w:pPr>
+              <w:spacing w:after="60" w:before="60"/>
+              <w:jc w:val="center"/>
+            </w:pPr>
+            <w:r>
+              <w:rPr>
+                <w:rFonts w:ascii="Arial" w:cs="Arial" w:eastAsia="Arial" w:hAnsi="Arial"/>
+                <w:b/>
+                <w:bCs/>
+                <w:color w:val="000000"/>
+                <w:sz w:val="18"/>
+                <w:szCs w:val="18"/>
+              </w:rPr>
+              <w:t xml:space="preserve">2</w:t>
+            </w:r>
+          </w:p>
+        </w:tc>
+        <w:tc>
+          <w:tcPr>
+            <w:tcW w:type="dxa" w:w="2800"/>
+            <w:gridSpan w:val="1"/>
+            <w:tcBorders>
+              <w:top w:val="single" w:color="000000" w:sz="4"/>
+              <w:left w:val="single" w:color="000000" w:sz="4"/>
+              <w:bottom w:val="single" w:color="000000" w:sz="4"/>
+              <w:right w:val="single" w:color="000000" w:sz="4"/>
+            </w:tcBorders>
+            <w:vAlign w:val="center"/>
+          </w:tcPr>
+          <w:p>
+            <w:pPr>
+              <w:spacing w:after="20" w:before="50"/>
+              <w:jc w:val="left"/>
+            </w:pPr>
+            <w:r>
+              <w:rPr>
+                <w:rFonts w:ascii="Arial" w:cs="Arial" w:eastAsia="Arial" w:hAnsi="Arial"/>
+                <w:b/>
+                <w:bCs/>
+                <w:color w:val="000000"/>
+                <w:sz w:val="18"/>
+                <w:szCs w:val="18"/>
+              </w:rPr>
+              <w:t xml:space="preserve">Afiliación al IESS</w:t>
+            </w:r>
+          </w:p>
+          <w:p>
+            <w:pPr>
+              <w:spacing w:after="50" w:before="0"/>
+              <w:jc w:val="left"/>
+            </w:pPr>
+            <w:r>
+              <w:rPr>
+                <w:rFonts w:ascii="Arial" w:cs="Arial" w:eastAsia="Arial" w:hAnsi="Arial"/>
+                <w:i/>
+                <w:iCs/>
+                <w:color w:val="444444"/>
+                <w:sz w:val="15"/>
+                <w:szCs w:val="15"/>
+              </w:rPr>
+              <w:t xml:space="preserve">Planilla del mes inmediato anterior o Aviso de entrada</w:t>
+            </w:r>
+          </w:p>
+        </w:tc>
+        <w:tc>
+          <w:tcPr>
+            <w:tcW w:type="dxa" w:w="1800"/>
+            <w:gridSpan w:val="1"/>
+            <w:tcBorders>
+              <w:top w:val="single" w:color="000000" w:sz="4"/>
+              <w:left w:val="single" w:color="000000" w:sz="4"/>
+              <w:bottom w:val="single" w:color="000000" w:sz="4"/>
+              <w:right w:val="single" w:color="000000" w:sz="4"/>
+            </w:tcBorders>
+            <w:vAlign w:val="center"/>
+          </w:tcPr>
+          <w:p>
+            <w:pPr>
+              <w:spacing w:after="60" w:before="60"/>
+              <w:jc w:val="left"/>
+            </w:pPr>
+            <w:r>
+              <w:rPr>
+                <w:rFonts w:ascii="Arial" w:cs="Arial" w:eastAsia="Arial" w:hAnsi="Arial"/>
+                <w:color w:val="000000"/>
+                <w:sz w:val="17"/>
+                <w:szCs w:val="17"/>
+              </w:rPr>
+              <w:t xml:space="preserve">Mensual</w:t>
+            </w:r>
+          </w:p>
+        </w:tc>
+        <w:tc>
+          <w:tcPr>
+            <w:tcW w:type="dxa" w:w="1600"/>
+            <w:gridSpan w:val="1"/>
+            <w:tcBorders>
+              <w:top w:val="single" w:color="000000" w:sz="4"/>
+              <w:left w:val="single" w:color="000000" w:sz="4"/>
+              <w:bottom w:val="single" w:color="000000" w:sz="4"/>
+              <w:right w:val="single" w:color="000000" w:sz="4"/>
+            </w:tcBorders>
+            <w:vAlign w:val="center"/>
+          </w:tcPr>
+          <w:p>
+            <w:pPr>
+              <w:spacing w:after="60" w:before="60"/>
+              <w:jc w:val="center"/>
+            </w:pPr>
+            <w:r>
+              <w:rPr>
+                <w:rFonts w:ascii="Arial" w:cs="Arial" w:eastAsia="Arial" w:hAnsi="Arial"/>
+                <w:color w:val="000000"/>
+                <w:sz w:val="17"/>
+                <w:szCs w:val="17"/>
+              </w:rPr>
+              <w:t xml:space="preserve">__/__/____</w:t>
+            </w:r>
+          </w:p>
+        </w:tc>
+        <w:tc>
+          <w:tcPr>
+            <w:tcW w:type="dxa" w:w="4200"/>
+            <w:gridSpan w:val="1"/>
+            <w:tcBorders>
+              <w:top w:val="single" w:color="000000" w:sz="4"/>
+              <w:left w:val="single" w:color="000000" w:sz="4"/>
+              <w:bottom w:val="single" w:color="000000" w:sz="4"/>
+              <w:right w:val="single" w:color="000000" w:sz="4"/>
+            </w:tcBorders>
+            <w:vAlign w:val="center"/>
+          </w:tcPr>
+          <w:p>
+            <w:pPr>
+              <w:spacing w:after="60" w:before="60"/>
+              <w:jc w:val="left"/>
+            </w:pPr>
+            <w:r>
+              <w:rPr>
+                <w:rFonts w:ascii="Arial" w:cs="Arial" w:eastAsia="Arial" w:hAnsi="Arial"/>
+                <w:i/>
+                <w:iCs/>
+                <w:color w:val="444444"/>
+                <w:sz w:val="15"/>
+                <w:szCs w:val="15"/>
+              </w:rPr>
+              <w:t xml:space="preserve">Si aplica aviso de entrada, registrar aquí</w:t>
+            </w:r>
+          </w:p>
+        </w:tc>
+      </w:tr>
+      <w:tr>
+        <w:tc>
+          <w:tcPr>
+            <w:tcW w:type="dxa" w:w="400"/>
+            <w:gridSpan w:val="1"/>
+            <w:tcBorders>
+              <w:top w:val="single" w:color="000000" w:sz="4"/>
+              <w:left w:val="single" w:color="000000" w:sz="4"/>
+              <w:bottom w:val="single" w:color="000000" w:sz="4"/>
+              <w:right w:val="single" w:color="000000" w:sz="4"/>
+            </w:tcBorders>
+            <w:shd w:fill="EBF5FB" w:val="clear"/>
+            <w:vAlign w:val="center"/>
+          </w:tcPr>
+          <w:p>
+            <w:pPr>
+              <w:spacing w:after="60" w:before="60"/>
+              <w:jc w:val="center"/>
+            </w:pPr>
+            <w:r>
+              <w:rPr>
+                <w:rFonts w:ascii="Arial" w:cs="Arial" w:eastAsia="Arial" w:hAnsi="Arial"/>
+                <w:b/>
+                <w:bCs/>
+                <w:color w:val="000000"/>
+                <w:sz w:val="18"/>
+                <w:szCs w:val="18"/>
+              </w:rPr>
+              <w:t xml:space="preserve">3</w:t>
+            </w:r>
+          </w:p>
+        </w:tc>
+        <w:tc>
+          <w:tcPr>
+            <w:tcW w:type="dxa" w:w="2800"/>
+            <w:gridSpan w:val="1"/>
+            <w:tcBorders>
+              <w:top w:val="single" w:color="000000" w:sz="4"/>
+              <w:left w:val="single" w:color="000000" w:sz="4"/>
+              <w:bottom w:val="single" w:color="000000" w:sz="4"/>
+              <w:right w:val="single" w:color="000000" w:sz="4"/>
+            </w:tcBorders>
+            <w:vAlign w:val="center"/>
+          </w:tcPr>
+          <w:p>
+            <w:pPr>
+              <w:spacing w:after="20" w:before="50"/>
+              <w:jc w:val="left"/>
+            </w:pPr>
+            <w:r>
+              <w:rPr>
+                <w:rFonts w:ascii="Arial" w:cs="Arial" w:eastAsia="Arial" w:hAnsi="Arial"/>
+                <w:b/>
+                <w:bCs/>
+                <w:color w:val="000000"/>
+                <w:sz w:val="18"/>
+                <w:szCs w:val="18"/>
+              </w:rPr>
+              <w:t xml:space="preserve">Certificado Médico Laboral</w:t>
+            </w:r>
+          </w:p>
+          <w:p>
+            <w:pPr>
+              <w:spacing w:after="50" w:before="0"/>
+              <w:jc w:val="left"/>
+            </w:pPr>
+            <w:r>
+              <w:rPr>
+                <w:rFonts w:ascii="Arial" w:cs="Arial" w:eastAsia="Arial" w:hAnsi="Arial"/>
+                <w:i/>
+                <w:iCs/>
+                <w:color w:val="444444"/>
+                <w:sz w:val="15"/>
+                <w:szCs w:val="15"/>
+              </w:rPr>
+              <w:t xml:space="preserve">Aptitud ocupacional emitida por médico de planta</w:t>
+            </w:r>
+          </w:p>
+        </w:tc>
+        <w:tc>
+          <w:tcPr>
+            <w:tcW w:type="dxa" w:w="1800"/>
+            <w:gridSpan w:val="1"/>
+            <w:tcBorders>
+              <w:top w:val="single" w:color="000000" w:sz="4"/>
+              <w:left w:val="single" w:color="000000" w:sz="4"/>
+              <w:bottom w:val="single" w:color="000000" w:sz="4"/>
+              <w:right w:val="single" w:color="000000" w:sz="4"/>
+            </w:tcBorders>
+            <w:vAlign w:val="center"/>
+          </w:tcPr>
+          <w:p>
+            <w:pPr>
+              <w:spacing w:after="60" w:before="60"/>
+              <w:jc w:val="left"/>
+            </w:pPr>
+            <w:r>
+              <w:rPr>
+                <w:rFonts w:ascii="Arial" w:cs="Arial" w:eastAsia="Arial" w:hAnsi="Arial"/>
+                <w:color w:val="000000"/>
+                <w:sz w:val="17"/>
+                <w:szCs w:val="17"/>
+              </w:rPr>
+              <w:t xml:space="preserve">Según criterio Médico de Planta</w:t>
+            </w:r>
+          </w:p>
+        </w:tc>
+        <w:tc>
+          <w:tcPr>
+            <w:tcW w:type="dxa" w:w="1600"/>
+            <w:gridSpan w:val="1"/>
+            <w:tcBorders>
+              <w:top w:val="single" w:color="000000" w:sz="4"/>
+              <w:left w:val="single" w:color="000000" w:sz="4"/>
+              <w:bottom w:val="single" w:color="000000" w:sz="4"/>
+              <w:right w:val="single" w:color="000000" w:sz="4"/>
+            </w:tcBorders>
+            <w:vAlign w:val="center"/>
+          </w:tcPr>
+          <w:p>
+            <w:pPr>
+              <w:spacing w:after="20" w:before="40"/>
+              <w:jc w:val="left"/>
+            </w:pPr>
+            <w:r>
+              <w:rPr>
+                <w:rFonts w:ascii="Arial" w:cs="Arial" w:eastAsia="Arial" w:hAnsi="Arial"/>
+                <w:color w:val="000000"/>
+                <w:sz w:val="17"/>
+                <w:szCs w:val="17"/>
+              </w:rPr>
+              <w:t xml:space="preserve">Vence: __/__/____</w:t>
+            </w:r>
+          </w:p>
+          <w:p>
+            <w:pPr>
+              <w:spacing w:after="40" w:before="20"/>
+              <w:jc w:val="left"/>
+            </w:pPr>
+            <w:r>
+              <w:rPr>
+                <w:rFonts w:ascii="Arial" w:cs="Arial" w:eastAsia="Arial" w:hAnsi="Arial"/>
+                <w:b/>
+                <w:bCs/>
+                <w:color w:val="000000"/>
+                <w:sz w:val="17"/>
+                <w:szCs w:val="17"/>
+              </w:rPr>
+              <w:t xml:space="preserve">□ APTO   □ NO APTO</w:t>
+            </w:r>
+          </w:p>
+        </w:tc>
+        <w:tc>
+          <w:tcPr>
+            <w:tcW w:type="dxa" w:w="4200"/>
+            <w:gridSpan w:val="1"/>
+            <w:tcBorders>
+              <w:top w:val="single" w:color="000000" w:sz="4"/>
+              <w:left w:val="single" w:color="000000" w:sz="4"/>
+              <w:bottom w:val="single" w:color="000000" w:sz="4"/>
+              <w:right w:val="single" w:color="000000" w:sz="4"/>
+            </w:tcBorders>
+            <w:vAlign w:val="center"/>
+          </w:tcPr>
+          <w:p>
+            <w:pPr>
+              <w:spacing w:after="50" w:before="50"/>
+              <w:jc w:val="left"/>
+            </w:pPr>
+            <w:r>
+              <w:rPr>
+                <w:rFonts w:ascii="Arial" w:cs="Arial" w:eastAsia="Arial" w:hAnsi="Arial"/>
+                <w:color w:val="000000"/>
+                <w:sz w:val="18"/>
+                <w:szCs w:val="18"/>
+              </w:rPr>
+              <w:t xml:space="preserve"/>
+            </w:r>
+          </w:p>
+        </w:tc>
+      </w:tr>
+      <w:tr>
+        <w:tc>
+          <w:tcPr>
+            <w:tcW w:type="dxa" w:w="10800"/>
+            <w:gridSpan w:val="5"/>
+            <w:tcBorders>
+              <w:top w:val="single" w:color="000000" w:sz="4"/>
+              <w:left w:val="single" w:color="000000" w:sz="4"/>
+              <w:bottom w:val="single" w:color="000000" w:sz="4"/>
+              <w:right w:val="single" w:color="000000" w:sz="4"/>
+            </w:tcBorders>
+            <w:shd w:fill="EBF5FB" w:val="clear"/>
+            <w:vAlign w:val="center"/>
+          </w:tcPr>
+          <w:p>
+            <w:pPr>
+              <w:spacing w:after="60" w:before="60"/>
+              <w:jc w:val="center"/>
+            </w:pPr>
+            <w:r>
+              <w:rPr>
+                <w:rFonts w:ascii="Arial" w:cs="Arial" w:eastAsia="Arial" w:hAnsi="Arial"/>
+                <w:b/>
+                <w:bCs/>
+                <w:color w:val="000000"/>
+                <w:sz w:val="18"/>
+                <w:szCs w:val="18"/>
+              </w:rPr>
+              <w:t xml:space="preserve">ACCESO GENERAL:  □ HABILITADO     □ NO HABILITADO</w:t>
+            </w:r>
+          </w:p>
+        </w:tc>
+      </w:tr>
+    </w:tbl>
+    <w:p>
+      <w:pPr>
+        <w:spacing w:after="0" w:before="80"/>
+      </w:pPr>
+    </w:p>
+    <w:tbl>
+      <w:tblPr>
+        <w:tblW w:type="dxa" w:w="10800"/>
+        <w:tblBorders>
+          <w:top w:val="single" w:color="auto" w:sz="4"/>
+          <w:left w:val="single" w:color="auto" w:sz="4"/>
+          <w:bottom w:val="single" w:color="auto" w:sz="4"/>
+          <w:right w:val="single" w:color="auto" w:sz="4"/>
+          <w:insideH w:val="single" w:color="auto" w:sz="4"/>
+          <w:insideV w:val="single" w:color="auto" w:sz="4"/>
+        </w:tblBorders>
+      </w:tblPr>
+      <w:tblGrid>
+        <w:gridCol w:w="10800"/>
+      </w:tblGrid>
+      <w:tr>
+        <w:tc>
+          <w:tcPr>
+            <w:tcW w:type="dxa" w:w="10800"/>
+            <w:gridSpan w:val="1"/>
+            <w:tcBorders>
+              <w:top w:val="single" w:color="000000" w:sz="8"/>
+              <w:left w:val="single" w:color="000000" w:sz="8"/>
+              <w:bottom w:val="single" w:color="000000" w:sz="8"/>
+              <w:right w:val="single" w:color="000000" w:sz="8"/>
+            </w:tcBorders>
+            <w:shd w:fill="1A3A6B" w:val="clear"/>
+            <w:vAlign w:val="center"/>
+          </w:tcPr>
+          <w:p>
+            <w:pPr>
+              <w:spacing w:after="60" w:before="60"/>
+              <w:jc w:val="center"/>
+            </w:pPr>
+            <w:r>
+              <w:rPr>
+                <w:rFonts w:ascii="Arial" w:cs="Arial" w:eastAsia="Arial" w:hAnsi="Arial"/>
+                <w:b/>
+                <w:bCs/>
+                <w:color w:val="FFFFFF"/>
+                <w:sz w:val="19"/>
+                <w:szCs w:val="19"/>
+              </w:rPr>
+              <w:t xml:space="preserve">3.  CERTIFICADOS PARA TRABAJOS DE ALTO RIESGO  (completar solo si aplica)</w:t>
+            </w:r>
+          </w:p>
+        </w:tc>
+      </w:tr>
+    </w:tbl>
+    <w:p>
+      <w:pPr>
+        <w:spacing w:after="60" w:before="60"/>
+        <w:jc w:val="left"/>
+      </w:pPr>
+      <w:r>
+        <w:rPr>
+          <w:rFonts w:ascii="Arial" w:cs="Arial" w:eastAsia="Arial" w:hAnsi="Arial"/>
+          <w:color w:val="000000"/>
+          <w:sz w:val="17"/>
+          <w:szCs w:val="17"/>
+        </w:rPr>
+        <w:t xml:space="preserve">Marque los tipos de trabajo que ejecutará el contratista y verifique la vigencia del certificado emitido por entidad reconocida (MDT o SENESCYT).</w:t>
+      </w:r>
+    </w:p>
+    <w:tbl>
+      <w:tblPr>
+        <w:tblW w:type="dxa" w:w="10800"/>
+        <w:tblBorders>
+          <w:top w:val="single" w:color="auto" w:sz="4"/>
+          <w:left w:val="single" w:color="auto" w:sz="4"/>
+          <w:bottom w:val="single" w:color="auto" w:sz="4"/>
+          <w:right w:val="single" w:color="auto" w:sz="4"/>
+          <w:insideH w:val="single" w:color="auto" w:sz="4"/>
+          <w:insideV w:val="single" w:color="auto" w:sz="4"/>
+        </w:tblBorders>
+      </w:tblPr>
+      <w:tblGrid>
+        <w:gridCol w:w="400"/>
+        <w:gridCol w:w="2600"/>
+        <w:gridCol w:w="2400"/>
+        <w:gridCol w:w="1600"/>
+        <w:gridCol w:w="3800"/>
+      </w:tblGrid>
+      <w:tr>
+        <w:tc>
+          <w:tcPr>
+            <w:tcW w:type="dxa" w:w="400"/>
+            <w:gridSpan w:val="1"/>
+            <w:tcBorders>
+              <w:top w:val="single" w:color="000000" w:sz="4"/>
+              <w:left w:val="single" w:color="000000" w:sz="4"/>
+              <w:bottom w:val="single" w:color="000000" w:sz="4"/>
+              <w:right w:val="single" w:color="000000" w:sz="4"/>
+            </w:tcBorders>
+            <w:shd w:fill="2E6DB4" w:val="clear"/>
+            <w:vAlign w:val="center"/>
+          </w:tcPr>
+          <w:p>
+            <w:pPr>
+              <w:spacing w:after="50" w:before="50"/>
+              <w:jc w:val="center"/>
+            </w:pPr>
+            <w:r>
+              <w:rPr>
+                <w:rFonts w:ascii="Arial" w:cs="Arial" w:eastAsia="Arial" w:hAnsi="Arial"/>
+                <w:b/>
+                <w:bCs/>
+                <w:color w:val="FFFFFF"/>
+                <w:sz w:val="18"/>
+                <w:szCs w:val="18"/>
+              </w:rPr>
+              <w:t xml:space="preserve">✓</w:t>
+            </w:r>
+          </w:p>
+        </w:tc>
+        <w:tc>
+          <w:tcPr>
+            <w:tcW w:type="dxa" w:w="2600"/>
+            <w:gridSpan w:val="1"/>
+            <w:tcBorders>
+              <w:top w:val="single" w:color="000000" w:sz="4"/>
+              <w:left w:val="single" w:color="000000" w:sz="4"/>
+              <w:bottom w:val="single" w:color="000000" w:sz="4"/>
+              <w:right w:val="single" w:color="000000" w:sz="4"/>
+            </w:tcBorders>
+            <w:shd w:fill="2E6DB4" w:val="clear"/>
+            <w:vAlign w:val="center"/>
+          </w:tcPr>
+          <w:p>
+            <w:pPr>
+              <w:spacing w:after="50" w:before="50"/>
+              <w:jc w:val="center"/>
+            </w:pPr>
+            <w:r>
+              <w:rPr>
+                <w:rFonts w:ascii="Arial" w:cs="Arial" w:eastAsia="Arial" w:hAnsi="Arial"/>
+                <w:b/>
+                <w:bCs/>
+                <w:color w:val="FFFFFF"/>
+                <w:sz w:val="18"/>
+                <w:szCs w:val="18"/>
+              </w:rPr>
+              <w:t xml:space="preserve">TIPO DE TRABAJO</w:t>
+            </w:r>
+          </w:p>
+        </w:tc>
+        <w:tc>
+          <w:tcPr>
+            <w:tcW w:type="dxa" w:w="2400"/>
+            <w:gridSpan w:val="1"/>
+            <w:tcBorders>
+              <w:top w:val="single" w:color="000000" w:sz="4"/>
+              <w:left w:val="single" w:color="000000" w:sz="4"/>
+              <w:bottom w:val="single" w:color="000000" w:sz="4"/>
+              <w:right w:val="single" w:color="000000" w:sz="4"/>
+            </w:tcBorders>
+            <w:shd w:fill="2E6DB4" w:val="clear"/>
+            <w:vAlign w:val="center"/>
+          </w:tcPr>
+          <w:p>
+            <w:pPr>
+              <w:spacing w:after="50" w:before="50"/>
+              <w:jc w:val="center"/>
+            </w:pPr>
+            <w:r>
+              <w:rPr>
+                <w:rFonts w:ascii="Arial" w:cs="Arial" w:eastAsia="Arial" w:hAnsi="Arial"/>
+                <w:b/>
+                <w:bCs/>
+                <w:color w:val="FFFFFF"/>
+                <w:sz w:val="18"/>
+                <w:szCs w:val="18"/>
+              </w:rPr>
+              <w:t xml:space="preserve">ENTIDAD EMISORA</w:t>
+            </w:r>
+          </w:p>
+        </w:tc>
+        <w:tc>
+          <w:tcPr>
+            <w:tcW w:type="dxa" w:w="1600"/>
+            <w:gridSpan w:val="1"/>
+            <w:tcBorders>
+              <w:top w:val="single" w:color="000000" w:sz="4"/>
+              <w:left w:val="single" w:color="000000" w:sz="4"/>
+              <w:bottom w:val="single" w:color="000000" w:sz="4"/>
+              <w:right w:val="single" w:color="000000" w:sz="4"/>
+            </w:tcBorders>
+            <w:shd w:fill="2E6DB4" w:val="clear"/>
+            <w:vAlign w:val="center"/>
+          </w:tcPr>
+          <w:p>
+            <w:pPr>
+              <w:spacing w:after="50" w:before="50"/>
+              <w:jc w:val="center"/>
+            </w:pPr>
+            <w:r>
+              <w:rPr>
+                <w:rFonts w:ascii="Arial" w:cs="Arial" w:eastAsia="Arial" w:hAnsi="Arial"/>
+                <w:b/>
+                <w:bCs/>
+                <w:color w:val="FFFFFF"/>
+                <w:sz w:val="18"/>
+                <w:szCs w:val="18"/>
+              </w:rPr>
+              <w:t xml:space="preserve">FECHA EMISIÓN</w:t>
+            </w:r>
+          </w:p>
+        </w:tc>
+        <w:tc>
+          <w:tcPr>
+            <w:tcW w:type="dxa" w:w="3800"/>
+            <w:gridSpan w:val="1"/>
+            <w:tcBorders>
+              <w:top w:val="single" w:color="000000" w:sz="4"/>
+              <w:left w:val="single" w:color="000000" w:sz="4"/>
+              <w:bottom w:val="single" w:color="000000" w:sz="4"/>
+              <w:right w:val="single" w:color="000000" w:sz="4"/>
+            </w:tcBorders>
+            <w:shd w:fill="2E6DB4" w:val="clear"/>
+            <w:vAlign w:val="center"/>
+          </w:tcPr>
+          <w:p>
+            <w:pPr>
+              <w:spacing w:after="50" w:before="50"/>
+              <w:jc w:val="center"/>
+            </w:pPr>
+            <w:r>
+              <w:rPr>
+                <w:rFonts w:ascii="Arial" w:cs="Arial" w:eastAsia="Arial" w:hAnsi="Arial"/>
+                <w:b/>
+                <w:bCs/>
+                <w:color w:val="FFFFFF"/>
+                <w:sz w:val="18"/>
+                <w:szCs w:val="18"/>
+              </w:rPr>
+              <w:t xml:space="preserve">FECHA VENCIMIENTO</w:t>
+            </w:r>
+          </w:p>
+        </w:tc>
+      </w:tr>
+      <w:tr>
+        <w:tc>
+          <w:tcPr>
+            <w:tcW w:type="dxa" w:w="400"/>
+            <w:gridSpan w:val="1"/>
+            <w:tcBorders>
+              <w:top w:val="single" w:color="000000" w:sz="4"/>
+              <w:left w:val="single" w:color="000000" w:sz="4"/>
+              <w:bottom w:val="single" w:color="000000" w:sz="4"/>
+              <w:right w:val="single" w:color="000000" w:sz="4"/>
+            </w:tcBorders>
+            <w:vAlign w:val="center"/>
+          </w:tcPr>
+          <w:p>
+            <w:pPr>
+              <w:spacing w:after="50" w:before="50"/>
+              <w:jc w:val="center"/>
+            </w:pPr>
+            <w:r>
+              <w:rPr>
+                <w:rFonts w:ascii="Arial" w:cs="Arial" w:eastAsia="Arial" w:hAnsi="Arial"/>
+                <w:color w:val="000000"/>
+                <w:sz w:val="18"/>
+                <w:szCs w:val="18"/>
+              </w:rPr>
+              <w:t xml:space="preserve">□</w:t>
+            </w:r>
+          </w:p>
+        </w:tc>
+        <w:tc>
+          <w:tcPr>
+            <w:tcW w:type="dxa" w:w="2600"/>
+            <w:gridSpan w:val="1"/>
+            <w:tcBorders>
+              <w:top w:val="single" w:color="000000" w:sz="4"/>
+              <w:left w:val="single" w:color="000000" w:sz="4"/>
+              <w:bottom w:val="single" w:color="000000" w:sz="4"/>
+              <w:right w:val="single" w:color="000000" w:sz="4"/>
+            </w:tcBorders>
+            <w:vAlign w:val="center"/>
+          </w:tcPr>
+          <w:p>
+            <w:pPr>
+              <w:spacing w:after="50" w:before="50"/>
+              <w:jc w:val="left"/>
+            </w:pPr>
+            <w:r>
+              <w:rPr>
+                <w:rFonts w:ascii="Arial" w:cs="Arial" w:eastAsia="Arial" w:hAnsi="Arial"/>
+                <w:color w:val="000000"/>
+                <w:sz w:val="18"/>
+                <w:szCs w:val="18"/>
+              </w:rPr>
+              <w:t xml:space="preserve">Trabajo en Caliente</w:t>
+            </w:r>
+          </w:p>
+        </w:tc>
+        <w:tc>
+          <w:tcPr>
+            <w:tcW w:type="dxa" w:w="2400"/>
+            <w:gridSpan w:val="1"/>
+            <w:tcBorders>
+              <w:top w:val="single" w:color="000000" w:sz="4"/>
+              <w:left w:val="single" w:color="000000" w:sz="4"/>
+              <w:bottom w:val="single" w:color="000000" w:sz="4"/>
+              <w:right w:val="single" w:color="000000" w:sz="4"/>
+            </w:tcBorders>
+            <w:vAlign w:val="center"/>
+          </w:tcPr>
+          <w:p>
+            <w:pPr>
+              <w:spacing w:after="50" w:before="50"/>
+              <w:jc w:val="left"/>
+            </w:pPr>
+            <w:r>
+              <w:rPr>
+                <w:rFonts w:ascii="Arial" w:cs="Arial" w:eastAsia="Arial" w:hAnsi="Arial"/>
+                <w:color w:val="000000"/>
+                <w:sz w:val="17"/>
+                <w:szCs w:val="17"/>
+              </w:rPr>
+              <w:t xml:space="preserve">MDT / SENESCYT</w:t>
+            </w:r>
+          </w:p>
+        </w:tc>
+        <w:tc>
+          <w:tcPr>
+            <w:tcW w:type="dxa" w:w="1600"/>
+            <w:gridSpan w:val="1"/>
+            <w:tcBorders>
+              <w:top w:val="single" w:color="000000" w:sz="4"/>
+              <w:left w:val="single" w:color="000000" w:sz="4"/>
+              <w:bottom w:val="single" w:color="000000" w:sz="4"/>
+              <w:right w:val="single" w:color="000000" w:sz="4"/>
+            </w:tcBorders>
+            <w:vAlign w:val="center"/>
+          </w:tcPr>
+          <w:p>
+            <w:pPr>
+              <w:spacing w:after="50" w:before="50"/>
+              <w:jc w:val="center"/>
+            </w:pPr>
+            <w:r>
+              <w:rPr>
+                <w:rFonts w:ascii="Arial" w:cs="Arial" w:eastAsia="Arial" w:hAnsi="Arial"/>
+                <w:color w:val="000000"/>
+                <w:sz w:val="17"/>
+                <w:szCs w:val="17"/>
+              </w:rPr>
+              <w:t xml:space="preserve">__/__/____</w:t>
+            </w:r>
+          </w:p>
+        </w:tc>
+        <w:tc>
+          <w:tcPr>
+            <w:tcW w:type="dxa" w:w="3800"/>
+            <w:gridSpan w:val="1"/>
+            <w:tcBorders>
+              <w:top w:val="single" w:color="000000" w:sz="4"/>
+              <w:left w:val="single" w:color="000000" w:sz="4"/>
+              <w:bottom w:val="single" w:color="000000" w:sz="4"/>
+              <w:right w:val="single" w:color="000000" w:sz="4"/>
+            </w:tcBorders>
+            <w:vAlign w:val="center"/>
+          </w:tcPr>
+          <w:p>
+            <w:pPr>
+              <w:spacing w:after="50" w:before="50"/>
+              <w:jc w:val="center"/>
+            </w:pPr>
+            <w:r>
+              <w:rPr>
+                <w:rFonts w:ascii="Arial" w:cs="Arial" w:eastAsia="Arial" w:hAnsi="Arial"/>
+                <w:color w:val="000000"/>
+                <w:sz w:val="17"/>
+                <w:szCs w:val="17"/>
+              </w:rPr>
+              <w:t xml:space="preserve">__/__/____</w:t>
+            </w:r>
+          </w:p>
+        </w:tc>
+      </w:tr>
+      <w:tr>
+        <w:tc>
+          <w:tcPr>
+            <w:tcW w:type="dxa" w:w="400"/>
+            <w:gridSpan w:val="1"/>
+            <w:tcBorders>
+              <w:top w:val="single" w:color="000000" w:sz="4"/>
+              <w:left w:val="single" w:color="000000" w:sz="4"/>
+              <w:bottom w:val="single" w:color="000000" w:sz="4"/>
+              <w:right w:val="single" w:color="000000" w:sz="4"/>
+            </w:tcBorders>
+            <w:vAlign w:val="center"/>
+          </w:tcPr>
+          <w:p>
+            <w:pPr>
+              <w:spacing w:after="50" w:before="50"/>
+              <w:jc w:val="center"/>
+            </w:pPr>
+            <w:r>
+              <w:rPr>
+                <w:rFonts w:ascii="Arial" w:cs="Arial" w:eastAsia="Arial" w:hAnsi="Arial"/>
+                <w:color w:val="000000"/>
+                <w:sz w:val="18"/>
+                <w:szCs w:val="18"/>
+              </w:rPr>
+              <w:t xml:space="preserve">□</w:t>
+            </w:r>
+          </w:p>
+        </w:tc>
+        <w:tc>
+          <w:tcPr>
+            <w:tcW w:type="dxa" w:w="2600"/>
+            <w:gridSpan w:val="1"/>
+            <w:tcBorders>
+              <w:top w:val="single" w:color="000000" w:sz="4"/>
+              <w:left w:val="single" w:color="000000" w:sz="4"/>
+              <w:bottom w:val="single" w:color="000000" w:sz="4"/>
+              <w:right w:val="single" w:color="000000" w:sz="4"/>
+            </w:tcBorders>
+            <w:vAlign w:val="center"/>
+          </w:tcPr>
+          <w:p>
+            <w:pPr>
+              <w:spacing w:after="50" w:before="50"/>
+              <w:jc w:val="left"/>
+            </w:pPr>
+            <w:r>
+              <w:rPr>
+                <w:rFonts w:ascii="Arial" w:cs="Arial" w:eastAsia="Arial" w:hAnsi="Arial"/>
+                <w:color w:val="000000"/>
+                <w:sz w:val="18"/>
+                <w:szCs w:val="18"/>
+              </w:rPr>
+              <w:t xml:space="preserve">Trabajo en Altura  (≥ 1,80 m)</w:t>
+            </w:r>
+          </w:p>
+        </w:tc>
+        <w:tc>
+          <w:tcPr>
+            <w:tcW w:type="dxa" w:w="2400"/>
+            <w:gridSpan w:val="1"/>
+            <w:tcBorders>
+              <w:top w:val="single" w:color="000000" w:sz="4"/>
+              <w:left w:val="single" w:color="000000" w:sz="4"/>
+              <w:bottom w:val="single" w:color="000000" w:sz="4"/>
+              <w:right w:val="single" w:color="000000" w:sz="4"/>
+            </w:tcBorders>
+            <w:vAlign w:val="center"/>
+          </w:tcPr>
+          <w:p>
+            <w:pPr>
+              <w:spacing w:after="50" w:before="50"/>
+              <w:jc w:val="left"/>
+            </w:pPr>
+            <w:r>
+              <w:rPr>
+                <w:rFonts w:ascii="Arial" w:cs="Arial" w:eastAsia="Arial" w:hAnsi="Arial"/>
+                <w:color w:val="000000"/>
+                <w:sz w:val="17"/>
+                <w:szCs w:val="17"/>
+              </w:rPr>
+              <w:t xml:space="preserve">MDT / SENESCYT</w:t>
+            </w:r>
+          </w:p>
+        </w:tc>
+        <w:tc>
+          <w:tcPr>
+            <w:tcW w:type="dxa" w:w="1600"/>
+            <w:gridSpan w:val="1"/>
+            <w:tcBorders>
+              <w:top w:val="single" w:color="000000" w:sz="4"/>
+              <w:left w:val="single" w:color="000000" w:sz="4"/>
+              <w:bottom w:val="single" w:color="000000" w:sz="4"/>
+              <w:right w:val="single" w:color="000000" w:sz="4"/>
+            </w:tcBorders>
+            <w:vAlign w:val="center"/>
+          </w:tcPr>
+          <w:p>
+            <w:pPr>
+              <w:spacing w:after="50" w:before="50"/>
+              <w:jc w:val="center"/>
+            </w:pPr>
+            <w:r>
+              <w:rPr>
+                <w:rFonts w:ascii="Arial" w:cs="Arial" w:eastAsia="Arial" w:hAnsi="Arial"/>
+                <w:color w:val="000000"/>
+                <w:sz w:val="17"/>
+                <w:szCs w:val="17"/>
+              </w:rPr>
+              <w:t xml:space="preserve">__/__/____</w:t>
+            </w:r>
+          </w:p>
+        </w:tc>
+        <w:tc>
+          <w:tcPr>
+            <w:tcW w:type="dxa" w:w="3800"/>
+            <w:gridSpan w:val="1"/>
+            <w:tcBorders>
+              <w:top w:val="single" w:color="000000" w:sz="4"/>
+              <w:left w:val="single" w:color="000000" w:sz="4"/>
+              <w:bottom w:val="single" w:color="000000" w:sz="4"/>
+              <w:right w:val="single" w:color="000000" w:sz="4"/>
+            </w:tcBorders>
+            <w:vAlign w:val="center"/>
+          </w:tcPr>
+          <w:p>
+            <w:pPr>
+              <w:spacing w:after="50" w:before="50"/>
+              <w:jc w:val="center"/>
+            </w:pPr>
+            <w:r>
+              <w:rPr>
+                <w:rFonts w:ascii="Arial" w:cs="Arial" w:eastAsia="Arial" w:hAnsi="Arial"/>
+                <w:color w:val="000000"/>
+                <w:sz w:val="17"/>
+                <w:szCs w:val="17"/>
+              </w:rPr>
+              <w:t xml:space="preserve">__/__/____</w:t>
+            </w:r>
+          </w:p>
+        </w:tc>
+      </w:tr>
+      <w:tr>
+        <w:tc>
+          <w:tcPr>
+            <w:tcW w:type="dxa" w:w="400"/>
+            <w:gridSpan w:val="1"/>
+            <w:tcBorders>
+              <w:top w:val="single" w:color="000000" w:sz="4"/>
+              <w:left w:val="single" w:color="000000" w:sz="4"/>
+              <w:bottom w:val="single" w:color="000000" w:sz="4"/>
+              <w:right w:val="single" w:color="000000" w:sz="4"/>
+            </w:tcBorders>
+            <w:vAlign w:val="center"/>
+          </w:tcPr>
+          <w:p>
+            <w:pPr>
+              <w:spacing w:after="50" w:before="50"/>
+              <w:jc w:val="center"/>
+            </w:pPr>
+            <w:r>
+              <w:rPr>
+                <w:rFonts w:ascii="Arial" w:cs="Arial" w:eastAsia="Arial" w:hAnsi="Arial"/>
+                <w:color w:val="000000"/>
+                <w:sz w:val="18"/>
+                <w:szCs w:val="18"/>
+              </w:rPr>
+              <w:t xml:space="preserve">□</w:t>
+            </w:r>
+          </w:p>
+        </w:tc>
+        <w:tc>
+          <w:tcPr>
+            <w:tcW w:type="dxa" w:w="2600"/>
+            <w:gridSpan w:val="1"/>
+            <w:tcBorders>
+              <w:top w:val="single" w:color="000000" w:sz="4"/>
+              <w:left w:val="single" w:color="000000" w:sz="4"/>
+              <w:bottom w:val="single" w:color="000000" w:sz="4"/>
+              <w:right w:val="single" w:color="000000" w:sz="4"/>
+            </w:tcBorders>
+            <w:vAlign w:val="center"/>
+          </w:tcPr>
+          <w:p>
+            <w:pPr>
+              <w:spacing w:after="50" w:before="50"/>
+              <w:jc w:val="left"/>
+            </w:pPr>
+            <w:r>
+              <w:rPr>
+                <w:rFonts w:ascii="Arial" w:cs="Arial" w:eastAsia="Arial" w:hAnsi="Arial"/>
+                <w:color w:val="000000"/>
+                <w:sz w:val="18"/>
+                <w:szCs w:val="18"/>
+              </w:rPr>
+              <w:t xml:space="preserve">Espacios Confinados</w:t>
+            </w:r>
+          </w:p>
+        </w:tc>
+        <w:tc>
+          <w:tcPr>
+            <w:tcW w:type="dxa" w:w="2400"/>
+            <w:gridSpan w:val="1"/>
+            <w:tcBorders>
+              <w:top w:val="single" w:color="000000" w:sz="4"/>
+              <w:left w:val="single" w:color="000000" w:sz="4"/>
+              <w:bottom w:val="single" w:color="000000" w:sz="4"/>
+              <w:right w:val="single" w:color="000000" w:sz="4"/>
+            </w:tcBorders>
+            <w:vAlign w:val="center"/>
+          </w:tcPr>
+          <w:p>
+            <w:pPr>
+              <w:spacing w:after="50" w:before="50"/>
+              <w:jc w:val="left"/>
+            </w:pPr>
+            <w:r>
+              <w:rPr>
+                <w:rFonts w:ascii="Arial" w:cs="Arial" w:eastAsia="Arial" w:hAnsi="Arial"/>
+                <w:color w:val="000000"/>
+                <w:sz w:val="17"/>
+                <w:szCs w:val="17"/>
+              </w:rPr>
+              <w:t xml:space="preserve">MDT / SENESCYT</w:t>
+            </w:r>
+          </w:p>
+        </w:tc>
+        <w:tc>
+          <w:tcPr>
+            <w:tcW w:type="dxa" w:w="1600"/>
+            <w:gridSpan w:val="1"/>
+            <w:tcBorders>
+              <w:top w:val="single" w:color="000000" w:sz="4"/>
+              <w:left w:val="single" w:color="000000" w:sz="4"/>
+              <w:bottom w:val="single" w:color="000000" w:sz="4"/>
+              <w:right w:val="single" w:color="000000" w:sz="4"/>
+            </w:tcBorders>
+            <w:vAlign w:val="center"/>
+          </w:tcPr>
+          <w:p>
+            <w:pPr>
+              <w:spacing w:after="50" w:before="50"/>
+              <w:jc w:val="center"/>
+            </w:pPr>
+            <w:r>
+              <w:rPr>
+                <w:rFonts w:ascii="Arial" w:cs="Arial" w:eastAsia="Arial" w:hAnsi="Arial"/>
+                <w:color w:val="000000"/>
+                <w:sz w:val="17"/>
+                <w:szCs w:val="17"/>
+              </w:rPr>
+              <w:t xml:space="preserve">__/__/____</w:t>
+            </w:r>
+          </w:p>
+        </w:tc>
+        <w:tc>
+          <w:tcPr>
+            <w:tcW w:type="dxa" w:w="3800"/>
+            <w:gridSpan w:val="1"/>
+            <w:tcBorders>
+              <w:top w:val="single" w:color="000000" w:sz="4"/>
+              <w:left w:val="single" w:color="000000" w:sz="4"/>
+              <w:bottom w:val="single" w:color="000000" w:sz="4"/>
+              <w:right w:val="single" w:color="000000" w:sz="4"/>
+            </w:tcBorders>
+            <w:vAlign w:val="center"/>
+          </w:tcPr>
+          <w:p>
+            <w:pPr>
+              <w:spacing w:after="50" w:before="50"/>
+              <w:jc w:val="center"/>
+            </w:pPr>
+            <w:r>
+              <w:rPr>
+                <w:rFonts w:ascii="Arial" w:cs="Arial" w:eastAsia="Arial" w:hAnsi="Arial"/>
+                <w:color w:val="000000"/>
+                <w:sz w:val="17"/>
+                <w:szCs w:val="17"/>
+              </w:rPr>
+              <w:t xml:space="preserve">__/__/____</w:t>
+            </w:r>
+          </w:p>
+        </w:tc>
+      </w:tr>
+      <w:tr>
+        <w:tc>
+          <w:tcPr>
+            <w:tcW w:type="dxa" w:w="400"/>
+            <w:gridSpan w:val="1"/>
+            <w:tcBorders>
+              <w:top w:val="single" w:color="000000" w:sz="4"/>
+              <w:left w:val="single" w:color="000000" w:sz="4"/>
+              <w:bottom w:val="single" w:color="000000" w:sz="4"/>
+              <w:right w:val="single" w:color="000000" w:sz="4"/>
+            </w:tcBorders>
+            <w:vAlign w:val="center"/>
+          </w:tcPr>
+          <w:p>
+            <w:pPr>
+              <w:spacing w:after="50" w:before="50"/>
+              <w:jc w:val="center"/>
+            </w:pPr>
+            <w:r>
+              <w:rPr>
+                <w:rFonts w:ascii="Arial" w:cs="Arial" w:eastAsia="Arial" w:hAnsi="Arial"/>
+                <w:color w:val="000000"/>
+                <w:sz w:val="18"/>
+                <w:szCs w:val="18"/>
+              </w:rPr>
+              <w:t xml:space="preserve">□</w:t>
+            </w:r>
+          </w:p>
+        </w:tc>
+        <w:tc>
+          <w:tcPr>
+            <w:tcW w:type="dxa" w:w="2600"/>
+            <w:gridSpan w:val="1"/>
+            <w:tcBorders>
+              <w:top w:val="single" w:color="000000" w:sz="4"/>
+              <w:left w:val="single" w:color="000000" w:sz="4"/>
+              <w:bottom w:val="single" w:color="000000" w:sz="4"/>
+              <w:right w:val="single" w:color="000000" w:sz="4"/>
+            </w:tcBorders>
+            <w:vAlign w:val="center"/>
+          </w:tcPr>
+          <w:p>
+            <w:pPr>
+              <w:spacing w:after="50" w:before="50"/>
+              <w:jc w:val="left"/>
+            </w:pPr>
+            <w:r>
+              <w:rPr>
+                <w:rFonts w:ascii="Arial" w:cs="Arial" w:eastAsia="Arial" w:hAnsi="Arial"/>
+                <w:color w:val="000000"/>
+                <w:sz w:val="18"/>
+                <w:szCs w:val="18"/>
+              </w:rPr>
+              <w:t xml:space="preserve">Trabajos Eléctricos  (media y alta tensión)</w:t>
+            </w:r>
+          </w:p>
+        </w:tc>
+        <w:tc>
+          <w:tcPr>
+            <w:tcW w:type="dxa" w:w="2400"/>
+            <w:gridSpan w:val="1"/>
+            <w:tcBorders>
+              <w:top w:val="single" w:color="000000" w:sz="4"/>
+              <w:left w:val="single" w:color="000000" w:sz="4"/>
+              <w:bottom w:val="single" w:color="000000" w:sz="4"/>
+              <w:right w:val="single" w:color="000000" w:sz="4"/>
+            </w:tcBorders>
+            <w:vAlign w:val="center"/>
+          </w:tcPr>
+          <w:p>
+            <w:pPr>
+              <w:spacing w:after="50" w:before="50"/>
+              <w:jc w:val="left"/>
+            </w:pPr>
+            <w:r>
+              <w:rPr>
+                <w:rFonts w:ascii="Arial" w:cs="Arial" w:eastAsia="Arial" w:hAnsi="Arial"/>
+                <w:color w:val="000000"/>
+                <w:sz w:val="17"/>
+                <w:szCs w:val="17"/>
+              </w:rPr>
+              <w:t xml:space="preserve">MDT / SENESCYT</w:t>
+            </w:r>
+          </w:p>
+        </w:tc>
+        <w:tc>
+          <w:tcPr>
+            <w:tcW w:type="dxa" w:w="1600"/>
+            <w:gridSpan w:val="1"/>
+            <w:tcBorders>
+              <w:top w:val="single" w:color="000000" w:sz="4"/>
+              <w:left w:val="single" w:color="000000" w:sz="4"/>
+              <w:bottom w:val="single" w:color="000000" w:sz="4"/>
+              <w:right w:val="single" w:color="000000" w:sz="4"/>
+            </w:tcBorders>
+            <w:vAlign w:val="center"/>
+          </w:tcPr>
+          <w:p>
+            <w:pPr>
+              <w:spacing w:after="50" w:before="50"/>
+              <w:jc w:val="center"/>
+            </w:pPr>
+            <w:r>
+              <w:rPr>
+                <w:rFonts w:ascii="Arial" w:cs="Arial" w:eastAsia="Arial" w:hAnsi="Arial"/>
+                <w:color w:val="000000"/>
+                <w:sz w:val="17"/>
+                <w:szCs w:val="17"/>
+              </w:rPr>
+              <w:t xml:space="preserve">__/__/____</w:t>
+            </w:r>
+          </w:p>
+        </w:tc>
+        <w:tc>
+          <w:tcPr>
+            <w:tcW w:type="dxa" w:w="3800"/>
+            <w:gridSpan w:val="1"/>
+            <w:tcBorders>
+              <w:top w:val="single" w:color="000000" w:sz="4"/>
+              <w:left w:val="single" w:color="000000" w:sz="4"/>
+              <w:bottom w:val="single" w:color="000000" w:sz="4"/>
+              <w:right w:val="single" w:color="000000" w:sz="4"/>
+            </w:tcBorders>
+            <w:vAlign w:val="center"/>
+          </w:tcPr>
+          <w:p>
+            <w:pPr>
+              <w:spacing w:after="50" w:before="50"/>
+              <w:jc w:val="center"/>
+            </w:pPr>
+            <w:r>
+              <w:rPr>
+                <w:rFonts w:ascii="Arial" w:cs="Arial" w:eastAsia="Arial" w:hAnsi="Arial"/>
+                <w:color w:val="000000"/>
+                <w:sz w:val="17"/>
+                <w:szCs w:val="17"/>
+              </w:rPr>
+              <w:t xml:space="preserve">__/__/____</w:t>
+            </w:r>
+          </w:p>
+        </w:tc>
+      </w:tr>
+      <w:tr>
+        <w:tc>
+          <w:tcPr>
+            <w:tcW w:type="dxa" w:w="400"/>
+            <w:gridSpan w:val="1"/>
+            <w:tcBorders>
+              <w:top w:val="single" w:color="000000" w:sz="4"/>
+              <w:left w:val="single" w:color="000000" w:sz="4"/>
+              <w:bottom w:val="single" w:color="000000" w:sz="4"/>
+              <w:right w:val="single" w:color="000000" w:sz="4"/>
+            </w:tcBorders>
+            <w:vAlign w:val="center"/>
+          </w:tcPr>
+          <w:p>
+            <w:pPr>
+              <w:spacing w:after="50" w:before="50"/>
+              <w:jc w:val="center"/>
+            </w:pPr>
+            <w:r>
+              <w:rPr>
+                <w:rFonts w:ascii="Arial" w:cs="Arial" w:eastAsia="Arial" w:hAnsi="Arial"/>
+                <w:color w:val="000000"/>
+                <w:sz w:val="18"/>
+                <w:szCs w:val="18"/>
+              </w:rPr>
+              <w:t xml:space="preserve">□</w:t>
+            </w:r>
+          </w:p>
+        </w:tc>
+        <w:tc>
+          <w:tcPr>
+            <w:tcW w:type="dxa" w:w="2600"/>
+            <w:gridSpan w:val="1"/>
+            <w:tcBorders>
+              <w:top w:val="single" w:color="000000" w:sz="4"/>
+              <w:left w:val="single" w:color="000000" w:sz="4"/>
+              <w:bottom w:val="single" w:color="000000" w:sz="4"/>
+              <w:right w:val="single" w:color="000000" w:sz="4"/>
+            </w:tcBorders>
+            <w:vAlign w:val="center"/>
+          </w:tcPr>
+          <w:p>
+            <w:pPr>
+              <w:spacing w:after="50" w:before="50"/>
+              <w:jc w:val="left"/>
+            </w:pPr>
+            <w:r>
+              <w:rPr>
+                <w:rFonts w:ascii="Arial" w:cs="Arial" w:eastAsia="Arial" w:hAnsi="Arial"/>
+                <w:color w:val="000000"/>
+                <w:sz w:val="18"/>
+                <w:szCs w:val="18"/>
+              </w:rPr>
+              <w:t xml:space="preserve">Izaje de Cargas</w:t>
+            </w:r>
+          </w:p>
+        </w:tc>
+        <w:tc>
+          <w:tcPr>
+            <w:tcW w:type="dxa" w:w="2400"/>
+            <w:gridSpan w:val="1"/>
+            <w:tcBorders>
+              <w:top w:val="single" w:color="000000" w:sz="4"/>
+              <w:left w:val="single" w:color="000000" w:sz="4"/>
+              <w:bottom w:val="single" w:color="000000" w:sz="4"/>
+              <w:right w:val="single" w:color="000000" w:sz="4"/>
+            </w:tcBorders>
+            <w:vAlign w:val="center"/>
+          </w:tcPr>
+          <w:p>
+            <w:pPr>
+              <w:spacing w:after="50" w:before="50"/>
+              <w:jc w:val="left"/>
+            </w:pPr>
+            <w:r>
+              <w:rPr>
+                <w:rFonts w:ascii="Arial" w:cs="Arial" w:eastAsia="Arial" w:hAnsi="Arial"/>
+                <w:color w:val="000000"/>
+                <w:sz w:val="17"/>
+                <w:szCs w:val="17"/>
+              </w:rPr>
+              <w:t xml:space="preserve">MDT / SENESCYT</w:t>
+            </w:r>
+          </w:p>
+        </w:tc>
+        <w:tc>
+          <w:tcPr>
+            <w:tcW w:type="dxa" w:w="1600"/>
+            <w:gridSpan w:val="1"/>
+            <w:tcBorders>
+              <w:top w:val="single" w:color="000000" w:sz="4"/>
+              <w:left w:val="single" w:color="000000" w:sz="4"/>
+              <w:bottom w:val="single" w:color="000000" w:sz="4"/>
+              <w:right w:val="single" w:color="000000" w:sz="4"/>
+            </w:tcBorders>
+            <w:vAlign w:val="center"/>
+          </w:tcPr>
+          <w:p>
+            <w:pPr>
+              <w:spacing w:after="50" w:before="50"/>
+              <w:jc w:val="center"/>
+            </w:pPr>
+            <w:r>
+              <w:rPr>
+                <w:rFonts w:ascii="Arial" w:cs="Arial" w:eastAsia="Arial" w:hAnsi="Arial"/>
+                <w:color w:val="000000"/>
+                <w:sz w:val="17"/>
+                <w:szCs w:val="17"/>
+              </w:rPr>
+              <w:t xml:space="preserve">__/__/____</w:t>
+            </w:r>
+          </w:p>
+        </w:tc>
+        <w:tc>
+          <w:tcPr>
+            <w:tcW w:type="dxa" w:w="3800"/>
+            <w:gridSpan w:val="1"/>
+            <w:tcBorders>
+              <w:top w:val="single" w:color="000000" w:sz="4"/>
+              <w:left w:val="single" w:color="000000" w:sz="4"/>
+              <w:bottom w:val="single" w:color="000000" w:sz="4"/>
+              <w:right w:val="single" w:color="000000" w:sz="4"/>
+            </w:tcBorders>
+            <w:vAlign w:val="center"/>
+          </w:tcPr>
+          <w:p>
+            <w:pPr>
+              <w:spacing w:after="50" w:before="50"/>
+              <w:jc w:val="center"/>
+            </w:pPr>
+            <w:r>
+              <w:rPr>
+                <w:rFonts w:ascii="Arial" w:cs="Arial" w:eastAsia="Arial" w:hAnsi="Arial"/>
+                <w:color w:val="000000"/>
+                <w:sz w:val="17"/>
+                <w:szCs w:val="17"/>
+              </w:rPr>
+              <w:t xml:space="preserve">__/__/____</w:t>
+            </w:r>
+          </w:p>
+        </w:tc>
+      </w:tr>
+      <w:tr>
+        <w:tc>
+          <w:tcPr>
+            <w:tcW w:type="dxa" w:w="400"/>
+            <w:gridSpan w:val="1"/>
+            <w:tcBorders>
+              <w:top w:val="single" w:color="000000" w:sz="4"/>
+              <w:left w:val="single" w:color="000000" w:sz="4"/>
+              <w:bottom w:val="single" w:color="000000" w:sz="4"/>
+              <w:right w:val="single" w:color="000000" w:sz="4"/>
+            </w:tcBorders>
+            <w:vAlign w:val="center"/>
+          </w:tcPr>
+          <w:p>
+            <w:pPr>
+              <w:spacing w:after="50" w:before="50"/>
+              <w:jc w:val="center"/>
+            </w:pPr>
+            <w:r>
+              <w:rPr>
+                <w:rFonts w:ascii="Arial" w:cs="Arial" w:eastAsia="Arial" w:hAnsi="Arial"/>
+                <w:color w:val="000000"/>
+                <w:sz w:val="18"/>
+                <w:szCs w:val="18"/>
+              </w:rPr>
+              <w:t xml:space="preserve">□</w:t>
+            </w:r>
+          </w:p>
+        </w:tc>
+        <w:tc>
+          <w:tcPr>
+            <w:tcW w:type="dxa" w:w="2600"/>
+            <w:gridSpan w:val="1"/>
+            <w:tcBorders>
+              <w:top w:val="single" w:color="000000" w:sz="4"/>
+              <w:left w:val="single" w:color="000000" w:sz="4"/>
+              <w:bottom w:val="single" w:color="000000" w:sz="4"/>
+              <w:right w:val="single" w:color="000000" w:sz="4"/>
+            </w:tcBorders>
+            <w:vAlign w:val="center"/>
+          </w:tcPr>
+          <w:p>
+            <w:pPr>
+              <w:spacing w:after="50" w:before="50"/>
+              <w:jc w:val="left"/>
+            </w:pPr>
+            <w:r>
+              <w:rPr>
+                <w:rFonts w:ascii="Arial" w:cs="Arial" w:eastAsia="Arial" w:hAnsi="Arial"/>
+                <w:color w:val="000000"/>
+                <w:sz w:val="18"/>
+                <w:szCs w:val="18"/>
+              </w:rPr>
+              <w:t xml:space="preserve">Excavaciones</w:t>
+            </w:r>
+          </w:p>
+        </w:tc>
+        <w:tc>
+          <w:tcPr>
+            <w:tcW w:type="dxa" w:w="2400"/>
+            <w:gridSpan w:val="1"/>
+            <w:tcBorders>
+              <w:top w:val="single" w:color="000000" w:sz="4"/>
+              <w:left w:val="single" w:color="000000" w:sz="4"/>
+              <w:bottom w:val="single" w:color="000000" w:sz="4"/>
+              <w:right w:val="single" w:color="000000" w:sz="4"/>
+            </w:tcBorders>
+            <w:vAlign w:val="center"/>
+          </w:tcPr>
+          <w:p>
+            <w:pPr>
+              <w:spacing w:after="50" w:before="50"/>
+              <w:jc w:val="left"/>
+            </w:pPr>
+            <w:r>
+              <w:rPr>
+                <w:rFonts w:ascii="Arial" w:cs="Arial" w:eastAsia="Arial" w:hAnsi="Arial"/>
+                <w:color w:val="000000"/>
+                <w:sz w:val="17"/>
+                <w:szCs w:val="17"/>
+              </w:rPr>
+              <w:t xml:space="preserve">MDT / SENESCYT</w:t>
+            </w:r>
+          </w:p>
+        </w:tc>
+        <w:tc>
+          <w:tcPr>
+            <w:tcW w:type="dxa" w:w="1600"/>
+            <w:gridSpan w:val="1"/>
+            <w:tcBorders>
+              <w:top w:val="single" w:color="000000" w:sz="4"/>
+              <w:left w:val="single" w:color="000000" w:sz="4"/>
+              <w:bottom w:val="single" w:color="000000" w:sz="4"/>
+              <w:right w:val="single" w:color="000000" w:sz="4"/>
+            </w:tcBorders>
+            <w:vAlign w:val="center"/>
+          </w:tcPr>
+          <w:p>
+            <w:pPr>
+              <w:spacing w:after="50" w:before="50"/>
+              <w:jc w:val="center"/>
+            </w:pPr>
+            <w:r>
+              <w:rPr>
+                <w:rFonts w:ascii="Arial" w:cs="Arial" w:eastAsia="Arial" w:hAnsi="Arial"/>
+                <w:color w:val="000000"/>
+                <w:sz w:val="17"/>
+                <w:szCs w:val="17"/>
+              </w:rPr>
+              <w:t xml:space="preserve">__/__/____</w:t>
+            </w:r>
+          </w:p>
+        </w:tc>
+        <w:tc>
+          <w:tcPr>
+            <w:tcW w:type="dxa" w:w="3800"/>
+            <w:gridSpan w:val="1"/>
+            <w:tcBorders>
+              <w:top w:val="single" w:color="000000" w:sz="4"/>
+              <w:left w:val="single" w:color="000000" w:sz="4"/>
+              <w:bottom w:val="single" w:color="000000" w:sz="4"/>
+              <w:right w:val="single" w:color="000000" w:sz="4"/>
+            </w:tcBorders>
+            <w:vAlign w:val="center"/>
+          </w:tcPr>
+          <w:p>
+            <w:pPr>
+              <w:spacing w:after="50" w:before="50"/>
+              <w:jc w:val="center"/>
+            </w:pPr>
+            <w:r>
+              <w:rPr>
+                <w:rFonts w:ascii="Arial" w:cs="Arial" w:eastAsia="Arial" w:hAnsi="Arial"/>
+                <w:color w:val="000000"/>
+                <w:sz w:val="17"/>
+                <w:szCs w:val="17"/>
+              </w:rPr>
+              <w:t xml:space="preserve">__/__/____</w:t>
             </w:r>
           </w:p>
         </w:tc>

</xml_diff>

<commit_message>
r34: add Listado de Personal Autorizado as page 2 (Option A group entry)
Second page includes: company/job reference fields, 15-row personnel
table (name, cedula, role, induction/IESS/medical/cert-AR, signature),
footnote on AE status, and dual-signature block (E&S + contractor rep).

Co-Authored-By: Claude Sonnet 4.6 <noreply@anthropic.com>
Claude-Session: https://claude.ai/code/session_01Mu84mNMmRhshwom6voaTeY
</commit_message>
<xml_diff>
--- a/GE-SO-R34_Rev05_Autorizacion_Ingreso_Contratistas.docx
+++ b/GE-SO-R34_Rev05_Autorizacion_Ingreso_Contratistas.docx
@@ -4314,6 +4314,4827 @@
                 <w:szCs w:val="15"/>
               </w:rPr>
               <w:t xml:space="preserve">Firma / Nombre / Fecha</w:t>
+            </w:r>
+          </w:p>
+        </w:tc>
+      </w:tr>
+    </w:tbl>
+    <w:p>
+      <w:pPr>
+        <w:spacing w:after="0" w:before="0"/>
+      </w:pPr>
+      <w:r>
+        <w:br w:type="page"/>
+      </w:r>
+    </w:p>
+    <w:tbl>
+      <w:tblPr>
+        <w:tblW w:type="dxa" w:w="10800"/>
+        <w:tblBorders>
+          <w:top w:val="single" w:color="auto" w:sz="4"/>
+          <w:left w:val="single" w:color="auto" w:sz="4"/>
+          <w:bottom w:val="single" w:color="auto" w:sz="4"/>
+          <w:right w:val="single" w:color="auto" w:sz="4"/>
+          <w:insideH w:val="single" w:color="auto" w:sz="4"/>
+          <w:insideV w:val="single" w:color="auto" w:sz="4"/>
+        </w:tblBorders>
+      </w:tblPr>
+      <w:tblGrid>
+        <w:gridCol w:w="1800"/>
+        <w:gridCol w:w="7000"/>
+        <w:gridCol w:w="2000"/>
+      </w:tblGrid>
+      <w:tr>
+        <w:tc>
+          <w:tcPr>
+            <w:tcW w:type="dxa" w:w="1800"/>
+            <w:gridSpan w:val="1"/>
+            <w:tcBorders>
+              <w:top w:val="single" w:color="000000" w:sz="8"/>
+              <w:left w:val="single" w:color="000000" w:sz="8"/>
+              <w:bottom w:val="single" w:color="000000" w:sz="8"/>
+              <w:right w:val="single" w:color="000000" w:sz="8"/>
+            </w:tcBorders>
+            <w:shd w:fill="FFFFFF" w:val="clear"/>
+            <w:vAlign w:val="center"/>
+          </w:tcPr>
+          <w:p>
+            <w:pPr>
+              <w:spacing w:after="30" w:before="30"/>
+              <w:jc w:val="center"/>
+            </w:pPr>
+            <w:r>
+              <w:drawing>
+                <wp:inline distT="0" distB="0" distL="0" distR="0">
+                  <wp:extent cx="1047750" cy="476250"/>
+                  <wp:effectExtent t="0" r="0" b="0" l="0"/>
+                  <wp:docPr id="1" name="" descr="" title=""/>
+                  <wp:cNvGraphicFramePr>
+                    <a:graphicFrameLocks xmlns:a="http://schemas.openxmlformats.org/drawingml/2006/main" noChangeAspect="1"/>
+                  </wp:cNvGraphicFramePr>
+                  <a:graphic xmlns:a="http://schemas.openxmlformats.org/drawingml/2006/main">
+                    <a:graphicData uri="http://schemas.openxmlformats.org/drawingml/2006/picture">
+                      <pic:pic xmlns:pic="http://schemas.openxmlformats.org/drawingml/2006/picture">
+                        <pic:nvPicPr>
+                          <pic:cNvPr id="0" name="" descr=""/>
+                          <pic:cNvPicPr>
+                            <a:picLocks noChangeAspect="1" noChangeArrowheads="1"/>
+                          </pic:cNvPicPr>
+                        </pic:nvPicPr>
+                        <pic:blipFill>
+                          <a:blip r:embed="rId7" cstate="none"/>
+                          <a:srcRect/>
+                          <a:stretch>
+                            <a:fillRect/>
+                          </a:stretch>
+                        </pic:blipFill>
+                        <pic:spPr bwMode="auto">
+                          <a:xfrm>
+                            <a:off x="0" y="0"/>
+                            <a:ext cx="1047750" cy="476250"/>
+                          </a:xfrm>
+                          <a:prstGeom prst="rect">
+                            <a:avLst/>
+                          </a:prstGeom>
+                        </pic:spPr>
+                      </pic:pic>
+                    </a:graphicData>
+                  </a:graphic>
+                </wp:inline>
+              </w:drawing>
+            </w:r>
+          </w:p>
+        </w:tc>
+        <w:tc>
+          <w:tcPr>
+            <w:tcW w:type="dxa" w:w="7000"/>
+            <w:gridSpan w:val="1"/>
+            <w:tcBorders>
+              <w:top w:val="single" w:color="000000" w:sz="8"/>
+              <w:left w:val="single" w:color="000000" w:sz="8"/>
+              <w:bottom w:val="single" w:color="000000" w:sz="8"/>
+              <w:right w:val="single" w:color="000000" w:sz="8"/>
+            </w:tcBorders>
+            <w:shd w:fill="1A3A6B" w:val="clear"/>
+            <w:vAlign w:val="center"/>
+          </w:tcPr>
+          <w:p>
+            <w:pPr>
+              <w:spacing w:after="40" w:before="40"/>
+              <w:jc w:val="center"/>
+            </w:pPr>
+            <w:r>
+              <w:rPr>
+                <w:rFonts w:ascii="Arial" w:cs="Arial" w:eastAsia="Arial" w:hAnsi="Arial"/>
+                <w:b/>
+                <w:bCs/>
+                <w:color w:val="FFFFFF"/>
+                <w:sz w:val="24"/>
+                <w:szCs w:val="24"/>
+              </w:rPr>
+              <w:t xml:space="preserve">LISTADO DE PERSONAL AUTORIZADO
+ANEXO GE-SO-R34</w:t>
+            </w:r>
+          </w:p>
+        </w:tc>
+        <w:tc>
+          <w:tcPr>
+            <w:tcW w:type="dxa" w:w="2000"/>
+            <w:gridSpan w:val="1"/>
+            <w:tcBorders>
+              <w:top w:val="single" w:color="000000" w:sz="8"/>
+              <w:left w:val="single" w:color="000000" w:sz="8"/>
+              <w:bottom w:val="single" w:color="000000" w:sz="8"/>
+              <w:right w:val="single" w:color="000000" w:sz="8"/>
+            </w:tcBorders>
+            <w:vAlign w:val="center"/>
+          </w:tcPr>
+          <w:p>
+            <w:pPr>
+              <w:spacing w:after="10" w:before="40"/>
+              <w:jc w:val="center"/>
+            </w:pPr>
+            <w:r>
+              <w:rPr>
+                <w:rFonts w:ascii="Arial" w:cs="Arial" w:eastAsia="Arial" w:hAnsi="Arial"/>
+                <w:b/>
+                <w:bCs/>
+                <w:color w:val="000000"/>
+                <w:sz w:val="20"/>
+                <w:szCs w:val="20"/>
+              </w:rPr>
+              <w:t xml:space="preserve">GE-SO-R34</w:t>
+            </w:r>
+          </w:p>
+          <w:p>
+            <w:pPr>
+              <w:spacing w:after="40" w:before="10"/>
+              <w:jc w:val="center"/>
+            </w:pPr>
+            <w:r>
+              <w:rPr>
+                <w:rFonts w:ascii="Arial" w:cs="Arial" w:eastAsia="Arial" w:hAnsi="Arial"/>
+                <w:b/>
+                <w:bCs/>
+                <w:color w:val="000000"/>
+                <w:sz w:val="18"/>
+                <w:szCs w:val="18"/>
+              </w:rPr>
+              <w:t xml:space="preserve">Versión: 04</w:t>
+            </w:r>
+          </w:p>
+        </w:tc>
+      </w:tr>
+    </w:tbl>
+    <w:p>
+      <w:pPr>
+        <w:spacing w:after="0" w:before="80"/>
+      </w:pPr>
+    </w:p>
+    <w:tbl>
+      <w:tblPr>
+        <w:tblW w:type="dxa" w:w="10800"/>
+        <w:tblBorders>
+          <w:top w:val="single" w:color="auto" w:sz="4"/>
+          <w:left w:val="single" w:color="auto" w:sz="4"/>
+          <w:bottom w:val="single" w:color="auto" w:sz="4"/>
+          <w:right w:val="single" w:color="auto" w:sz="4"/>
+          <w:insideH w:val="single" w:color="auto" w:sz="4"/>
+          <w:insideV w:val="single" w:color="auto" w:sz="4"/>
+        </w:tblBorders>
+      </w:tblPr>
+      <w:tblGrid>
+        <w:gridCol w:w="2200"/>
+        <w:gridCol w:w="8600"/>
+      </w:tblGrid>
+      <w:tr>
+        <w:tc>
+          <w:tcPr>
+            <w:tcW w:type="dxa" w:w="2200"/>
+            <w:gridSpan w:val="1"/>
+            <w:tcBorders>
+              <w:top w:val="single" w:color="000000" w:sz="4"/>
+              <w:left w:val="single" w:color="000000" w:sz="4"/>
+              <w:bottom w:val="single" w:color="000000" w:sz="4"/>
+              <w:right w:val="single" w:color="000000" w:sz="4"/>
+            </w:tcBorders>
+            <w:vAlign w:val="center"/>
+          </w:tcPr>
+          <w:p>
+            <w:pPr>
+              <w:spacing w:after="60" w:before="60"/>
+              <w:jc w:val="left"/>
+            </w:pPr>
+            <w:r>
+              <w:rPr>
+                <w:rFonts w:ascii="Arial" w:cs="Arial" w:eastAsia="Arial" w:hAnsi="Arial"/>
+                <w:b/>
+                <w:bCs/>
+                <w:color w:val="000000"/>
+                <w:sz w:val="18"/>
+                <w:szCs w:val="18"/>
+              </w:rPr>
+              <w:t xml:space="preserve">EMPRESA CONTRATISTA:</w:t>
+            </w:r>
+          </w:p>
+        </w:tc>
+        <w:tc>
+          <w:tcPr>
+            <w:tcW w:type="dxa" w:w="8600"/>
+            <w:gridSpan w:val="1"/>
+            <w:tcBorders>
+              <w:top w:val="single" w:color="000000" w:sz="4"/>
+              <w:left w:val="single" w:color="000000" w:sz="4"/>
+              <w:bottom w:val="single" w:color="000000" w:sz="4"/>
+              <w:right w:val="single" w:color="000000" w:sz="4"/>
+            </w:tcBorders>
+            <w:vAlign w:val="center"/>
+          </w:tcPr>
+          <w:p>
+            <w:pPr>
+              <w:spacing w:after="50" w:before="50"/>
+              <w:jc w:val="left"/>
+            </w:pPr>
+            <w:r>
+              <w:rPr>
+                <w:rFonts w:ascii="Arial" w:cs="Arial" w:eastAsia="Arial" w:hAnsi="Arial"/>
+                <w:color w:val="000000"/>
+                <w:sz w:val="18"/>
+                <w:szCs w:val="18"/>
+              </w:rPr>
+              <w:t xml:space="preserve"/>
+            </w:r>
+          </w:p>
+        </w:tc>
+      </w:tr>
+      <w:tr>
+        <w:tc>
+          <w:tcPr>
+            <w:tcW w:type="dxa" w:w="2200"/>
+            <w:gridSpan w:val="1"/>
+            <w:tcBorders>
+              <w:top w:val="single" w:color="000000" w:sz="4"/>
+              <w:left w:val="single" w:color="000000" w:sz="4"/>
+              <w:bottom w:val="single" w:color="000000" w:sz="4"/>
+              <w:right w:val="single" w:color="000000" w:sz="4"/>
+            </w:tcBorders>
+            <w:vAlign w:val="center"/>
+          </w:tcPr>
+          <w:p>
+            <w:pPr>
+              <w:spacing w:after="60" w:before="60"/>
+              <w:jc w:val="left"/>
+            </w:pPr>
+            <w:r>
+              <w:rPr>
+                <w:rFonts w:ascii="Arial" w:cs="Arial" w:eastAsia="Arial" w:hAnsi="Arial"/>
+                <w:b/>
+                <w:bCs/>
+                <w:color w:val="000000"/>
+                <w:sz w:val="18"/>
+                <w:szCs w:val="18"/>
+              </w:rPr>
+              <w:t xml:space="preserve">TRABAJO / SERVICIO:</w:t>
+            </w:r>
+          </w:p>
+        </w:tc>
+        <w:tc>
+          <w:tcPr>
+            <w:tcW w:type="dxa" w:w="8600"/>
+            <w:gridSpan w:val="1"/>
+            <w:tcBorders>
+              <w:top w:val="single" w:color="000000" w:sz="4"/>
+              <w:left w:val="single" w:color="000000" w:sz="4"/>
+              <w:bottom w:val="single" w:color="000000" w:sz="4"/>
+              <w:right w:val="single" w:color="000000" w:sz="4"/>
+            </w:tcBorders>
+            <w:vAlign w:val="center"/>
+          </w:tcPr>
+          <w:p>
+            <w:pPr>
+              <w:spacing w:after="50" w:before="50"/>
+              <w:jc w:val="left"/>
+            </w:pPr>
+            <w:r>
+              <w:rPr>
+                <w:rFonts w:ascii="Arial" w:cs="Arial" w:eastAsia="Arial" w:hAnsi="Arial"/>
+                <w:color w:val="000000"/>
+                <w:sz w:val="18"/>
+                <w:szCs w:val="18"/>
+              </w:rPr>
+              <w:t xml:space="preserve"/>
+            </w:r>
+          </w:p>
+        </w:tc>
+      </w:tr>
+      <w:tr>
+        <w:tc>
+          <w:tcPr>
+            <w:tcW w:type="dxa" w:w="2200"/>
+            <w:gridSpan w:val="1"/>
+            <w:tcBorders>
+              <w:top w:val="single" w:color="000000" w:sz="4"/>
+              <w:left w:val="single" w:color="000000" w:sz="4"/>
+              <w:bottom w:val="single" w:color="000000" w:sz="4"/>
+              <w:right w:val="single" w:color="000000" w:sz="4"/>
+            </w:tcBorders>
+            <w:vAlign w:val="center"/>
+          </w:tcPr>
+          <w:p>
+            <w:pPr>
+              <w:spacing w:after="60" w:before="60"/>
+              <w:jc w:val="left"/>
+            </w:pPr>
+            <w:r>
+              <w:rPr>
+                <w:rFonts w:ascii="Arial" w:cs="Arial" w:eastAsia="Arial" w:hAnsi="Arial"/>
+                <w:b/>
+                <w:bCs/>
+                <w:color w:val="000000"/>
+                <w:sz w:val="18"/>
+                <w:szCs w:val="18"/>
+              </w:rPr>
+              <w:t xml:space="preserve">FECHA DE INGRESO:</w:t>
+            </w:r>
+          </w:p>
+        </w:tc>
+        <w:tc>
+          <w:tcPr>
+            <w:tcW w:type="dxa" w:w="8600"/>
+            <w:gridSpan w:val="1"/>
+            <w:tcBorders>
+              <w:top w:val="single" w:color="000000" w:sz="4"/>
+              <w:left w:val="single" w:color="000000" w:sz="4"/>
+              <w:bottom w:val="single" w:color="000000" w:sz="4"/>
+              <w:right w:val="single" w:color="000000" w:sz="4"/>
+            </w:tcBorders>
+            <w:vAlign w:val="center"/>
+          </w:tcPr>
+          <w:p>
+            <w:pPr>
+              <w:spacing w:after="50" w:before="50"/>
+              <w:jc w:val="left"/>
+            </w:pPr>
+            <w:r>
+              <w:rPr>
+                <w:rFonts w:ascii="Arial" w:cs="Arial" w:eastAsia="Arial" w:hAnsi="Arial"/>
+                <w:color w:val="000000"/>
+                <w:sz w:val="18"/>
+                <w:szCs w:val="18"/>
+              </w:rPr>
+              <w:t xml:space="preserve"/>
+            </w:r>
+          </w:p>
+        </w:tc>
+      </w:tr>
+    </w:tbl>
+    <w:p>
+      <w:pPr>
+        <w:spacing w:after="0" w:before="80"/>
+      </w:pPr>
+    </w:p>
+    <w:tbl>
+      <w:tblPr>
+        <w:tblW w:type="dxa" w:w="10800"/>
+        <w:tblBorders>
+          <w:top w:val="single" w:color="auto" w:sz="4"/>
+          <w:left w:val="single" w:color="auto" w:sz="4"/>
+          <w:bottom w:val="single" w:color="auto" w:sz="4"/>
+          <w:right w:val="single" w:color="auto" w:sz="4"/>
+          <w:insideH w:val="single" w:color="auto" w:sz="4"/>
+          <w:insideV w:val="single" w:color="auto" w:sz="4"/>
+        </w:tblBorders>
+      </w:tblPr>
+      <w:tblGrid>
+        <w:gridCol w:w="10800"/>
+      </w:tblGrid>
+      <w:tr>
+        <w:tc>
+          <w:tcPr>
+            <w:tcW w:type="dxa" w:w="10800"/>
+            <w:gridSpan w:val="1"/>
+            <w:tcBorders>
+              <w:top w:val="single" w:color="000000" w:sz="8"/>
+              <w:left w:val="single" w:color="000000" w:sz="8"/>
+              <w:bottom w:val="single" w:color="000000" w:sz="8"/>
+              <w:right w:val="single" w:color="000000" w:sz="8"/>
+            </w:tcBorders>
+            <w:shd w:fill="1A3A6B" w:val="clear"/>
+            <w:vAlign w:val="center"/>
+          </w:tcPr>
+          <w:p>
+            <w:pPr>
+              <w:spacing w:after="60" w:before="60"/>
+              <w:jc w:val="center"/>
+            </w:pPr>
+            <w:r>
+              <w:rPr>
+                <w:rFonts w:ascii="Arial" w:cs="Arial" w:eastAsia="Arial" w:hAnsi="Arial"/>
+                <w:b/>
+                <w:bCs/>
+                <w:color w:val="FFFFFF"/>
+                <w:sz w:val="19"/>
+                <w:szCs w:val="19"/>
+              </w:rPr>
+              <w:t xml:space="preserve">PERSONAL HABILITADO PARA EL INGRESO</w:t>
+            </w:r>
+          </w:p>
+        </w:tc>
+      </w:tr>
+    </w:tbl>
+    <w:tbl>
+      <w:tblPr>
+        <w:tblW w:type="dxa" w:w="10800"/>
+        <w:tblBorders>
+          <w:top w:val="single" w:color="auto" w:sz="4"/>
+          <w:left w:val="single" w:color="auto" w:sz="4"/>
+          <w:bottom w:val="single" w:color="auto" w:sz="4"/>
+          <w:right w:val="single" w:color="auto" w:sz="4"/>
+          <w:insideH w:val="single" w:color="auto" w:sz="4"/>
+          <w:insideV w:val="single" w:color="auto" w:sz="4"/>
+        </w:tblBorders>
+      </w:tblPr>
+      <w:tblGrid>
+        <w:gridCol w:w="460"/>
+        <w:gridCol w:w="2200"/>
+        <w:gridCol w:w="1000"/>
+        <w:gridCol w:w="1300"/>
+        <w:gridCol w:w="780"/>
+        <w:gridCol w:w="780"/>
+        <w:gridCol w:w="780"/>
+        <w:gridCol w:w="780"/>
+        <w:gridCol w:w="2720"/>
+      </w:tblGrid>
+      <w:tr>
+        <w:tc>
+          <w:tcPr>
+            <w:tcW w:type="dxa" w:w="460"/>
+            <w:gridSpan w:val="1"/>
+            <w:tcBorders>
+              <w:top w:val="single" w:color="000000" w:sz="4"/>
+              <w:left w:val="single" w:color="000000" w:sz="4"/>
+              <w:bottom w:val="single" w:color="000000" w:sz="4"/>
+              <w:right w:val="single" w:color="000000" w:sz="4"/>
+            </w:tcBorders>
+            <w:shd w:fill="2E6DB4" w:val="clear"/>
+            <w:vAlign w:val="center"/>
+          </w:tcPr>
+          <w:p>
+            <w:pPr>
+              <w:spacing w:after="40" w:before="40"/>
+              <w:jc w:val="center"/>
+            </w:pPr>
+            <w:r>
+              <w:rPr>
+                <w:rFonts w:ascii="Arial" w:cs="Arial" w:eastAsia="Arial" w:hAnsi="Arial"/>
+                <w:b/>
+                <w:bCs/>
+                <w:color w:val="FFFFFF"/>
+                <w:sz w:val="16"/>
+                <w:szCs w:val="16"/>
+              </w:rPr>
+              <w:t xml:space="preserve">#</w:t>
+            </w:r>
+          </w:p>
+        </w:tc>
+        <w:tc>
+          <w:tcPr>
+            <w:tcW w:type="dxa" w:w="2200"/>
+            <w:gridSpan w:val="1"/>
+            <w:tcBorders>
+              <w:top w:val="single" w:color="000000" w:sz="4"/>
+              <w:left w:val="single" w:color="000000" w:sz="4"/>
+              <w:bottom w:val="single" w:color="000000" w:sz="4"/>
+              <w:right w:val="single" w:color="000000" w:sz="4"/>
+            </w:tcBorders>
+            <w:shd w:fill="2E6DB4" w:val="clear"/>
+            <w:vAlign w:val="center"/>
+          </w:tcPr>
+          <w:p>
+            <w:pPr>
+              <w:spacing w:after="40" w:before="40"/>
+              <w:jc w:val="center"/>
+            </w:pPr>
+            <w:r>
+              <w:rPr>
+                <w:rFonts w:ascii="Arial" w:cs="Arial" w:eastAsia="Arial" w:hAnsi="Arial"/>
+                <w:b/>
+                <w:bCs/>
+                <w:color w:val="FFFFFF"/>
+                <w:sz w:val="16"/>
+                <w:szCs w:val="16"/>
+              </w:rPr>
+              <w:t xml:space="preserve">NOMBRE COMPLETO</w:t>
+            </w:r>
+          </w:p>
+        </w:tc>
+        <w:tc>
+          <w:tcPr>
+            <w:tcW w:type="dxa" w:w="1000"/>
+            <w:gridSpan w:val="1"/>
+            <w:tcBorders>
+              <w:top w:val="single" w:color="000000" w:sz="4"/>
+              <w:left w:val="single" w:color="000000" w:sz="4"/>
+              <w:bottom w:val="single" w:color="000000" w:sz="4"/>
+              <w:right w:val="single" w:color="000000" w:sz="4"/>
+            </w:tcBorders>
+            <w:shd w:fill="2E6DB4" w:val="clear"/>
+            <w:vAlign w:val="center"/>
+          </w:tcPr>
+          <w:p>
+            <w:pPr>
+              <w:spacing w:after="40" w:before="40"/>
+              <w:jc w:val="center"/>
+            </w:pPr>
+            <w:r>
+              <w:rPr>
+                <w:rFonts w:ascii="Arial" w:cs="Arial" w:eastAsia="Arial" w:hAnsi="Arial"/>
+                <w:b/>
+                <w:bCs/>
+                <w:color w:val="FFFFFF"/>
+                <w:sz w:val="16"/>
+                <w:szCs w:val="16"/>
+              </w:rPr>
+              <w:t xml:space="preserve">CÉDULA</w:t>
+            </w:r>
+          </w:p>
+        </w:tc>
+        <w:tc>
+          <w:tcPr>
+            <w:tcW w:type="dxa" w:w="1300"/>
+            <w:gridSpan w:val="1"/>
+            <w:tcBorders>
+              <w:top w:val="single" w:color="000000" w:sz="4"/>
+              <w:left w:val="single" w:color="000000" w:sz="4"/>
+              <w:bottom w:val="single" w:color="000000" w:sz="4"/>
+              <w:right w:val="single" w:color="000000" w:sz="4"/>
+            </w:tcBorders>
+            <w:shd w:fill="2E6DB4" w:val="clear"/>
+            <w:vAlign w:val="center"/>
+          </w:tcPr>
+          <w:p>
+            <w:pPr>
+              <w:spacing w:after="40" w:before="40"/>
+              <w:jc w:val="center"/>
+            </w:pPr>
+            <w:r>
+              <w:rPr>
+                <w:rFonts w:ascii="Arial" w:cs="Arial" w:eastAsia="Arial" w:hAnsi="Arial"/>
+                <w:b/>
+                <w:bCs/>
+                <w:color w:val="FFFFFF"/>
+                <w:sz w:val="16"/>
+                <w:szCs w:val="16"/>
+              </w:rPr>
+              <w:t xml:space="preserve">CARGO /
+FUNCIÓN</w:t>
+            </w:r>
+          </w:p>
+        </w:tc>
+        <w:tc>
+          <w:tcPr>
+            <w:tcW w:type="dxa" w:w="780"/>
+            <w:gridSpan w:val="1"/>
+            <w:tcBorders>
+              <w:top w:val="single" w:color="000000" w:sz="4"/>
+              <w:left w:val="single" w:color="000000" w:sz="4"/>
+              <w:bottom w:val="single" w:color="000000" w:sz="4"/>
+              <w:right w:val="single" w:color="000000" w:sz="4"/>
+            </w:tcBorders>
+            <w:shd w:fill="2E6DB4" w:val="clear"/>
+            <w:vAlign w:val="center"/>
+          </w:tcPr>
+          <w:p>
+            <w:pPr>
+              <w:spacing w:after="40" w:before="40"/>
+              <w:jc w:val="center"/>
+            </w:pPr>
+            <w:r>
+              <w:rPr>
+                <w:rFonts w:ascii="Arial" w:cs="Arial" w:eastAsia="Arial" w:hAnsi="Arial"/>
+                <w:b/>
+                <w:bCs/>
+                <w:color w:val="FFFFFF"/>
+                <w:sz w:val="15"/>
+                <w:szCs w:val="15"/>
+              </w:rPr>
+              <w:t xml:space="preserve">INDUCCIÓN
+✓ / ✗</w:t>
+            </w:r>
+          </w:p>
+        </w:tc>
+        <w:tc>
+          <w:tcPr>
+            <w:tcW w:type="dxa" w:w="780"/>
+            <w:gridSpan w:val="1"/>
+            <w:tcBorders>
+              <w:top w:val="single" w:color="000000" w:sz="4"/>
+              <w:left w:val="single" w:color="000000" w:sz="4"/>
+              <w:bottom w:val="single" w:color="000000" w:sz="4"/>
+              <w:right w:val="single" w:color="000000" w:sz="4"/>
+            </w:tcBorders>
+            <w:shd w:fill="2E6DB4" w:val="clear"/>
+            <w:vAlign w:val="center"/>
+          </w:tcPr>
+          <w:p>
+            <w:pPr>
+              <w:spacing w:after="40" w:before="40"/>
+              <w:jc w:val="center"/>
+            </w:pPr>
+            <w:r>
+              <w:rPr>
+                <w:rFonts w:ascii="Arial" w:cs="Arial" w:eastAsia="Arial" w:hAnsi="Arial"/>
+                <w:b/>
+                <w:bCs/>
+                <w:color w:val="FFFFFF"/>
+                <w:sz w:val="15"/>
+                <w:szCs w:val="15"/>
+              </w:rPr>
+              <w:t xml:space="preserve">IESS
+✓ / AE</w:t>
+            </w:r>
+          </w:p>
+        </w:tc>
+        <w:tc>
+          <w:tcPr>
+            <w:tcW w:type="dxa" w:w="780"/>
+            <w:gridSpan w:val="1"/>
+            <w:tcBorders>
+              <w:top w:val="single" w:color="000000" w:sz="4"/>
+              <w:left w:val="single" w:color="000000" w:sz="4"/>
+              <w:bottom w:val="single" w:color="000000" w:sz="4"/>
+              <w:right w:val="single" w:color="000000" w:sz="4"/>
+            </w:tcBorders>
+            <w:shd w:fill="2E6DB4" w:val="clear"/>
+            <w:vAlign w:val="center"/>
+          </w:tcPr>
+          <w:p>
+            <w:pPr>
+              <w:spacing w:after="40" w:before="40"/>
+              <w:jc w:val="center"/>
+            </w:pPr>
+            <w:r>
+              <w:rPr>
+                <w:rFonts w:ascii="Arial" w:cs="Arial" w:eastAsia="Arial" w:hAnsi="Arial"/>
+                <w:b/>
+                <w:bCs/>
+                <w:color w:val="FFFFFF"/>
+                <w:sz w:val="15"/>
+                <w:szCs w:val="15"/>
+              </w:rPr>
+              <w:t xml:space="preserve">MÉDICO
+✓ / ✗</w:t>
+            </w:r>
+          </w:p>
+        </w:tc>
+        <w:tc>
+          <w:tcPr>
+            <w:tcW w:type="dxa" w:w="780"/>
+            <w:gridSpan w:val="1"/>
+            <w:tcBorders>
+              <w:top w:val="single" w:color="000000" w:sz="4"/>
+              <w:left w:val="single" w:color="000000" w:sz="4"/>
+              <w:bottom w:val="single" w:color="000000" w:sz="4"/>
+              <w:right w:val="single" w:color="000000" w:sz="4"/>
+            </w:tcBorders>
+            <w:shd w:fill="2E6DB4" w:val="clear"/>
+            <w:vAlign w:val="center"/>
+          </w:tcPr>
+          <w:p>
+            <w:pPr>
+              <w:spacing w:after="40" w:before="40"/>
+              <w:jc w:val="center"/>
+            </w:pPr>
+            <w:r>
+              <w:rPr>
+                <w:rFonts w:ascii="Arial" w:cs="Arial" w:eastAsia="Arial" w:hAnsi="Arial"/>
+                <w:b/>
+                <w:bCs/>
+                <w:color w:val="FFFFFF"/>
+                <w:sz w:val="15"/>
+                <w:szCs w:val="15"/>
+              </w:rPr>
+              <w:t xml:space="preserve">CERT.
+ALTO RIESGO</w:t>
+            </w:r>
+          </w:p>
+        </w:tc>
+        <w:tc>
+          <w:tcPr>
+            <w:tcW w:type="dxa" w:w="2720"/>
+            <w:gridSpan w:val="1"/>
+            <w:tcBorders>
+              <w:top w:val="single" w:color="000000" w:sz="4"/>
+              <w:left w:val="single" w:color="000000" w:sz="4"/>
+              <w:bottom w:val="single" w:color="000000" w:sz="4"/>
+              <w:right w:val="single" w:color="000000" w:sz="4"/>
+            </w:tcBorders>
+            <w:shd w:fill="2E6DB4" w:val="clear"/>
+            <w:vAlign w:val="center"/>
+          </w:tcPr>
+          <w:p>
+            <w:pPr>
+              <w:spacing w:after="40" w:before="40"/>
+              <w:jc w:val="center"/>
+            </w:pPr>
+            <w:r>
+              <w:rPr>
+                <w:rFonts w:ascii="Arial" w:cs="Arial" w:eastAsia="Arial" w:hAnsi="Arial"/>
+                <w:b/>
+                <w:bCs/>
+                <w:color w:val="FFFFFF"/>
+                <w:sz w:val="16"/>
+                <w:szCs w:val="16"/>
+              </w:rPr>
+              <w:t xml:space="preserve">FIRMA DEL TRABAJADOR</w:t>
+            </w:r>
+          </w:p>
+        </w:tc>
+      </w:tr>
+      <w:tr>
+        <w:trPr>
+          <w:trHeight w:val="360" w:hRule="exact"/>
+        </w:trPr>
+        <w:tc>
+          <w:tcPr>
+            <w:tcW w:type="dxa" w:w="460"/>
+            <w:gridSpan w:val="1"/>
+            <w:tcBorders>
+              <w:top w:val="single" w:color="000000" w:sz="4"/>
+              <w:left w:val="single" w:color="000000" w:sz="4"/>
+              <w:bottom w:val="single" w:color="000000" w:sz="4"/>
+              <w:right w:val="single" w:color="000000" w:sz="4"/>
+            </w:tcBorders>
+            <w:shd w:fill="EBF5FB" w:val="clear"/>
+            <w:vAlign w:val="center"/>
+          </w:tcPr>
+          <w:p>
+            <w:pPr>
+              <w:spacing w:after="30" w:before="30"/>
+              <w:jc w:val="center"/>
+            </w:pPr>
+            <w:r>
+              <w:rPr>
+                <w:rFonts w:ascii="Arial" w:cs="Arial" w:eastAsia="Arial" w:hAnsi="Arial"/>
+                <w:color w:val="000000"/>
+                <w:sz w:val="16"/>
+                <w:szCs w:val="16"/>
+              </w:rPr>
+              <w:t xml:space="preserve">1</w:t>
+            </w:r>
+          </w:p>
+        </w:tc>
+        <w:tc>
+          <w:tcPr>
+            <w:tcW w:type="dxa" w:w="2200"/>
+            <w:gridSpan w:val="1"/>
+            <w:tcBorders>
+              <w:top w:val="single" w:color="000000" w:sz="4"/>
+              <w:left w:val="single" w:color="000000" w:sz="4"/>
+              <w:bottom w:val="single" w:color="000000" w:sz="4"/>
+              <w:right w:val="single" w:color="000000" w:sz="4"/>
+            </w:tcBorders>
+            <w:shd w:fill="EBF5FB" w:val="clear"/>
+            <w:vAlign w:val="center"/>
+          </w:tcPr>
+          <w:p>
+            <w:pPr>
+              <w:spacing w:after="50" w:before="50"/>
+              <w:jc w:val="left"/>
+            </w:pPr>
+            <w:r>
+              <w:rPr>
+                <w:rFonts w:ascii="Arial" w:cs="Arial" w:eastAsia="Arial" w:hAnsi="Arial"/>
+                <w:color w:val="000000"/>
+                <w:sz w:val="18"/>
+                <w:szCs w:val="18"/>
+              </w:rPr>
+              <w:t xml:space="preserve"/>
+            </w:r>
+          </w:p>
+        </w:tc>
+        <w:tc>
+          <w:tcPr>
+            <w:tcW w:type="dxa" w:w="1000"/>
+            <w:gridSpan w:val="1"/>
+            <w:tcBorders>
+              <w:top w:val="single" w:color="000000" w:sz="4"/>
+              <w:left w:val="single" w:color="000000" w:sz="4"/>
+              <w:bottom w:val="single" w:color="000000" w:sz="4"/>
+              <w:right w:val="single" w:color="000000" w:sz="4"/>
+            </w:tcBorders>
+            <w:shd w:fill="EBF5FB" w:val="clear"/>
+            <w:vAlign w:val="center"/>
+          </w:tcPr>
+          <w:p>
+            <w:pPr>
+              <w:spacing w:after="50" w:before="50"/>
+              <w:jc w:val="left"/>
+            </w:pPr>
+            <w:r>
+              <w:rPr>
+                <w:rFonts w:ascii="Arial" w:cs="Arial" w:eastAsia="Arial" w:hAnsi="Arial"/>
+                <w:color w:val="000000"/>
+                <w:sz w:val="18"/>
+                <w:szCs w:val="18"/>
+              </w:rPr>
+              <w:t xml:space="preserve"/>
+            </w:r>
+          </w:p>
+        </w:tc>
+        <w:tc>
+          <w:tcPr>
+            <w:tcW w:type="dxa" w:w="1300"/>
+            <w:gridSpan w:val="1"/>
+            <w:tcBorders>
+              <w:top w:val="single" w:color="000000" w:sz="4"/>
+              <w:left w:val="single" w:color="000000" w:sz="4"/>
+              <w:bottom w:val="single" w:color="000000" w:sz="4"/>
+              <w:right w:val="single" w:color="000000" w:sz="4"/>
+            </w:tcBorders>
+            <w:shd w:fill="EBF5FB" w:val="clear"/>
+            <w:vAlign w:val="center"/>
+          </w:tcPr>
+          <w:p>
+            <w:pPr>
+              <w:spacing w:after="50" w:before="50"/>
+              <w:jc w:val="left"/>
+            </w:pPr>
+            <w:r>
+              <w:rPr>
+                <w:rFonts w:ascii="Arial" w:cs="Arial" w:eastAsia="Arial" w:hAnsi="Arial"/>
+                <w:color w:val="000000"/>
+                <w:sz w:val="18"/>
+                <w:szCs w:val="18"/>
+              </w:rPr>
+              <w:t xml:space="preserve"/>
+            </w:r>
+          </w:p>
+        </w:tc>
+        <w:tc>
+          <w:tcPr>
+            <w:tcW w:type="dxa" w:w="780"/>
+            <w:gridSpan w:val="1"/>
+            <w:tcBorders>
+              <w:top w:val="single" w:color="000000" w:sz="4"/>
+              <w:left w:val="single" w:color="000000" w:sz="4"/>
+              <w:bottom w:val="single" w:color="000000" w:sz="4"/>
+              <w:right w:val="single" w:color="000000" w:sz="4"/>
+            </w:tcBorders>
+            <w:shd w:fill="EBF5FB" w:val="clear"/>
+            <w:vAlign w:val="center"/>
+          </w:tcPr>
+          <w:p>
+            <w:pPr>
+              <w:spacing w:after="50" w:before="50"/>
+              <w:jc w:val="left"/>
+            </w:pPr>
+            <w:r>
+              <w:rPr>
+                <w:rFonts w:ascii="Arial" w:cs="Arial" w:eastAsia="Arial" w:hAnsi="Arial"/>
+                <w:color w:val="000000"/>
+                <w:sz w:val="18"/>
+                <w:szCs w:val="18"/>
+              </w:rPr>
+              <w:t xml:space="preserve"/>
+            </w:r>
+          </w:p>
+        </w:tc>
+        <w:tc>
+          <w:tcPr>
+            <w:tcW w:type="dxa" w:w="780"/>
+            <w:gridSpan w:val="1"/>
+            <w:tcBorders>
+              <w:top w:val="single" w:color="000000" w:sz="4"/>
+              <w:left w:val="single" w:color="000000" w:sz="4"/>
+              <w:bottom w:val="single" w:color="000000" w:sz="4"/>
+              <w:right w:val="single" w:color="000000" w:sz="4"/>
+            </w:tcBorders>
+            <w:shd w:fill="EBF5FB" w:val="clear"/>
+            <w:vAlign w:val="center"/>
+          </w:tcPr>
+          <w:p>
+            <w:pPr>
+              <w:spacing w:after="50" w:before="50"/>
+              <w:jc w:val="left"/>
+            </w:pPr>
+            <w:r>
+              <w:rPr>
+                <w:rFonts w:ascii="Arial" w:cs="Arial" w:eastAsia="Arial" w:hAnsi="Arial"/>
+                <w:color w:val="000000"/>
+                <w:sz w:val="18"/>
+                <w:szCs w:val="18"/>
+              </w:rPr>
+              <w:t xml:space="preserve"/>
+            </w:r>
+          </w:p>
+        </w:tc>
+        <w:tc>
+          <w:tcPr>
+            <w:tcW w:type="dxa" w:w="780"/>
+            <w:gridSpan w:val="1"/>
+            <w:tcBorders>
+              <w:top w:val="single" w:color="000000" w:sz="4"/>
+              <w:left w:val="single" w:color="000000" w:sz="4"/>
+              <w:bottom w:val="single" w:color="000000" w:sz="4"/>
+              <w:right w:val="single" w:color="000000" w:sz="4"/>
+            </w:tcBorders>
+            <w:shd w:fill="EBF5FB" w:val="clear"/>
+            <w:vAlign w:val="center"/>
+          </w:tcPr>
+          <w:p>
+            <w:pPr>
+              <w:spacing w:after="50" w:before="50"/>
+              <w:jc w:val="left"/>
+            </w:pPr>
+            <w:r>
+              <w:rPr>
+                <w:rFonts w:ascii="Arial" w:cs="Arial" w:eastAsia="Arial" w:hAnsi="Arial"/>
+                <w:color w:val="000000"/>
+                <w:sz w:val="18"/>
+                <w:szCs w:val="18"/>
+              </w:rPr>
+              <w:t xml:space="preserve"/>
+            </w:r>
+          </w:p>
+        </w:tc>
+        <w:tc>
+          <w:tcPr>
+            <w:tcW w:type="dxa" w:w="780"/>
+            <w:gridSpan w:val="1"/>
+            <w:tcBorders>
+              <w:top w:val="single" w:color="000000" w:sz="4"/>
+              <w:left w:val="single" w:color="000000" w:sz="4"/>
+              <w:bottom w:val="single" w:color="000000" w:sz="4"/>
+              <w:right w:val="single" w:color="000000" w:sz="4"/>
+            </w:tcBorders>
+            <w:shd w:fill="EBF5FB" w:val="clear"/>
+            <w:vAlign w:val="center"/>
+          </w:tcPr>
+          <w:p>
+            <w:pPr>
+              <w:spacing w:after="50" w:before="50"/>
+              <w:jc w:val="left"/>
+            </w:pPr>
+            <w:r>
+              <w:rPr>
+                <w:rFonts w:ascii="Arial" w:cs="Arial" w:eastAsia="Arial" w:hAnsi="Arial"/>
+                <w:color w:val="000000"/>
+                <w:sz w:val="18"/>
+                <w:szCs w:val="18"/>
+              </w:rPr>
+              <w:t xml:space="preserve"/>
+            </w:r>
+          </w:p>
+        </w:tc>
+        <w:tc>
+          <w:tcPr>
+            <w:tcW w:type="dxa" w:w="2720"/>
+            <w:gridSpan w:val="1"/>
+            <w:tcBorders>
+              <w:top w:val="single" w:color="000000" w:sz="4"/>
+              <w:left w:val="single" w:color="000000" w:sz="4"/>
+              <w:bottom w:val="single" w:color="000000" w:sz="4"/>
+              <w:right w:val="single" w:color="000000" w:sz="4"/>
+            </w:tcBorders>
+            <w:shd w:fill="EBF5FB" w:val="clear"/>
+            <w:vAlign w:val="center"/>
+          </w:tcPr>
+          <w:p>
+            <w:pPr>
+              <w:spacing w:after="50" w:before="50"/>
+              <w:jc w:val="left"/>
+            </w:pPr>
+            <w:r>
+              <w:rPr>
+                <w:rFonts w:ascii="Arial" w:cs="Arial" w:eastAsia="Arial" w:hAnsi="Arial"/>
+                <w:color w:val="000000"/>
+                <w:sz w:val="18"/>
+                <w:szCs w:val="18"/>
+              </w:rPr>
+              <w:t xml:space="preserve"/>
+            </w:r>
+          </w:p>
+        </w:tc>
+      </w:tr>
+      <w:tr>
+        <w:trPr>
+          <w:trHeight w:val="360" w:hRule="exact"/>
+        </w:trPr>
+        <w:tc>
+          <w:tcPr>
+            <w:tcW w:type="dxa" w:w="460"/>
+            <w:gridSpan w:val="1"/>
+            <w:tcBorders>
+              <w:top w:val="single" w:color="000000" w:sz="4"/>
+              <w:left w:val="single" w:color="000000" w:sz="4"/>
+              <w:bottom w:val="single" w:color="000000" w:sz="4"/>
+              <w:right w:val="single" w:color="000000" w:sz="4"/>
+            </w:tcBorders>
+            <w:vAlign w:val="center"/>
+          </w:tcPr>
+          <w:p>
+            <w:pPr>
+              <w:spacing w:after="30" w:before="30"/>
+              <w:jc w:val="center"/>
+            </w:pPr>
+            <w:r>
+              <w:rPr>
+                <w:rFonts w:ascii="Arial" w:cs="Arial" w:eastAsia="Arial" w:hAnsi="Arial"/>
+                <w:color w:val="000000"/>
+                <w:sz w:val="16"/>
+                <w:szCs w:val="16"/>
+              </w:rPr>
+              <w:t xml:space="preserve">2</w:t>
+            </w:r>
+          </w:p>
+        </w:tc>
+        <w:tc>
+          <w:tcPr>
+            <w:tcW w:type="dxa" w:w="2200"/>
+            <w:gridSpan w:val="1"/>
+            <w:tcBorders>
+              <w:top w:val="single" w:color="000000" w:sz="4"/>
+              <w:left w:val="single" w:color="000000" w:sz="4"/>
+              <w:bottom w:val="single" w:color="000000" w:sz="4"/>
+              <w:right w:val="single" w:color="000000" w:sz="4"/>
+            </w:tcBorders>
+            <w:vAlign w:val="center"/>
+          </w:tcPr>
+          <w:p>
+            <w:pPr>
+              <w:spacing w:after="50" w:before="50"/>
+              <w:jc w:val="left"/>
+            </w:pPr>
+            <w:r>
+              <w:rPr>
+                <w:rFonts w:ascii="Arial" w:cs="Arial" w:eastAsia="Arial" w:hAnsi="Arial"/>
+                <w:color w:val="000000"/>
+                <w:sz w:val="18"/>
+                <w:szCs w:val="18"/>
+              </w:rPr>
+              <w:t xml:space="preserve"/>
+            </w:r>
+          </w:p>
+        </w:tc>
+        <w:tc>
+          <w:tcPr>
+            <w:tcW w:type="dxa" w:w="1000"/>
+            <w:gridSpan w:val="1"/>
+            <w:tcBorders>
+              <w:top w:val="single" w:color="000000" w:sz="4"/>
+              <w:left w:val="single" w:color="000000" w:sz="4"/>
+              <w:bottom w:val="single" w:color="000000" w:sz="4"/>
+              <w:right w:val="single" w:color="000000" w:sz="4"/>
+            </w:tcBorders>
+            <w:vAlign w:val="center"/>
+          </w:tcPr>
+          <w:p>
+            <w:pPr>
+              <w:spacing w:after="50" w:before="50"/>
+              <w:jc w:val="left"/>
+            </w:pPr>
+            <w:r>
+              <w:rPr>
+                <w:rFonts w:ascii="Arial" w:cs="Arial" w:eastAsia="Arial" w:hAnsi="Arial"/>
+                <w:color w:val="000000"/>
+                <w:sz w:val="18"/>
+                <w:szCs w:val="18"/>
+              </w:rPr>
+              <w:t xml:space="preserve"/>
+            </w:r>
+          </w:p>
+        </w:tc>
+        <w:tc>
+          <w:tcPr>
+            <w:tcW w:type="dxa" w:w="1300"/>
+            <w:gridSpan w:val="1"/>
+            <w:tcBorders>
+              <w:top w:val="single" w:color="000000" w:sz="4"/>
+              <w:left w:val="single" w:color="000000" w:sz="4"/>
+              <w:bottom w:val="single" w:color="000000" w:sz="4"/>
+              <w:right w:val="single" w:color="000000" w:sz="4"/>
+            </w:tcBorders>
+            <w:vAlign w:val="center"/>
+          </w:tcPr>
+          <w:p>
+            <w:pPr>
+              <w:spacing w:after="50" w:before="50"/>
+              <w:jc w:val="left"/>
+            </w:pPr>
+            <w:r>
+              <w:rPr>
+                <w:rFonts w:ascii="Arial" w:cs="Arial" w:eastAsia="Arial" w:hAnsi="Arial"/>
+                <w:color w:val="000000"/>
+                <w:sz w:val="18"/>
+                <w:szCs w:val="18"/>
+              </w:rPr>
+              <w:t xml:space="preserve"/>
+            </w:r>
+          </w:p>
+        </w:tc>
+        <w:tc>
+          <w:tcPr>
+            <w:tcW w:type="dxa" w:w="780"/>
+            <w:gridSpan w:val="1"/>
+            <w:tcBorders>
+              <w:top w:val="single" w:color="000000" w:sz="4"/>
+              <w:left w:val="single" w:color="000000" w:sz="4"/>
+              <w:bottom w:val="single" w:color="000000" w:sz="4"/>
+              <w:right w:val="single" w:color="000000" w:sz="4"/>
+            </w:tcBorders>
+            <w:vAlign w:val="center"/>
+          </w:tcPr>
+          <w:p>
+            <w:pPr>
+              <w:spacing w:after="50" w:before="50"/>
+              <w:jc w:val="left"/>
+            </w:pPr>
+            <w:r>
+              <w:rPr>
+                <w:rFonts w:ascii="Arial" w:cs="Arial" w:eastAsia="Arial" w:hAnsi="Arial"/>
+                <w:color w:val="000000"/>
+                <w:sz w:val="18"/>
+                <w:szCs w:val="18"/>
+              </w:rPr>
+              <w:t xml:space="preserve"/>
+            </w:r>
+          </w:p>
+        </w:tc>
+        <w:tc>
+          <w:tcPr>
+            <w:tcW w:type="dxa" w:w="780"/>
+            <w:gridSpan w:val="1"/>
+            <w:tcBorders>
+              <w:top w:val="single" w:color="000000" w:sz="4"/>
+              <w:left w:val="single" w:color="000000" w:sz="4"/>
+              <w:bottom w:val="single" w:color="000000" w:sz="4"/>
+              <w:right w:val="single" w:color="000000" w:sz="4"/>
+            </w:tcBorders>
+            <w:vAlign w:val="center"/>
+          </w:tcPr>
+          <w:p>
+            <w:pPr>
+              <w:spacing w:after="50" w:before="50"/>
+              <w:jc w:val="left"/>
+            </w:pPr>
+            <w:r>
+              <w:rPr>
+                <w:rFonts w:ascii="Arial" w:cs="Arial" w:eastAsia="Arial" w:hAnsi="Arial"/>
+                <w:color w:val="000000"/>
+                <w:sz w:val="18"/>
+                <w:szCs w:val="18"/>
+              </w:rPr>
+              <w:t xml:space="preserve"/>
+            </w:r>
+          </w:p>
+        </w:tc>
+        <w:tc>
+          <w:tcPr>
+            <w:tcW w:type="dxa" w:w="780"/>
+            <w:gridSpan w:val="1"/>
+            <w:tcBorders>
+              <w:top w:val="single" w:color="000000" w:sz="4"/>
+              <w:left w:val="single" w:color="000000" w:sz="4"/>
+              <w:bottom w:val="single" w:color="000000" w:sz="4"/>
+              <w:right w:val="single" w:color="000000" w:sz="4"/>
+            </w:tcBorders>
+            <w:vAlign w:val="center"/>
+          </w:tcPr>
+          <w:p>
+            <w:pPr>
+              <w:spacing w:after="50" w:before="50"/>
+              <w:jc w:val="left"/>
+            </w:pPr>
+            <w:r>
+              <w:rPr>
+                <w:rFonts w:ascii="Arial" w:cs="Arial" w:eastAsia="Arial" w:hAnsi="Arial"/>
+                <w:color w:val="000000"/>
+                <w:sz w:val="18"/>
+                <w:szCs w:val="18"/>
+              </w:rPr>
+              <w:t xml:space="preserve"/>
+            </w:r>
+          </w:p>
+        </w:tc>
+        <w:tc>
+          <w:tcPr>
+            <w:tcW w:type="dxa" w:w="780"/>
+            <w:gridSpan w:val="1"/>
+            <w:tcBorders>
+              <w:top w:val="single" w:color="000000" w:sz="4"/>
+              <w:left w:val="single" w:color="000000" w:sz="4"/>
+              <w:bottom w:val="single" w:color="000000" w:sz="4"/>
+              <w:right w:val="single" w:color="000000" w:sz="4"/>
+            </w:tcBorders>
+            <w:vAlign w:val="center"/>
+          </w:tcPr>
+          <w:p>
+            <w:pPr>
+              <w:spacing w:after="50" w:before="50"/>
+              <w:jc w:val="left"/>
+            </w:pPr>
+            <w:r>
+              <w:rPr>
+                <w:rFonts w:ascii="Arial" w:cs="Arial" w:eastAsia="Arial" w:hAnsi="Arial"/>
+                <w:color w:val="000000"/>
+                <w:sz w:val="18"/>
+                <w:szCs w:val="18"/>
+              </w:rPr>
+              <w:t xml:space="preserve"/>
+            </w:r>
+          </w:p>
+        </w:tc>
+        <w:tc>
+          <w:tcPr>
+            <w:tcW w:type="dxa" w:w="2720"/>
+            <w:gridSpan w:val="1"/>
+            <w:tcBorders>
+              <w:top w:val="single" w:color="000000" w:sz="4"/>
+              <w:left w:val="single" w:color="000000" w:sz="4"/>
+              <w:bottom w:val="single" w:color="000000" w:sz="4"/>
+              <w:right w:val="single" w:color="000000" w:sz="4"/>
+            </w:tcBorders>
+            <w:vAlign w:val="center"/>
+          </w:tcPr>
+          <w:p>
+            <w:pPr>
+              <w:spacing w:after="50" w:before="50"/>
+              <w:jc w:val="left"/>
+            </w:pPr>
+            <w:r>
+              <w:rPr>
+                <w:rFonts w:ascii="Arial" w:cs="Arial" w:eastAsia="Arial" w:hAnsi="Arial"/>
+                <w:color w:val="000000"/>
+                <w:sz w:val="18"/>
+                <w:szCs w:val="18"/>
+              </w:rPr>
+              <w:t xml:space="preserve"/>
+            </w:r>
+          </w:p>
+        </w:tc>
+      </w:tr>
+      <w:tr>
+        <w:trPr>
+          <w:trHeight w:val="360" w:hRule="exact"/>
+        </w:trPr>
+        <w:tc>
+          <w:tcPr>
+            <w:tcW w:type="dxa" w:w="460"/>
+            <w:gridSpan w:val="1"/>
+            <w:tcBorders>
+              <w:top w:val="single" w:color="000000" w:sz="4"/>
+              <w:left w:val="single" w:color="000000" w:sz="4"/>
+              <w:bottom w:val="single" w:color="000000" w:sz="4"/>
+              <w:right w:val="single" w:color="000000" w:sz="4"/>
+            </w:tcBorders>
+            <w:shd w:fill="EBF5FB" w:val="clear"/>
+            <w:vAlign w:val="center"/>
+          </w:tcPr>
+          <w:p>
+            <w:pPr>
+              <w:spacing w:after="30" w:before="30"/>
+              <w:jc w:val="center"/>
+            </w:pPr>
+            <w:r>
+              <w:rPr>
+                <w:rFonts w:ascii="Arial" w:cs="Arial" w:eastAsia="Arial" w:hAnsi="Arial"/>
+                <w:color w:val="000000"/>
+                <w:sz w:val="16"/>
+                <w:szCs w:val="16"/>
+              </w:rPr>
+              <w:t xml:space="preserve">3</w:t>
+            </w:r>
+          </w:p>
+        </w:tc>
+        <w:tc>
+          <w:tcPr>
+            <w:tcW w:type="dxa" w:w="2200"/>
+            <w:gridSpan w:val="1"/>
+            <w:tcBorders>
+              <w:top w:val="single" w:color="000000" w:sz="4"/>
+              <w:left w:val="single" w:color="000000" w:sz="4"/>
+              <w:bottom w:val="single" w:color="000000" w:sz="4"/>
+              <w:right w:val="single" w:color="000000" w:sz="4"/>
+            </w:tcBorders>
+            <w:shd w:fill="EBF5FB" w:val="clear"/>
+            <w:vAlign w:val="center"/>
+          </w:tcPr>
+          <w:p>
+            <w:pPr>
+              <w:spacing w:after="50" w:before="50"/>
+              <w:jc w:val="left"/>
+            </w:pPr>
+            <w:r>
+              <w:rPr>
+                <w:rFonts w:ascii="Arial" w:cs="Arial" w:eastAsia="Arial" w:hAnsi="Arial"/>
+                <w:color w:val="000000"/>
+                <w:sz w:val="18"/>
+                <w:szCs w:val="18"/>
+              </w:rPr>
+              <w:t xml:space="preserve"/>
+            </w:r>
+          </w:p>
+        </w:tc>
+        <w:tc>
+          <w:tcPr>
+            <w:tcW w:type="dxa" w:w="1000"/>
+            <w:gridSpan w:val="1"/>
+            <w:tcBorders>
+              <w:top w:val="single" w:color="000000" w:sz="4"/>
+              <w:left w:val="single" w:color="000000" w:sz="4"/>
+              <w:bottom w:val="single" w:color="000000" w:sz="4"/>
+              <w:right w:val="single" w:color="000000" w:sz="4"/>
+            </w:tcBorders>
+            <w:shd w:fill="EBF5FB" w:val="clear"/>
+            <w:vAlign w:val="center"/>
+          </w:tcPr>
+          <w:p>
+            <w:pPr>
+              <w:spacing w:after="50" w:before="50"/>
+              <w:jc w:val="left"/>
+            </w:pPr>
+            <w:r>
+              <w:rPr>
+                <w:rFonts w:ascii="Arial" w:cs="Arial" w:eastAsia="Arial" w:hAnsi="Arial"/>
+                <w:color w:val="000000"/>
+                <w:sz w:val="18"/>
+                <w:szCs w:val="18"/>
+              </w:rPr>
+              <w:t xml:space="preserve"/>
+            </w:r>
+          </w:p>
+        </w:tc>
+        <w:tc>
+          <w:tcPr>
+            <w:tcW w:type="dxa" w:w="1300"/>
+            <w:gridSpan w:val="1"/>
+            <w:tcBorders>
+              <w:top w:val="single" w:color="000000" w:sz="4"/>
+              <w:left w:val="single" w:color="000000" w:sz="4"/>
+              <w:bottom w:val="single" w:color="000000" w:sz="4"/>
+              <w:right w:val="single" w:color="000000" w:sz="4"/>
+            </w:tcBorders>
+            <w:shd w:fill="EBF5FB" w:val="clear"/>
+            <w:vAlign w:val="center"/>
+          </w:tcPr>
+          <w:p>
+            <w:pPr>
+              <w:spacing w:after="50" w:before="50"/>
+              <w:jc w:val="left"/>
+            </w:pPr>
+            <w:r>
+              <w:rPr>
+                <w:rFonts w:ascii="Arial" w:cs="Arial" w:eastAsia="Arial" w:hAnsi="Arial"/>
+                <w:color w:val="000000"/>
+                <w:sz w:val="18"/>
+                <w:szCs w:val="18"/>
+              </w:rPr>
+              <w:t xml:space="preserve"/>
+            </w:r>
+          </w:p>
+        </w:tc>
+        <w:tc>
+          <w:tcPr>
+            <w:tcW w:type="dxa" w:w="780"/>
+            <w:gridSpan w:val="1"/>
+            <w:tcBorders>
+              <w:top w:val="single" w:color="000000" w:sz="4"/>
+              <w:left w:val="single" w:color="000000" w:sz="4"/>
+              <w:bottom w:val="single" w:color="000000" w:sz="4"/>
+              <w:right w:val="single" w:color="000000" w:sz="4"/>
+            </w:tcBorders>
+            <w:shd w:fill="EBF5FB" w:val="clear"/>
+            <w:vAlign w:val="center"/>
+          </w:tcPr>
+          <w:p>
+            <w:pPr>
+              <w:spacing w:after="50" w:before="50"/>
+              <w:jc w:val="left"/>
+            </w:pPr>
+            <w:r>
+              <w:rPr>
+                <w:rFonts w:ascii="Arial" w:cs="Arial" w:eastAsia="Arial" w:hAnsi="Arial"/>
+                <w:color w:val="000000"/>
+                <w:sz w:val="18"/>
+                <w:szCs w:val="18"/>
+              </w:rPr>
+              <w:t xml:space="preserve"/>
+            </w:r>
+          </w:p>
+        </w:tc>
+        <w:tc>
+          <w:tcPr>
+            <w:tcW w:type="dxa" w:w="780"/>
+            <w:gridSpan w:val="1"/>
+            <w:tcBorders>
+              <w:top w:val="single" w:color="000000" w:sz="4"/>
+              <w:left w:val="single" w:color="000000" w:sz="4"/>
+              <w:bottom w:val="single" w:color="000000" w:sz="4"/>
+              <w:right w:val="single" w:color="000000" w:sz="4"/>
+            </w:tcBorders>
+            <w:shd w:fill="EBF5FB" w:val="clear"/>
+            <w:vAlign w:val="center"/>
+          </w:tcPr>
+          <w:p>
+            <w:pPr>
+              <w:spacing w:after="50" w:before="50"/>
+              <w:jc w:val="left"/>
+            </w:pPr>
+            <w:r>
+              <w:rPr>
+                <w:rFonts w:ascii="Arial" w:cs="Arial" w:eastAsia="Arial" w:hAnsi="Arial"/>
+                <w:color w:val="000000"/>
+                <w:sz w:val="18"/>
+                <w:szCs w:val="18"/>
+              </w:rPr>
+              <w:t xml:space="preserve"/>
+            </w:r>
+          </w:p>
+        </w:tc>
+        <w:tc>
+          <w:tcPr>
+            <w:tcW w:type="dxa" w:w="780"/>
+            <w:gridSpan w:val="1"/>
+            <w:tcBorders>
+              <w:top w:val="single" w:color="000000" w:sz="4"/>
+              <w:left w:val="single" w:color="000000" w:sz="4"/>
+              <w:bottom w:val="single" w:color="000000" w:sz="4"/>
+              <w:right w:val="single" w:color="000000" w:sz="4"/>
+            </w:tcBorders>
+            <w:shd w:fill="EBF5FB" w:val="clear"/>
+            <w:vAlign w:val="center"/>
+          </w:tcPr>
+          <w:p>
+            <w:pPr>
+              <w:spacing w:after="50" w:before="50"/>
+              <w:jc w:val="left"/>
+            </w:pPr>
+            <w:r>
+              <w:rPr>
+                <w:rFonts w:ascii="Arial" w:cs="Arial" w:eastAsia="Arial" w:hAnsi="Arial"/>
+                <w:color w:val="000000"/>
+                <w:sz w:val="18"/>
+                <w:szCs w:val="18"/>
+              </w:rPr>
+              <w:t xml:space="preserve"/>
+            </w:r>
+          </w:p>
+        </w:tc>
+        <w:tc>
+          <w:tcPr>
+            <w:tcW w:type="dxa" w:w="780"/>
+            <w:gridSpan w:val="1"/>
+            <w:tcBorders>
+              <w:top w:val="single" w:color="000000" w:sz="4"/>
+              <w:left w:val="single" w:color="000000" w:sz="4"/>
+              <w:bottom w:val="single" w:color="000000" w:sz="4"/>
+              <w:right w:val="single" w:color="000000" w:sz="4"/>
+            </w:tcBorders>
+            <w:shd w:fill="EBF5FB" w:val="clear"/>
+            <w:vAlign w:val="center"/>
+          </w:tcPr>
+          <w:p>
+            <w:pPr>
+              <w:spacing w:after="50" w:before="50"/>
+              <w:jc w:val="left"/>
+            </w:pPr>
+            <w:r>
+              <w:rPr>
+                <w:rFonts w:ascii="Arial" w:cs="Arial" w:eastAsia="Arial" w:hAnsi="Arial"/>
+                <w:color w:val="000000"/>
+                <w:sz w:val="18"/>
+                <w:szCs w:val="18"/>
+              </w:rPr>
+              <w:t xml:space="preserve"/>
+            </w:r>
+          </w:p>
+        </w:tc>
+        <w:tc>
+          <w:tcPr>
+            <w:tcW w:type="dxa" w:w="2720"/>
+            <w:gridSpan w:val="1"/>
+            <w:tcBorders>
+              <w:top w:val="single" w:color="000000" w:sz="4"/>
+              <w:left w:val="single" w:color="000000" w:sz="4"/>
+              <w:bottom w:val="single" w:color="000000" w:sz="4"/>
+              <w:right w:val="single" w:color="000000" w:sz="4"/>
+            </w:tcBorders>
+            <w:shd w:fill="EBF5FB" w:val="clear"/>
+            <w:vAlign w:val="center"/>
+          </w:tcPr>
+          <w:p>
+            <w:pPr>
+              <w:spacing w:after="50" w:before="50"/>
+              <w:jc w:val="left"/>
+            </w:pPr>
+            <w:r>
+              <w:rPr>
+                <w:rFonts w:ascii="Arial" w:cs="Arial" w:eastAsia="Arial" w:hAnsi="Arial"/>
+                <w:color w:val="000000"/>
+                <w:sz w:val="18"/>
+                <w:szCs w:val="18"/>
+              </w:rPr>
+              <w:t xml:space="preserve"/>
+            </w:r>
+          </w:p>
+        </w:tc>
+      </w:tr>
+      <w:tr>
+        <w:trPr>
+          <w:trHeight w:val="360" w:hRule="exact"/>
+        </w:trPr>
+        <w:tc>
+          <w:tcPr>
+            <w:tcW w:type="dxa" w:w="460"/>
+            <w:gridSpan w:val="1"/>
+            <w:tcBorders>
+              <w:top w:val="single" w:color="000000" w:sz="4"/>
+              <w:left w:val="single" w:color="000000" w:sz="4"/>
+              <w:bottom w:val="single" w:color="000000" w:sz="4"/>
+              <w:right w:val="single" w:color="000000" w:sz="4"/>
+            </w:tcBorders>
+            <w:vAlign w:val="center"/>
+          </w:tcPr>
+          <w:p>
+            <w:pPr>
+              <w:spacing w:after="30" w:before="30"/>
+              <w:jc w:val="center"/>
+            </w:pPr>
+            <w:r>
+              <w:rPr>
+                <w:rFonts w:ascii="Arial" w:cs="Arial" w:eastAsia="Arial" w:hAnsi="Arial"/>
+                <w:color w:val="000000"/>
+                <w:sz w:val="16"/>
+                <w:szCs w:val="16"/>
+              </w:rPr>
+              <w:t xml:space="preserve">4</w:t>
+            </w:r>
+          </w:p>
+        </w:tc>
+        <w:tc>
+          <w:tcPr>
+            <w:tcW w:type="dxa" w:w="2200"/>
+            <w:gridSpan w:val="1"/>
+            <w:tcBorders>
+              <w:top w:val="single" w:color="000000" w:sz="4"/>
+              <w:left w:val="single" w:color="000000" w:sz="4"/>
+              <w:bottom w:val="single" w:color="000000" w:sz="4"/>
+              <w:right w:val="single" w:color="000000" w:sz="4"/>
+            </w:tcBorders>
+            <w:vAlign w:val="center"/>
+          </w:tcPr>
+          <w:p>
+            <w:pPr>
+              <w:spacing w:after="50" w:before="50"/>
+              <w:jc w:val="left"/>
+            </w:pPr>
+            <w:r>
+              <w:rPr>
+                <w:rFonts w:ascii="Arial" w:cs="Arial" w:eastAsia="Arial" w:hAnsi="Arial"/>
+                <w:color w:val="000000"/>
+                <w:sz w:val="18"/>
+                <w:szCs w:val="18"/>
+              </w:rPr>
+              <w:t xml:space="preserve"/>
+            </w:r>
+          </w:p>
+        </w:tc>
+        <w:tc>
+          <w:tcPr>
+            <w:tcW w:type="dxa" w:w="1000"/>
+            <w:gridSpan w:val="1"/>
+            <w:tcBorders>
+              <w:top w:val="single" w:color="000000" w:sz="4"/>
+              <w:left w:val="single" w:color="000000" w:sz="4"/>
+              <w:bottom w:val="single" w:color="000000" w:sz="4"/>
+              <w:right w:val="single" w:color="000000" w:sz="4"/>
+            </w:tcBorders>
+            <w:vAlign w:val="center"/>
+          </w:tcPr>
+          <w:p>
+            <w:pPr>
+              <w:spacing w:after="50" w:before="50"/>
+              <w:jc w:val="left"/>
+            </w:pPr>
+            <w:r>
+              <w:rPr>
+                <w:rFonts w:ascii="Arial" w:cs="Arial" w:eastAsia="Arial" w:hAnsi="Arial"/>
+                <w:color w:val="000000"/>
+                <w:sz w:val="18"/>
+                <w:szCs w:val="18"/>
+              </w:rPr>
+              <w:t xml:space="preserve"/>
+            </w:r>
+          </w:p>
+        </w:tc>
+        <w:tc>
+          <w:tcPr>
+            <w:tcW w:type="dxa" w:w="1300"/>
+            <w:gridSpan w:val="1"/>
+            <w:tcBorders>
+              <w:top w:val="single" w:color="000000" w:sz="4"/>
+              <w:left w:val="single" w:color="000000" w:sz="4"/>
+              <w:bottom w:val="single" w:color="000000" w:sz="4"/>
+              <w:right w:val="single" w:color="000000" w:sz="4"/>
+            </w:tcBorders>
+            <w:vAlign w:val="center"/>
+          </w:tcPr>
+          <w:p>
+            <w:pPr>
+              <w:spacing w:after="50" w:before="50"/>
+              <w:jc w:val="left"/>
+            </w:pPr>
+            <w:r>
+              <w:rPr>
+                <w:rFonts w:ascii="Arial" w:cs="Arial" w:eastAsia="Arial" w:hAnsi="Arial"/>
+                <w:color w:val="000000"/>
+                <w:sz w:val="18"/>
+                <w:szCs w:val="18"/>
+              </w:rPr>
+              <w:t xml:space="preserve"/>
+            </w:r>
+          </w:p>
+        </w:tc>
+        <w:tc>
+          <w:tcPr>
+            <w:tcW w:type="dxa" w:w="780"/>
+            <w:gridSpan w:val="1"/>
+            <w:tcBorders>
+              <w:top w:val="single" w:color="000000" w:sz="4"/>
+              <w:left w:val="single" w:color="000000" w:sz="4"/>
+              <w:bottom w:val="single" w:color="000000" w:sz="4"/>
+              <w:right w:val="single" w:color="000000" w:sz="4"/>
+            </w:tcBorders>
+            <w:vAlign w:val="center"/>
+          </w:tcPr>
+          <w:p>
+            <w:pPr>
+              <w:spacing w:after="50" w:before="50"/>
+              <w:jc w:val="left"/>
+            </w:pPr>
+            <w:r>
+              <w:rPr>
+                <w:rFonts w:ascii="Arial" w:cs="Arial" w:eastAsia="Arial" w:hAnsi="Arial"/>
+                <w:color w:val="000000"/>
+                <w:sz w:val="18"/>
+                <w:szCs w:val="18"/>
+              </w:rPr>
+              <w:t xml:space="preserve"/>
+            </w:r>
+          </w:p>
+        </w:tc>
+        <w:tc>
+          <w:tcPr>
+            <w:tcW w:type="dxa" w:w="780"/>
+            <w:gridSpan w:val="1"/>
+            <w:tcBorders>
+              <w:top w:val="single" w:color="000000" w:sz="4"/>
+              <w:left w:val="single" w:color="000000" w:sz="4"/>
+              <w:bottom w:val="single" w:color="000000" w:sz="4"/>
+              <w:right w:val="single" w:color="000000" w:sz="4"/>
+            </w:tcBorders>
+            <w:vAlign w:val="center"/>
+          </w:tcPr>
+          <w:p>
+            <w:pPr>
+              <w:spacing w:after="50" w:before="50"/>
+              <w:jc w:val="left"/>
+            </w:pPr>
+            <w:r>
+              <w:rPr>
+                <w:rFonts w:ascii="Arial" w:cs="Arial" w:eastAsia="Arial" w:hAnsi="Arial"/>
+                <w:color w:val="000000"/>
+                <w:sz w:val="18"/>
+                <w:szCs w:val="18"/>
+              </w:rPr>
+              <w:t xml:space="preserve"/>
+            </w:r>
+          </w:p>
+        </w:tc>
+        <w:tc>
+          <w:tcPr>
+            <w:tcW w:type="dxa" w:w="780"/>
+            <w:gridSpan w:val="1"/>
+            <w:tcBorders>
+              <w:top w:val="single" w:color="000000" w:sz="4"/>
+              <w:left w:val="single" w:color="000000" w:sz="4"/>
+              <w:bottom w:val="single" w:color="000000" w:sz="4"/>
+              <w:right w:val="single" w:color="000000" w:sz="4"/>
+            </w:tcBorders>
+            <w:vAlign w:val="center"/>
+          </w:tcPr>
+          <w:p>
+            <w:pPr>
+              <w:spacing w:after="50" w:before="50"/>
+              <w:jc w:val="left"/>
+            </w:pPr>
+            <w:r>
+              <w:rPr>
+                <w:rFonts w:ascii="Arial" w:cs="Arial" w:eastAsia="Arial" w:hAnsi="Arial"/>
+                <w:color w:val="000000"/>
+                <w:sz w:val="18"/>
+                <w:szCs w:val="18"/>
+              </w:rPr>
+              <w:t xml:space="preserve"/>
+            </w:r>
+          </w:p>
+        </w:tc>
+        <w:tc>
+          <w:tcPr>
+            <w:tcW w:type="dxa" w:w="780"/>
+            <w:gridSpan w:val="1"/>
+            <w:tcBorders>
+              <w:top w:val="single" w:color="000000" w:sz="4"/>
+              <w:left w:val="single" w:color="000000" w:sz="4"/>
+              <w:bottom w:val="single" w:color="000000" w:sz="4"/>
+              <w:right w:val="single" w:color="000000" w:sz="4"/>
+            </w:tcBorders>
+            <w:vAlign w:val="center"/>
+          </w:tcPr>
+          <w:p>
+            <w:pPr>
+              <w:spacing w:after="50" w:before="50"/>
+              <w:jc w:val="left"/>
+            </w:pPr>
+            <w:r>
+              <w:rPr>
+                <w:rFonts w:ascii="Arial" w:cs="Arial" w:eastAsia="Arial" w:hAnsi="Arial"/>
+                <w:color w:val="000000"/>
+                <w:sz w:val="18"/>
+                <w:szCs w:val="18"/>
+              </w:rPr>
+              <w:t xml:space="preserve"/>
+            </w:r>
+          </w:p>
+        </w:tc>
+        <w:tc>
+          <w:tcPr>
+            <w:tcW w:type="dxa" w:w="2720"/>
+            <w:gridSpan w:val="1"/>
+            <w:tcBorders>
+              <w:top w:val="single" w:color="000000" w:sz="4"/>
+              <w:left w:val="single" w:color="000000" w:sz="4"/>
+              <w:bottom w:val="single" w:color="000000" w:sz="4"/>
+              <w:right w:val="single" w:color="000000" w:sz="4"/>
+            </w:tcBorders>
+            <w:vAlign w:val="center"/>
+          </w:tcPr>
+          <w:p>
+            <w:pPr>
+              <w:spacing w:after="50" w:before="50"/>
+              <w:jc w:val="left"/>
+            </w:pPr>
+            <w:r>
+              <w:rPr>
+                <w:rFonts w:ascii="Arial" w:cs="Arial" w:eastAsia="Arial" w:hAnsi="Arial"/>
+                <w:color w:val="000000"/>
+                <w:sz w:val="18"/>
+                <w:szCs w:val="18"/>
+              </w:rPr>
+              <w:t xml:space="preserve"/>
+            </w:r>
+          </w:p>
+        </w:tc>
+      </w:tr>
+      <w:tr>
+        <w:trPr>
+          <w:trHeight w:val="360" w:hRule="exact"/>
+        </w:trPr>
+        <w:tc>
+          <w:tcPr>
+            <w:tcW w:type="dxa" w:w="460"/>
+            <w:gridSpan w:val="1"/>
+            <w:tcBorders>
+              <w:top w:val="single" w:color="000000" w:sz="4"/>
+              <w:left w:val="single" w:color="000000" w:sz="4"/>
+              <w:bottom w:val="single" w:color="000000" w:sz="4"/>
+              <w:right w:val="single" w:color="000000" w:sz="4"/>
+            </w:tcBorders>
+            <w:shd w:fill="EBF5FB" w:val="clear"/>
+            <w:vAlign w:val="center"/>
+          </w:tcPr>
+          <w:p>
+            <w:pPr>
+              <w:spacing w:after="30" w:before="30"/>
+              <w:jc w:val="center"/>
+            </w:pPr>
+            <w:r>
+              <w:rPr>
+                <w:rFonts w:ascii="Arial" w:cs="Arial" w:eastAsia="Arial" w:hAnsi="Arial"/>
+                <w:color w:val="000000"/>
+                <w:sz w:val="16"/>
+                <w:szCs w:val="16"/>
+              </w:rPr>
+              <w:t xml:space="preserve">5</w:t>
+            </w:r>
+          </w:p>
+        </w:tc>
+        <w:tc>
+          <w:tcPr>
+            <w:tcW w:type="dxa" w:w="2200"/>
+            <w:gridSpan w:val="1"/>
+            <w:tcBorders>
+              <w:top w:val="single" w:color="000000" w:sz="4"/>
+              <w:left w:val="single" w:color="000000" w:sz="4"/>
+              <w:bottom w:val="single" w:color="000000" w:sz="4"/>
+              <w:right w:val="single" w:color="000000" w:sz="4"/>
+            </w:tcBorders>
+            <w:shd w:fill="EBF5FB" w:val="clear"/>
+            <w:vAlign w:val="center"/>
+          </w:tcPr>
+          <w:p>
+            <w:pPr>
+              <w:spacing w:after="50" w:before="50"/>
+              <w:jc w:val="left"/>
+            </w:pPr>
+            <w:r>
+              <w:rPr>
+                <w:rFonts w:ascii="Arial" w:cs="Arial" w:eastAsia="Arial" w:hAnsi="Arial"/>
+                <w:color w:val="000000"/>
+                <w:sz w:val="18"/>
+                <w:szCs w:val="18"/>
+              </w:rPr>
+              <w:t xml:space="preserve"/>
+            </w:r>
+          </w:p>
+        </w:tc>
+        <w:tc>
+          <w:tcPr>
+            <w:tcW w:type="dxa" w:w="1000"/>
+            <w:gridSpan w:val="1"/>
+            <w:tcBorders>
+              <w:top w:val="single" w:color="000000" w:sz="4"/>
+              <w:left w:val="single" w:color="000000" w:sz="4"/>
+              <w:bottom w:val="single" w:color="000000" w:sz="4"/>
+              <w:right w:val="single" w:color="000000" w:sz="4"/>
+            </w:tcBorders>
+            <w:shd w:fill="EBF5FB" w:val="clear"/>
+            <w:vAlign w:val="center"/>
+          </w:tcPr>
+          <w:p>
+            <w:pPr>
+              <w:spacing w:after="50" w:before="50"/>
+              <w:jc w:val="left"/>
+            </w:pPr>
+            <w:r>
+              <w:rPr>
+                <w:rFonts w:ascii="Arial" w:cs="Arial" w:eastAsia="Arial" w:hAnsi="Arial"/>
+                <w:color w:val="000000"/>
+                <w:sz w:val="18"/>
+                <w:szCs w:val="18"/>
+              </w:rPr>
+              <w:t xml:space="preserve"/>
+            </w:r>
+          </w:p>
+        </w:tc>
+        <w:tc>
+          <w:tcPr>
+            <w:tcW w:type="dxa" w:w="1300"/>
+            <w:gridSpan w:val="1"/>
+            <w:tcBorders>
+              <w:top w:val="single" w:color="000000" w:sz="4"/>
+              <w:left w:val="single" w:color="000000" w:sz="4"/>
+              <w:bottom w:val="single" w:color="000000" w:sz="4"/>
+              <w:right w:val="single" w:color="000000" w:sz="4"/>
+            </w:tcBorders>
+            <w:shd w:fill="EBF5FB" w:val="clear"/>
+            <w:vAlign w:val="center"/>
+          </w:tcPr>
+          <w:p>
+            <w:pPr>
+              <w:spacing w:after="50" w:before="50"/>
+              <w:jc w:val="left"/>
+            </w:pPr>
+            <w:r>
+              <w:rPr>
+                <w:rFonts w:ascii="Arial" w:cs="Arial" w:eastAsia="Arial" w:hAnsi="Arial"/>
+                <w:color w:val="000000"/>
+                <w:sz w:val="18"/>
+                <w:szCs w:val="18"/>
+              </w:rPr>
+              <w:t xml:space="preserve"/>
+            </w:r>
+          </w:p>
+        </w:tc>
+        <w:tc>
+          <w:tcPr>
+            <w:tcW w:type="dxa" w:w="780"/>
+            <w:gridSpan w:val="1"/>
+            <w:tcBorders>
+              <w:top w:val="single" w:color="000000" w:sz="4"/>
+              <w:left w:val="single" w:color="000000" w:sz="4"/>
+              <w:bottom w:val="single" w:color="000000" w:sz="4"/>
+              <w:right w:val="single" w:color="000000" w:sz="4"/>
+            </w:tcBorders>
+            <w:shd w:fill="EBF5FB" w:val="clear"/>
+            <w:vAlign w:val="center"/>
+          </w:tcPr>
+          <w:p>
+            <w:pPr>
+              <w:spacing w:after="50" w:before="50"/>
+              <w:jc w:val="left"/>
+            </w:pPr>
+            <w:r>
+              <w:rPr>
+                <w:rFonts w:ascii="Arial" w:cs="Arial" w:eastAsia="Arial" w:hAnsi="Arial"/>
+                <w:color w:val="000000"/>
+                <w:sz w:val="18"/>
+                <w:szCs w:val="18"/>
+              </w:rPr>
+              <w:t xml:space="preserve"/>
+            </w:r>
+          </w:p>
+        </w:tc>
+        <w:tc>
+          <w:tcPr>
+            <w:tcW w:type="dxa" w:w="780"/>
+            <w:gridSpan w:val="1"/>
+            <w:tcBorders>
+              <w:top w:val="single" w:color="000000" w:sz="4"/>
+              <w:left w:val="single" w:color="000000" w:sz="4"/>
+              <w:bottom w:val="single" w:color="000000" w:sz="4"/>
+              <w:right w:val="single" w:color="000000" w:sz="4"/>
+            </w:tcBorders>
+            <w:shd w:fill="EBF5FB" w:val="clear"/>
+            <w:vAlign w:val="center"/>
+          </w:tcPr>
+          <w:p>
+            <w:pPr>
+              <w:spacing w:after="50" w:before="50"/>
+              <w:jc w:val="left"/>
+            </w:pPr>
+            <w:r>
+              <w:rPr>
+                <w:rFonts w:ascii="Arial" w:cs="Arial" w:eastAsia="Arial" w:hAnsi="Arial"/>
+                <w:color w:val="000000"/>
+                <w:sz w:val="18"/>
+                <w:szCs w:val="18"/>
+              </w:rPr>
+              <w:t xml:space="preserve"/>
+            </w:r>
+          </w:p>
+        </w:tc>
+        <w:tc>
+          <w:tcPr>
+            <w:tcW w:type="dxa" w:w="780"/>
+            <w:gridSpan w:val="1"/>
+            <w:tcBorders>
+              <w:top w:val="single" w:color="000000" w:sz="4"/>
+              <w:left w:val="single" w:color="000000" w:sz="4"/>
+              <w:bottom w:val="single" w:color="000000" w:sz="4"/>
+              <w:right w:val="single" w:color="000000" w:sz="4"/>
+            </w:tcBorders>
+            <w:shd w:fill="EBF5FB" w:val="clear"/>
+            <w:vAlign w:val="center"/>
+          </w:tcPr>
+          <w:p>
+            <w:pPr>
+              <w:spacing w:after="50" w:before="50"/>
+              <w:jc w:val="left"/>
+            </w:pPr>
+            <w:r>
+              <w:rPr>
+                <w:rFonts w:ascii="Arial" w:cs="Arial" w:eastAsia="Arial" w:hAnsi="Arial"/>
+                <w:color w:val="000000"/>
+                <w:sz w:val="18"/>
+                <w:szCs w:val="18"/>
+              </w:rPr>
+              <w:t xml:space="preserve"/>
+            </w:r>
+          </w:p>
+        </w:tc>
+        <w:tc>
+          <w:tcPr>
+            <w:tcW w:type="dxa" w:w="780"/>
+            <w:gridSpan w:val="1"/>
+            <w:tcBorders>
+              <w:top w:val="single" w:color="000000" w:sz="4"/>
+              <w:left w:val="single" w:color="000000" w:sz="4"/>
+              <w:bottom w:val="single" w:color="000000" w:sz="4"/>
+              <w:right w:val="single" w:color="000000" w:sz="4"/>
+            </w:tcBorders>
+            <w:shd w:fill="EBF5FB" w:val="clear"/>
+            <w:vAlign w:val="center"/>
+          </w:tcPr>
+          <w:p>
+            <w:pPr>
+              <w:spacing w:after="50" w:before="50"/>
+              <w:jc w:val="left"/>
+            </w:pPr>
+            <w:r>
+              <w:rPr>
+                <w:rFonts w:ascii="Arial" w:cs="Arial" w:eastAsia="Arial" w:hAnsi="Arial"/>
+                <w:color w:val="000000"/>
+                <w:sz w:val="18"/>
+                <w:szCs w:val="18"/>
+              </w:rPr>
+              <w:t xml:space="preserve"/>
+            </w:r>
+          </w:p>
+        </w:tc>
+        <w:tc>
+          <w:tcPr>
+            <w:tcW w:type="dxa" w:w="2720"/>
+            <w:gridSpan w:val="1"/>
+            <w:tcBorders>
+              <w:top w:val="single" w:color="000000" w:sz="4"/>
+              <w:left w:val="single" w:color="000000" w:sz="4"/>
+              <w:bottom w:val="single" w:color="000000" w:sz="4"/>
+              <w:right w:val="single" w:color="000000" w:sz="4"/>
+            </w:tcBorders>
+            <w:shd w:fill="EBF5FB" w:val="clear"/>
+            <w:vAlign w:val="center"/>
+          </w:tcPr>
+          <w:p>
+            <w:pPr>
+              <w:spacing w:after="50" w:before="50"/>
+              <w:jc w:val="left"/>
+            </w:pPr>
+            <w:r>
+              <w:rPr>
+                <w:rFonts w:ascii="Arial" w:cs="Arial" w:eastAsia="Arial" w:hAnsi="Arial"/>
+                <w:color w:val="000000"/>
+                <w:sz w:val="18"/>
+                <w:szCs w:val="18"/>
+              </w:rPr>
+              <w:t xml:space="preserve"/>
+            </w:r>
+          </w:p>
+        </w:tc>
+      </w:tr>
+      <w:tr>
+        <w:trPr>
+          <w:trHeight w:val="360" w:hRule="exact"/>
+        </w:trPr>
+        <w:tc>
+          <w:tcPr>
+            <w:tcW w:type="dxa" w:w="460"/>
+            <w:gridSpan w:val="1"/>
+            <w:tcBorders>
+              <w:top w:val="single" w:color="000000" w:sz="4"/>
+              <w:left w:val="single" w:color="000000" w:sz="4"/>
+              <w:bottom w:val="single" w:color="000000" w:sz="4"/>
+              <w:right w:val="single" w:color="000000" w:sz="4"/>
+            </w:tcBorders>
+            <w:vAlign w:val="center"/>
+          </w:tcPr>
+          <w:p>
+            <w:pPr>
+              <w:spacing w:after="30" w:before="30"/>
+              <w:jc w:val="center"/>
+            </w:pPr>
+            <w:r>
+              <w:rPr>
+                <w:rFonts w:ascii="Arial" w:cs="Arial" w:eastAsia="Arial" w:hAnsi="Arial"/>
+                <w:color w:val="000000"/>
+                <w:sz w:val="16"/>
+                <w:szCs w:val="16"/>
+              </w:rPr>
+              <w:t xml:space="preserve">6</w:t>
+            </w:r>
+          </w:p>
+        </w:tc>
+        <w:tc>
+          <w:tcPr>
+            <w:tcW w:type="dxa" w:w="2200"/>
+            <w:gridSpan w:val="1"/>
+            <w:tcBorders>
+              <w:top w:val="single" w:color="000000" w:sz="4"/>
+              <w:left w:val="single" w:color="000000" w:sz="4"/>
+              <w:bottom w:val="single" w:color="000000" w:sz="4"/>
+              <w:right w:val="single" w:color="000000" w:sz="4"/>
+            </w:tcBorders>
+            <w:vAlign w:val="center"/>
+          </w:tcPr>
+          <w:p>
+            <w:pPr>
+              <w:spacing w:after="50" w:before="50"/>
+              <w:jc w:val="left"/>
+            </w:pPr>
+            <w:r>
+              <w:rPr>
+                <w:rFonts w:ascii="Arial" w:cs="Arial" w:eastAsia="Arial" w:hAnsi="Arial"/>
+                <w:color w:val="000000"/>
+                <w:sz w:val="18"/>
+                <w:szCs w:val="18"/>
+              </w:rPr>
+              <w:t xml:space="preserve"/>
+            </w:r>
+          </w:p>
+        </w:tc>
+        <w:tc>
+          <w:tcPr>
+            <w:tcW w:type="dxa" w:w="1000"/>
+            <w:gridSpan w:val="1"/>
+            <w:tcBorders>
+              <w:top w:val="single" w:color="000000" w:sz="4"/>
+              <w:left w:val="single" w:color="000000" w:sz="4"/>
+              <w:bottom w:val="single" w:color="000000" w:sz="4"/>
+              <w:right w:val="single" w:color="000000" w:sz="4"/>
+            </w:tcBorders>
+            <w:vAlign w:val="center"/>
+          </w:tcPr>
+          <w:p>
+            <w:pPr>
+              <w:spacing w:after="50" w:before="50"/>
+              <w:jc w:val="left"/>
+            </w:pPr>
+            <w:r>
+              <w:rPr>
+                <w:rFonts w:ascii="Arial" w:cs="Arial" w:eastAsia="Arial" w:hAnsi="Arial"/>
+                <w:color w:val="000000"/>
+                <w:sz w:val="18"/>
+                <w:szCs w:val="18"/>
+              </w:rPr>
+              <w:t xml:space="preserve"/>
+            </w:r>
+          </w:p>
+        </w:tc>
+        <w:tc>
+          <w:tcPr>
+            <w:tcW w:type="dxa" w:w="1300"/>
+            <w:gridSpan w:val="1"/>
+            <w:tcBorders>
+              <w:top w:val="single" w:color="000000" w:sz="4"/>
+              <w:left w:val="single" w:color="000000" w:sz="4"/>
+              <w:bottom w:val="single" w:color="000000" w:sz="4"/>
+              <w:right w:val="single" w:color="000000" w:sz="4"/>
+            </w:tcBorders>
+            <w:vAlign w:val="center"/>
+          </w:tcPr>
+          <w:p>
+            <w:pPr>
+              <w:spacing w:after="50" w:before="50"/>
+              <w:jc w:val="left"/>
+            </w:pPr>
+            <w:r>
+              <w:rPr>
+                <w:rFonts w:ascii="Arial" w:cs="Arial" w:eastAsia="Arial" w:hAnsi="Arial"/>
+                <w:color w:val="000000"/>
+                <w:sz w:val="18"/>
+                <w:szCs w:val="18"/>
+              </w:rPr>
+              <w:t xml:space="preserve"/>
+            </w:r>
+          </w:p>
+        </w:tc>
+        <w:tc>
+          <w:tcPr>
+            <w:tcW w:type="dxa" w:w="780"/>
+            <w:gridSpan w:val="1"/>
+            <w:tcBorders>
+              <w:top w:val="single" w:color="000000" w:sz="4"/>
+              <w:left w:val="single" w:color="000000" w:sz="4"/>
+              <w:bottom w:val="single" w:color="000000" w:sz="4"/>
+              <w:right w:val="single" w:color="000000" w:sz="4"/>
+            </w:tcBorders>
+            <w:vAlign w:val="center"/>
+          </w:tcPr>
+          <w:p>
+            <w:pPr>
+              <w:spacing w:after="50" w:before="50"/>
+              <w:jc w:val="left"/>
+            </w:pPr>
+            <w:r>
+              <w:rPr>
+                <w:rFonts w:ascii="Arial" w:cs="Arial" w:eastAsia="Arial" w:hAnsi="Arial"/>
+                <w:color w:val="000000"/>
+                <w:sz w:val="18"/>
+                <w:szCs w:val="18"/>
+              </w:rPr>
+              <w:t xml:space="preserve"/>
+            </w:r>
+          </w:p>
+        </w:tc>
+        <w:tc>
+          <w:tcPr>
+            <w:tcW w:type="dxa" w:w="780"/>
+            <w:gridSpan w:val="1"/>
+            <w:tcBorders>
+              <w:top w:val="single" w:color="000000" w:sz="4"/>
+              <w:left w:val="single" w:color="000000" w:sz="4"/>
+              <w:bottom w:val="single" w:color="000000" w:sz="4"/>
+              <w:right w:val="single" w:color="000000" w:sz="4"/>
+            </w:tcBorders>
+            <w:vAlign w:val="center"/>
+          </w:tcPr>
+          <w:p>
+            <w:pPr>
+              <w:spacing w:after="50" w:before="50"/>
+              <w:jc w:val="left"/>
+            </w:pPr>
+            <w:r>
+              <w:rPr>
+                <w:rFonts w:ascii="Arial" w:cs="Arial" w:eastAsia="Arial" w:hAnsi="Arial"/>
+                <w:color w:val="000000"/>
+                <w:sz w:val="18"/>
+                <w:szCs w:val="18"/>
+              </w:rPr>
+              <w:t xml:space="preserve"/>
+            </w:r>
+          </w:p>
+        </w:tc>
+        <w:tc>
+          <w:tcPr>
+            <w:tcW w:type="dxa" w:w="780"/>
+            <w:gridSpan w:val="1"/>
+            <w:tcBorders>
+              <w:top w:val="single" w:color="000000" w:sz="4"/>
+              <w:left w:val="single" w:color="000000" w:sz="4"/>
+              <w:bottom w:val="single" w:color="000000" w:sz="4"/>
+              <w:right w:val="single" w:color="000000" w:sz="4"/>
+            </w:tcBorders>
+            <w:vAlign w:val="center"/>
+          </w:tcPr>
+          <w:p>
+            <w:pPr>
+              <w:spacing w:after="50" w:before="50"/>
+              <w:jc w:val="left"/>
+            </w:pPr>
+            <w:r>
+              <w:rPr>
+                <w:rFonts w:ascii="Arial" w:cs="Arial" w:eastAsia="Arial" w:hAnsi="Arial"/>
+                <w:color w:val="000000"/>
+                <w:sz w:val="18"/>
+                <w:szCs w:val="18"/>
+              </w:rPr>
+              <w:t xml:space="preserve"/>
+            </w:r>
+          </w:p>
+        </w:tc>
+        <w:tc>
+          <w:tcPr>
+            <w:tcW w:type="dxa" w:w="780"/>
+            <w:gridSpan w:val="1"/>
+            <w:tcBorders>
+              <w:top w:val="single" w:color="000000" w:sz="4"/>
+              <w:left w:val="single" w:color="000000" w:sz="4"/>
+              <w:bottom w:val="single" w:color="000000" w:sz="4"/>
+              <w:right w:val="single" w:color="000000" w:sz="4"/>
+            </w:tcBorders>
+            <w:vAlign w:val="center"/>
+          </w:tcPr>
+          <w:p>
+            <w:pPr>
+              <w:spacing w:after="50" w:before="50"/>
+              <w:jc w:val="left"/>
+            </w:pPr>
+            <w:r>
+              <w:rPr>
+                <w:rFonts w:ascii="Arial" w:cs="Arial" w:eastAsia="Arial" w:hAnsi="Arial"/>
+                <w:color w:val="000000"/>
+                <w:sz w:val="18"/>
+                <w:szCs w:val="18"/>
+              </w:rPr>
+              <w:t xml:space="preserve"/>
+            </w:r>
+          </w:p>
+        </w:tc>
+        <w:tc>
+          <w:tcPr>
+            <w:tcW w:type="dxa" w:w="2720"/>
+            <w:gridSpan w:val="1"/>
+            <w:tcBorders>
+              <w:top w:val="single" w:color="000000" w:sz="4"/>
+              <w:left w:val="single" w:color="000000" w:sz="4"/>
+              <w:bottom w:val="single" w:color="000000" w:sz="4"/>
+              <w:right w:val="single" w:color="000000" w:sz="4"/>
+            </w:tcBorders>
+            <w:vAlign w:val="center"/>
+          </w:tcPr>
+          <w:p>
+            <w:pPr>
+              <w:spacing w:after="50" w:before="50"/>
+              <w:jc w:val="left"/>
+            </w:pPr>
+            <w:r>
+              <w:rPr>
+                <w:rFonts w:ascii="Arial" w:cs="Arial" w:eastAsia="Arial" w:hAnsi="Arial"/>
+                <w:color w:val="000000"/>
+                <w:sz w:val="18"/>
+                <w:szCs w:val="18"/>
+              </w:rPr>
+              <w:t xml:space="preserve"/>
+            </w:r>
+          </w:p>
+        </w:tc>
+      </w:tr>
+      <w:tr>
+        <w:trPr>
+          <w:trHeight w:val="360" w:hRule="exact"/>
+        </w:trPr>
+        <w:tc>
+          <w:tcPr>
+            <w:tcW w:type="dxa" w:w="460"/>
+            <w:gridSpan w:val="1"/>
+            <w:tcBorders>
+              <w:top w:val="single" w:color="000000" w:sz="4"/>
+              <w:left w:val="single" w:color="000000" w:sz="4"/>
+              <w:bottom w:val="single" w:color="000000" w:sz="4"/>
+              <w:right w:val="single" w:color="000000" w:sz="4"/>
+            </w:tcBorders>
+            <w:shd w:fill="EBF5FB" w:val="clear"/>
+            <w:vAlign w:val="center"/>
+          </w:tcPr>
+          <w:p>
+            <w:pPr>
+              <w:spacing w:after="30" w:before="30"/>
+              <w:jc w:val="center"/>
+            </w:pPr>
+            <w:r>
+              <w:rPr>
+                <w:rFonts w:ascii="Arial" w:cs="Arial" w:eastAsia="Arial" w:hAnsi="Arial"/>
+                <w:color w:val="000000"/>
+                <w:sz w:val="16"/>
+                <w:szCs w:val="16"/>
+              </w:rPr>
+              <w:t xml:space="preserve">7</w:t>
+            </w:r>
+          </w:p>
+        </w:tc>
+        <w:tc>
+          <w:tcPr>
+            <w:tcW w:type="dxa" w:w="2200"/>
+            <w:gridSpan w:val="1"/>
+            <w:tcBorders>
+              <w:top w:val="single" w:color="000000" w:sz="4"/>
+              <w:left w:val="single" w:color="000000" w:sz="4"/>
+              <w:bottom w:val="single" w:color="000000" w:sz="4"/>
+              <w:right w:val="single" w:color="000000" w:sz="4"/>
+            </w:tcBorders>
+            <w:shd w:fill="EBF5FB" w:val="clear"/>
+            <w:vAlign w:val="center"/>
+          </w:tcPr>
+          <w:p>
+            <w:pPr>
+              <w:spacing w:after="50" w:before="50"/>
+              <w:jc w:val="left"/>
+            </w:pPr>
+            <w:r>
+              <w:rPr>
+                <w:rFonts w:ascii="Arial" w:cs="Arial" w:eastAsia="Arial" w:hAnsi="Arial"/>
+                <w:color w:val="000000"/>
+                <w:sz w:val="18"/>
+                <w:szCs w:val="18"/>
+              </w:rPr>
+              <w:t xml:space="preserve"/>
+            </w:r>
+          </w:p>
+        </w:tc>
+        <w:tc>
+          <w:tcPr>
+            <w:tcW w:type="dxa" w:w="1000"/>
+            <w:gridSpan w:val="1"/>
+            <w:tcBorders>
+              <w:top w:val="single" w:color="000000" w:sz="4"/>
+              <w:left w:val="single" w:color="000000" w:sz="4"/>
+              <w:bottom w:val="single" w:color="000000" w:sz="4"/>
+              <w:right w:val="single" w:color="000000" w:sz="4"/>
+            </w:tcBorders>
+            <w:shd w:fill="EBF5FB" w:val="clear"/>
+            <w:vAlign w:val="center"/>
+          </w:tcPr>
+          <w:p>
+            <w:pPr>
+              <w:spacing w:after="50" w:before="50"/>
+              <w:jc w:val="left"/>
+            </w:pPr>
+            <w:r>
+              <w:rPr>
+                <w:rFonts w:ascii="Arial" w:cs="Arial" w:eastAsia="Arial" w:hAnsi="Arial"/>
+                <w:color w:val="000000"/>
+                <w:sz w:val="18"/>
+                <w:szCs w:val="18"/>
+              </w:rPr>
+              <w:t xml:space="preserve"/>
+            </w:r>
+          </w:p>
+        </w:tc>
+        <w:tc>
+          <w:tcPr>
+            <w:tcW w:type="dxa" w:w="1300"/>
+            <w:gridSpan w:val="1"/>
+            <w:tcBorders>
+              <w:top w:val="single" w:color="000000" w:sz="4"/>
+              <w:left w:val="single" w:color="000000" w:sz="4"/>
+              <w:bottom w:val="single" w:color="000000" w:sz="4"/>
+              <w:right w:val="single" w:color="000000" w:sz="4"/>
+            </w:tcBorders>
+            <w:shd w:fill="EBF5FB" w:val="clear"/>
+            <w:vAlign w:val="center"/>
+          </w:tcPr>
+          <w:p>
+            <w:pPr>
+              <w:spacing w:after="50" w:before="50"/>
+              <w:jc w:val="left"/>
+            </w:pPr>
+            <w:r>
+              <w:rPr>
+                <w:rFonts w:ascii="Arial" w:cs="Arial" w:eastAsia="Arial" w:hAnsi="Arial"/>
+                <w:color w:val="000000"/>
+                <w:sz w:val="18"/>
+                <w:szCs w:val="18"/>
+              </w:rPr>
+              <w:t xml:space="preserve"/>
+            </w:r>
+          </w:p>
+        </w:tc>
+        <w:tc>
+          <w:tcPr>
+            <w:tcW w:type="dxa" w:w="780"/>
+            <w:gridSpan w:val="1"/>
+            <w:tcBorders>
+              <w:top w:val="single" w:color="000000" w:sz="4"/>
+              <w:left w:val="single" w:color="000000" w:sz="4"/>
+              <w:bottom w:val="single" w:color="000000" w:sz="4"/>
+              <w:right w:val="single" w:color="000000" w:sz="4"/>
+            </w:tcBorders>
+            <w:shd w:fill="EBF5FB" w:val="clear"/>
+            <w:vAlign w:val="center"/>
+          </w:tcPr>
+          <w:p>
+            <w:pPr>
+              <w:spacing w:after="50" w:before="50"/>
+              <w:jc w:val="left"/>
+            </w:pPr>
+            <w:r>
+              <w:rPr>
+                <w:rFonts w:ascii="Arial" w:cs="Arial" w:eastAsia="Arial" w:hAnsi="Arial"/>
+                <w:color w:val="000000"/>
+                <w:sz w:val="18"/>
+                <w:szCs w:val="18"/>
+              </w:rPr>
+              <w:t xml:space="preserve"/>
+            </w:r>
+          </w:p>
+        </w:tc>
+        <w:tc>
+          <w:tcPr>
+            <w:tcW w:type="dxa" w:w="780"/>
+            <w:gridSpan w:val="1"/>
+            <w:tcBorders>
+              <w:top w:val="single" w:color="000000" w:sz="4"/>
+              <w:left w:val="single" w:color="000000" w:sz="4"/>
+              <w:bottom w:val="single" w:color="000000" w:sz="4"/>
+              <w:right w:val="single" w:color="000000" w:sz="4"/>
+            </w:tcBorders>
+            <w:shd w:fill="EBF5FB" w:val="clear"/>
+            <w:vAlign w:val="center"/>
+          </w:tcPr>
+          <w:p>
+            <w:pPr>
+              <w:spacing w:after="50" w:before="50"/>
+              <w:jc w:val="left"/>
+            </w:pPr>
+            <w:r>
+              <w:rPr>
+                <w:rFonts w:ascii="Arial" w:cs="Arial" w:eastAsia="Arial" w:hAnsi="Arial"/>
+                <w:color w:val="000000"/>
+                <w:sz w:val="18"/>
+                <w:szCs w:val="18"/>
+              </w:rPr>
+              <w:t xml:space="preserve"/>
+            </w:r>
+          </w:p>
+        </w:tc>
+        <w:tc>
+          <w:tcPr>
+            <w:tcW w:type="dxa" w:w="780"/>
+            <w:gridSpan w:val="1"/>
+            <w:tcBorders>
+              <w:top w:val="single" w:color="000000" w:sz="4"/>
+              <w:left w:val="single" w:color="000000" w:sz="4"/>
+              <w:bottom w:val="single" w:color="000000" w:sz="4"/>
+              <w:right w:val="single" w:color="000000" w:sz="4"/>
+            </w:tcBorders>
+            <w:shd w:fill="EBF5FB" w:val="clear"/>
+            <w:vAlign w:val="center"/>
+          </w:tcPr>
+          <w:p>
+            <w:pPr>
+              <w:spacing w:after="50" w:before="50"/>
+              <w:jc w:val="left"/>
+            </w:pPr>
+            <w:r>
+              <w:rPr>
+                <w:rFonts w:ascii="Arial" w:cs="Arial" w:eastAsia="Arial" w:hAnsi="Arial"/>
+                <w:color w:val="000000"/>
+                <w:sz w:val="18"/>
+                <w:szCs w:val="18"/>
+              </w:rPr>
+              <w:t xml:space="preserve"/>
+            </w:r>
+          </w:p>
+        </w:tc>
+        <w:tc>
+          <w:tcPr>
+            <w:tcW w:type="dxa" w:w="780"/>
+            <w:gridSpan w:val="1"/>
+            <w:tcBorders>
+              <w:top w:val="single" w:color="000000" w:sz="4"/>
+              <w:left w:val="single" w:color="000000" w:sz="4"/>
+              <w:bottom w:val="single" w:color="000000" w:sz="4"/>
+              <w:right w:val="single" w:color="000000" w:sz="4"/>
+            </w:tcBorders>
+            <w:shd w:fill="EBF5FB" w:val="clear"/>
+            <w:vAlign w:val="center"/>
+          </w:tcPr>
+          <w:p>
+            <w:pPr>
+              <w:spacing w:after="50" w:before="50"/>
+              <w:jc w:val="left"/>
+            </w:pPr>
+            <w:r>
+              <w:rPr>
+                <w:rFonts w:ascii="Arial" w:cs="Arial" w:eastAsia="Arial" w:hAnsi="Arial"/>
+                <w:color w:val="000000"/>
+                <w:sz w:val="18"/>
+                <w:szCs w:val="18"/>
+              </w:rPr>
+              <w:t xml:space="preserve"/>
+            </w:r>
+          </w:p>
+        </w:tc>
+        <w:tc>
+          <w:tcPr>
+            <w:tcW w:type="dxa" w:w="2720"/>
+            <w:gridSpan w:val="1"/>
+            <w:tcBorders>
+              <w:top w:val="single" w:color="000000" w:sz="4"/>
+              <w:left w:val="single" w:color="000000" w:sz="4"/>
+              <w:bottom w:val="single" w:color="000000" w:sz="4"/>
+              <w:right w:val="single" w:color="000000" w:sz="4"/>
+            </w:tcBorders>
+            <w:shd w:fill="EBF5FB" w:val="clear"/>
+            <w:vAlign w:val="center"/>
+          </w:tcPr>
+          <w:p>
+            <w:pPr>
+              <w:spacing w:after="50" w:before="50"/>
+              <w:jc w:val="left"/>
+            </w:pPr>
+            <w:r>
+              <w:rPr>
+                <w:rFonts w:ascii="Arial" w:cs="Arial" w:eastAsia="Arial" w:hAnsi="Arial"/>
+                <w:color w:val="000000"/>
+                <w:sz w:val="18"/>
+                <w:szCs w:val="18"/>
+              </w:rPr>
+              <w:t xml:space="preserve"/>
+            </w:r>
+          </w:p>
+        </w:tc>
+      </w:tr>
+      <w:tr>
+        <w:trPr>
+          <w:trHeight w:val="360" w:hRule="exact"/>
+        </w:trPr>
+        <w:tc>
+          <w:tcPr>
+            <w:tcW w:type="dxa" w:w="460"/>
+            <w:gridSpan w:val="1"/>
+            <w:tcBorders>
+              <w:top w:val="single" w:color="000000" w:sz="4"/>
+              <w:left w:val="single" w:color="000000" w:sz="4"/>
+              <w:bottom w:val="single" w:color="000000" w:sz="4"/>
+              <w:right w:val="single" w:color="000000" w:sz="4"/>
+            </w:tcBorders>
+            <w:vAlign w:val="center"/>
+          </w:tcPr>
+          <w:p>
+            <w:pPr>
+              <w:spacing w:after="30" w:before="30"/>
+              <w:jc w:val="center"/>
+            </w:pPr>
+            <w:r>
+              <w:rPr>
+                <w:rFonts w:ascii="Arial" w:cs="Arial" w:eastAsia="Arial" w:hAnsi="Arial"/>
+                <w:color w:val="000000"/>
+                <w:sz w:val="16"/>
+                <w:szCs w:val="16"/>
+              </w:rPr>
+              <w:t xml:space="preserve">8</w:t>
+            </w:r>
+          </w:p>
+        </w:tc>
+        <w:tc>
+          <w:tcPr>
+            <w:tcW w:type="dxa" w:w="2200"/>
+            <w:gridSpan w:val="1"/>
+            <w:tcBorders>
+              <w:top w:val="single" w:color="000000" w:sz="4"/>
+              <w:left w:val="single" w:color="000000" w:sz="4"/>
+              <w:bottom w:val="single" w:color="000000" w:sz="4"/>
+              <w:right w:val="single" w:color="000000" w:sz="4"/>
+            </w:tcBorders>
+            <w:vAlign w:val="center"/>
+          </w:tcPr>
+          <w:p>
+            <w:pPr>
+              <w:spacing w:after="50" w:before="50"/>
+              <w:jc w:val="left"/>
+            </w:pPr>
+            <w:r>
+              <w:rPr>
+                <w:rFonts w:ascii="Arial" w:cs="Arial" w:eastAsia="Arial" w:hAnsi="Arial"/>
+                <w:color w:val="000000"/>
+                <w:sz w:val="18"/>
+                <w:szCs w:val="18"/>
+              </w:rPr>
+              <w:t xml:space="preserve"/>
+            </w:r>
+          </w:p>
+        </w:tc>
+        <w:tc>
+          <w:tcPr>
+            <w:tcW w:type="dxa" w:w="1000"/>
+            <w:gridSpan w:val="1"/>
+            <w:tcBorders>
+              <w:top w:val="single" w:color="000000" w:sz="4"/>
+              <w:left w:val="single" w:color="000000" w:sz="4"/>
+              <w:bottom w:val="single" w:color="000000" w:sz="4"/>
+              <w:right w:val="single" w:color="000000" w:sz="4"/>
+            </w:tcBorders>
+            <w:vAlign w:val="center"/>
+          </w:tcPr>
+          <w:p>
+            <w:pPr>
+              <w:spacing w:after="50" w:before="50"/>
+              <w:jc w:val="left"/>
+            </w:pPr>
+            <w:r>
+              <w:rPr>
+                <w:rFonts w:ascii="Arial" w:cs="Arial" w:eastAsia="Arial" w:hAnsi="Arial"/>
+                <w:color w:val="000000"/>
+                <w:sz w:val="18"/>
+                <w:szCs w:val="18"/>
+              </w:rPr>
+              <w:t xml:space="preserve"/>
+            </w:r>
+          </w:p>
+        </w:tc>
+        <w:tc>
+          <w:tcPr>
+            <w:tcW w:type="dxa" w:w="1300"/>
+            <w:gridSpan w:val="1"/>
+            <w:tcBorders>
+              <w:top w:val="single" w:color="000000" w:sz="4"/>
+              <w:left w:val="single" w:color="000000" w:sz="4"/>
+              <w:bottom w:val="single" w:color="000000" w:sz="4"/>
+              <w:right w:val="single" w:color="000000" w:sz="4"/>
+            </w:tcBorders>
+            <w:vAlign w:val="center"/>
+          </w:tcPr>
+          <w:p>
+            <w:pPr>
+              <w:spacing w:after="50" w:before="50"/>
+              <w:jc w:val="left"/>
+            </w:pPr>
+            <w:r>
+              <w:rPr>
+                <w:rFonts w:ascii="Arial" w:cs="Arial" w:eastAsia="Arial" w:hAnsi="Arial"/>
+                <w:color w:val="000000"/>
+                <w:sz w:val="18"/>
+                <w:szCs w:val="18"/>
+              </w:rPr>
+              <w:t xml:space="preserve"/>
+            </w:r>
+          </w:p>
+        </w:tc>
+        <w:tc>
+          <w:tcPr>
+            <w:tcW w:type="dxa" w:w="780"/>
+            <w:gridSpan w:val="1"/>
+            <w:tcBorders>
+              <w:top w:val="single" w:color="000000" w:sz="4"/>
+              <w:left w:val="single" w:color="000000" w:sz="4"/>
+              <w:bottom w:val="single" w:color="000000" w:sz="4"/>
+              <w:right w:val="single" w:color="000000" w:sz="4"/>
+            </w:tcBorders>
+            <w:vAlign w:val="center"/>
+          </w:tcPr>
+          <w:p>
+            <w:pPr>
+              <w:spacing w:after="50" w:before="50"/>
+              <w:jc w:val="left"/>
+            </w:pPr>
+            <w:r>
+              <w:rPr>
+                <w:rFonts w:ascii="Arial" w:cs="Arial" w:eastAsia="Arial" w:hAnsi="Arial"/>
+                <w:color w:val="000000"/>
+                <w:sz w:val="18"/>
+                <w:szCs w:val="18"/>
+              </w:rPr>
+              <w:t xml:space="preserve"/>
+            </w:r>
+          </w:p>
+        </w:tc>
+        <w:tc>
+          <w:tcPr>
+            <w:tcW w:type="dxa" w:w="780"/>
+            <w:gridSpan w:val="1"/>
+            <w:tcBorders>
+              <w:top w:val="single" w:color="000000" w:sz="4"/>
+              <w:left w:val="single" w:color="000000" w:sz="4"/>
+              <w:bottom w:val="single" w:color="000000" w:sz="4"/>
+              <w:right w:val="single" w:color="000000" w:sz="4"/>
+            </w:tcBorders>
+            <w:vAlign w:val="center"/>
+          </w:tcPr>
+          <w:p>
+            <w:pPr>
+              <w:spacing w:after="50" w:before="50"/>
+              <w:jc w:val="left"/>
+            </w:pPr>
+            <w:r>
+              <w:rPr>
+                <w:rFonts w:ascii="Arial" w:cs="Arial" w:eastAsia="Arial" w:hAnsi="Arial"/>
+                <w:color w:val="000000"/>
+                <w:sz w:val="18"/>
+                <w:szCs w:val="18"/>
+              </w:rPr>
+              <w:t xml:space="preserve"/>
+            </w:r>
+          </w:p>
+        </w:tc>
+        <w:tc>
+          <w:tcPr>
+            <w:tcW w:type="dxa" w:w="780"/>
+            <w:gridSpan w:val="1"/>
+            <w:tcBorders>
+              <w:top w:val="single" w:color="000000" w:sz="4"/>
+              <w:left w:val="single" w:color="000000" w:sz="4"/>
+              <w:bottom w:val="single" w:color="000000" w:sz="4"/>
+              <w:right w:val="single" w:color="000000" w:sz="4"/>
+            </w:tcBorders>
+            <w:vAlign w:val="center"/>
+          </w:tcPr>
+          <w:p>
+            <w:pPr>
+              <w:spacing w:after="50" w:before="50"/>
+              <w:jc w:val="left"/>
+            </w:pPr>
+            <w:r>
+              <w:rPr>
+                <w:rFonts w:ascii="Arial" w:cs="Arial" w:eastAsia="Arial" w:hAnsi="Arial"/>
+                <w:color w:val="000000"/>
+                <w:sz w:val="18"/>
+                <w:szCs w:val="18"/>
+              </w:rPr>
+              <w:t xml:space="preserve"/>
+            </w:r>
+          </w:p>
+        </w:tc>
+        <w:tc>
+          <w:tcPr>
+            <w:tcW w:type="dxa" w:w="780"/>
+            <w:gridSpan w:val="1"/>
+            <w:tcBorders>
+              <w:top w:val="single" w:color="000000" w:sz="4"/>
+              <w:left w:val="single" w:color="000000" w:sz="4"/>
+              <w:bottom w:val="single" w:color="000000" w:sz="4"/>
+              <w:right w:val="single" w:color="000000" w:sz="4"/>
+            </w:tcBorders>
+            <w:vAlign w:val="center"/>
+          </w:tcPr>
+          <w:p>
+            <w:pPr>
+              <w:spacing w:after="50" w:before="50"/>
+              <w:jc w:val="left"/>
+            </w:pPr>
+            <w:r>
+              <w:rPr>
+                <w:rFonts w:ascii="Arial" w:cs="Arial" w:eastAsia="Arial" w:hAnsi="Arial"/>
+                <w:color w:val="000000"/>
+                <w:sz w:val="18"/>
+                <w:szCs w:val="18"/>
+              </w:rPr>
+              <w:t xml:space="preserve"/>
+            </w:r>
+          </w:p>
+        </w:tc>
+        <w:tc>
+          <w:tcPr>
+            <w:tcW w:type="dxa" w:w="2720"/>
+            <w:gridSpan w:val="1"/>
+            <w:tcBorders>
+              <w:top w:val="single" w:color="000000" w:sz="4"/>
+              <w:left w:val="single" w:color="000000" w:sz="4"/>
+              <w:bottom w:val="single" w:color="000000" w:sz="4"/>
+              <w:right w:val="single" w:color="000000" w:sz="4"/>
+            </w:tcBorders>
+            <w:vAlign w:val="center"/>
+          </w:tcPr>
+          <w:p>
+            <w:pPr>
+              <w:spacing w:after="50" w:before="50"/>
+              <w:jc w:val="left"/>
+            </w:pPr>
+            <w:r>
+              <w:rPr>
+                <w:rFonts w:ascii="Arial" w:cs="Arial" w:eastAsia="Arial" w:hAnsi="Arial"/>
+                <w:color w:val="000000"/>
+                <w:sz w:val="18"/>
+                <w:szCs w:val="18"/>
+              </w:rPr>
+              <w:t xml:space="preserve"/>
+            </w:r>
+          </w:p>
+        </w:tc>
+      </w:tr>
+      <w:tr>
+        <w:trPr>
+          <w:trHeight w:val="360" w:hRule="exact"/>
+        </w:trPr>
+        <w:tc>
+          <w:tcPr>
+            <w:tcW w:type="dxa" w:w="460"/>
+            <w:gridSpan w:val="1"/>
+            <w:tcBorders>
+              <w:top w:val="single" w:color="000000" w:sz="4"/>
+              <w:left w:val="single" w:color="000000" w:sz="4"/>
+              <w:bottom w:val="single" w:color="000000" w:sz="4"/>
+              <w:right w:val="single" w:color="000000" w:sz="4"/>
+            </w:tcBorders>
+            <w:shd w:fill="EBF5FB" w:val="clear"/>
+            <w:vAlign w:val="center"/>
+          </w:tcPr>
+          <w:p>
+            <w:pPr>
+              <w:spacing w:after="30" w:before="30"/>
+              <w:jc w:val="center"/>
+            </w:pPr>
+            <w:r>
+              <w:rPr>
+                <w:rFonts w:ascii="Arial" w:cs="Arial" w:eastAsia="Arial" w:hAnsi="Arial"/>
+                <w:color w:val="000000"/>
+                <w:sz w:val="16"/>
+                <w:szCs w:val="16"/>
+              </w:rPr>
+              <w:t xml:space="preserve">9</w:t>
+            </w:r>
+          </w:p>
+        </w:tc>
+        <w:tc>
+          <w:tcPr>
+            <w:tcW w:type="dxa" w:w="2200"/>
+            <w:gridSpan w:val="1"/>
+            <w:tcBorders>
+              <w:top w:val="single" w:color="000000" w:sz="4"/>
+              <w:left w:val="single" w:color="000000" w:sz="4"/>
+              <w:bottom w:val="single" w:color="000000" w:sz="4"/>
+              <w:right w:val="single" w:color="000000" w:sz="4"/>
+            </w:tcBorders>
+            <w:shd w:fill="EBF5FB" w:val="clear"/>
+            <w:vAlign w:val="center"/>
+          </w:tcPr>
+          <w:p>
+            <w:pPr>
+              <w:spacing w:after="50" w:before="50"/>
+              <w:jc w:val="left"/>
+            </w:pPr>
+            <w:r>
+              <w:rPr>
+                <w:rFonts w:ascii="Arial" w:cs="Arial" w:eastAsia="Arial" w:hAnsi="Arial"/>
+                <w:color w:val="000000"/>
+                <w:sz w:val="18"/>
+                <w:szCs w:val="18"/>
+              </w:rPr>
+              <w:t xml:space="preserve"/>
+            </w:r>
+          </w:p>
+        </w:tc>
+        <w:tc>
+          <w:tcPr>
+            <w:tcW w:type="dxa" w:w="1000"/>
+            <w:gridSpan w:val="1"/>
+            <w:tcBorders>
+              <w:top w:val="single" w:color="000000" w:sz="4"/>
+              <w:left w:val="single" w:color="000000" w:sz="4"/>
+              <w:bottom w:val="single" w:color="000000" w:sz="4"/>
+              <w:right w:val="single" w:color="000000" w:sz="4"/>
+            </w:tcBorders>
+            <w:shd w:fill="EBF5FB" w:val="clear"/>
+            <w:vAlign w:val="center"/>
+          </w:tcPr>
+          <w:p>
+            <w:pPr>
+              <w:spacing w:after="50" w:before="50"/>
+              <w:jc w:val="left"/>
+            </w:pPr>
+            <w:r>
+              <w:rPr>
+                <w:rFonts w:ascii="Arial" w:cs="Arial" w:eastAsia="Arial" w:hAnsi="Arial"/>
+                <w:color w:val="000000"/>
+                <w:sz w:val="18"/>
+                <w:szCs w:val="18"/>
+              </w:rPr>
+              <w:t xml:space="preserve"/>
+            </w:r>
+          </w:p>
+        </w:tc>
+        <w:tc>
+          <w:tcPr>
+            <w:tcW w:type="dxa" w:w="1300"/>
+            <w:gridSpan w:val="1"/>
+            <w:tcBorders>
+              <w:top w:val="single" w:color="000000" w:sz="4"/>
+              <w:left w:val="single" w:color="000000" w:sz="4"/>
+              <w:bottom w:val="single" w:color="000000" w:sz="4"/>
+              <w:right w:val="single" w:color="000000" w:sz="4"/>
+            </w:tcBorders>
+            <w:shd w:fill="EBF5FB" w:val="clear"/>
+            <w:vAlign w:val="center"/>
+          </w:tcPr>
+          <w:p>
+            <w:pPr>
+              <w:spacing w:after="50" w:before="50"/>
+              <w:jc w:val="left"/>
+            </w:pPr>
+            <w:r>
+              <w:rPr>
+                <w:rFonts w:ascii="Arial" w:cs="Arial" w:eastAsia="Arial" w:hAnsi="Arial"/>
+                <w:color w:val="000000"/>
+                <w:sz w:val="18"/>
+                <w:szCs w:val="18"/>
+              </w:rPr>
+              <w:t xml:space="preserve"/>
+            </w:r>
+          </w:p>
+        </w:tc>
+        <w:tc>
+          <w:tcPr>
+            <w:tcW w:type="dxa" w:w="780"/>
+            <w:gridSpan w:val="1"/>
+            <w:tcBorders>
+              <w:top w:val="single" w:color="000000" w:sz="4"/>
+              <w:left w:val="single" w:color="000000" w:sz="4"/>
+              <w:bottom w:val="single" w:color="000000" w:sz="4"/>
+              <w:right w:val="single" w:color="000000" w:sz="4"/>
+            </w:tcBorders>
+            <w:shd w:fill="EBF5FB" w:val="clear"/>
+            <w:vAlign w:val="center"/>
+          </w:tcPr>
+          <w:p>
+            <w:pPr>
+              <w:spacing w:after="50" w:before="50"/>
+              <w:jc w:val="left"/>
+            </w:pPr>
+            <w:r>
+              <w:rPr>
+                <w:rFonts w:ascii="Arial" w:cs="Arial" w:eastAsia="Arial" w:hAnsi="Arial"/>
+                <w:color w:val="000000"/>
+                <w:sz w:val="18"/>
+                <w:szCs w:val="18"/>
+              </w:rPr>
+              <w:t xml:space="preserve"/>
+            </w:r>
+          </w:p>
+        </w:tc>
+        <w:tc>
+          <w:tcPr>
+            <w:tcW w:type="dxa" w:w="780"/>
+            <w:gridSpan w:val="1"/>
+            <w:tcBorders>
+              <w:top w:val="single" w:color="000000" w:sz="4"/>
+              <w:left w:val="single" w:color="000000" w:sz="4"/>
+              <w:bottom w:val="single" w:color="000000" w:sz="4"/>
+              <w:right w:val="single" w:color="000000" w:sz="4"/>
+            </w:tcBorders>
+            <w:shd w:fill="EBF5FB" w:val="clear"/>
+            <w:vAlign w:val="center"/>
+          </w:tcPr>
+          <w:p>
+            <w:pPr>
+              <w:spacing w:after="50" w:before="50"/>
+              <w:jc w:val="left"/>
+            </w:pPr>
+            <w:r>
+              <w:rPr>
+                <w:rFonts w:ascii="Arial" w:cs="Arial" w:eastAsia="Arial" w:hAnsi="Arial"/>
+                <w:color w:val="000000"/>
+                <w:sz w:val="18"/>
+                <w:szCs w:val="18"/>
+              </w:rPr>
+              <w:t xml:space="preserve"/>
+            </w:r>
+          </w:p>
+        </w:tc>
+        <w:tc>
+          <w:tcPr>
+            <w:tcW w:type="dxa" w:w="780"/>
+            <w:gridSpan w:val="1"/>
+            <w:tcBorders>
+              <w:top w:val="single" w:color="000000" w:sz="4"/>
+              <w:left w:val="single" w:color="000000" w:sz="4"/>
+              <w:bottom w:val="single" w:color="000000" w:sz="4"/>
+              <w:right w:val="single" w:color="000000" w:sz="4"/>
+            </w:tcBorders>
+            <w:shd w:fill="EBF5FB" w:val="clear"/>
+            <w:vAlign w:val="center"/>
+          </w:tcPr>
+          <w:p>
+            <w:pPr>
+              <w:spacing w:after="50" w:before="50"/>
+              <w:jc w:val="left"/>
+            </w:pPr>
+            <w:r>
+              <w:rPr>
+                <w:rFonts w:ascii="Arial" w:cs="Arial" w:eastAsia="Arial" w:hAnsi="Arial"/>
+                <w:color w:val="000000"/>
+                <w:sz w:val="18"/>
+                <w:szCs w:val="18"/>
+              </w:rPr>
+              <w:t xml:space="preserve"/>
+            </w:r>
+          </w:p>
+        </w:tc>
+        <w:tc>
+          <w:tcPr>
+            <w:tcW w:type="dxa" w:w="780"/>
+            <w:gridSpan w:val="1"/>
+            <w:tcBorders>
+              <w:top w:val="single" w:color="000000" w:sz="4"/>
+              <w:left w:val="single" w:color="000000" w:sz="4"/>
+              <w:bottom w:val="single" w:color="000000" w:sz="4"/>
+              <w:right w:val="single" w:color="000000" w:sz="4"/>
+            </w:tcBorders>
+            <w:shd w:fill="EBF5FB" w:val="clear"/>
+            <w:vAlign w:val="center"/>
+          </w:tcPr>
+          <w:p>
+            <w:pPr>
+              <w:spacing w:after="50" w:before="50"/>
+              <w:jc w:val="left"/>
+            </w:pPr>
+            <w:r>
+              <w:rPr>
+                <w:rFonts w:ascii="Arial" w:cs="Arial" w:eastAsia="Arial" w:hAnsi="Arial"/>
+                <w:color w:val="000000"/>
+                <w:sz w:val="18"/>
+                <w:szCs w:val="18"/>
+              </w:rPr>
+              <w:t xml:space="preserve"/>
+            </w:r>
+          </w:p>
+        </w:tc>
+        <w:tc>
+          <w:tcPr>
+            <w:tcW w:type="dxa" w:w="2720"/>
+            <w:gridSpan w:val="1"/>
+            <w:tcBorders>
+              <w:top w:val="single" w:color="000000" w:sz="4"/>
+              <w:left w:val="single" w:color="000000" w:sz="4"/>
+              <w:bottom w:val="single" w:color="000000" w:sz="4"/>
+              <w:right w:val="single" w:color="000000" w:sz="4"/>
+            </w:tcBorders>
+            <w:shd w:fill="EBF5FB" w:val="clear"/>
+            <w:vAlign w:val="center"/>
+          </w:tcPr>
+          <w:p>
+            <w:pPr>
+              <w:spacing w:after="50" w:before="50"/>
+              <w:jc w:val="left"/>
+            </w:pPr>
+            <w:r>
+              <w:rPr>
+                <w:rFonts w:ascii="Arial" w:cs="Arial" w:eastAsia="Arial" w:hAnsi="Arial"/>
+                <w:color w:val="000000"/>
+                <w:sz w:val="18"/>
+                <w:szCs w:val="18"/>
+              </w:rPr>
+              <w:t xml:space="preserve"/>
+            </w:r>
+          </w:p>
+        </w:tc>
+      </w:tr>
+      <w:tr>
+        <w:trPr>
+          <w:trHeight w:val="360" w:hRule="exact"/>
+        </w:trPr>
+        <w:tc>
+          <w:tcPr>
+            <w:tcW w:type="dxa" w:w="460"/>
+            <w:gridSpan w:val="1"/>
+            <w:tcBorders>
+              <w:top w:val="single" w:color="000000" w:sz="4"/>
+              <w:left w:val="single" w:color="000000" w:sz="4"/>
+              <w:bottom w:val="single" w:color="000000" w:sz="4"/>
+              <w:right w:val="single" w:color="000000" w:sz="4"/>
+            </w:tcBorders>
+            <w:vAlign w:val="center"/>
+          </w:tcPr>
+          <w:p>
+            <w:pPr>
+              <w:spacing w:after="30" w:before="30"/>
+              <w:jc w:val="center"/>
+            </w:pPr>
+            <w:r>
+              <w:rPr>
+                <w:rFonts w:ascii="Arial" w:cs="Arial" w:eastAsia="Arial" w:hAnsi="Arial"/>
+                <w:color w:val="000000"/>
+                <w:sz w:val="16"/>
+                <w:szCs w:val="16"/>
+              </w:rPr>
+              <w:t xml:space="preserve">10</w:t>
+            </w:r>
+          </w:p>
+        </w:tc>
+        <w:tc>
+          <w:tcPr>
+            <w:tcW w:type="dxa" w:w="2200"/>
+            <w:gridSpan w:val="1"/>
+            <w:tcBorders>
+              <w:top w:val="single" w:color="000000" w:sz="4"/>
+              <w:left w:val="single" w:color="000000" w:sz="4"/>
+              <w:bottom w:val="single" w:color="000000" w:sz="4"/>
+              <w:right w:val="single" w:color="000000" w:sz="4"/>
+            </w:tcBorders>
+            <w:vAlign w:val="center"/>
+          </w:tcPr>
+          <w:p>
+            <w:pPr>
+              <w:spacing w:after="50" w:before="50"/>
+              <w:jc w:val="left"/>
+            </w:pPr>
+            <w:r>
+              <w:rPr>
+                <w:rFonts w:ascii="Arial" w:cs="Arial" w:eastAsia="Arial" w:hAnsi="Arial"/>
+                <w:color w:val="000000"/>
+                <w:sz w:val="18"/>
+                <w:szCs w:val="18"/>
+              </w:rPr>
+              <w:t xml:space="preserve"/>
+            </w:r>
+          </w:p>
+        </w:tc>
+        <w:tc>
+          <w:tcPr>
+            <w:tcW w:type="dxa" w:w="1000"/>
+            <w:gridSpan w:val="1"/>
+            <w:tcBorders>
+              <w:top w:val="single" w:color="000000" w:sz="4"/>
+              <w:left w:val="single" w:color="000000" w:sz="4"/>
+              <w:bottom w:val="single" w:color="000000" w:sz="4"/>
+              <w:right w:val="single" w:color="000000" w:sz="4"/>
+            </w:tcBorders>
+            <w:vAlign w:val="center"/>
+          </w:tcPr>
+          <w:p>
+            <w:pPr>
+              <w:spacing w:after="50" w:before="50"/>
+              <w:jc w:val="left"/>
+            </w:pPr>
+            <w:r>
+              <w:rPr>
+                <w:rFonts w:ascii="Arial" w:cs="Arial" w:eastAsia="Arial" w:hAnsi="Arial"/>
+                <w:color w:val="000000"/>
+                <w:sz w:val="18"/>
+                <w:szCs w:val="18"/>
+              </w:rPr>
+              <w:t xml:space="preserve"/>
+            </w:r>
+          </w:p>
+        </w:tc>
+        <w:tc>
+          <w:tcPr>
+            <w:tcW w:type="dxa" w:w="1300"/>
+            <w:gridSpan w:val="1"/>
+            <w:tcBorders>
+              <w:top w:val="single" w:color="000000" w:sz="4"/>
+              <w:left w:val="single" w:color="000000" w:sz="4"/>
+              <w:bottom w:val="single" w:color="000000" w:sz="4"/>
+              <w:right w:val="single" w:color="000000" w:sz="4"/>
+            </w:tcBorders>
+            <w:vAlign w:val="center"/>
+          </w:tcPr>
+          <w:p>
+            <w:pPr>
+              <w:spacing w:after="50" w:before="50"/>
+              <w:jc w:val="left"/>
+            </w:pPr>
+            <w:r>
+              <w:rPr>
+                <w:rFonts w:ascii="Arial" w:cs="Arial" w:eastAsia="Arial" w:hAnsi="Arial"/>
+                <w:color w:val="000000"/>
+                <w:sz w:val="18"/>
+                <w:szCs w:val="18"/>
+              </w:rPr>
+              <w:t xml:space="preserve"/>
+            </w:r>
+          </w:p>
+        </w:tc>
+        <w:tc>
+          <w:tcPr>
+            <w:tcW w:type="dxa" w:w="780"/>
+            <w:gridSpan w:val="1"/>
+            <w:tcBorders>
+              <w:top w:val="single" w:color="000000" w:sz="4"/>
+              <w:left w:val="single" w:color="000000" w:sz="4"/>
+              <w:bottom w:val="single" w:color="000000" w:sz="4"/>
+              <w:right w:val="single" w:color="000000" w:sz="4"/>
+            </w:tcBorders>
+            <w:vAlign w:val="center"/>
+          </w:tcPr>
+          <w:p>
+            <w:pPr>
+              <w:spacing w:after="50" w:before="50"/>
+              <w:jc w:val="left"/>
+            </w:pPr>
+            <w:r>
+              <w:rPr>
+                <w:rFonts w:ascii="Arial" w:cs="Arial" w:eastAsia="Arial" w:hAnsi="Arial"/>
+                <w:color w:val="000000"/>
+                <w:sz w:val="18"/>
+                <w:szCs w:val="18"/>
+              </w:rPr>
+              <w:t xml:space="preserve"/>
+            </w:r>
+          </w:p>
+        </w:tc>
+        <w:tc>
+          <w:tcPr>
+            <w:tcW w:type="dxa" w:w="780"/>
+            <w:gridSpan w:val="1"/>
+            <w:tcBorders>
+              <w:top w:val="single" w:color="000000" w:sz="4"/>
+              <w:left w:val="single" w:color="000000" w:sz="4"/>
+              <w:bottom w:val="single" w:color="000000" w:sz="4"/>
+              <w:right w:val="single" w:color="000000" w:sz="4"/>
+            </w:tcBorders>
+            <w:vAlign w:val="center"/>
+          </w:tcPr>
+          <w:p>
+            <w:pPr>
+              <w:spacing w:after="50" w:before="50"/>
+              <w:jc w:val="left"/>
+            </w:pPr>
+            <w:r>
+              <w:rPr>
+                <w:rFonts w:ascii="Arial" w:cs="Arial" w:eastAsia="Arial" w:hAnsi="Arial"/>
+                <w:color w:val="000000"/>
+                <w:sz w:val="18"/>
+                <w:szCs w:val="18"/>
+              </w:rPr>
+              <w:t xml:space="preserve"/>
+            </w:r>
+          </w:p>
+        </w:tc>
+        <w:tc>
+          <w:tcPr>
+            <w:tcW w:type="dxa" w:w="780"/>
+            <w:gridSpan w:val="1"/>
+            <w:tcBorders>
+              <w:top w:val="single" w:color="000000" w:sz="4"/>
+              <w:left w:val="single" w:color="000000" w:sz="4"/>
+              <w:bottom w:val="single" w:color="000000" w:sz="4"/>
+              <w:right w:val="single" w:color="000000" w:sz="4"/>
+            </w:tcBorders>
+            <w:vAlign w:val="center"/>
+          </w:tcPr>
+          <w:p>
+            <w:pPr>
+              <w:spacing w:after="50" w:before="50"/>
+              <w:jc w:val="left"/>
+            </w:pPr>
+            <w:r>
+              <w:rPr>
+                <w:rFonts w:ascii="Arial" w:cs="Arial" w:eastAsia="Arial" w:hAnsi="Arial"/>
+                <w:color w:val="000000"/>
+                <w:sz w:val="18"/>
+                <w:szCs w:val="18"/>
+              </w:rPr>
+              <w:t xml:space="preserve"/>
+            </w:r>
+          </w:p>
+        </w:tc>
+        <w:tc>
+          <w:tcPr>
+            <w:tcW w:type="dxa" w:w="780"/>
+            <w:gridSpan w:val="1"/>
+            <w:tcBorders>
+              <w:top w:val="single" w:color="000000" w:sz="4"/>
+              <w:left w:val="single" w:color="000000" w:sz="4"/>
+              <w:bottom w:val="single" w:color="000000" w:sz="4"/>
+              <w:right w:val="single" w:color="000000" w:sz="4"/>
+            </w:tcBorders>
+            <w:vAlign w:val="center"/>
+          </w:tcPr>
+          <w:p>
+            <w:pPr>
+              <w:spacing w:after="50" w:before="50"/>
+              <w:jc w:val="left"/>
+            </w:pPr>
+            <w:r>
+              <w:rPr>
+                <w:rFonts w:ascii="Arial" w:cs="Arial" w:eastAsia="Arial" w:hAnsi="Arial"/>
+                <w:color w:val="000000"/>
+                <w:sz w:val="18"/>
+                <w:szCs w:val="18"/>
+              </w:rPr>
+              <w:t xml:space="preserve"/>
+            </w:r>
+          </w:p>
+        </w:tc>
+        <w:tc>
+          <w:tcPr>
+            <w:tcW w:type="dxa" w:w="2720"/>
+            <w:gridSpan w:val="1"/>
+            <w:tcBorders>
+              <w:top w:val="single" w:color="000000" w:sz="4"/>
+              <w:left w:val="single" w:color="000000" w:sz="4"/>
+              <w:bottom w:val="single" w:color="000000" w:sz="4"/>
+              <w:right w:val="single" w:color="000000" w:sz="4"/>
+            </w:tcBorders>
+            <w:vAlign w:val="center"/>
+          </w:tcPr>
+          <w:p>
+            <w:pPr>
+              <w:spacing w:after="50" w:before="50"/>
+              <w:jc w:val="left"/>
+            </w:pPr>
+            <w:r>
+              <w:rPr>
+                <w:rFonts w:ascii="Arial" w:cs="Arial" w:eastAsia="Arial" w:hAnsi="Arial"/>
+                <w:color w:val="000000"/>
+                <w:sz w:val="18"/>
+                <w:szCs w:val="18"/>
+              </w:rPr>
+              <w:t xml:space="preserve"/>
+            </w:r>
+          </w:p>
+        </w:tc>
+      </w:tr>
+      <w:tr>
+        <w:trPr>
+          <w:trHeight w:val="360" w:hRule="exact"/>
+        </w:trPr>
+        <w:tc>
+          <w:tcPr>
+            <w:tcW w:type="dxa" w:w="460"/>
+            <w:gridSpan w:val="1"/>
+            <w:tcBorders>
+              <w:top w:val="single" w:color="000000" w:sz="4"/>
+              <w:left w:val="single" w:color="000000" w:sz="4"/>
+              <w:bottom w:val="single" w:color="000000" w:sz="4"/>
+              <w:right w:val="single" w:color="000000" w:sz="4"/>
+            </w:tcBorders>
+            <w:shd w:fill="EBF5FB" w:val="clear"/>
+            <w:vAlign w:val="center"/>
+          </w:tcPr>
+          <w:p>
+            <w:pPr>
+              <w:spacing w:after="30" w:before="30"/>
+              <w:jc w:val="center"/>
+            </w:pPr>
+            <w:r>
+              <w:rPr>
+                <w:rFonts w:ascii="Arial" w:cs="Arial" w:eastAsia="Arial" w:hAnsi="Arial"/>
+                <w:color w:val="000000"/>
+                <w:sz w:val="16"/>
+                <w:szCs w:val="16"/>
+              </w:rPr>
+              <w:t xml:space="preserve">11</w:t>
+            </w:r>
+          </w:p>
+        </w:tc>
+        <w:tc>
+          <w:tcPr>
+            <w:tcW w:type="dxa" w:w="2200"/>
+            <w:gridSpan w:val="1"/>
+            <w:tcBorders>
+              <w:top w:val="single" w:color="000000" w:sz="4"/>
+              <w:left w:val="single" w:color="000000" w:sz="4"/>
+              <w:bottom w:val="single" w:color="000000" w:sz="4"/>
+              <w:right w:val="single" w:color="000000" w:sz="4"/>
+            </w:tcBorders>
+            <w:shd w:fill="EBF5FB" w:val="clear"/>
+            <w:vAlign w:val="center"/>
+          </w:tcPr>
+          <w:p>
+            <w:pPr>
+              <w:spacing w:after="50" w:before="50"/>
+              <w:jc w:val="left"/>
+            </w:pPr>
+            <w:r>
+              <w:rPr>
+                <w:rFonts w:ascii="Arial" w:cs="Arial" w:eastAsia="Arial" w:hAnsi="Arial"/>
+                <w:color w:val="000000"/>
+                <w:sz w:val="18"/>
+                <w:szCs w:val="18"/>
+              </w:rPr>
+              <w:t xml:space="preserve"/>
+            </w:r>
+          </w:p>
+        </w:tc>
+        <w:tc>
+          <w:tcPr>
+            <w:tcW w:type="dxa" w:w="1000"/>
+            <w:gridSpan w:val="1"/>
+            <w:tcBorders>
+              <w:top w:val="single" w:color="000000" w:sz="4"/>
+              <w:left w:val="single" w:color="000000" w:sz="4"/>
+              <w:bottom w:val="single" w:color="000000" w:sz="4"/>
+              <w:right w:val="single" w:color="000000" w:sz="4"/>
+            </w:tcBorders>
+            <w:shd w:fill="EBF5FB" w:val="clear"/>
+            <w:vAlign w:val="center"/>
+          </w:tcPr>
+          <w:p>
+            <w:pPr>
+              <w:spacing w:after="50" w:before="50"/>
+              <w:jc w:val="left"/>
+            </w:pPr>
+            <w:r>
+              <w:rPr>
+                <w:rFonts w:ascii="Arial" w:cs="Arial" w:eastAsia="Arial" w:hAnsi="Arial"/>
+                <w:color w:val="000000"/>
+                <w:sz w:val="18"/>
+                <w:szCs w:val="18"/>
+              </w:rPr>
+              <w:t xml:space="preserve"/>
+            </w:r>
+          </w:p>
+        </w:tc>
+        <w:tc>
+          <w:tcPr>
+            <w:tcW w:type="dxa" w:w="1300"/>
+            <w:gridSpan w:val="1"/>
+            <w:tcBorders>
+              <w:top w:val="single" w:color="000000" w:sz="4"/>
+              <w:left w:val="single" w:color="000000" w:sz="4"/>
+              <w:bottom w:val="single" w:color="000000" w:sz="4"/>
+              <w:right w:val="single" w:color="000000" w:sz="4"/>
+            </w:tcBorders>
+            <w:shd w:fill="EBF5FB" w:val="clear"/>
+            <w:vAlign w:val="center"/>
+          </w:tcPr>
+          <w:p>
+            <w:pPr>
+              <w:spacing w:after="50" w:before="50"/>
+              <w:jc w:val="left"/>
+            </w:pPr>
+            <w:r>
+              <w:rPr>
+                <w:rFonts w:ascii="Arial" w:cs="Arial" w:eastAsia="Arial" w:hAnsi="Arial"/>
+                <w:color w:val="000000"/>
+                <w:sz w:val="18"/>
+                <w:szCs w:val="18"/>
+              </w:rPr>
+              <w:t xml:space="preserve"/>
+            </w:r>
+          </w:p>
+        </w:tc>
+        <w:tc>
+          <w:tcPr>
+            <w:tcW w:type="dxa" w:w="780"/>
+            <w:gridSpan w:val="1"/>
+            <w:tcBorders>
+              <w:top w:val="single" w:color="000000" w:sz="4"/>
+              <w:left w:val="single" w:color="000000" w:sz="4"/>
+              <w:bottom w:val="single" w:color="000000" w:sz="4"/>
+              <w:right w:val="single" w:color="000000" w:sz="4"/>
+            </w:tcBorders>
+            <w:shd w:fill="EBF5FB" w:val="clear"/>
+            <w:vAlign w:val="center"/>
+          </w:tcPr>
+          <w:p>
+            <w:pPr>
+              <w:spacing w:after="50" w:before="50"/>
+              <w:jc w:val="left"/>
+            </w:pPr>
+            <w:r>
+              <w:rPr>
+                <w:rFonts w:ascii="Arial" w:cs="Arial" w:eastAsia="Arial" w:hAnsi="Arial"/>
+                <w:color w:val="000000"/>
+                <w:sz w:val="18"/>
+                <w:szCs w:val="18"/>
+              </w:rPr>
+              <w:t xml:space="preserve"/>
+            </w:r>
+          </w:p>
+        </w:tc>
+        <w:tc>
+          <w:tcPr>
+            <w:tcW w:type="dxa" w:w="780"/>
+            <w:gridSpan w:val="1"/>
+            <w:tcBorders>
+              <w:top w:val="single" w:color="000000" w:sz="4"/>
+              <w:left w:val="single" w:color="000000" w:sz="4"/>
+              <w:bottom w:val="single" w:color="000000" w:sz="4"/>
+              <w:right w:val="single" w:color="000000" w:sz="4"/>
+            </w:tcBorders>
+            <w:shd w:fill="EBF5FB" w:val="clear"/>
+            <w:vAlign w:val="center"/>
+          </w:tcPr>
+          <w:p>
+            <w:pPr>
+              <w:spacing w:after="50" w:before="50"/>
+              <w:jc w:val="left"/>
+            </w:pPr>
+            <w:r>
+              <w:rPr>
+                <w:rFonts w:ascii="Arial" w:cs="Arial" w:eastAsia="Arial" w:hAnsi="Arial"/>
+                <w:color w:val="000000"/>
+                <w:sz w:val="18"/>
+                <w:szCs w:val="18"/>
+              </w:rPr>
+              <w:t xml:space="preserve"/>
+            </w:r>
+          </w:p>
+        </w:tc>
+        <w:tc>
+          <w:tcPr>
+            <w:tcW w:type="dxa" w:w="780"/>
+            <w:gridSpan w:val="1"/>
+            <w:tcBorders>
+              <w:top w:val="single" w:color="000000" w:sz="4"/>
+              <w:left w:val="single" w:color="000000" w:sz="4"/>
+              <w:bottom w:val="single" w:color="000000" w:sz="4"/>
+              <w:right w:val="single" w:color="000000" w:sz="4"/>
+            </w:tcBorders>
+            <w:shd w:fill="EBF5FB" w:val="clear"/>
+            <w:vAlign w:val="center"/>
+          </w:tcPr>
+          <w:p>
+            <w:pPr>
+              <w:spacing w:after="50" w:before="50"/>
+              <w:jc w:val="left"/>
+            </w:pPr>
+            <w:r>
+              <w:rPr>
+                <w:rFonts w:ascii="Arial" w:cs="Arial" w:eastAsia="Arial" w:hAnsi="Arial"/>
+                <w:color w:val="000000"/>
+                <w:sz w:val="18"/>
+                <w:szCs w:val="18"/>
+              </w:rPr>
+              <w:t xml:space="preserve"/>
+            </w:r>
+          </w:p>
+        </w:tc>
+        <w:tc>
+          <w:tcPr>
+            <w:tcW w:type="dxa" w:w="780"/>
+            <w:gridSpan w:val="1"/>
+            <w:tcBorders>
+              <w:top w:val="single" w:color="000000" w:sz="4"/>
+              <w:left w:val="single" w:color="000000" w:sz="4"/>
+              <w:bottom w:val="single" w:color="000000" w:sz="4"/>
+              <w:right w:val="single" w:color="000000" w:sz="4"/>
+            </w:tcBorders>
+            <w:shd w:fill="EBF5FB" w:val="clear"/>
+            <w:vAlign w:val="center"/>
+          </w:tcPr>
+          <w:p>
+            <w:pPr>
+              <w:spacing w:after="50" w:before="50"/>
+              <w:jc w:val="left"/>
+            </w:pPr>
+            <w:r>
+              <w:rPr>
+                <w:rFonts w:ascii="Arial" w:cs="Arial" w:eastAsia="Arial" w:hAnsi="Arial"/>
+                <w:color w:val="000000"/>
+                <w:sz w:val="18"/>
+                <w:szCs w:val="18"/>
+              </w:rPr>
+              <w:t xml:space="preserve"/>
+            </w:r>
+          </w:p>
+        </w:tc>
+        <w:tc>
+          <w:tcPr>
+            <w:tcW w:type="dxa" w:w="2720"/>
+            <w:gridSpan w:val="1"/>
+            <w:tcBorders>
+              <w:top w:val="single" w:color="000000" w:sz="4"/>
+              <w:left w:val="single" w:color="000000" w:sz="4"/>
+              <w:bottom w:val="single" w:color="000000" w:sz="4"/>
+              <w:right w:val="single" w:color="000000" w:sz="4"/>
+            </w:tcBorders>
+            <w:shd w:fill="EBF5FB" w:val="clear"/>
+            <w:vAlign w:val="center"/>
+          </w:tcPr>
+          <w:p>
+            <w:pPr>
+              <w:spacing w:after="50" w:before="50"/>
+              <w:jc w:val="left"/>
+            </w:pPr>
+            <w:r>
+              <w:rPr>
+                <w:rFonts w:ascii="Arial" w:cs="Arial" w:eastAsia="Arial" w:hAnsi="Arial"/>
+                <w:color w:val="000000"/>
+                <w:sz w:val="18"/>
+                <w:szCs w:val="18"/>
+              </w:rPr>
+              <w:t xml:space="preserve"/>
+            </w:r>
+          </w:p>
+        </w:tc>
+      </w:tr>
+      <w:tr>
+        <w:trPr>
+          <w:trHeight w:val="360" w:hRule="exact"/>
+        </w:trPr>
+        <w:tc>
+          <w:tcPr>
+            <w:tcW w:type="dxa" w:w="460"/>
+            <w:gridSpan w:val="1"/>
+            <w:tcBorders>
+              <w:top w:val="single" w:color="000000" w:sz="4"/>
+              <w:left w:val="single" w:color="000000" w:sz="4"/>
+              <w:bottom w:val="single" w:color="000000" w:sz="4"/>
+              <w:right w:val="single" w:color="000000" w:sz="4"/>
+            </w:tcBorders>
+            <w:vAlign w:val="center"/>
+          </w:tcPr>
+          <w:p>
+            <w:pPr>
+              <w:spacing w:after="30" w:before="30"/>
+              <w:jc w:val="center"/>
+            </w:pPr>
+            <w:r>
+              <w:rPr>
+                <w:rFonts w:ascii="Arial" w:cs="Arial" w:eastAsia="Arial" w:hAnsi="Arial"/>
+                <w:color w:val="000000"/>
+                <w:sz w:val="16"/>
+                <w:szCs w:val="16"/>
+              </w:rPr>
+              <w:t xml:space="preserve">12</w:t>
+            </w:r>
+          </w:p>
+        </w:tc>
+        <w:tc>
+          <w:tcPr>
+            <w:tcW w:type="dxa" w:w="2200"/>
+            <w:gridSpan w:val="1"/>
+            <w:tcBorders>
+              <w:top w:val="single" w:color="000000" w:sz="4"/>
+              <w:left w:val="single" w:color="000000" w:sz="4"/>
+              <w:bottom w:val="single" w:color="000000" w:sz="4"/>
+              <w:right w:val="single" w:color="000000" w:sz="4"/>
+            </w:tcBorders>
+            <w:vAlign w:val="center"/>
+          </w:tcPr>
+          <w:p>
+            <w:pPr>
+              <w:spacing w:after="50" w:before="50"/>
+              <w:jc w:val="left"/>
+            </w:pPr>
+            <w:r>
+              <w:rPr>
+                <w:rFonts w:ascii="Arial" w:cs="Arial" w:eastAsia="Arial" w:hAnsi="Arial"/>
+                <w:color w:val="000000"/>
+                <w:sz w:val="18"/>
+                <w:szCs w:val="18"/>
+              </w:rPr>
+              <w:t xml:space="preserve"/>
+            </w:r>
+          </w:p>
+        </w:tc>
+        <w:tc>
+          <w:tcPr>
+            <w:tcW w:type="dxa" w:w="1000"/>
+            <w:gridSpan w:val="1"/>
+            <w:tcBorders>
+              <w:top w:val="single" w:color="000000" w:sz="4"/>
+              <w:left w:val="single" w:color="000000" w:sz="4"/>
+              <w:bottom w:val="single" w:color="000000" w:sz="4"/>
+              <w:right w:val="single" w:color="000000" w:sz="4"/>
+            </w:tcBorders>
+            <w:vAlign w:val="center"/>
+          </w:tcPr>
+          <w:p>
+            <w:pPr>
+              <w:spacing w:after="50" w:before="50"/>
+              <w:jc w:val="left"/>
+            </w:pPr>
+            <w:r>
+              <w:rPr>
+                <w:rFonts w:ascii="Arial" w:cs="Arial" w:eastAsia="Arial" w:hAnsi="Arial"/>
+                <w:color w:val="000000"/>
+                <w:sz w:val="18"/>
+                <w:szCs w:val="18"/>
+              </w:rPr>
+              <w:t xml:space="preserve"/>
+            </w:r>
+          </w:p>
+        </w:tc>
+        <w:tc>
+          <w:tcPr>
+            <w:tcW w:type="dxa" w:w="1300"/>
+            <w:gridSpan w:val="1"/>
+            <w:tcBorders>
+              <w:top w:val="single" w:color="000000" w:sz="4"/>
+              <w:left w:val="single" w:color="000000" w:sz="4"/>
+              <w:bottom w:val="single" w:color="000000" w:sz="4"/>
+              <w:right w:val="single" w:color="000000" w:sz="4"/>
+            </w:tcBorders>
+            <w:vAlign w:val="center"/>
+          </w:tcPr>
+          <w:p>
+            <w:pPr>
+              <w:spacing w:after="50" w:before="50"/>
+              <w:jc w:val="left"/>
+            </w:pPr>
+            <w:r>
+              <w:rPr>
+                <w:rFonts w:ascii="Arial" w:cs="Arial" w:eastAsia="Arial" w:hAnsi="Arial"/>
+                <w:color w:val="000000"/>
+                <w:sz w:val="18"/>
+                <w:szCs w:val="18"/>
+              </w:rPr>
+              <w:t xml:space="preserve"/>
+            </w:r>
+          </w:p>
+        </w:tc>
+        <w:tc>
+          <w:tcPr>
+            <w:tcW w:type="dxa" w:w="780"/>
+            <w:gridSpan w:val="1"/>
+            <w:tcBorders>
+              <w:top w:val="single" w:color="000000" w:sz="4"/>
+              <w:left w:val="single" w:color="000000" w:sz="4"/>
+              <w:bottom w:val="single" w:color="000000" w:sz="4"/>
+              <w:right w:val="single" w:color="000000" w:sz="4"/>
+            </w:tcBorders>
+            <w:vAlign w:val="center"/>
+          </w:tcPr>
+          <w:p>
+            <w:pPr>
+              <w:spacing w:after="50" w:before="50"/>
+              <w:jc w:val="left"/>
+            </w:pPr>
+            <w:r>
+              <w:rPr>
+                <w:rFonts w:ascii="Arial" w:cs="Arial" w:eastAsia="Arial" w:hAnsi="Arial"/>
+                <w:color w:val="000000"/>
+                <w:sz w:val="18"/>
+                <w:szCs w:val="18"/>
+              </w:rPr>
+              <w:t xml:space="preserve"/>
+            </w:r>
+          </w:p>
+        </w:tc>
+        <w:tc>
+          <w:tcPr>
+            <w:tcW w:type="dxa" w:w="780"/>
+            <w:gridSpan w:val="1"/>
+            <w:tcBorders>
+              <w:top w:val="single" w:color="000000" w:sz="4"/>
+              <w:left w:val="single" w:color="000000" w:sz="4"/>
+              <w:bottom w:val="single" w:color="000000" w:sz="4"/>
+              <w:right w:val="single" w:color="000000" w:sz="4"/>
+            </w:tcBorders>
+            <w:vAlign w:val="center"/>
+          </w:tcPr>
+          <w:p>
+            <w:pPr>
+              <w:spacing w:after="50" w:before="50"/>
+              <w:jc w:val="left"/>
+            </w:pPr>
+            <w:r>
+              <w:rPr>
+                <w:rFonts w:ascii="Arial" w:cs="Arial" w:eastAsia="Arial" w:hAnsi="Arial"/>
+                <w:color w:val="000000"/>
+                <w:sz w:val="18"/>
+                <w:szCs w:val="18"/>
+              </w:rPr>
+              <w:t xml:space="preserve"/>
+            </w:r>
+          </w:p>
+        </w:tc>
+        <w:tc>
+          <w:tcPr>
+            <w:tcW w:type="dxa" w:w="780"/>
+            <w:gridSpan w:val="1"/>
+            <w:tcBorders>
+              <w:top w:val="single" w:color="000000" w:sz="4"/>
+              <w:left w:val="single" w:color="000000" w:sz="4"/>
+              <w:bottom w:val="single" w:color="000000" w:sz="4"/>
+              <w:right w:val="single" w:color="000000" w:sz="4"/>
+            </w:tcBorders>
+            <w:vAlign w:val="center"/>
+          </w:tcPr>
+          <w:p>
+            <w:pPr>
+              <w:spacing w:after="50" w:before="50"/>
+              <w:jc w:val="left"/>
+            </w:pPr>
+            <w:r>
+              <w:rPr>
+                <w:rFonts w:ascii="Arial" w:cs="Arial" w:eastAsia="Arial" w:hAnsi="Arial"/>
+                <w:color w:val="000000"/>
+                <w:sz w:val="18"/>
+                <w:szCs w:val="18"/>
+              </w:rPr>
+              <w:t xml:space="preserve"/>
+            </w:r>
+          </w:p>
+        </w:tc>
+        <w:tc>
+          <w:tcPr>
+            <w:tcW w:type="dxa" w:w="780"/>
+            <w:gridSpan w:val="1"/>
+            <w:tcBorders>
+              <w:top w:val="single" w:color="000000" w:sz="4"/>
+              <w:left w:val="single" w:color="000000" w:sz="4"/>
+              <w:bottom w:val="single" w:color="000000" w:sz="4"/>
+              <w:right w:val="single" w:color="000000" w:sz="4"/>
+            </w:tcBorders>
+            <w:vAlign w:val="center"/>
+          </w:tcPr>
+          <w:p>
+            <w:pPr>
+              <w:spacing w:after="50" w:before="50"/>
+              <w:jc w:val="left"/>
+            </w:pPr>
+            <w:r>
+              <w:rPr>
+                <w:rFonts w:ascii="Arial" w:cs="Arial" w:eastAsia="Arial" w:hAnsi="Arial"/>
+                <w:color w:val="000000"/>
+                <w:sz w:val="18"/>
+                <w:szCs w:val="18"/>
+              </w:rPr>
+              <w:t xml:space="preserve"/>
+            </w:r>
+          </w:p>
+        </w:tc>
+        <w:tc>
+          <w:tcPr>
+            <w:tcW w:type="dxa" w:w="2720"/>
+            <w:gridSpan w:val="1"/>
+            <w:tcBorders>
+              <w:top w:val="single" w:color="000000" w:sz="4"/>
+              <w:left w:val="single" w:color="000000" w:sz="4"/>
+              <w:bottom w:val="single" w:color="000000" w:sz="4"/>
+              <w:right w:val="single" w:color="000000" w:sz="4"/>
+            </w:tcBorders>
+            <w:vAlign w:val="center"/>
+          </w:tcPr>
+          <w:p>
+            <w:pPr>
+              <w:spacing w:after="50" w:before="50"/>
+              <w:jc w:val="left"/>
+            </w:pPr>
+            <w:r>
+              <w:rPr>
+                <w:rFonts w:ascii="Arial" w:cs="Arial" w:eastAsia="Arial" w:hAnsi="Arial"/>
+                <w:color w:val="000000"/>
+                <w:sz w:val="18"/>
+                <w:szCs w:val="18"/>
+              </w:rPr>
+              <w:t xml:space="preserve"/>
+            </w:r>
+          </w:p>
+        </w:tc>
+      </w:tr>
+      <w:tr>
+        <w:trPr>
+          <w:trHeight w:val="360" w:hRule="exact"/>
+        </w:trPr>
+        <w:tc>
+          <w:tcPr>
+            <w:tcW w:type="dxa" w:w="460"/>
+            <w:gridSpan w:val="1"/>
+            <w:tcBorders>
+              <w:top w:val="single" w:color="000000" w:sz="4"/>
+              <w:left w:val="single" w:color="000000" w:sz="4"/>
+              <w:bottom w:val="single" w:color="000000" w:sz="4"/>
+              <w:right w:val="single" w:color="000000" w:sz="4"/>
+            </w:tcBorders>
+            <w:shd w:fill="EBF5FB" w:val="clear"/>
+            <w:vAlign w:val="center"/>
+          </w:tcPr>
+          <w:p>
+            <w:pPr>
+              <w:spacing w:after="30" w:before="30"/>
+              <w:jc w:val="center"/>
+            </w:pPr>
+            <w:r>
+              <w:rPr>
+                <w:rFonts w:ascii="Arial" w:cs="Arial" w:eastAsia="Arial" w:hAnsi="Arial"/>
+                <w:color w:val="000000"/>
+                <w:sz w:val="16"/>
+                <w:szCs w:val="16"/>
+              </w:rPr>
+              <w:t xml:space="preserve">13</w:t>
+            </w:r>
+          </w:p>
+        </w:tc>
+        <w:tc>
+          <w:tcPr>
+            <w:tcW w:type="dxa" w:w="2200"/>
+            <w:gridSpan w:val="1"/>
+            <w:tcBorders>
+              <w:top w:val="single" w:color="000000" w:sz="4"/>
+              <w:left w:val="single" w:color="000000" w:sz="4"/>
+              <w:bottom w:val="single" w:color="000000" w:sz="4"/>
+              <w:right w:val="single" w:color="000000" w:sz="4"/>
+            </w:tcBorders>
+            <w:shd w:fill="EBF5FB" w:val="clear"/>
+            <w:vAlign w:val="center"/>
+          </w:tcPr>
+          <w:p>
+            <w:pPr>
+              <w:spacing w:after="50" w:before="50"/>
+              <w:jc w:val="left"/>
+            </w:pPr>
+            <w:r>
+              <w:rPr>
+                <w:rFonts w:ascii="Arial" w:cs="Arial" w:eastAsia="Arial" w:hAnsi="Arial"/>
+                <w:color w:val="000000"/>
+                <w:sz w:val="18"/>
+                <w:szCs w:val="18"/>
+              </w:rPr>
+              <w:t xml:space="preserve"/>
+            </w:r>
+          </w:p>
+        </w:tc>
+        <w:tc>
+          <w:tcPr>
+            <w:tcW w:type="dxa" w:w="1000"/>
+            <w:gridSpan w:val="1"/>
+            <w:tcBorders>
+              <w:top w:val="single" w:color="000000" w:sz="4"/>
+              <w:left w:val="single" w:color="000000" w:sz="4"/>
+              <w:bottom w:val="single" w:color="000000" w:sz="4"/>
+              <w:right w:val="single" w:color="000000" w:sz="4"/>
+            </w:tcBorders>
+            <w:shd w:fill="EBF5FB" w:val="clear"/>
+            <w:vAlign w:val="center"/>
+          </w:tcPr>
+          <w:p>
+            <w:pPr>
+              <w:spacing w:after="50" w:before="50"/>
+              <w:jc w:val="left"/>
+            </w:pPr>
+            <w:r>
+              <w:rPr>
+                <w:rFonts w:ascii="Arial" w:cs="Arial" w:eastAsia="Arial" w:hAnsi="Arial"/>
+                <w:color w:val="000000"/>
+                <w:sz w:val="18"/>
+                <w:szCs w:val="18"/>
+              </w:rPr>
+              <w:t xml:space="preserve"/>
+            </w:r>
+          </w:p>
+        </w:tc>
+        <w:tc>
+          <w:tcPr>
+            <w:tcW w:type="dxa" w:w="1300"/>
+            <w:gridSpan w:val="1"/>
+            <w:tcBorders>
+              <w:top w:val="single" w:color="000000" w:sz="4"/>
+              <w:left w:val="single" w:color="000000" w:sz="4"/>
+              <w:bottom w:val="single" w:color="000000" w:sz="4"/>
+              <w:right w:val="single" w:color="000000" w:sz="4"/>
+            </w:tcBorders>
+            <w:shd w:fill="EBF5FB" w:val="clear"/>
+            <w:vAlign w:val="center"/>
+          </w:tcPr>
+          <w:p>
+            <w:pPr>
+              <w:spacing w:after="50" w:before="50"/>
+              <w:jc w:val="left"/>
+            </w:pPr>
+            <w:r>
+              <w:rPr>
+                <w:rFonts w:ascii="Arial" w:cs="Arial" w:eastAsia="Arial" w:hAnsi="Arial"/>
+                <w:color w:val="000000"/>
+                <w:sz w:val="18"/>
+                <w:szCs w:val="18"/>
+              </w:rPr>
+              <w:t xml:space="preserve"/>
+            </w:r>
+          </w:p>
+        </w:tc>
+        <w:tc>
+          <w:tcPr>
+            <w:tcW w:type="dxa" w:w="780"/>
+            <w:gridSpan w:val="1"/>
+            <w:tcBorders>
+              <w:top w:val="single" w:color="000000" w:sz="4"/>
+              <w:left w:val="single" w:color="000000" w:sz="4"/>
+              <w:bottom w:val="single" w:color="000000" w:sz="4"/>
+              <w:right w:val="single" w:color="000000" w:sz="4"/>
+            </w:tcBorders>
+            <w:shd w:fill="EBF5FB" w:val="clear"/>
+            <w:vAlign w:val="center"/>
+          </w:tcPr>
+          <w:p>
+            <w:pPr>
+              <w:spacing w:after="50" w:before="50"/>
+              <w:jc w:val="left"/>
+            </w:pPr>
+            <w:r>
+              <w:rPr>
+                <w:rFonts w:ascii="Arial" w:cs="Arial" w:eastAsia="Arial" w:hAnsi="Arial"/>
+                <w:color w:val="000000"/>
+                <w:sz w:val="18"/>
+                <w:szCs w:val="18"/>
+              </w:rPr>
+              <w:t xml:space="preserve"/>
+            </w:r>
+          </w:p>
+        </w:tc>
+        <w:tc>
+          <w:tcPr>
+            <w:tcW w:type="dxa" w:w="780"/>
+            <w:gridSpan w:val="1"/>
+            <w:tcBorders>
+              <w:top w:val="single" w:color="000000" w:sz="4"/>
+              <w:left w:val="single" w:color="000000" w:sz="4"/>
+              <w:bottom w:val="single" w:color="000000" w:sz="4"/>
+              <w:right w:val="single" w:color="000000" w:sz="4"/>
+            </w:tcBorders>
+            <w:shd w:fill="EBF5FB" w:val="clear"/>
+            <w:vAlign w:val="center"/>
+          </w:tcPr>
+          <w:p>
+            <w:pPr>
+              <w:spacing w:after="50" w:before="50"/>
+              <w:jc w:val="left"/>
+            </w:pPr>
+            <w:r>
+              <w:rPr>
+                <w:rFonts w:ascii="Arial" w:cs="Arial" w:eastAsia="Arial" w:hAnsi="Arial"/>
+                <w:color w:val="000000"/>
+                <w:sz w:val="18"/>
+                <w:szCs w:val="18"/>
+              </w:rPr>
+              <w:t xml:space="preserve"/>
+            </w:r>
+          </w:p>
+        </w:tc>
+        <w:tc>
+          <w:tcPr>
+            <w:tcW w:type="dxa" w:w="780"/>
+            <w:gridSpan w:val="1"/>
+            <w:tcBorders>
+              <w:top w:val="single" w:color="000000" w:sz="4"/>
+              <w:left w:val="single" w:color="000000" w:sz="4"/>
+              <w:bottom w:val="single" w:color="000000" w:sz="4"/>
+              <w:right w:val="single" w:color="000000" w:sz="4"/>
+            </w:tcBorders>
+            <w:shd w:fill="EBF5FB" w:val="clear"/>
+            <w:vAlign w:val="center"/>
+          </w:tcPr>
+          <w:p>
+            <w:pPr>
+              <w:spacing w:after="50" w:before="50"/>
+              <w:jc w:val="left"/>
+            </w:pPr>
+            <w:r>
+              <w:rPr>
+                <w:rFonts w:ascii="Arial" w:cs="Arial" w:eastAsia="Arial" w:hAnsi="Arial"/>
+                <w:color w:val="000000"/>
+                <w:sz w:val="18"/>
+                <w:szCs w:val="18"/>
+              </w:rPr>
+              <w:t xml:space="preserve"/>
+            </w:r>
+          </w:p>
+        </w:tc>
+        <w:tc>
+          <w:tcPr>
+            <w:tcW w:type="dxa" w:w="780"/>
+            <w:gridSpan w:val="1"/>
+            <w:tcBorders>
+              <w:top w:val="single" w:color="000000" w:sz="4"/>
+              <w:left w:val="single" w:color="000000" w:sz="4"/>
+              <w:bottom w:val="single" w:color="000000" w:sz="4"/>
+              <w:right w:val="single" w:color="000000" w:sz="4"/>
+            </w:tcBorders>
+            <w:shd w:fill="EBF5FB" w:val="clear"/>
+            <w:vAlign w:val="center"/>
+          </w:tcPr>
+          <w:p>
+            <w:pPr>
+              <w:spacing w:after="50" w:before="50"/>
+              <w:jc w:val="left"/>
+            </w:pPr>
+            <w:r>
+              <w:rPr>
+                <w:rFonts w:ascii="Arial" w:cs="Arial" w:eastAsia="Arial" w:hAnsi="Arial"/>
+                <w:color w:val="000000"/>
+                <w:sz w:val="18"/>
+                <w:szCs w:val="18"/>
+              </w:rPr>
+              <w:t xml:space="preserve"/>
+            </w:r>
+          </w:p>
+        </w:tc>
+        <w:tc>
+          <w:tcPr>
+            <w:tcW w:type="dxa" w:w="2720"/>
+            <w:gridSpan w:val="1"/>
+            <w:tcBorders>
+              <w:top w:val="single" w:color="000000" w:sz="4"/>
+              <w:left w:val="single" w:color="000000" w:sz="4"/>
+              <w:bottom w:val="single" w:color="000000" w:sz="4"/>
+              <w:right w:val="single" w:color="000000" w:sz="4"/>
+            </w:tcBorders>
+            <w:shd w:fill="EBF5FB" w:val="clear"/>
+            <w:vAlign w:val="center"/>
+          </w:tcPr>
+          <w:p>
+            <w:pPr>
+              <w:spacing w:after="50" w:before="50"/>
+              <w:jc w:val="left"/>
+            </w:pPr>
+            <w:r>
+              <w:rPr>
+                <w:rFonts w:ascii="Arial" w:cs="Arial" w:eastAsia="Arial" w:hAnsi="Arial"/>
+                <w:color w:val="000000"/>
+                <w:sz w:val="18"/>
+                <w:szCs w:val="18"/>
+              </w:rPr>
+              <w:t xml:space="preserve"/>
+            </w:r>
+          </w:p>
+        </w:tc>
+      </w:tr>
+      <w:tr>
+        <w:trPr>
+          <w:trHeight w:val="360" w:hRule="exact"/>
+        </w:trPr>
+        <w:tc>
+          <w:tcPr>
+            <w:tcW w:type="dxa" w:w="460"/>
+            <w:gridSpan w:val="1"/>
+            <w:tcBorders>
+              <w:top w:val="single" w:color="000000" w:sz="4"/>
+              <w:left w:val="single" w:color="000000" w:sz="4"/>
+              <w:bottom w:val="single" w:color="000000" w:sz="4"/>
+              <w:right w:val="single" w:color="000000" w:sz="4"/>
+            </w:tcBorders>
+            <w:vAlign w:val="center"/>
+          </w:tcPr>
+          <w:p>
+            <w:pPr>
+              <w:spacing w:after="30" w:before="30"/>
+              <w:jc w:val="center"/>
+            </w:pPr>
+            <w:r>
+              <w:rPr>
+                <w:rFonts w:ascii="Arial" w:cs="Arial" w:eastAsia="Arial" w:hAnsi="Arial"/>
+                <w:color w:val="000000"/>
+                <w:sz w:val="16"/>
+                <w:szCs w:val="16"/>
+              </w:rPr>
+              <w:t xml:space="preserve">14</w:t>
+            </w:r>
+          </w:p>
+        </w:tc>
+        <w:tc>
+          <w:tcPr>
+            <w:tcW w:type="dxa" w:w="2200"/>
+            <w:gridSpan w:val="1"/>
+            <w:tcBorders>
+              <w:top w:val="single" w:color="000000" w:sz="4"/>
+              <w:left w:val="single" w:color="000000" w:sz="4"/>
+              <w:bottom w:val="single" w:color="000000" w:sz="4"/>
+              <w:right w:val="single" w:color="000000" w:sz="4"/>
+            </w:tcBorders>
+            <w:vAlign w:val="center"/>
+          </w:tcPr>
+          <w:p>
+            <w:pPr>
+              <w:spacing w:after="50" w:before="50"/>
+              <w:jc w:val="left"/>
+            </w:pPr>
+            <w:r>
+              <w:rPr>
+                <w:rFonts w:ascii="Arial" w:cs="Arial" w:eastAsia="Arial" w:hAnsi="Arial"/>
+                <w:color w:val="000000"/>
+                <w:sz w:val="18"/>
+                <w:szCs w:val="18"/>
+              </w:rPr>
+              <w:t xml:space="preserve"/>
+            </w:r>
+          </w:p>
+        </w:tc>
+        <w:tc>
+          <w:tcPr>
+            <w:tcW w:type="dxa" w:w="1000"/>
+            <w:gridSpan w:val="1"/>
+            <w:tcBorders>
+              <w:top w:val="single" w:color="000000" w:sz="4"/>
+              <w:left w:val="single" w:color="000000" w:sz="4"/>
+              <w:bottom w:val="single" w:color="000000" w:sz="4"/>
+              <w:right w:val="single" w:color="000000" w:sz="4"/>
+            </w:tcBorders>
+            <w:vAlign w:val="center"/>
+          </w:tcPr>
+          <w:p>
+            <w:pPr>
+              <w:spacing w:after="50" w:before="50"/>
+              <w:jc w:val="left"/>
+            </w:pPr>
+            <w:r>
+              <w:rPr>
+                <w:rFonts w:ascii="Arial" w:cs="Arial" w:eastAsia="Arial" w:hAnsi="Arial"/>
+                <w:color w:val="000000"/>
+                <w:sz w:val="18"/>
+                <w:szCs w:val="18"/>
+              </w:rPr>
+              <w:t xml:space="preserve"/>
+            </w:r>
+          </w:p>
+        </w:tc>
+        <w:tc>
+          <w:tcPr>
+            <w:tcW w:type="dxa" w:w="1300"/>
+            <w:gridSpan w:val="1"/>
+            <w:tcBorders>
+              <w:top w:val="single" w:color="000000" w:sz="4"/>
+              <w:left w:val="single" w:color="000000" w:sz="4"/>
+              <w:bottom w:val="single" w:color="000000" w:sz="4"/>
+              <w:right w:val="single" w:color="000000" w:sz="4"/>
+            </w:tcBorders>
+            <w:vAlign w:val="center"/>
+          </w:tcPr>
+          <w:p>
+            <w:pPr>
+              <w:spacing w:after="50" w:before="50"/>
+              <w:jc w:val="left"/>
+            </w:pPr>
+            <w:r>
+              <w:rPr>
+                <w:rFonts w:ascii="Arial" w:cs="Arial" w:eastAsia="Arial" w:hAnsi="Arial"/>
+                <w:color w:val="000000"/>
+                <w:sz w:val="18"/>
+                <w:szCs w:val="18"/>
+              </w:rPr>
+              <w:t xml:space="preserve"/>
+            </w:r>
+          </w:p>
+        </w:tc>
+        <w:tc>
+          <w:tcPr>
+            <w:tcW w:type="dxa" w:w="780"/>
+            <w:gridSpan w:val="1"/>
+            <w:tcBorders>
+              <w:top w:val="single" w:color="000000" w:sz="4"/>
+              <w:left w:val="single" w:color="000000" w:sz="4"/>
+              <w:bottom w:val="single" w:color="000000" w:sz="4"/>
+              <w:right w:val="single" w:color="000000" w:sz="4"/>
+            </w:tcBorders>
+            <w:vAlign w:val="center"/>
+          </w:tcPr>
+          <w:p>
+            <w:pPr>
+              <w:spacing w:after="50" w:before="50"/>
+              <w:jc w:val="left"/>
+            </w:pPr>
+            <w:r>
+              <w:rPr>
+                <w:rFonts w:ascii="Arial" w:cs="Arial" w:eastAsia="Arial" w:hAnsi="Arial"/>
+                <w:color w:val="000000"/>
+                <w:sz w:val="18"/>
+                <w:szCs w:val="18"/>
+              </w:rPr>
+              <w:t xml:space="preserve"/>
+            </w:r>
+          </w:p>
+        </w:tc>
+        <w:tc>
+          <w:tcPr>
+            <w:tcW w:type="dxa" w:w="780"/>
+            <w:gridSpan w:val="1"/>
+            <w:tcBorders>
+              <w:top w:val="single" w:color="000000" w:sz="4"/>
+              <w:left w:val="single" w:color="000000" w:sz="4"/>
+              <w:bottom w:val="single" w:color="000000" w:sz="4"/>
+              <w:right w:val="single" w:color="000000" w:sz="4"/>
+            </w:tcBorders>
+            <w:vAlign w:val="center"/>
+          </w:tcPr>
+          <w:p>
+            <w:pPr>
+              <w:spacing w:after="50" w:before="50"/>
+              <w:jc w:val="left"/>
+            </w:pPr>
+            <w:r>
+              <w:rPr>
+                <w:rFonts w:ascii="Arial" w:cs="Arial" w:eastAsia="Arial" w:hAnsi="Arial"/>
+                <w:color w:val="000000"/>
+                <w:sz w:val="18"/>
+                <w:szCs w:val="18"/>
+              </w:rPr>
+              <w:t xml:space="preserve"/>
+            </w:r>
+          </w:p>
+        </w:tc>
+        <w:tc>
+          <w:tcPr>
+            <w:tcW w:type="dxa" w:w="780"/>
+            <w:gridSpan w:val="1"/>
+            <w:tcBorders>
+              <w:top w:val="single" w:color="000000" w:sz="4"/>
+              <w:left w:val="single" w:color="000000" w:sz="4"/>
+              <w:bottom w:val="single" w:color="000000" w:sz="4"/>
+              <w:right w:val="single" w:color="000000" w:sz="4"/>
+            </w:tcBorders>
+            <w:vAlign w:val="center"/>
+          </w:tcPr>
+          <w:p>
+            <w:pPr>
+              <w:spacing w:after="50" w:before="50"/>
+              <w:jc w:val="left"/>
+            </w:pPr>
+            <w:r>
+              <w:rPr>
+                <w:rFonts w:ascii="Arial" w:cs="Arial" w:eastAsia="Arial" w:hAnsi="Arial"/>
+                <w:color w:val="000000"/>
+                <w:sz w:val="18"/>
+                <w:szCs w:val="18"/>
+              </w:rPr>
+              <w:t xml:space="preserve"/>
+            </w:r>
+          </w:p>
+        </w:tc>
+        <w:tc>
+          <w:tcPr>
+            <w:tcW w:type="dxa" w:w="780"/>
+            <w:gridSpan w:val="1"/>
+            <w:tcBorders>
+              <w:top w:val="single" w:color="000000" w:sz="4"/>
+              <w:left w:val="single" w:color="000000" w:sz="4"/>
+              <w:bottom w:val="single" w:color="000000" w:sz="4"/>
+              <w:right w:val="single" w:color="000000" w:sz="4"/>
+            </w:tcBorders>
+            <w:vAlign w:val="center"/>
+          </w:tcPr>
+          <w:p>
+            <w:pPr>
+              <w:spacing w:after="50" w:before="50"/>
+              <w:jc w:val="left"/>
+            </w:pPr>
+            <w:r>
+              <w:rPr>
+                <w:rFonts w:ascii="Arial" w:cs="Arial" w:eastAsia="Arial" w:hAnsi="Arial"/>
+                <w:color w:val="000000"/>
+                <w:sz w:val="18"/>
+                <w:szCs w:val="18"/>
+              </w:rPr>
+              <w:t xml:space="preserve"/>
+            </w:r>
+          </w:p>
+        </w:tc>
+        <w:tc>
+          <w:tcPr>
+            <w:tcW w:type="dxa" w:w="2720"/>
+            <w:gridSpan w:val="1"/>
+            <w:tcBorders>
+              <w:top w:val="single" w:color="000000" w:sz="4"/>
+              <w:left w:val="single" w:color="000000" w:sz="4"/>
+              <w:bottom w:val="single" w:color="000000" w:sz="4"/>
+              <w:right w:val="single" w:color="000000" w:sz="4"/>
+            </w:tcBorders>
+            <w:vAlign w:val="center"/>
+          </w:tcPr>
+          <w:p>
+            <w:pPr>
+              <w:spacing w:after="50" w:before="50"/>
+              <w:jc w:val="left"/>
+            </w:pPr>
+            <w:r>
+              <w:rPr>
+                <w:rFonts w:ascii="Arial" w:cs="Arial" w:eastAsia="Arial" w:hAnsi="Arial"/>
+                <w:color w:val="000000"/>
+                <w:sz w:val="18"/>
+                <w:szCs w:val="18"/>
+              </w:rPr>
+              <w:t xml:space="preserve"/>
+            </w:r>
+          </w:p>
+        </w:tc>
+      </w:tr>
+      <w:tr>
+        <w:trPr>
+          <w:trHeight w:val="360" w:hRule="exact"/>
+        </w:trPr>
+        <w:tc>
+          <w:tcPr>
+            <w:tcW w:type="dxa" w:w="460"/>
+            <w:gridSpan w:val="1"/>
+            <w:tcBorders>
+              <w:top w:val="single" w:color="000000" w:sz="4"/>
+              <w:left w:val="single" w:color="000000" w:sz="4"/>
+              <w:bottom w:val="single" w:color="000000" w:sz="4"/>
+              <w:right w:val="single" w:color="000000" w:sz="4"/>
+            </w:tcBorders>
+            <w:shd w:fill="EBF5FB" w:val="clear"/>
+            <w:vAlign w:val="center"/>
+          </w:tcPr>
+          <w:p>
+            <w:pPr>
+              <w:spacing w:after="30" w:before="30"/>
+              <w:jc w:val="center"/>
+            </w:pPr>
+            <w:r>
+              <w:rPr>
+                <w:rFonts w:ascii="Arial" w:cs="Arial" w:eastAsia="Arial" w:hAnsi="Arial"/>
+                <w:color w:val="000000"/>
+                <w:sz w:val="16"/>
+                <w:szCs w:val="16"/>
+              </w:rPr>
+              <w:t xml:space="preserve">15</w:t>
+            </w:r>
+          </w:p>
+        </w:tc>
+        <w:tc>
+          <w:tcPr>
+            <w:tcW w:type="dxa" w:w="2200"/>
+            <w:gridSpan w:val="1"/>
+            <w:tcBorders>
+              <w:top w:val="single" w:color="000000" w:sz="4"/>
+              <w:left w:val="single" w:color="000000" w:sz="4"/>
+              <w:bottom w:val="single" w:color="000000" w:sz="4"/>
+              <w:right w:val="single" w:color="000000" w:sz="4"/>
+            </w:tcBorders>
+            <w:shd w:fill="EBF5FB" w:val="clear"/>
+            <w:vAlign w:val="center"/>
+          </w:tcPr>
+          <w:p>
+            <w:pPr>
+              <w:spacing w:after="50" w:before="50"/>
+              <w:jc w:val="left"/>
+            </w:pPr>
+            <w:r>
+              <w:rPr>
+                <w:rFonts w:ascii="Arial" w:cs="Arial" w:eastAsia="Arial" w:hAnsi="Arial"/>
+                <w:color w:val="000000"/>
+                <w:sz w:val="18"/>
+                <w:szCs w:val="18"/>
+              </w:rPr>
+              <w:t xml:space="preserve"/>
+            </w:r>
+          </w:p>
+        </w:tc>
+        <w:tc>
+          <w:tcPr>
+            <w:tcW w:type="dxa" w:w="1000"/>
+            <w:gridSpan w:val="1"/>
+            <w:tcBorders>
+              <w:top w:val="single" w:color="000000" w:sz="4"/>
+              <w:left w:val="single" w:color="000000" w:sz="4"/>
+              <w:bottom w:val="single" w:color="000000" w:sz="4"/>
+              <w:right w:val="single" w:color="000000" w:sz="4"/>
+            </w:tcBorders>
+            <w:shd w:fill="EBF5FB" w:val="clear"/>
+            <w:vAlign w:val="center"/>
+          </w:tcPr>
+          <w:p>
+            <w:pPr>
+              <w:spacing w:after="50" w:before="50"/>
+              <w:jc w:val="left"/>
+            </w:pPr>
+            <w:r>
+              <w:rPr>
+                <w:rFonts w:ascii="Arial" w:cs="Arial" w:eastAsia="Arial" w:hAnsi="Arial"/>
+                <w:color w:val="000000"/>
+                <w:sz w:val="18"/>
+                <w:szCs w:val="18"/>
+              </w:rPr>
+              <w:t xml:space="preserve"/>
+            </w:r>
+          </w:p>
+        </w:tc>
+        <w:tc>
+          <w:tcPr>
+            <w:tcW w:type="dxa" w:w="1300"/>
+            <w:gridSpan w:val="1"/>
+            <w:tcBorders>
+              <w:top w:val="single" w:color="000000" w:sz="4"/>
+              <w:left w:val="single" w:color="000000" w:sz="4"/>
+              <w:bottom w:val="single" w:color="000000" w:sz="4"/>
+              <w:right w:val="single" w:color="000000" w:sz="4"/>
+            </w:tcBorders>
+            <w:shd w:fill="EBF5FB" w:val="clear"/>
+            <w:vAlign w:val="center"/>
+          </w:tcPr>
+          <w:p>
+            <w:pPr>
+              <w:spacing w:after="50" w:before="50"/>
+              <w:jc w:val="left"/>
+            </w:pPr>
+            <w:r>
+              <w:rPr>
+                <w:rFonts w:ascii="Arial" w:cs="Arial" w:eastAsia="Arial" w:hAnsi="Arial"/>
+                <w:color w:val="000000"/>
+                <w:sz w:val="18"/>
+                <w:szCs w:val="18"/>
+              </w:rPr>
+              <w:t xml:space="preserve"/>
+            </w:r>
+          </w:p>
+        </w:tc>
+        <w:tc>
+          <w:tcPr>
+            <w:tcW w:type="dxa" w:w="780"/>
+            <w:gridSpan w:val="1"/>
+            <w:tcBorders>
+              <w:top w:val="single" w:color="000000" w:sz="4"/>
+              <w:left w:val="single" w:color="000000" w:sz="4"/>
+              <w:bottom w:val="single" w:color="000000" w:sz="4"/>
+              <w:right w:val="single" w:color="000000" w:sz="4"/>
+            </w:tcBorders>
+            <w:shd w:fill="EBF5FB" w:val="clear"/>
+            <w:vAlign w:val="center"/>
+          </w:tcPr>
+          <w:p>
+            <w:pPr>
+              <w:spacing w:after="50" w:before="50"/>
+              <w:jc w:val="left"/>
+            </w:pPr>
+            <w:r>
+              <w:rPr>
+                <w:rFonts w:ascii="Arial" w:cs="Arial" w:eastAsia="Arial" w:hAnsi="Arial"/>
+                <w:color w:val="000000"/>
+                <w:sz w:val="18"/>
+                <w:szCs w:val="18"/>
+              </w:rPr>
+              <w:t xml:space="preserve"/>
+            </w:r>
+          </w:p>
+        </w:tc>
+        <w:tc>
+          <w:tcPr>
+            <w:tcW w:type="dxa" w:w="780"/>
+            <w:gridSpan w:val="1"/>
+            <w:tcBorders>
+              <w:top w:val="single" w:color="000000" w:sz="4"/>
+              <w:left w:val="single" w:color="000000" w:sz="4"/>
+              <w:bottom w:val="single" w:color="000000" w:sz="4"/>
+              <w:right w:val="single" w:color="000000" w:sz="4"/>
+            </w:tcBorders>
+            <w:shd w:fill="EBF5FB" w:val="clear"/>
+            <w:vAlign w:val="center"/>
+          </w:tcPr>
+          <w:p>
+            <w:pPr>
+              <w:spacing w:after="50" w:before="50"/>
+              <w:jc w:val="left"/>
+            </w:pPr>
+            <w:r>
+              <w:rPr>
+                <w:rFonts w:ascii="Arial" w:cs="Arial" w:eastAsia="Arial" w:hAnsi="Arial"/>
+                <w:color w:val="000000"/>
+                <w:sz w:val="18"/>
+                <w:szCs w:val="18"/>
+              </w:rPr>
+              <w:t xml:space="preserve"/>
+            </w:r>
+          </w:p>
+        </w:tc>
+        <w:tc>
+          <w:tcPr>
+            <w:tcW w:type="dxa" w:w="780"/>
+            <w:gridSpan w:val="1"/>
+            <w:tcBorders>
+              <w:top w:val="single" w:color="000000" w:sz="4"/>
+              <w:left w:val="single" w:color="000000" w:sz="4"/>
+              <w:bottom w:val="single" w:color="000000" w:sz="4"/>
+              <w:right w:val="single" w:color="000000" w:sz="4"/>
+            </w:tcBorders>
+            <w:shd w:fill="EBF5FB" w:val="clear"/>
+            <w:vAlign w:val="center"/>
+          </w:tcPr>
+          <w:p>
+            <w:pPr>
+              <w:spacing w:after="50" w:before="50"/>
+              <w:jc w:val="left"/>
+            </w:pPr>
+            <w:r>
+              <w:rPr>
+                <w:rFonts w:ascii="Arial" w:cs="Arial" w:eastAsia="Arial" w:hAnsi="Arial"/>
+                <w:color w:val="000000"/>
+                <w:sz w:val="18"/>
+                <w:szCs w:val="18"/>
+              </w:rPr>
+              <w:t xml:space="preserve"/>
+            </w:r>
+          </w:p>
+        </w:tc>
+        <w:tc>
+          <w:tcPr>
+            <w:tcW w:type="dxa" w:w="780"/>
+            <w:gridSpan w:val="1"/>
+            <w:tcBorders>
+              <w:top w:val="single" w:color="000000" w:sz="4"/>
+              <w:left w:val="single" w:color="000000" w:sz="4"/>
+              <w:bottom w:val="single" w:color="000000" w:sz="4"/>
+              <w:right w:val="single" w:color="000000" w:sz="4"/>
+            </w:tcBorders>
+            <w:shd w:fill="EBF5FB" w:val="clear"/>
+            <w:vAlign w:val="center"/>
+          </w:tcPr>
+          <w:p>
+            <w:pPr>
+              <w:spacing w:after="50" w:before="50"/>
+              <w:jc w:val="left"/>
+            </w:pPr>
+            <w:r>
+              <w:rPr>
+                <w:rFonts w:ascii="Arial" w:cs="Arial" w:eastAsia="Arial" w:hAnsi="Arial"/>
+                <w:color w:val="000000"/>
+                <w:sz w:val="18"/>
+                <w:szCs w:val="18"/>
+              </w:rPr>
+              <w:t xml:space="preserve"/>
+            </w:r>
+          </w:p>
+        </w:tc>
+        <w:tc>
+          <w:tcPr>
+            <w:tcW w:type="dxa" w:w="2720"/>
+            <w:gridSpan w:val="1"/>
+            <w:tcBorders>
+              <w:top w:val="single" w:color="000000" w:sz="4"/>
+              <w:left w:val="single" w:color="000000" w:sz="4"/>
+              <w:bottom w:val="single" w:color="000000" w:sz="4"/>
+              <w:right w:val="single" w:color="000000" w:sz="4"/>
+            </w:tcBorders>
+            <w:shd w:fill="EBF5FB" w:val="clear"/>
+            <w:vAlign w:val="center"/>
+          </w:tcPr>
+          <w:p>
+            <w:pPr>
+              <w:spacing w:after="50" w:before="50"/>
+              <w:jc w:val="left"/>
+            </w:pPr>
+            <w:r>
+              <w:rPr>
+                <w:rFonts w:ascii="Arial" w:cs="Arial" w:eastAsia="Arial" w:hAnsi="Arial"/>
+                <w:color w:val="000000"/>
+                <w:sz w:val="18"/>
+                <w:szCs w:val="18"/>
+              </w:rPr>
+              <w:t xml:space="preserve"/>
+            </w:r>
+          </w:p>
+        </w:tc>
+      </w:tr>
+    </w:tbl>
+    <w:p>
+      <w:pPr>
+        <w:spacing w:after="40" w:before="60"/>
+        <w:jc w:val="left"/>
+      </w:pPr>
+      <w:r>
+        <w:rPr>
+          <w:rFonts w:ascii="Arial" w:cs="Arial" w:eastAsia="Arial" w:hAnsi="Arial"/>
+          <w:i/>
+          <w:iCs/>
+          <w:color w:val="444444"/>
+          <w:sz w:val="15"/>
+          <w:szCs w:val="15"/>
+        </w:rPr>
+        <w:t xml:space="preserve">* AE = Aviso de Entrada (trabajador nuevo). Presentar planilla del mes siguiente dentro del plazo establecido. Si el trabajador no está en este listado, no se permite el ingreso a planta.</w:t>
+      </w:r>
+    </w:p>
+    <w:p>
+      <w:pPr>
+        <w:spacing w:after="0" w:before="80"/>
+      </w:pPr>
+    </w:p>
+    <w:tbl>
+      <w:tblPr>
+        <w:tblW w:type="dxa" w:w="10800"/>
+        <w:tblBorders>
+          <w:top w:val="single" w:color="auto" w:sz="4"/>
+          <w:left w:val="single" w:color="auto" w:sz="4"/>
+          <w:bottom w:val="single" w:color="auto" w:sz="4"/>
+          <w:right w:val="single" w:color="auto" w:sz="4"/>
+          <w:insideH w:val="single" w:color="auto" w:sz="4"/>
+          <w:insideV w:val="single" w:color="auto" w:sz="4"/>
+        </w:tblBorders>
+      </w:tblPr>
+      <w:tblGrid>
+        <w:gridCol w:w="5400"/>
+        <w:gridCol w:w="5400"/>
+      </w:tblGrid>
+      <w:tr>
+        <w:tc>
+          <w:tcPr>
+            <w:tcW w:type="dxa" w:w="5400"/>
+            <w:gridSpan w:val="1"/>
+            <w:tcBorders>
+              <w:top w:val="single" w:color="000000" w:sz="4"/>
+              <w:left w:val="single" w:color="000000" w:sz="4"/>
+              <w:bottom w:val="single" w:color="000000" w:sz="4"/>
+              <w:right w:val="single" w:color="000000" w:sz="4"/>
+            </w:tcBorders>
+            <w:vAlign w:val="center"/>
+          </w:tcPr>
+          <w:p>
+            <w:pPr>
+              <w:spacing w:after="100" w:before="40"/>
+              <w:jc w:val="center"/>
+            </w:pPr>
+            <w:r>
+              <w:rPr>
+                <w:rFonts w:ascii="Arial" w:cs="Arial" w:eastAsia="Arial" w:hAnsi="Arial"/>
+                <w:b/>
+                <w:bCs/>
+                <w:color w:val="000000"/>
+                <w:sz w:val="17"/>
+                <w:szCs w:val="17"/>
+              </w:rPr>
+              <w:t xml:space="preserve">TÉCNICO(A) E&amp;S</w:t>
+            </w:r>
+          </w:p>
+          <w:p>
+            <w:pPr>
+              <w:spacing w:after="20" w:before="80"/>
+              <w:jc w:val="center"/>
+            </w:pPr>
+            <w:r>
+              <w:rPr>
+                <w:rFonts w:ascii="Arial" w:cs="Arial" w:eastAsia="Arial" w:hAnsi="Arial"/>
+                <w:color w:val="000000"/>
+                <w:sz w:val="17"/>
+                <w:szCs w:val="17"/>
+              </w:rPr>
+              <w:t xml:space="preserve">_________________________________</w:t>
+            </w:r>
+          </w:p>
+          <w:p>
+            <w:pPr>
+              <w:spacing w:after="40" w:before="10"/>
+              <w:jc w:val="center"/>
+            </w:pPr>
+            <w:r>
+              <w:rPr>
+                <w:rFonts w:ascii="Arial" w:cs="Arial" w:eastAsia="Arial" w:hAnsi="Arial"/>
+                <w:color w:val="000000"/>
+                <w:sz w:val="15"/>
+                <w:szCs w:val="15"/>
+              </w:rPr>
+              <w:t xml:space="preserve">Verifica documentación</w:t>
+            </w:r>
+          </w:p>
+        </w:tc>
+        <w:tc>
+          <w:tcPr>
+            <w:tcW w:type="dxa" w:w="5400"/>
+            <w:gridSpan w:val="1"/>
+            <w:tcBorders>
+              <w:top w:val="single" w:color="000000" w:sz="4"/>
+              <w:left w:val="single" w:color="000000" w:sz="4"/>
+              <w:bottom w:val="single" w:color="000000" w:sz="4"/>
+              <w:right w:val="single" w:color="000000" w:sz="4"/>
+            </w:tcBorders>
+            <w:vAlign w:val="center"/>
+          </w:tcPr>
+          <w:p>
+            <w:pPr>
+              <w:spacing w:after="100" w:before="40"/>
+              <w:jc w:val="center"/>
+            </w:pPr>
+            <w:r>
+              <w:rPr>
+                <w:rFonts w:ascii="Arial" w:cs="Arial" w:eastAsia="Arial" w:hAnsi="Arial"/>
+                <w:b/>
+                <w:bCs/>
+                <w:color w:val="000000"/>
+                <w:sz w:val="17"/>
+                <w:szCs w:val="17"/>
+              </w:rPr>
+              <w:t xml:space="preserve">REPRESENTANTE EMPRESA CONTRATISTA</w:t>
+            </w:r>
+          </w:p>
+          <w:p>
+            <w:pPr>
+              <w:spacing w:after="20" w:before="80"/>
+              <w:jc w:val="center"/>
+            </w:pPr>
+            <w:r>
+              <w:rPr>
+                <w:rFonts w:ascii="Arial" w:cs="Arial" w:eastAsia="Arial" w:hAnsi="Arial"/>
+                <w:color w:val="000000"/>
+                <w:sz w:val="17"/>
+                <w:szCs w:val="17"/>
+              </w:rPr>
+              <w:t xml:space="preserve">_________________________________</w:t>
+            </w:r>
+          </w:p>
+          <w:p>
+            <w:pPr>
+              <w:spacing w:after="40" w:before="10"/>
+              <w:jc w:val="center"/>
+            </w:pPr>
+            <w:r>
+              <w:rPr>
+                <w:rFonts w:ascii="Arial" w:cs="Arial" w:eastAsia="Arial" w:hAnsi="Arial"/>
+                <w:color w:val="000000"/>
+                <w:sz w:val="15"/>
+                <w:szCs w:val="15"/>
+              </w:rPr>
+              <w:t xml:space="preserve">Confirma nómina / Firma</w:t>
             </w:r>
           </w:p>
         </w:tc>

</xml_diff>

<commit_message>
r34: replace sec 2 & 3 with integrated personnel list table
Removed individual verification rows (sec 2) and certificates table
(sec 3). Replaced with "2. Personal Autorizado para el Ingreso" table
(15 rows: name, cedula, role, induction, IESS, medical, cert-AR,
signature) directly on the main form — no separate annex page.

Co-Authored-By: Claude Sonnet 4.6 <noreply@anthropic.com>
Claude-Session: https://claude.ai/code/session_01Mu84mNMmRhshwom6voaTeY
</commit_message>
<xml_diff>
--- a/GE-SO-R34_Rev05_Autorizacion_Ingreso_Contratistas.docx
+++ b/GE-SO-R34_Rev05_Autorizacion_Ingreso_Contratistas.docx
@@ -1549,3194 +1549,7 @@
                 <w:sz w:val="19"/>
                 <w:szCs w:val="19"/>
               </w:rPr>
-              <w:t xml:space="preserve">2.  VERIFICACIÓN DE REQUISITOS DE ACCESO GENERAL</w:t>
-            </w:r>
-          </w:p>
-        </w:tc>
-      </w:tr>
-    </w:tbl>
-    <w:tbl>
-      <w:tblPr>
-        <w:tblW w:type="dxa" w:w="10800"/>
-        <w:tblBorders>
-          <w:top w:val="single" w:color="auto" w:sz="4"/>
-          <w:left w:val="single" w:color="auto" w:sz="4"/>
-          <w:bottom w:val="single" w:color="auto" w:sz="4"/>
-          <w:right w:val="single" w:color="auto" w:sz="4"/>
-          <w:insideH w:val="single" w:color="auto" w:sz="4"/>
-          <w:insideV w:val="single" w:color="auto" w:sz="4"/>
-        </w:tblBorders>
-      </w:tblPr>
-      <w:tblGrid>
-        <w:gridCol w:w="400"/>
-        <w:gridCol w:w="2800"/>
-        <w:gridCol w:w="1800"/>
-        <w:gridCol w:w="1600"/>
-        <w:gridCol w:w="4200"/>
-      </w:tblGrid>
-      <w:tr>
-        <w:tc>
-          <w:tcPr>
-            <w:tcW w:type="dxa" w:w="400"/>
-            <w:gridSpan w:val="1"/>
-            <w:tcBorders>
-              <w:top w:val="single" w:color="000000" w:sz="4"/>
-              <w:left w:val="single" w:color="000000" w:sz="4"/>
-              <w:bottom w:val="single" w:color="000000" w:sz="4"/>
-              <w:right w:val="single" w:color="000000" w:sz="4"/>
-            </w:tcBorders>
-            <w:shd w:fill="2E6DB4" w:val="clear"/>
-            <w:vAlign w:val="center"/>
-          </w:tcPr>
-          <w:p>
-            <w:pPr>
-              <w:spacing w:after="50" w:before="50"/>
-              <w:jc w:val="center"/>
-            </w:pPr>
-            <w:r>
-              <w:rPr>
-                <w:rFonts w:ascii="Arial" w:cs="Arial" w:eastAsia="Arial" w:hAnsi="Arial"/>
-                <w:b/>
-                <w:bCs/>
-                <w:color w:val="FFFFFF"/>
-                <w:sz w:val="18"/>
-                <w:szCs w:val="18"/>
-              </w:rPr>
-              <w:t xml:space="preserve">#</w:t>
-            </w:r>
-          </w:p>
-        </w:tc>
-        <w:tc>
-          <w:tcPr>
-            <w:tcW w:type="dxa" w:w="2800"/>
-            <w:gridSpan w:val="1"/>
-            <w:tcBorders>
-              <w:top w:val="single" w:color="000000" w:sz="4"/>
-              <w:left w:val="single" w:color="000000" w:sz="4"/>
-              <w:bottom w:val="single" w:color="000000" w:sz="4"/>
-              <w:right w:val="single" w:color="000000" w:sz="4"/>
-            </w:tcBorders>
-            <w:shd w:fill="2E6DB4" w:val="clear"/>
-            <w:vAlign w:val="center"/>
-          </w:tcPr>
-          <w:p>
-            <w:pPr>
-              <w:spacing w:after="50" w:before="50"/>
-              <w:jc w:val="center"/>
-            </w:pPr>
-            <w:r>
-              <w:rPr>
-                <w:rFonts w:ascii="Arial" w:cs="Arial" w:eastAsia="Arial" w:hAnsi="Arial"/>
-                <w:b/>
-                <w:bCs/>
-                <w:color w:val="FFFFFF"/>
-                <w:sz w:val="18"/>
-                <w:szCs w:val="18"/>
-              </w:rPr>
-              <w:t xml:space="preserve">REQUISITO</w:t>
-            </w:r>
-          </w:p>
-        </w:tc>
-        <w:tc>
-          <w:tcPr>
-            <w:tcW w:type="dxa" w:w="1800"/>
-            <w:gridSpan w:val="1"/>
-            <w:tcBorders>
-              <w:top w:val="single" w:color="000000" w:sz="4"/>
-              <w:left w:val="single" w:color="000000" w:sz="4"/>
-              <w:bottom w:val="single" w:color="000000" w:sz="4"/>
-              <w:right w:val="single" w:color="000000" w:sz="4"/>
-            </w:tcBorders>
-            <w:shd w:fill="2E6DB4" w:val="clear"/>
-            <w:vAlign w:val="center"/>
-          </w:tcPr>
-          <w:p>
-            <w:pPr>
-              <w:spacing w:after="50" w:before="50"/>
-              <w:jc w:val="center"/>
-            </w:pPr>
-            <w:r>
-              <w:rPr>
-                <w:rFonts w:ascii="Arial" w:cs="Arial" w:eastAsia="Arial" w:hAnsi="Arial"/>
-                <w:b/>
-                <w:bCs/>
-                <w:color w:val="FFFFFF"/>
-                <w:sz w:val="18"/>
-                <w:szCs w:val="18"/>
-              </w:rPr>
-              <w:t xml:space="preserve">DETALLE /
-VIGENCIA</w:t>
-            </w:r>
-          </w:p>
-        </w:tc>
-        <w:tc>
-          <w:tcPr>
-            <w:tcW w:type="dxa" w:w="1600"/>
-            <w:gridSpan w:val="1"/>
-            <w:tcBorders>
-              <w:top w:val="single" w:color="000000" w:sz="4"/>
-              <w:left w:val="single" w:color="000000" w:sz="4"/>
-              <w:bottom w:val="single" w:color="000000" w:sz="4"/>
-              <w:right w:val="single" w:color="000000" w:sz="4"/>
-            </w:tcBorders>
-            <w:shd w:fill="2E6DB4" w:val="clear"/>
-            <w:vAlign w:val="center"/>
-          </w:tcPr>
-          <w:p>
-            <w:pPr>
-              <w:spacing w:after="50" w:before="50"/>
-              <w:jc w:val="center"/>
-            </w:pPr>
-            <w:r>
-              <w:rPr>
-                <w:rFonts w:ascii="Arial" w:cs="Arial" w:eastAsia="Arial" w:hAnsi="Arial"/>
-                <w:b/>
-                <w:bCs/>
-                <w:color w:val="FFFFFF"/>
-                <w:sz w:val="18"/>
-                <w:szCs w:val="18"/>
-              </w:rPr>
-              <w:t xml:space="preserve">FECHA /
-ESTADO</w:t>
-            </w:r>
-          </w:p>
-        </w:tc>
-        <w:tc>
-          <w:tcPr>
-            <w:tcW w:type="dxa" w:w="4200"/>
-            <w:gridSpan w:val="1"/>
-            <w:tcBorders>
-              <w:top w:val="single" w:color="000000" w:sz="4"/>
-              <w:left w:val="single" w:color="000000" w:sz="4"/>
-              <w:bottom w:val="single" w:color="000000" w:sz="4"/>
-              <w:right w:val="single" w:color="000000" w:sz="4"/>
-            </w:tcBorders>
-            <w:shd w:fill="2E6DB4" w:val="clear"/>
-            <w:vAlign w:val="center"/>
-          </w:tcPr>
-          <w:p>
-            <w:pPr>
-              <w:spacing w:after="50" w:before="50"/>
-              <w:jc w:val="center"/>
-            </w:pPr>
-            <w:r>
-              <w:rPr>
-                <w:rFonts w:ascii="Arial" w:cs="Arial" w:eastAsia="Arial" w:hAnsi="Arial"/>
-                <w:b/>
-                <w:bCs/>
-                <w:color w:val="FFFFFF"/>
-                <w:sz w:val="18"/>
-                <w:szCs w:val="18"/>
-              </w:rPr>
-              <w:t xml:space="preserve">OBSERVACIONES</w:t>
-            </w:r>
-          </w:p>
-        </w:tc>
-      </w:tr>
-      <w:tr>
-        <w:tc>
-          <w:tcPr>
-            <w:tcW w:type="dxa" w:w="400"/>
-            <w:gridSpan w:val="1"/>
-            <w:tcBorders>
-              <w:top w:val="single" w:color="000000" w:sz="4"/>
-              <w:left w:val="single" w:color="000000" w:sz="4"/>
-              <w:bottom w:val="single" w:color="000000" w:sz="4"/>
-              <w:right w:val="single" w:color="000000" w:sz="4"/>
-            </w:tcBorders>
-            <w:shd w:fill="EBF5FB" w:val="clear"/>
-            <w:vAlign w:val="center"/>
-          </w:tcPr>
-          <w:p>
-            <w:pPr>
-              <w:spacing w:after="60" w:before="60"/>
-              <w:jc w:val="center"/>
-            </w:pPr>
-            <w:r>
-              <w:rPr>
-                <w:rFonts w:ascii="Arial" w:cs="Arial" w:eastAsia="Arial" w:hAnsi="Arial"/>
-                <w:b/>
-                <w:bCs/>
-                <w:color w:val="000000"/>
-                <w:sz w:val="18"/>
-                <w:szCs w:val="18"/>
-              </w:rPr>
-              <w:t xml:space="preserve">1</w:t>
-            </w:r>
-          </w:p>
-        </w:tc>
-        <w:tc>
-          <w:tcPr>
-            <w:tcW w:type="dxa" w:w="2800"/>
-            <w:gridSpan w:val="1"/>
-            <w:tcBorders>
-              <w:top w:val="single" w:color="000000" w:sz="4"/>
-              <w:left w:val="single" w:color="000000" w:sz="4"/>
-              <w:bottom w:val="single" w:color="000000" w:sz="4"/>
-              <w:right w:val="single" w:color="000000" w:sz="4"/>
-            </w:tcBorders>
-            <w:vAlign w:val="center"/>
-          </w:tcPr>
-          <w:p>
-            <w:pPr>
-              <w:spacing w:after="60" w:before="60"/>
-              <w:jc w:val="left"/>
-            </w:pPr>
-            <w:r>
-              <w:rPr>
-                <w:rFonts w:ascii="Arial" w:cs="Arial" w:eastAsia="Arial" w:hAnsi="Arial"/>
-                <w:b/>
-                <w:bCs/>
-                <w:color w:val="000000"/>
-                <w:sz w:val="18"/>
-                <w:szCs w:val="18"/>
-              </w:rPr>
-              <w:t xml:space="preserve">Inducción de Seguridad Plantabal</w:t>
-            </w:r>
-          </w:p>
-        </w:tc>
-        <w:tc>
-          <w:tcPr>
-            <w:tcW w:type="dxa" w:w="1800"/>
-            <w:gridSpan w:val="1"/>
-            <w:tcBorders>
-              <w:top w:val="single" w:color="000000" w:sz="4"/>
-              <w:left w:val="single" w:color="000000" w:sz="4"/>
-              <w:bottom w:val="single" w:color="000000" w:sz="4"/>
-              <w:right w:val="single" w:color="000000" w:sz="4"/>
-            </w:tcBorders>
-            <w:vAlign w:val="center"/>
-          </w:tcPr>
-          <w:p>
-            <w:pPr>
-              <w:spacing w:after="60" w:before="60"/>
-              <w:jc w:val="left"/>
-            </w:pPr>
-            <w:r>
-              <w:rPr>
-                <w:rFonts w:ascii="Arial" w:cs="Arial" w:eastAsia="Arial" w:hAnsi="Arial"/>
-                <w:color w:val="000000"/>
-                <w:sz w:val="17"/>
-                <w:szCs w:val="17"/>
-              </w:rPr>
-              <w:t xml:space="preserve">1 año desde la recepción</w:t>
-            </w:r>
-          </w:p>
-        </w:tc>
-        <w:tc>
-          <w:tcPr>
-            <w:tcW w:type="dxa" w:w="1600"/>
-            <w:gridSpan w:val="1"/>
-            <w:tcBorders>
-              <w:top w:val="single" w:color="000000" w:sz="4"/>
-              <w:left w:val="single" w:color="000000" w:sz="4"/>
-              <w:bottom w:val="single" w:color="000000" w:sz="4"/>
-              <w:right w:val="single" w:color="000000" w:sz="4"/>
-            </w:tcBorders>
-            <w:vAlign w:val="center"/>
-          </w:tcPr>
-          <w:p>
-            <w:pPr>
-              <w:spacing w:after="60" w:before="60"/>
-              <w:jc w:val="center"/>
-            </w:pPr>
-            <w:r>
-              <w:rPr>
-                <w:rFonts w:ascii="Arial" w:cs="Arial" w:eastAsia="Arial" w:hAnsi="Arial"/>
-                <w:color w:val="000000"/>
-                <w:sz w:val="17"/>
-                <w:szCs w:val="17"/>
-              </w:rPr>
-              <w:t xml:space="preserve">__/__/____</w:t>
-            </w:r>
-          </w:p>
-        </w:tc>
-        <w:tc>
-          <w:tcPr>
-            <w:tcW w:type="dxa" w:w="4200"/>
-            <w:gridSpan w:val="1"/>
-            <w:tcBorders>
-              <w:top w:val="single" w:color="000000" w:sz="4"/>
-              <w:left w:val="single" w:color="000000" w:sz="4"/>
-              <w:bottom w:val="single" w:color="000000" w:sz="4"/>
-              <w:right w:val="single" w:color="000000" w:sz="4"/>
-            </w:tcBorders>
-            <w:vAlign w:val="center"/>
-          </w:tcPr>
-          <w:p>
-            <w:pPr>
-              <w:spacing w:after="50" w:before="50"/>
-              <w:jc w:val="left"/>
-            </w:pPr>
-            <w:r>
-              <w:rPr>
-                <w:rFonts w:ascii="Arial" w:cs="Arial" w:eastAsia="Arial" w:hAnsi="Arial"/>
-                <w:color w:val="000000"/>
-                <w:sz w:val="18"/>
-                <w:szCs w:val="18"/>
-              </w:rPr>
-              <w:t xml:space="preserve"/>
-            </w:r>
-          </w:p>
-        </w:tc>
-      </w:tr>
-      <w:tr>
-        <w:tc>
-          <w:tcPr>
-            <w:tcW w:type="dxa" w:w="400"/>
-            <w:gridSpan w:val="1"/>
-            <w:tcBorders>
-              <w:top w:val="single" w:color="000000" w:sz="4"/>
-              <w:left w:val="single" w:color="000000" w:sz="4"/>
-              <w:bottom w:val="single" w:color="000000" w:sz="4"/>
-              <w:right w:val="single" w:color="000000" w:sz="4"/>
-            </w:tcBorders>
-            <w:shd w:fill="EBF5FB" w:val="clear"/>
-            <w:vAlign w:val="center"/>
-          </w:tcPr>
-          <w:p>
-            <w:pPr>
-              <w:spacing w:after="60" w:before="60"/>
-              <w:jc w:val="center"/>
-            </w:pPr>
-            <w:r>
-              <w:rPr>
-                <w:rFonts w:ascii="Arial" w:cs="Arial" w:eastAsia="Arial" w:hAnsi="Arial"/>
-                <w:b/>
-                <w:bCs/>
-                <w:color w:val="000000"/>
-                <w:sz w:val="18"/>
-                <w:szCs w:val="18"/>
-              </w:rPr>
-              <w:t xml:space="preserve">2</w:t>
-            </w:r>
-          </w:p>
-        </w:tc>
-        <w:tc>
-          <w:tcPr>
-            <w:tcW w:type="dxa" w:w="2800"/>
-            <w:gridSpan w:val="1"/>
-            <w:tcBorders>
-              <w:top w:val="single" w:color="000000" w:sz="4"/>
-              <w:left w:val="single" w:color="000000" w:sz="4"/>
-              <w:bottom w:val="single" w:color="000000" w:sz="4"/>
-              <w:right w:val="single" w:color="000000" w:sz="4"/>
-            </w:tcBorders>
-            <w:vAlign w:val="center"/>
-          </w:tcPr>
-          <w:p>
-            <w:pPr>
-              <w:spacing w:after="20" w:before="50"/>
-              <w:jc w:val="left"/>
-            </w:pPr>
-            <w:r>
-              <w:rPr>
-                <w:rFonts w:ascii="Arial" w:cs="Arial" w:eastAsia="Arial" w:hAnsi="Arial"/>
-                <w:b/>
-                <w:bCs/>
-                <w:color w:val="000000"/>
-                <w:sz w:val="18"/>
-                <w:szCs w:val="18"/>
-              </w:rPr>
-              <w:t xml:space="preserve">Afiliación al IESS</w:t>
-            </w:r>
-          </w:p>
-          <w:p>
-            <w:pPr>
-              <w:spacing w:after="50" w:before="0"/>
-              <w:jc w:val="left"/>
-            </w:pPr>
-            <w:r>
-              <w:rPr>
-                <w:rFonts w:ascii="Arial" w:cs="Arial" w:eastAsia="Arial" w:hAnsi="Arial"/>
-                <w:i/>
-                <w:iCs/>
-                <w:color w:val="444444"/>
-                <w:sz w:val="15"/>
-                <w:szCs w:val="15"/>
-              </w:rPr>
-              <w:t xml:space="preserve">Planilla del mes inmediato anterior o Aviso de entrada</w:t>
-            </w:r>
-          </w:p>
-        </w:tc>
-        <w:tc>
-          <w:tcPr>
-            <w:tcW w:type="dxa" w:w="1800"/>
-            <w:gridSpan w:val="1"/>
-            <w:tcBorders>
-              <w:top w:val="single" w:color="000000" w:sz="4"/>
-              <w:left w:val="single" w:color="000000" w:sz="4"/>
-              <w:bottom w:val="single" w:color="000000" w:sz="4"/>
-              <w:right w:val="single" w:color="000000" w:sz="4"/>
-            </w:tcBorders>
-            <w:vAlign w:val="center"/>
-          </w:tcPr>
-          <w:p>
-            <w:pPr>
-              <w:spacing w:after="60" w:before="60"/>
-              <w:jc w:val="left"/>
-            </w:pPr>
-            <w:r>
-              <w:rPr>
-                <w:rFonts w:ascii="Arial" w:cs="Arial" w:eastAsia="Arial" w:hAnsi="Arial"/>
-                <w:color w:val="000000"/>
-                <w:sz w:val="17"/>
-                <w:szCs w:val="17"/>
-              </w:rPr>
-              <w:t xml:space="preserve">Mensual</w:t>
-            </w:r>
-          </w:p>
-        </w:tc>
-        <w:tc>
-          <w:tcPr>
-            <w:tcW w:type="dxa" w:w="1600"/>
-            <w:gridSpan w:val="1"/>
-            <w:tcBorders>
-              <w:top w:val="single" w:color="000000" w:sz="4"/>
-              <w:left w:val="single" w:color="000000" w:sz="4"/>
-              <w:bottom w:val="single" w:color="000000" w:sz="4"/>
-              <w:right w:val="single" w:color="000000" w:sz="4"/>
-            </w:tcBorders>
-            <w:vAlign w:val="center"/>
-          </w:tcPr>
-          <w:p>
-            <w:pPr>
-              <w:spacing w:after="60" w:before="60"/>
-              <w:jc w:val="center"/>
-            </w:pPr>
-            <w:r>
-              <w:rPr>
-                <w:rFonts w:ascii="Arial" w:cs="Arial" w:eastAsia="Arial" w:hAnsi="Arial"/>
-                <w:color w:val="000000"/>
-                <w:sz w:val="17"/>
-                <w:szCs w:val="17"/>
-              </w:rPr>
-              <w:t xml:space="preserve">__/__/____</w:t>
-            </w:r>
-          </w:p>
-        </w:tc>
-        <w:tc>
-          <w:tcPr>
-            <w:tcW w:type="dxa" w:w="4200"/>
-            <w:gridSpan w:val="1"/>
-            <w:tcBorders>
-              <w:top w:val="single" w:color="000000" w:sz="4"/>
-              <w:left w:val="single" w:color="000000" w:sz="4"/>
-              <w:bottom w:val="single" w:color="000000" w:sz="4"/>
-              <w:right w:val="single" w:color="000000" w:sz="4"/>
-            </w:tcBorders>
-            <w:vAlign w:val="center"/>
-          </w:tcPr>
-          <w:p>
-            <w:pPr>
-              <w:spacing w:after="60" w:before="60"/>
-              <w:jc w:val="left"/>
-            </w:pPr>
-            <w:r>
-              <w:rPr>
-                <w:rFonts w:ascii="Arial" w:cs="Arial" w:eastAsia="Arial" w:hAnsi="Arial"/>
-                <w:i/>
-                <w:iCs/>
-                <w:color w:val="444444"/>
-                <w:sz w:val="15"/>
-                <w:szCs w:val="15"/>
-              </w:rPr>
-              <w:t xml:space="preserve">Si aplica aviso de entrada, registrar aquí</w:t>
-            </w:r>
-          </w:p>
-        </w:tc>
-      </w:tr>
-      <w:tr>
-        <w:tc>
-          <w:tcPr>
-            <w:tcW w:type="dxa" w:w="400"/>
-            <w:gridSpan w:val="1"/>
-            <w:tcBorders>
-              <w:top w:val="single" w:color="000000" w:sz="4"/>
-              <w:left w:val="single" w:color="000000" w:sz="4"/>
-              <w:bottom w:val="single" w:color="000000" w:sz="4"/>
-              <w:right w:val="single" w:color="000000" w:sz="4"/>
-            </w:tcBorders>
-            <w:shd w:fill="EBF5FB" w:val="clear"/>
-            <w:vAlign w:val="center"/>
-          </w:tcPr>
-          <w:p>
-            <w:pPr>
-              <w:spacing w:after="60" w:before="60"/>
-              <w:jc w:val="center"/>
-            </w:pPr>
-            <w:r>
-              <w:rPr>
-                <w:rFonts w:ascii="Arial" w:cs="Arial" w:eastAsia="Arial" w:hAnsi="Arial"/>
-                <w:b/>
-                <w:bCs/>
-                <w:color w:val="000000"/>
-                <w:sz w:val="18"/>
-                <w:szCs w:val="18"/>
-              </w:rPr>
-              <w:t xml:space="preserve">3</w:t>
-            </w:r>
-          </w:p>
-        </w:tc>
-        <w:tc>
-          <w:tcPr>
-            <w:tcW w:type="dxa" w:w="2800"/>
-            <w:gridSpan w:val="1"/>
-            <w:tcBorders>
-              <w:top w:val="single" w:color="000000" w:sz="4"/>
-              <w:left w:val="single" w:color="000000" w:sz="4"/>
-              <w:bottom w:val="single" w:color="000000" w:sz="4"/>
-              <w:right w:val="single" w:color="000000" w:sz="4"/>
-            </w:tcBorders>
-            <w:vAlign w:val="center"/>
-          </w:tcPr>
-          <w:p>
-            <w:pPr>
-              <w:spacing w:after="20" w:before="50"/>
-              <w:jc w:val="left"/>
-            </w:pPr>
-            <w:r>
-              <w:rPr>
-                <w:rFonts w:ascii="Arial" w:cs="Arial" w:eastAsia="Arial" w:hAnsi="Arial"/>
-                <w:b/>
-                <w:bCs/>
-                <w:color w:val="000000"/>
-                <w:sz w:val="18"/>
-                <w:szCs w:val="18"/>
-              </w:rPr>
-              <w:t xml:space="preserve">Certificado Médico Laboral</w:t>
-            </w:r>
-          </w:p>
-          <w:p>
-            <w:pPr>
-              <w:spacing w:after="50" w:before="0"/>
-              <w:jc w:val="left"/>
-            </w:pPr>
-            <w:r>
-              <w:rPr>
-                <w:rFonts w:ascii="Arial" w:cs="Arial" w:eastAsia="Arial" w:hAnsi="Arial"/>
-                <w:i/>
-                <w:iCs/>
-                <w:color w:val="444444"/>
-                <w:sz w:val="15"/>
-                <w:szCs w:val="15"/>
-              </w:rPr>
-              <w:t xml:space="preserve">Aptitud ocupacional emitida por médico de planta</w:t>
-            </w:r>
-          </w:p>
-        </w:tc>
-        <w:tc>
-          <w:tcPr>
-            <w:tcW w:type="dxa" w:w="1800"/>
-            <w:gridSpan w:val="1"/>
-            <w:tcBorders>
-              <w:top w:val="single" w:color="000000" w:sz="4"/>
-              <w:left w:val="single" w:color="000000" w:sz="4"/>
-              <w:bottom w:val="single" w:color="000000" w:sz="4"/>
-              <w:right w:val="single" w:color="000000" w:sz="4"/>
-            </w:tcBorders>
-            <w:vAlign w:val="center"/>
-          </w:tcPr>
-          <w:p>
-            <w:pPr>
-              <w:spacing w:after="60" w:before="60"/>
-              <w:jc w:val="left"/>
-            </w:pPr>
-            <w:r>
-              <w:rPr>
-                <w:rFonts w:ascii="Arial" w:cs="Arial" w:eastAsia="Arial" w:hAnsi="Arial"/>
-                <w:color w:val="000000"/>
-                <w:sz w:val="17"/>
-                <w:szCs w:val="17"/>
-              </w:rPr>
-              <w:t xml:space="preserve">Según criterio Médico de Planta</w:t>
-            </w:r>
-          </w:p>
-        </w:tc>
-        <w:tc>
-          <w:tcPr>
-            <w:tcW w:type="dxa" w:w="1600"/>
-            <w:gridSpan w:val="1"/>
-            <w:tcBorders>
-              <w:top w:val="single" w:color="000000" w:sz="4"/>
-              <w:left w:val="single" w:color="000000" w:sz="4"/>
-              <w:bottom w:val="single" w:color="000000" w:sz="4"/>
-              <w:right w:val="single" w:color="000000" w:sz="4"/>
-            </w:tcBorders>
-            <w:vAlign w:val="center"/>
-          </w:tcPr>
-          <w:p>
-            <w:pPr>
-              <w:spacing w:after="20" w:before="40"/>
-              <w:jc w:val="left"/>
-            </w:pPr>
-            <w:r>
-              <w:rPr>
-                <w:rFonts w:ascii="Arial" w:cs="Arial" w:eastAsia="Arial" w:hAnsi="Arial"/>
-                <w:color w:val="000000"/>
-                <w:sz w:val="17"/>
-                <w:szCs w:val="17"/>
-              </w:rPr>
-              <w:t xml:space="preserve">Vence: __/__/____</w:t>
-            </w:r>
-          </w:p>
-          <w:p>
-            <w:pPr>
-              <w:spacing w:after="40" w:before="20"/>
-              <w:jc w:val="left"/>
-            </w:pPr>
-            <w:r>
-              <w:rPr>
-                <w:rFonts w:ascii="Arial" w:cs="Arial" w:eastAsia="Arial" w:hAnsi="Arial"/>
-                <w:b/>
-                <w:bCs/>
-                <w:color w:val="000000"/>
-                <w:sz w:val="17"/>
-                <w:szCs w:val="17"/>
-              </w:rPr>
-              <w:t xml:space="preserve">□ APTO   □ NO APTO</w:t>
-            </w:r>
-          </w:p>
-        </w:tc>
-        <w:tc>
-          <w:tcPr>
-            <w:tcW w:type="dxa" w:w="4200"/>
-            <w:gridSpan w:val="1"/>
-            <w:tcBorders>
-              <w:top w:val="single" w:color="000000" w:sz="4"/>
-              <w:left w:val="single" w:color="000000" w:sz="4"/>
-              <w:bottom w:val="single" w:color="000000" w:sz="4"/>
-              <w:right w:val="single" w:color="000000" w:sz="4"/>
-            </w:tcBorders>
-            <w:vAlign w:val="center"/>
-          </w:tcPr>
-          <w:p>
-            <w:pPr>
-              <w:spacing w:after="50" w:before="50"/>
-              <w:jc w:val="left"/>
-            </w:pPr>
-            <w:r>
-              <w:rPr>
-                <w:rFonts w:ascii="Arial" w:cs="Arial" w:eastAsia="Arial" w:hAnsi="Arial"/>
-                <w:color w:val="000000"/>
-                <w:sz w:val="18"/>
-                <w:szCs w:val="18"/>
-              </w:rPr>
-              <w:t xml:space="preserve"/>
-            </w:r>
-          </w:p>
-        </w:tc>
-      </w:tr>
-      <w:tr>
-        <w:tc>
-          <w:tcPr>
-            <w:tcW w:type="dxa" w:w="10800"/>
-            <w:gridSpan w:val="5"/>
-            <w:tcBorders>
-              <w:top w:val="single" w:color="000000" w:sz="4"/>
-              <w:left w:val="single" w:color="000000" w:sz="4"/>
-              <w:bottom w:val="single" w:color="000000" w:sz="4"/>
-              <w:right w:val="single" w:color="000000" w:sz="4"/>
-            </w:tcBorders>
-            <w:shd w:fill="EBF5FB" w:val="clear"/>
-            <w:vAlign w:val="center"/>
-          </w:tcPr>
-          <w:p>
-            <w:pPr>
-              <w:spacing w:after="60" w:before="60"/>
-              <w:jc w:val="center"/>
-            </w:pPr>
-            <w:r>
-              <w:rPr>
-                <w:rFonts w:ascii="Arial" w:cs="Arial" w:eastAsia="Arial" w:hAnsi="Arial"/>
-                <w:b/>
-                <w:bCs/>
-                <w:color w:val="000000"/>
-                <w:sz w:val="18"/>
-                <w:szCs w:val="18"/>
-              </w:rPr>
-              <w:t xml:space="preserve">ACCESO GENERAL:  □ HABILITADO     □ NO HABILITADO</w:t>
-            </w:r>
-          </w:p>
-        </w:tc>
-      </w:tr>
-    </w:tbl>
-    <w:p>
-      <w:pPr>
-        <w:spacing w:after="0" w:before="80"/>
-      </w:pPr>
-    </w:p>
-    <w:tbl>
-      <w:tblPr>
-        <w:tblW w:type="dxa" w:w="10800"/>
-        <w:tblBorders>
-          <w:top w:val="single" w:color="auto" w:sz="4"/>
-          <w:left w:val="single" w:color="auto" w:sz="4"/>
-          <w:bottom w:val="single" w:color="auto" w:sz="4"/>
-          <w:right w:val="single" w:color="auto" w:sz="4"/>
-          <w:insideH w:val="single" w:color="auto" w:sz="4"/>
-          <w:insideV w:val="single" w:color="auto" w:sz="4"/>
-        </w:tblBorders>
-      </w:tblPr>
-      <w:tblGrid>
-        <w:gridCol w:w="10800"/>
-      </w:tblGrid>
-      <w:tr>
-        <w:tc>
-          <w:tcPr>
-            <w:tcW w:type="dxa" w:w="10800"/>
-            <w:gridSpan w:val="1"/>
-            <w:tcBorders>
-              <w:top w:val="single" w:color="000000" w:sz="8"/>
-              <w:left w:val="single" w:color="000000" w:sz="8"/>
-              <w:bottom w:val="single" w:color="000000" w:sz="8"/>
-              <w:right w:val="single" w:color="000000" w:sz="8"/>
-            </w:tcBorders>
-            <w:shd w:fill="1A3A6B" w:val="clear"/>
-            <w:vAlign w:val="center"/>
-          </w:tcPr>
-          <w:p>
-            <w:pPr>
-              <w:spacing w:after="60" w:before="60"/>
-              <w:jc w:val="center"/>
-            </w:pPr>
-            <w:r>
-              <w:rPr>
-                <w:rFonts w:ascii="Arial" w:cs="Arial" w:eastAsia="Arial" w:hAnsi="Arial"/>
-                <w:b/>
-                <w:bCs/>
-                <w:color w:val="FFFFFF"/>
-                <w:sz w:val="19"/>
-                <w:szCs w:val="19"/>
-              </w:rPr>
-              <w:t xml:space="preserve">3.  CERTIFICADOS PARA TRABAJOS DE ALTO RIESGO  (completar solo si aplica)</w:t>
-            </w:r>
-          </w:p>
-        </w:tc>
-      </w:tr>
-    </w:tbl>
-    <w:p>
-      <w:pPr>
-        <w:spacing w:after="60" w:before="60"/>
-        <w:jc w:val="left"/>
-      </w:pPr>
-      <w:r>
-        <w:rPr>
-          <w:rFonts w:ascii="Arial" w:cs="Arial" w:eastAsia="Arial" w:hAnsi="Arial"/>
-          <w:color w:val="000000"/>
-          <w:sz w:val="17"/>
-          <w:szCs w:val="17"/>
-        </w:rPr>
-        <w:t xml:space="preserve">Marque los tipos de trabajo que ejecutará el contratista y verifique la vigencia del certificado emitido por entidad reconocida (MDT o SENESCYT).</w:t>
-      </w:r>
-    </w:p>
-    <w:tbl>
-      <w:tblPr>
-        <w:tblW w:type="dxa" w:w="10800"/>
-        <w:tblBorders>
-          <w:top w:val="single" w:color="auto" w:sz="4"/>
-          <w:left w:val="single" w:color="auto" w:sz="4"/>
-          <w:bottom w:val="single" w:color="auto" w:sz="4"/>
-          <w:right w:val="single" w:color="auto" w:sz="4"/>
-          <w:insideH w:val="single" w:color="auto" w:sz="4"/>
-          <w:insideV w:val="single" w:color="auto" w:sz="4"/>
-        </w:tblBorders>
-      </w:tblPr>
-      <w:tblGrid>
-        <w:gridCol w:w="400"/>
-        <w:gridCol w:w="2600"/>
-        <w:gridCol w:w="2400"/>
-        <w:gridCol w:w="1600"/>
-        <w:gridCol w:w="3800"/>
-      </w:tblGrid>
-      <w:tr>
-        <w:tc>
-          <w:tcPr>
-            <w:tcW w:type="dxa" w:w="400"/>
-            <w:gridSpan w:val="1"/>
-            <w:tcBorders>
-              <w:top w:val="single" w:color="000000" w:sz="4"/>
-              <w:left w:val="single" w:color="000000" w:sz="4"/>
-              <w:bottom w:val="single" w:color="000000" w:sz="4"/>
-              <w:right w:val="single" w:color="000000" w:sz="4"/>
-            </w:tcBorders>
-            <w:shd w:fill="2E6DB4" w:val="clear"/>
-            <w:vAlign w:val="center"/>
-          </w:tcPr>
-          <w:p>
-            <w:pPr>
-              <w:spacing w:after="50" w:before="50"/>
-              <w:jc w:val="center"/>
-            </w:pPr>
-            <w:r>
-              <w:rPr>
-                <w:rFonts w:ascii="Arial" w:cs="Arial" w:eastAsia="Arial" w:hAnsi="Arial"/>
-                <w:b/>
-                <w:bCs/>
-                <w:color w:val="FFFFFF"/>
-                <w:sz w:val="18"/>
-                <w:szCs w:val="18"/>
-              </w:rPr>
-              <w:t xml:space="preserve">✓</w:t>
-            </w:r>
-          </w:p>
-        </w:tc>
-        <w:tc>
-          <w:tcPr>
-            <w:tcW w:type="dxa" w:w="2600"/>
-            <w:gridSpan w:val="1"/>
-            <w:tcBorders>
-              <w:top w:val="single" w:color="000000" w:sz="4"/>
-              <w:left w:val="single" w:color="000000" w:sz="4"/>
-              <w:bottom w:val="single" w:color="000000" w:sz="4"/>
-              <w:right w:val="single" w:color="000000" w:sz="4"/>
-            </w:tcBorders>
-            <w:shd w:fill="2E6DB4" w:val="clear"/>
-            <w:vAlign w:val="center"/>
-          </w:tcPr>
-          <w:p>
-            <w:pPr>
-              <w:spacing w:after="50" w:before="50"/>
-              <w:jc w:val="center"/>
-            </w:pPr>
-            <w:r>
-              <w:rPr>
-                <w:rFonts w:ascii="Arial" w:cs="Arial" w:eastAsia="Arial" w:hAnsi="Arial"/>
-                <w:b/>
-                <w:bCs/>
-                <w:color w:val="FFFFFF"/>
-                <w:sz w:val="18"/>
-                <w:szCs w:val="18"/>
-              </w:rPr>
-              <w:t xml:space="preserve">TIPO DE TRABAJO</w:t>
-            </w:r>
-          </w:p>
-        </w:tc>
-        <w:tc>
-          <w:tcPr>
-            <w:tcW w:type="dxa" w:w="2400"/>
-            <w:gridSpan w:val="1"/>
-            <w:tcBorders>
-              <w:top w:val="single" w:color="000000" w:sz="4"/>
-              <w:left w:val="single" w:color="000000" w:sz="4"/>
-              <w:bottom w:val="single" w:color="000000" w:sz="4"/>
-              <w:right w:val="single" w:color="000000" w:sz="4"/>
-            </w:tcBorders>
-            <w:shd w:fill="2E6DB4" w:val="clear"/>
-            <w:vAlign w:val="center"/>
-          </w:tcPr>
-          <w:p>
-            <w:pPr>
-              <w:spacing w:after="50" w:before="50"/>
-              <w:jc w:val="center"/>
-            </w:pPr>
-            <w:r>
-              <w:rPr>
-                <w:rFonts w:ascii="Arial" w:cs="Arial" w:eastAsia="Arial" w:hAnsi="Arial"/>
-                <w:b/>
-                <w:bCs/>
-                <w:color w:val="FFFFFF"/>
-                <w:sz w:val="18"/>
-                <w:szCs w:val="18"/>
-              </w:rPr>
-              <w:t xml:space="preserve">ENTIDAD EMISORA</w:t>
-            </w:r>
-          </w:p>
-        </w:tc>
-        <w:tc>
-          <w:tcPr>
-            <w:tcW w:type="dxa" w:w="1600"/>
-            <w:gridSpan w:val="1"/>
-            <w:tcBorders>
-              <w:top w:val="single" w:color="000000" w:sz="4"/>
-              <w:left w:val="single" w:color="000000" w:sz="4"/>
-              <w:bottom w:val="single" w:color="000000" w:sz="4"/>
-              <w:right w:val="single" w:color="000000" w:sz="4"/>
-            </w:tcBorders>
-            <w:shd w:fill="2E6DB4" w:val="clear"/>
-            <w:vAlign w:val="center"/>
-          </w:tcPr>
-          <w:p>
-            <w:pPr>
-              <w:spacing w:after="50" w:before="50"/>
-              <w:jc w:val="center"/>
-            </w:pPr>
-            <w:r>
-              <w:rPr>
-                <w:rFonts w:ascii="Arial" w:cs="Arial" w:eastAsia="Arial" w:hAnsi="Arial"/>
-                <w:b/>
-                <w:bCs/>
-                <w:color w:val="FFFFFF"/>
-                <w:sz w:val="18"/>
-                <w:szCs w:val="18"/>
-              </w:rPr>
-              <w:t xml:space="preserve">FECHA EMISIÓN</w:t>
-            </w:r>
-          </w:p>
-        </w:tc>
-        <w:tc>
-          <w:tcPr>
-            <w:tcW w:type="dxa" w:w="3800"/>
-            <w:gridSpan w:val="1"/>
-            <w:tcBorders>
-              <w:top w:val="single" w:color="000000" w:sz="4"/>
-              <w:left w:val="single" w:color="000000" w:sz="4"/>
-              <w:bottom w:val="single" w:color="000000" w:sz="4"/>
-              <w:right w:val="single" w:color="000000" w:sz="4"/>
-            </w:tcBorders>
-            <w:shd w:fill="2E6DB4" w:val="clear"/>
-            <w:vAlign w:val="center"/>
-          </w:tcPr>
-          <w:p>
-            <w:pPr>
-              <w:spacing w:after="50" w:before="50"/>
-              <w:jc w:val="center"/>
-            </w:pPr>
-            <w:r>
-              <w:rPr>
-                <w:rFonts w:ascii="Arial" w:cs="Arial" w:eastAsia="Arial" w:hAnsi="Arial"/>
-                <w:b/>
-                <w:bCs/>
-                <w:color w:val="FFFFFF"/>
-                <w:sz w:val="18"/>
-                <w:szCs w:val="18"/>
-              </w:rPr>
-              <w:t xml:space="preserve">FECHA VENCIMIENTO</w:t>
-            </w:r>
-          </w:p>
-        </w:tc>
-      </w:tr>
-      <w:tr>
-        <w:tc>
-          <w:tcPr>
-            <w:tcW w:type="dxa" w:w="400"/>
-            <w:gridSpan w:val="1"/>
-            <w:tcBorders>
-              <w:top w:val="single" w:color="000000" w:sz="4"/>
-              <w:left w:val="single" w:color="000000" w:sz="4"/>
-              <w:bottom w:val="single" w:color="000000" w:sz="4"/>
-              <w:right w:val="single" w:color="000000" w:sz="4"/>
-            </w:tcBorders>
-            <w:vAlign w:val="center"/>
-          </w:tcPr>
-          <w:p>
-            <w:pPr>
-              <w:spacing w:after="50" w:before="50"/>
-              <w:jc w:val="center"/>
-            </w:pPr>
-            <w:r>
-              <w:rPr>
-                <w:rFonts w:ascii="Arial" w:cs="Arial" w:eastAsia="Arial" w:hAnsi="Arial"/>
-                <w:color w:val="000000"/>
-                <w:sz w:val="18"/>
-                <w:szCs w:val="18"/>
-              </w:rPr>
-              <w:t xml:space="preserve">□</w:t>
-            </w:r>
-          </w:p>
-        </w:tc>
-        <w:tc>
-          <w:tcPr>
-            <w:tcW w:type="dxa" w:w="2600"/>
-            <w:gridSpan w:val="1"/>
-            <w:tcBorders>
-              <w:top w:val="single" w:color="000000" w:sz="4"/>
-              <w:left w:val="single" w:color="000000" w:sz="4"/>
-              <w:bottom w:val="single" w:color="000000" w:sz="4"/>
-              <w:right w:val="single" w:color="000000" w:sz="4"/>
-            </w:tcBorders>
-            <w:vAlign w:val="center"/>
-          </w:tcPr>
-          <w:p>
-            <w:pPr>
-              <w:spacing w:after="50" w:before="50"/>
-              <w:jc w:val="left"/>
-            </w:pPr>
-            <w:r>
-              <w:rPr>
-                <w:rFonts w:ascii="Arial" w:cs="Arial" w:eastAsia="Arial" w:hAnsi="Arial"/>
-                <w:color w:val="000000"/>
-                <w:sz w:val="18"/>
-                <w:szCs w:val="18"/>
-              </w:rPr>
-              <w:t xml:space="preserve">Trabajo en Caliente</w:t>
-            </w:r>
-          </w:p>
-        </w:tc>
-        <w:tc>
-          <w:tcPr>
-            <w:tcW w:type="dxa" w:w="2400"/>
-            <w:gridSpan w:val="1"/>
-            <w:tcBorders>
-              <w:top w:val="single" w:color="000000" w:sz="4"/>
-              <w:left w:val="single" w:color="000000" w:sz="4"/>
-              <w:bottom w:val="single" w:color="000000" w:sz="4"/>
-              <w:right w:val="single" w:color="000000" w:sz="4"/>
-            </w:tcBorders>
-            <w:vAlign w:val="center"/>
-          </w:tcPr>
-          <w:p>
-            <w:pPr>
-              <w:spacing w:after="50" w:before="50"/>
-              <w:jc w:val="left"/>
-            </w:pPr>
-            <w:r>
-              <w:rPr>
-                <w:rFonts w:ascii="Arial" w:cs="Arial" w:eastAsia="Arial" w:hAnsi="Arial"/>
-                <w:color w:val="000000"/>
-                <w:sz w:val="17"/>
-                <w:szCs w:val="17"/>
-              </w:rPr>
-              <w:t xml:space="preserve">MDT / SENESCYT</w:t>
-            </w:r>
-          </w:p>
-        </w:tc>
-        <w:tc>
-          <w:tcPr>
-            <w:tcW w:type="dxa" w:w="1600"/>
-            <w:gridSpan w:val="1"/>
-            <w:tcBorders>
-              <w:top w:val="single" w:color="000000" w:sz="4"/>
-              <w:left w:val="single" w:color="000000" w:sz="4"/>
-              <w:bottom w:val="single" w:color="000000" w:sz="4"/>
-              <w:right w:val="single" w:color="000000" w:sz="4"/>
-            </w:tcBorders>
-            <w:vAlign w:val="center"/>
-          </w:tcPr>
-          <w:p>
-            <w:pPr>
-              <w:spacing w:after="50" w:before="50"/>
-              <w:jc w:val="center"/>
-            </w:pPr>
-            <w:r>
-              <w:rPr>
-                <w:rFonts w:ascii="Arial" w:cs="Arial" w:eastAsia="Arial" w:hAnsi="Arial"/>
-                <w:color w:val="000000"/>
-                <w:sz w:val="17"/>
-                <w:szCs w:val="17"/>
-              </w:rPr>
-              <w:t xml:space="preserve">__/__/____</w:t>
-            </w:r>
-          </w:p>
-        </w:tc>
-        <w:tc>
-          <w:tcPr>
-            <w:tcW w:type="dxa" w:w="3800"/>
-            <w:gridSpan w:val="1"/>
-            <w:tcBorders>
-              <w:top w:val="single" w:color="000000" w:sz="4"/>
-              <w:left w:val="single" w:color="000000" w:sz="4"/>
-              <w:bottom w:val="single" w:color="000000" w:sz="4"/>
-              <w:right w:val="single" w:color="000000" w:sz="4"/>
-            </w:tcBorders>
-            <w:vAlign w:val="center"/>
-          </w:tcPr>
-          <w:p>
-            <w:pPr>
-              <w:spacing w:after="50" w:before="50"/>
-              <w:jc w:val="center"/>
-            </w:pPr>
-            <w:r>
-              <w:rPr>
-                <w:rFonts w:ascii="Arial" w:cs="Arial" w:eastAsia="Arial" w:hAnsi="Arial"/>
-                <w:color w:val="000000"/>
-                <w:sz w:val="17"/>
-                <w:szCs w:val="17"/>
-              </w:rPr>
-              <w:t xml:space="preserve">__/__/____</w:t>
-            </w:r>
-          </w:p>
-        </w:tc>
-      </w:tr>
-      <w:tr>
-        <w:tc>
-          <w:tcPr>
-            <w:tcW w:type="dxa" w:w="400"/>
-            <w:gridSpan w:val="1"/>
-            <w:tcBorders>
-              <w:top w:val="single" w:color="000000" w:sz="4"/>
-              <w:left w:val="single" w:color="000000" w:sz="4"/>
-              <w:bottom w:val="single" w:color="000000" w:sz="4"/>
-              <w:right w:val="single" w:color="000000" w:sz="4"/>
-            </w:tcBorders>
-            <w:vAlign w:val="center"/>
-          </w:tcPr>
-          <w:p>
-            <w:pPr>
-              <w:spacing w:after="50" w:before="50"/>
-              <w:jc w:val="center"/>
-            </w:pPr>
-            <w:r>
-              <w:rPr>
-                <w:rFonts w:ascii="Arial" w:cs="Arial" w:eastAsia="Arial" w:hAnsi="Arial"/>
-                <w:color w:val="000000"/>
-                <w:sz w:val="18"/>
-                <w:szCs w:val="18"/>
-              </w:rPr>
-              <w:t xml:space="preserve">□</w:t>
-            </w:r>
-          </w:p>
-        </w:tc>
-        <w:tc>
-          <w:tcPr>
-            <w:tcW w:type="dxa" w:w="2600"/>
-            <w:gridSpan w:val="1"/>
-            <w:tcBorders>
-              <w:top w:val="single" w:color="000000" w:sz="4"/>
-              <w:left w:val="single" w:color="000000" w:sz="4"/>
-              <w:bottom w:val="single" w:color="000000" w:sz="4"/>
-              <w:right w:val="single" w:color="000000" w:sz="4"/>
-            </w:tcBorders>
-            <w:vAlign w:val="center"/>
-          </w:tcPr>
-          <w:p>
-            <w:pPr>
-              <w:spacing w:after="50" w:before="50"/>
-              <w:jc w:val="left"/>
-            </w:pPr>
-            <w:r>
-              <w:rPr>
-                <w:rFonts w:ascii="Arial" w:cs="Arial" w:eastAsia="Arial" w:hAnsi="Arial"/>
-                <w:color w:val="000000"/>
-                <w:sz w:val="18"/>
-                <w:szCs w:val="18"/>
-              </w:rPr>
-              <w:t xml:space="preserve">Trabajo en Altura  (≥ 1,80 m)</w:t>
-            </w:r>
-          </w:p>
-        </w:tc>
-        <w:tc>
-          <w:tcPr>
-            <w:tcW w:type="dxa" w:w="2400"/>
-            <w:gridSpan w:val="1"/>
-            <w:tcBorders>
-              <w:top w:val="single" w:color="000000" w:sz="4"/>
-              <w:left w:val="single" w:color="000000" w:sz="4"/>
-              <w:bottom w:val="single" w:color="000000" w:sz="4"/>
-              <w:right w:val="single" w:color="000000" w:sz="4"/>
-            </w:tcBorders>
-            <w:vAlign w:val="center"/>
-          </w:tcPr>
-          <w:p>
-            <w:pPr>
-              <w:spacing w:after="50" w:before="50"/>
-              <w:jc w:val="left"/>
-            </w:pPr>
-            <w:r>
-              <w:rPr>
-                <w:rFonts w:ascii="Arial" w:cs="Arial" w:eastAsia="Arial" w:hAnsi="Arial"/>
-                <w:color w:val="000000"/>
-                <w:sz w:val="17"/>
-                <w:szCs w:val="17"/>
-              </w:rPr>
-              <w:t xml:space="preserve">MDT / SENESCYT</w:t>
-            </w:r>
-          </w:p>
-        </w:tc>
-        <w:tc>
-          <w:tcPr>
-            <w:tcW w:type="dxa" w:w="1600"/>
-            <w:gridSpan w:val="1"/>
-            <w:tcBorders>
-              <w:top w:val="single" w:color="000000" w:sz="4"/>
-              <w:left w:val="single" w:color="000000" w:sz="4"/>
-              <w:bottom w:val="single" w:color="000000" w:sz="4"/>
-              <w:right w:val="single" w:color="000000" w:sz="4"/>
-            </w:tcBorders>
-            <w:vAlign w:val="center"/>
-          </w:tcPr>
-          <w:p>
-            <w:pPr>
-              <w:spacing w:after="50" w:before="50"/>
-              <w:jc w:val="center"/>
-            </w:pPr>
-            <w:r>
-              <w:rPr>
-                <w:rFonts w:ascii="Arial" w:cs="Arial" w:eastAsia="Arial" w:hAnsi="Arial"/>
-                <w:color w:val="000000"/>
-                <w:sz w:val="17"/>
-                <w:szCs w:val="17"/>
-              </w:rPr>
-              <w:t xml:space="preserve">__/__/____</w:t>
-            </w:r>
-          </w:p>
-        </w:tc>
-        <w:tc>
-          <w:tcPr>
-            <w:tcW w:type="dxa" w:w="3800"/>
-            <w:gridSpan w:val="1"/>
-            <w:tcBorders>
-              <w:top w:val="single" w:color="000000" w:sz="4"/>
-              <w:left w:val="single" w:color="000000" w:sz="4"/>
-              <w:bottom w:val="single" w:color="000000" w:sz="4"/>
-              <w:right w:val="single" w:color="000000" w:sz="4"/>
-            </w:tcBorders>
-            <w:vAlign w:val="center"/>
-          </w:tcPr>
-          <w:p>
-            <w:pPr>
-              <w:spacing w:after="50" w:before="50"/>
-              <w:jc w:val="center"/>
-            </w:pPr>
-            <w:r>
-              <w:rPr>
-                <w:rFonts w:ascii="Arial" w:cs="Arial" w:eastAsia="Arial" w:hAnsi="Arial"/>
-                <w:color w:val="000000"/>
-                <w:sz w:val="17"/>
-                <w:szCs w:val="17"/>
-              </w:rPr>
-              <w:t xml:space="preserve">__/__/____</w:t>
-            </w:r>
-          </w:p>
-        </w:tc>
-      </w:tr>
-      <w:tr>
-        <w:tc>
-          <w:tcPr>
-            <w:tcW w:type="dxa" w:w="400"/>
-            <w:gridSpan w:val="1"/>
-            <w:tcBorders>
-              <w:top w:val="single" w:color="000000" w:sz="4"/>
-              <w:left w:val="single" w:color="000000" w:sz="4"/>
-              <w:bottom w:val="single" w:color="000000" w:sz="4"/>
-              <w:right w:val="single" w:color="000000" w:sz="4"/>
-            </w:tcBorders>
-            <w:vAlign w:val="center"/>
-          </w:tcPr>
-          <w:p>
-            <w:pPr>
-              <w:spacing w:after="50" w:before="50"/>
-              <w:jc w:val="center"/>
-            </w:pPr>
-            <w:r>
-              <w:rPr>
-                <w:rFonts w:ascii="Arial" w:cs="Arial" w:eastAsia="Arial" w:hAnsi="Arial"/>
-                <w:color w:val="000000"/>
-                <w:sz w:val="18"/>
-                <w:szCs w:val="18"/>
-              </w:rPr>
-              <w:t xml:space="preserve">□</w:t>
-            </w:r>
-          </w:p>
-        </w:tc>
-        <w:tc>
-          <w:tcPr>
-            <w:tcW w:type="dxa" w:w="2600"/>
-            <w:gridSpan w:val="1"/>
-            <w:tcBorders>
-              <w:top w:val="single" w:color="000000" w:sz="4"/>
-              <w:left w:val="single" w:color="000000" w:sz="4"/>
-              <w:bottom w:val="single" w:color="000000" w:sz="4"/>
-              <w:right w:val="single" w:color="000000" w:sz="4"/>
-            </w:tcBorders>
-            <w:vAlign w:val="center"/>
-          </w:tcPr>
-          <w:p>
-            <w:pPr>
-              <w:spacing w:after="50" w:before="50"/>
-              <w:jc w:val="left"/>
-            </w:pPr>
-            <w:r>
-              <w:rPr>
-                <w:rFonts w:ascii="Arial" w:cs="Arial" w:eastAsia="Arial" w:hAnsi="Arial"/>
-                <w:color w:val="000000"/>
-                <w:sz w:val="18"/>
-                <w:szCs w:val="18"/>
-              </w:rPr>
-              <w:t xml:space="preserve">Espacios Confinados</w:t>
-            </w:r>
-          </w:p>
-        </w:tc>
-        <w:tc>
-          <w:tcPr>
-            <w:tcW w:type="dxa" w:w="2400"/>
-            <w:gridSpan w:val="1"/>
-            <w:tcBorders>
-              <w:top w:val="single" w:color="000000" w:sz="4"/>
-              <w:left w:val="single" w:color="000000" w:sz="4"/>
-              <w:bottom w:val="single" w:color="000000" w:sz="4"/>
-              <w:right w:val="single" w:color="000000" w:sz="4"/>
-            </w:tcBorders>
-            <w:vAlign w:val="center"/>
-          </w:tcPr>
-          <w:p>
-            <w:pPr>
-              <w:spacing w:after="50" w:before="50"/>
-              <w:jc w:val="left"/>
-            </w:pPr>
-            <w:r>
-              <w:rPr>
-                <w:rFonts w:ascii="Arial" w:cs="Arial" w:eastAsia="Arial" w:hAnsi="Arial"/>
-                <w:color w:val="000000"/>
-                <w:sz w:val="17"/>
-                <w:szCs w:val="17"/>
-              </w:rPr>
-              <w:t xml:space="preserve">MDT / SENESCYT</w:t>
-            </w:r>
-          </w:p>
-        </w:tc>
-        <w:tc>
-          <w:tcPr>
-            <w:tcW w:type="dxa" w:w="1600"/>
-            <w:gridSpan w:val="1"/>
-            <w:tcBorders>
-              <w:top w:val="single" w:color="000000" w:sz="4"/>
-              <w:left w:val="single" w:color="000000" w:sz="4"/>
-              <w:bottom w:val="single" w:color="000000" w:sz="4"/>
-              <w:right w:val="single" w:color="000000" w:sz="4"/>
-            </w:tcBorders>
-            <w:vAlign w:val="center"/>
-          </w:tcPr>
-          <w:p>
-            <w:pPr>
-              <w:spacing w:after="50" w:before="50"/>
-              <w:jc w:val="center"/>
-            </w:pPr>
-            <w:r>
-              <w:rPr>
-                <w:rFonts w:ascii="Arial" w:cs="Arial" w:eastAsia="Arial" w:hAnsi="Arial"/>
-                <w:color w:val="000000"/>
-                <w:sz w:val="17"/>
-                <w:szCs w:val="17"/>
-              </w:rPr>
-              <w:t xml:space="preserve">__/__/____</w:t>
-            </w:r>
-          </w:p>
-        </w:tc>
-        <w:tc>
-          <w:tcPr>
-            <w:tcW w:type="dxa" w:w="3800"/>
-            <w:gridSpan w:val="1"/>
-            <w:tcBorders>
-              <w:top w:val="single" w:color="000000" w:sz="4"/>
-              <w:left w:val="single" w:color="000000" w:sz="4"/>
-              <w:bottom w:val="single" w:color="000000" w:sz="4"/>
-              <w:right w:val="single" w:color="000000" w:sz="4"/>
-            </w:tcBorders>
-            <w:vAlign w:val="center"/>
-          </w:tcPr>
-          <w:p>
-            <w:pPr>
-              <w:spacing w:after="50" w:before="50"/>
-              <w:jc w:val="center"/>
-            </w:pPr>
-            <w:r>
-              <w:rPr>
-                <w:rFonts w:ascii="Arial" w:cs="Arial" w:eastAsia="Arial" w:hAnsi="Arial"/>
-                <w:color w:val="000000"/>
-                <w:sz w:val="17"/>
-                <w:szCs w:val="17"/>
-              </w:rPr>
-              <w:t xml:space="preserve">__/__/____</w:t>
-            </w:r>
-          </w:p>
-        </w:tc>
-      </w:tr>
-      <w:tr>
-        <w:tc>
-          <w:tcPr>
-            <w:tcW w:type="dxa" w:w="400"/>
-            <w:gridSpan w:val="1"/>
-            <w:tcBorders>
-              <w:top w:val="single" w:color="000000" w:sz="4"/>
-              <w:left w:val="single" w:color="000000" w:sz="4"/>
-              <w:bottom w:val="single" w:color="000000" w:sz="4"/>
-              <w:right w:val="single" w:color="000000" w:sz="4"/>
-            </w:tcBorders>
-            <w:vAlign w:val="center"/>
-          </w:tcPr>
-          <w:p>
-            <w:pPr>
-              <w:spacing w:after="50" w:before="50"/>
-              <w:jc w:val="center"/>
-            </w:pPr>
-            <w:r>
-              <w:rPr>
-                <w:rFonts w:ascii="Arial" w:cs="Arial" w:eastAsia="Arial" w:hAnsi="Arial"/>
-                <w:color w:val="000000"/>
-                <w:sz w:val="18"/>
-                <w:szCs w:val="18"/>
-              </w:rPr>
-              <w:t xml:space="preserve">□</w:t>
-            </w:r>
-          </w:p>
-        </w:tc>
-        <w:tc>
-          <w:tcPr>
-            <w:tcW w:type="dxa" w:w="2600"/>
-            <w:gridSpan w:val="1"/>
-            <w:tcBorders>
-              <w:top w:val="single" w:color="000000" w:sz="4"/>
-              <w:left w:val="single" w:color="000000" w:sz="4"/>
-              <w:bottom w:val="single" w:color="000000" w:sz="4"/>
-              <w:right w:val="single" w:color="000000" w:sz="4"/>
-            </w:tcBorders>
-            <w:vAlign w:val="center"/>
-          </w:tcPr>
-          <w:p>
-            <w:pPr>
-              <w:spacing w:after="50" w:before="50"/>
-              <w:jc w:val="left"/>
-            </w:pPr>
-            <w:r>
-              <w:rPr>
-                <w:rFonts w:ascii="Arial" w:cs="Arial" w:eastAsia="Arial" w:hAnsi="Arial"/>
-                <w:color w:val="000000"/>
-                <w:sz w:val="18"/>
-                <w:szCs w:val="18"/>
-              </w:rPr>
-              <w:t xml:space="preserve">Trabajos Eléctricos  (media y alta tensión)</w:t>
-            </w:r>
-          </w:p>
-        </w:tc>
-        <w:tc>
-          <w:tcPr>
-            <w:tcW w:type="dxa" w:w="2400"/>
-            <w:gridSpan w:val="1"/>
-            <w:tcBorders>
-              <w:top w:val="single" w:color="000000" w:sz="4"/>
-              <w:left w:val="single" w:color="000000" w:sz="4"/>
-              <w:bottom w:val="single" w:color="000000" w:sz="4"/>
-              <w:right w:val="single" w:color="000000" w:sz="4"/>
-            </w:tcBorders>
-            <w:vAlign w:val="center"/>
-          </w:tcPr>
-          <w:p>
-            <w:pPr>
-              <w:spacing w:after="50" w:before="50"/>
-              <w:jc w:val="left"/>
-            </w:pPr>
-            <w:r>
-              <w:rPr>
-                <w:rFonts w:ascii="Arial" w:cs="Arial" w:eastAsia="Arial" w:hAnsi="Arial"/>
-                <w:color w:val="000000"/>
-                <w:sz w:val="17"/>
-                <w:szCs w:val="17"/>
-              </w:rPr>
-              <w:t xml:space="preserve">MDT / SENESCYT</w:t>
-            </w:r>
-          </w:p>
-        </w:tc>
-        <w:tc>
-          <w:tcPr>
-            <w:tcW w:type="dxa" w:w="1600"/>
-            <w:gridSpan w:val="1"/>
-            <w:tcBorders>
-              <w:top w:val="single" w:color="000000" w:sz="4"/>
-              <w:left w:val="single" w:color="000000" w:sz="4"/>
-              <w:bottom w:val="single" w:color="000000" w:sz="4"/>
-              <w:right w:val="single" w:color="000000" w:sz="4"/>
-            </w:tcBorders>
-            <w:vAlign w:val="center"/>
-          </w:tcPr>
-          <w:p>
-            <w:pPr>
-              <w:spacing w:after="50" w:before="50"/>
-              <w:jc w:val="center"/>
-            </w:pPr>
-            <w:r>
-              <w:rPr>
-                <w:rFonts w:ascii="Arial" w:cs="Arial" w:eastAsia="Arial" w:hAnsi="Arial"/>
-                <w:color w:val="000000"/>
-                <w:sz w:val="17"/>
-                <w:szCs w:val="17"/>
-              </w:rPr>
-              <w:t xml:space="preserve">__/__/____</w:t>
-            </w:r>
-          </w:p>
-        </w:tc>
-        <w:tc>
-          <w:tcPr>
-            <w:tcW w:type="dxa" w:w="3800"/>
-            <w:gridSpan w:val="1"/>
-            <w:tcBorders>
-              <w:top w:val="single" w:color="000000" w:sz="4"/>
-              <w:left w:val="single" w:color="000000" w:sz="4"/>
-              <w:bottom w:val="single" w:color="000000" w:sz="4"/>
-              <w:right w:val="single" w:color="000000" w:sz="4"/>
-            </w:tcBorders>
-            <w:vAlign w:val="center"/>
-          </w:tcPr>
-          <w:p>
-            <w:pPr>
-              <w:spacing w:after="50" w:before="50"/>
-              <w:jc w:val="center"/>
-            </w:pPr>
-            <w:r>
-              <w:rPr>
-                <w:rFonts w:ascii="Arial" w:cs="Arial" w:eastAsia="Arial" w:hAnsi="Arial"/>
-                <w:color w:val="000000"/>
-                <w:sz w:val="17"/>
-                <w:szCs w:val="17"/>
-              </w:rPr>
-              <w:t xml:space="preserve">__/__/____</w:t>
-            </w:r>
-          </w:p>
-        </w:tc>
-      </w:tr>
-      <w:tr>
-        <w:tc>
-          <w:tcPr>
-            <w:tcW w:type="dxa" w:w="400"/>
-            <w:gridSpan w:val="1"/>
-            <w:tcBorders>
-              <w:top w:val="single" w:color="000000" w:sz="4"/>
-              <w:left w:val="single" w:color="000000" w:sz="4"/>
-              <w:bottom w:val="single" w:color="000000" w:sz="4"/>
-              <w:right w:val="single" w:color="000000" w:sz="4"/>
-            </w:tcBorders>
-            <w:vAlign w:val="center"/>
-          </w:tcPr>
-          <w:p>
-            <w:pPr>
-              <w:spacing w:after="50" w:before="50"/>
-              <w:jc w:val="center"/>
-            </w:pPr>
-            <w:r>
-              <w:rPr>
-                <w:rFonts w:ascii="Arial" w:cs="Arial" w:eastAsia="Arial" w:hAnsi="Arial"/>
-                <w:color w:val="000000"/>
-                <w:sz w:val="18"/>
-                <w:szCs w:val="18"/>
-              </w:rPr>
-              <w:t xml:space="preserve">□</w:t>
-            </w:r>
-          </w:p>
-        </w:tc>
-        <w:tc>
-          <w:tcPr>
-            <w:tcW w:type="dxa" w:w="2600"/>
-            <w:gridSpan w:val="1"/>
-            <w:tcBorders>
-              <w:top w:val="single" w:color="000000" w:sz="4"/>
-              <w:left w:val="single" w:color="000000" w:sz="4"/>
-              <w:bottom w:val="single" w:color="000000" w:sz="4"/>
-              <w:right w:val="single" w:color="000000" w:sz="4"/>
-            </w:tcBorders>
-            <w:vAlign w:val="center"/>
-          </w:tcPr>
-          <w:p>
-            <w:pPr>
-              <w:spacing w:after="50" w:before="50"/>
-              <w:jc w:val="left"/>
-            </w:pPr>
-            <w:r>
-              <w:rPr>
-                <w:rFonts w:ascii="Arial" w:cs="Arial" w:eastAsia="Arial" w:hAnsi="Arial"/>
-                <w:color w:val="000000"/>
-                <w:sz w:val="18"/>
-                <w:szCs w:val="18"/>
-              </w:rPr>
-              <w:t xml:space="preserve">Izaje de Cargas</w:t>
-            </w:r>
-          </w:p>
-        </w:tc>
-        <w:tc>
-          <w:tcPr>
-            <w:tcW w:type="dxa" w:w="2400"/>
-            <w:gridSpan w:val="1"/>
-            <w:tcBorders>
-              <w:top w:val="single" w:color="000000" w:sz="4"/>
-              <w:left w:val="single" w:color="000000" w:sz="4"/>
-              <w:bottom w:val="single" w:color="000000" w:sz="4"/>
-              <w:right w:val="single" w:color="000000" w:sz="4"/>
-            </w:tcBorders>
-            <w:vAlign w:val="center"/>
-          </w:tcPr>
-          <w:p>
-            <w:pPr>
-              <w:spacing w:after="50" w:before="50"/>
-              <w:jc w:val="left"/>
-            </w:pPr>
-            <w:r>
-              <w:rPr>
-                <w:rFonts w:ascii="Arial" w:cs="Arial" w:eastAsia="Arial" w:hAnsi="Arial"/>
-                <w:color w:val="000000"/>
-                <w:sz w:val="17"/>
-                <w:szCs w:val="17"/>
-              </w:rPr>
-              <w:t xml:space="preserve">MDT / SENESCYT</w:t>
-            </w:r>
-          </w:p>
-        </w:tc>
-        <w:tc>
-          <w:tcPr>
-            <w:tcW w:type="dxa" w:w="1600"/>
-            <w:gridSpan w:val="1"/>
-            <w:tcBorders>
-              <w:top w:val="single" w:color="000000" w:sz="4"/>
-              <w:left w:val="single" w:color="000000" w:sz="4"/>
-              <w:bottom w:val="single" w:color="000000" w:sz="4"/>
-              <w:right w:val="single" w:color="000000" w:sz="4"/>
-            </w:tcBorders>
-            <w:vAlign w:val="center"/>
-          </w:tcPr>
-          <w:p>
-            <w:pPr>
-              <w:spacing w:after="50" w:before="50"/>
-              <w:jc w:val="center"/>
-            </w:pPr>
-            <w:r>
-              <w:rPr>
-                <w:rFonts w:ascii="Arial" w:cs="Arial" w:eastAsia="Arial" w:hAnsi="Arial"/>
-                <w:color w:val="000000"/>
-                <w:sz w:val="17"/>
-                <w:szCs w:val="17"/>
-              </w:rPr>
-              <w:t xml:space="preserve">__/__/____</w:t>
-            </w:r>
-          </w:p>
-        </w:tc>
-        <w:tc>
-          <w:tcPr>
-            <w:tcW w:type="dxa" w:w="3800"/>
-            <w:gridSpan w:val="1"/>
-            <w:tcBorders>
-              <w:top w:val="single" w:color="000000" w:sz="4"/>
-              <w:left w:val="single" w:color="000000" w:sz="4"/>
-              <w:bottom w:val="single" w:color="000000" w:sz="4"/>
-              <w:right w:val="single" w:color="000000" w:sz="4"/>
-            </w:tcBorders>
-            <w:vAlign w:val="center"/>
-          </w:tcPr>
-          <w:p>
-            <w:pPr>
-              <w:spacing w:after="50" w:before="50"/>
-              <w:jc w:val="center"/>
-            </w:pPr>
-            <w:r>
-              <w:rPr>
-                <w:rFonts w:ascii="Arial" w:cs="Arial" w:eastAsia="Arial" w:hAnsi="Arial"/>
-                <w:color w:val="000000"/>
-                <w:sz w:val="17"/>
-                <w:szCs w:val="17"/>
-              </w:rPr>
-              <w:t xml:space="preserve">__/__/____</w:t>
-            </w:r>
-          </w:p>
-        </w:tc>
-      </w:tr>
-      <w:tr>
-        <w:tc>
-          <w:tcPr>
-            <w:tcW w:type="dxa" w:w="400"/>
-            <w:gridSpan w:val="1"/>
-            <w:tcBorders>
-              <w:top w:val="single" w:color="000000" w:sz="4"/>
-              <w:left w:val="single" w:color="000000" w:sz="4"/>
-              <w:bottom w:val="single" w:color="000000" w:sz="4"/>
-              <w:right w:val="single" w:color="000000" w:sz="4"/>
-            </w:tcBorders>
-            <w:vAlign w:val="center"/>
-          </w:tcPr>
-          <w:p>
-            <w:pPr>
-              <w:spacing w:after="50" w:before="50"/>
-              <w:jc w:val="center"/>
-            </w:pPr>
-            <w:r>
-              <w:rPr>
-                <w:rFonts w:ascii="Arial" w:cs="Arial" w:eastAsia="Arial" w:hAnsi="Arial"/>
-                <w:color w:val="000000"/>
-                <w:sz w:val="18"/>
-                <w:szCs w:val="18"/>
-              </w:rPr>
-              <w:t xml:space="preserve">□</w:t>
-            </w:r>
-          </w:p>
-        </w:tc>
-        <w:tc>
-          <w:tcPr>
-            <w:tcW w:type="dxa" w:w="2600"/>
-            <w:gridSpan w:val="1"/>
-            <w:tcBorders>
-              <w:top w:val="single" w:color="000000" w:sz="4"/>
-              <w:left w:val="single" w:color="000000" w:sz="4"/>
-              <w:bottom w:val="single" w:color="000000" w:sz="4"/>
-              <w:right w:val="single" w:color="000000" w:sz="4"/>
-            </w:tcBorders>
-            <w:vAlign w:val="center"/>
-          </w:tcPr>
-          <w:p>
-            <w:pPr>
-              <w:spacing w:after="50" w:before="50"/>
-              <w:jc w:val="left"/>
-            </w:pPr>
-            <w:r>
-              <w:rPr>
-                <w:rFonts w:ascii="Arial" w:cs="Arial" w:eastAsia="Arial" w:hAnsi="Arial"/>
-                <w:color w:val="000000"/>
-                <w:sz w:val="18"/>
-                <w:szCs w:val="18"/>
-              </w:rPr>
-              <w:t xml:space="preserve">Excavaciones</w:t>
-            </w:r>
-          </w:p>
-        </w:tc>
-        <w:tc>
-          <w:tcPr>
-            <w:tcW w:type="dxa" w:w="2400"/>
-            <w:gridSpan w:val="1"/>
-            <w:tcBorders>
-              <w:top w:val="single" w:color="000000" w:sz="4"/>
-              <w:left w:val="single" w:color="000000" w:sz="4"/>
-              <w:bottom w:val="single" w:color="000000" w:sz="4"/>
-              <w:right w:val="single" w:color="000000" w:sz="4"/>
-            </w:tcBorders>
-            <w:vAlign w:val="center"/>
-          </w:tcPr>
-          <w:p>
-            <w:pPr>
-              <w:spacing w:after="50" w:before="50"/>
-              <w:jc w:val="left"/>
-            </w:pPr>
-            <w:r>
-              <w:rPr>
-                <w:rFonts w:ascii="Arial" w:cs="Arial" w:eastAsia="Arial" w:hAnsi="Arial"/>
-                <w:color w:val="000000"/>
-                <w:sz w:val="17"/>
-                <w:szCs w:val="17"/>
-              </w:rPr>
-              <w:t xml:space="preserve">MDT / SENESCYT</w:t>
-            </w:r>
-          </w:p>
-        </w:tc>
-        <w:tc>
-          <w:tcPr>
-            <w:tcW w:type="dxa" w:w="1600"/>
-            <w:gridSpan w:val="1"/>
-            <w:tcBorders>
-              <w:top w:val="single" w:color="000000" w:sz="4"/>
-              <w:left w:val="single" w:color="000000" w:sz="4"/>
-              <w:bottom w:val="single" w:color="000000" w:sz="4"/>
-              <w:right w:val="single" w:color="000000" w:sz="4"/>
-            </w:tcBorders>
-            <w:vAlign w:val="center"/>
-          </w:tcPr>
-          <w:p>
-            <w:pPr>
-              <w:spacing w:after="50" w:before="50"/>
-              <w:jc w:val="center"/>
-            </w:pPr>
-            <w:r>
-              <w:rPr>
-                <w:rFonts w:ascii="Arial" w:cs="Arial" w:eastAsia="Arial" w:hAnsi="Arial"/>
-                <w:color w:val="000000"/>
-                <w:sz w:val="17"/>
-                <w:szCs w:val="17"/>
-              </w:rPr>
-              <w:t xml:space="preserve">__/__/____</w:t>
-            </w:r>
-          </w:p>
-        </w:tc>
-        <w:tc>
-          <w:tcPr>
-            <w:tcW w:type="dxa" w:w="3800"/>
-            <w:gridSpan w:val="1"/>
-            <w:tcBorders>
-              <w:top w:val="single" w:color="000000" w:sz="4"/>
-              <w:left w:val="single" w:color="000000" w:sz="4"/>
-              <w:bottom w:val="single" w:color="000000" w:sz="4"/>
-              <w:right w:val="single" w:color="000000" w:sz="4"/>
-            </w:tcBorders>
-            <w:vAlign w:val="center"/>
-          </w:tcPr>
-          <w:p>
-            <w:pPr>
-              <w:spacing w:after="50" w:before="50"/>
-              <w:jc w:val="center"/>
-            </w:pPr>
-            <w:r>
-              <w:rPr>
-                <w:rFonts w:ascii="Arial" w:cs="Arial" w:eastAsia="Arial" w:hAnsi="Arial"/>
-                <w:color w:val="000000"/>
-                <w:sz w:val="17"/>
-                <w:szCs w:val="17"/>
-              </w:rPr>
-              <w:t xml:space="preserve">__/__/____</w:t>
-            </w:r>
-          </w:p>
-        </w:tc>
-      </w:tr>
-    </w:tbl>
-    <w:p>
-      <w:pPr>
-        <w:spacing w:after="0" w:before="80"/>
-      </w:pPr>
-    </w:p>
-    <w:tbl>
-      <w:tblPr>
-        <w:tblW w:type="dxa" w:w="10800"/>
-        <w:tblBorders>
-          <w:top w:val="single" w:color="auto" w:sz="4"/>
-          <w:left w:val="single" w:color="auto" w:sz="4"/>
-          <w:bottom w:val="single" w:color="auto" w:sz="4"/>
-          <w:right w:val="single" w:color="auto" w:sz="4"/>
-          <w:insideH w:val="single" w:color="auto" w:sz="4"/>
-          <w:insideV w:val="single" w:color="auto" w:sz="4"/>
-        </w:tblBorders>
-      </w:tblPr>
-      <w:tblGrid>
-        <w:gridCol w:w="2200"/>
-        <w:gridCol w:w="8600"/>
-      </w:tblGrid>
-      <w:tr>
-        <w:tc>
-          <w:tcPr>
-            <w:tcW w:type="dxa" w:w="2200"/>
-            <w:gridSpan w:val="1"/>
-            <w:tcBorders>
-              <w:top w:val="single" w:color="000000" w:sz="4"/>
-              <w:left w:val="single" w:color="000000" w:sz="4"/>
-              <w:bottom w:val="single" w:color="000000" w:sz="4"/>
-              <w:right w:val="single" w:color="000000" w:sz="4"/>
-            </w:tcBorders>
-            <w:vAlign w:val="center"/>
-          </w:tcPr>
-          <w:p>
-            <w:pPr>
-              <w:spacing w:after="60" w:before="60"/>
-              <w:jc w:val="left"/>
-            </w:pPr>
-            <w:r>
-              <w:rPr>
-                <w:rFonts w:ascii="Arial" w:cs="Arial" w:eastAsia="Arial" w:hAnsi="Arial"/>
-                <w:b/>
-                <w:bCs/>
-                <w:color w:val="000000"/>
-                <w:sz w:val="18"/>
-                <w:szCs w:val="18"/>
-              </w:rPr>
-              <w:t xml:space="preserve">EMPRESA / CONTRATISTA:</w:t>
-            </w:r>
-          </w:p>
-        </w:tc>
-        <w:tc>
-          <w:tcPr>
-            <w:tcW w:type="dxa" w:w="8600"/>
-            <w:gridSpan w:val="1"/>
-            <w:tcBorders>
-              <w:top w:val="single" w:color="000000" w:sz="4"/>
-              <w:left w:val="single" w:color="000000" w:sz="4"/>
-              <w:bottom w:val="single" w:color="000000" w:sz="4"/>
-              <w:right w:val="single" w:color="000000" w:sz="4"/>
-            </w:tcBorders>
-            <w:vAlign w:val="center"/>
-          </w:tcPr>
-          <w:p>
-            <w:pPr>
-              <w:spacing w:after="50" w:before="50"/>
-              <w:jc w:val="left"/>
-            </w:pPr>
-            <w:r>
-              <w:rPr>
-                <w:rFonts w:ascii="Arial" w:cs="Arial" w:eastAsia="Arial" w:hAnsi="Arial"/>
-                <w:color w:val="000000"/>
-                <w:sz w:val="18"/>
-                <w:szCs w:val="18"/>
-              </w:rPr>
-              <w:t xml:space="preserve"/>
-            </w:r>
-          </w:p>
-        </w:tc>
-      </w:tr>
-      <w:tr>
-        <w:tc>
-          <w:tcPr>
-            <w:tcW w:type="dxa" w:w="2200"/>
-            <w:gridSpan w:val="1"/>
-            <w:tcBorders>
-              <w:top w:val="single" w:color="000000" w:sz="4"/>
-              <w:left w:val="single" w:color="000000" w:sz="4"/>
-              <w:bottom w:val="single" w:color="000000" w:sz="4"/>
-              <w:right w:val="single" w:color="000000" w:sz="4"/>
-            </w:tcBorders>
-            <w:vAlign w:val="center"/>
-          </w:tcPr>
-          <w:p>
-            <w:pPr>
-              <w:spacing w:after="60" w:before="60"/>
-              <w:jc w:val="left"/>
-            </w:pPr>
-            <w:r>
-              <w:rPr>
-                <w:rFonts w:ascii="Arial" w:cs="Arial" w:eastAsia="Arial" w:hAnsi="Arial"/>
-                <w:b/>
-                <w:bCs/>
-                <w:color w:val="000000"/>
-                <w:sz w:val="18"/>
-                <w:szCs w:val="18"/>
-              </w:rPr>
-              <w:t xml:space="preserve">NOMBRE DE CONTACTO</w:t>
-            </w:r>
-          </w:p>
-        </w:tc>
-        <w:tc>
-          <w:tcPr>
-            <w:tcW w:type="dxa" w:w="8600"/>
-            <w:gridSpan w:val="1"/>
-            <w:tcBorders>
-              <w:top w:val="single" w:color="000000" w:sz="4"/>
-              <w:left w:val="single" w:color="000000" w:sz="4"/>
-              <w:bottom w:val="single" w:color="000000" w:sz="4"/>
-              <w:right w:val="single" w:color="000000" w:sz="4"/>
-            </w:tcBorders>
-            <w:vAlign w:val="center"/>
-          </w:tcPr>
-          <w:p>
-            <w:pPr>
-              <w:spacing w:after="50" w:before="50"/>
-              <w:jc w:val="left"/>
-            </w:pPr>
-            <w:r>
-              <w:rPr>
-                <w:rFonts w:ascii="Arial" w:cs="Arial" w:eastAsia="Arial" w:hAnsi="Arial"/>
-                <w:color w:val="000000"/>
-                <w:sz w:val="18"/>
-                <w:szCs w:val="18"/>
-              </w:rPr>
-              <w:t xml:space="preserve"/>
-            </w:r>
-          </w:p>
-        </w:tc>
-      </w:tr>
-    </w:tbl>
-    <w:p>
-      <w:pPr>
-        <w:spacing w:after="0" w:before="80"/>
-      </w:pPr>
-    </w:p>
-    <w:tbl>
-      <w:tblPr>
-        <w:tblW w:type="dxa" w:w="10800"/>
-        <w:tblBorders>
-          <w:top w:val="single" w:color="auto" w:sz="4"/>
-          <w:left w:val="single" w:color="auto" w:sz="4"/>
-          <w:bottom w:val="single" w:color="auto" w:sz="4"/>
-          <w:right w:val="single" w:color="auto" w:sz="4"/>
-          <w:insideH w:val="single" w:color="auto" w:sz="4"/>
-          <w:insideV w:val="single" w:color="auto" w:sz="4"/>
-        </w:tblBorders>
-      </w:tblPr>
-      <w:tblGrid>
-        <w:gridCol w:w="10800"/>
-      </w:tblGrid>
-      <w:tr>
-        <w:tc>
-          <w:tcPr>
-            <w:tcW w:type="dxa" w:w="10800"/>
-            <w:gridSpan w:val="1"/>
-            <w:tcBorders>
-              <w:top w:val="single" w:color="000000" w:sz="8"/>
-              <w:left w:val="single" w:color="000000" w:sz="8"/>
-              <w:bottom w:val="single" w:color="000000" w:sz="8"/>
-              <w:right w:val="single" w:color="000000" w:sz="8"/>
-            </w:tcBorders>
-            <w:shd w:fill="1A3A6B" w:val="clear"/>
-            <w:vAlign w:val="center"/>
-          </w:tcPr>
-          <w:p>
-            <w:pPr>
-              <w:spacing w:after="60" w:before="60"/>
-              <w:jc w:val="center"/>
-            </w:pPr>
-            <w:r>
-              <w:rPr>
-                <w:rFonts w:ascii="Arial" w:cs="Arial" w:eastAsia="Arial" w:hAnsi="Arial"/>
-                <w:b/>
-                <w:bCs/>
-                <w:color w:val="FFFFFF"/>
-                <w:sz w:val="19"/>
-                <w:szCs w:val="19"/>
-              </w:rPr>
-              <w:t xml:space="preserve">AUTORIZADO A INGRESAR CON</w:t>
-            </w:r>
-          </w:p>
-        </w:tc>
-      </w:tr>
-    </w:tbl>
-    <w:tbl>
-      <w:tblPr>
-        <w:tblW w:type="dxa" w:w="10800"/>
-        <w:tblBorders>
-          <w:top w:val="single" w:color="auto" w:sz="4"/>
-          <w:left w:val="single" w:color="auto" w:sz="4"/>
-          <w:bottom w:val="single" w:color="auto" w:sz="4"/>
-          <w:right w:val="single" w:color="auto" w:sz="4"/>
-          <w:insideH w:val="single" w:color="auto" w:sz="4"/>
-          <w:insideV w:val="single" w:color="auto" w:sz="4"/>
-        </w:tblBorders>
-      </w:tblPr>
-      <w:tblGrid>
-        <w:gridCol w:w="2700"/>
-        <w:gridCol w:w="2700"/>
-        <w:gridCol w:w="2700"/>
-        <w:gridCol w:w="2700"/>
-      </w:tblGrid>
-      <w:tr>
-        <w:tc>
-          <w:tcPr>
-            <w:tcW w:type="dxa" w:w="2700"/>
-            <w:gridSpan w:val="1"/>
-            <w:tcBorders>
-              <w:top w:val="single" w:color="000000" w:sz="4"/>
-              <w:left w:val="single" w:color="000000" w:sz="4"/>
-              <w:bottom w:val="single" w:color="000000" w:sz="4"/>
-              <w:right w:val="single" w:color="000000" w:sz="4"/>
-            </w:tcBorders>
-            <w:vAlign w:val="center"/>
-          </w:tcPr>
-          <w:p>
-            <w:pPr>
-              <w:spacing w:after="50" w:before="50"/>
-              <w:jc w:val="left"/>
-            </w:pPr>
-            <w:r>
-              <w:rPr>
-                <w:rFonts w:ascii="Arial" w:cs="Arial" w:eastAsia="Arial" w:hAnsi="Arial"/>
-                <w:b/>
-                <w:bCs/>
-                <w:color w:val="000000"/>
-                <w:sz w:val="17"/>
-                <w:szCs w:val="17"/>
-              </w:rPr>
-              <w:t xml:space="preserve">Casco de seguridad </w:t>
-            </w:r>
-            <w:r>
-              <w:rPr>
-                <w:rFonts w:ascii="Arial" w:cs="Arial" w:eastAsia="Arial" w:hAnsi="Arial"/>
-                <w:color w:val="000000"/>
-                <w:sz w:val="17"/>
-                <w:szCs w:val="17"/>
-              </w:rPr>
-              <w:t xml:space="preserve">□</w:t>
-            </w:r>
-          </w:p>
-        </w:tc>
-        <w:tc>
-          <w:tcPr>
-            <w:tcW w:type="dxa" w:w="2700"/>
-            <w:gridSpan w:val="1"/>
-            <w:tcBorders>
-              <w:top w:val="single" w:color="000000" w:sz="4"/>
-              <w:left w:val="single" w:color="000000" w:sz="4"/>
-              <w:bottom w:val="single" w:color="000000" w:sz="4"/>
-              <w:right w:val="single" w:color="000000" w:sz="4"/>
-            </w:tcBorders>
-            <w:vAlign w:val="center"/>
-          </w:tcPr>
-          <w:p>
-            <w:pPr>
-              <w:spacing w:after="50" w:before="50"/>
-              <w:jc w:val="left"/>
-            </w:pPr>
-            <w:r>
-              <w:rPr>
-                <w:rFonts w:ascii="Arial" w:cs="Arial" w:eastAsia="Arial" w:hAnsi="Arial"/>
-                <w:b/>
-                <w:bCs/>
-                <w:color w:val="000000"/>
-                <w:sz w:val="17"/>
-                <w:szCs w:val="17"/>
-              </w:rPr>
-              <w:t xml:space="preserve">Calzado de seguridad </w:t>
-            </w:r>
-            <w:r>
-              <w:rPr>
-                <w:rFonts w:ascii="Arial" w:cs="Arial" w:eastAsia="Arial" w:hAnsi="Arial"/>
-                <w:color w:val="000000"/>
-                <w:sz w:val="17"/>
-                <w:szCs w:val="17"/>
-              </w:rPr>
-              <w:t xml:space="preserve">□</w:t>
-            </w:r>
-          </w:p>
-        </w:tc>
-        <w:tc>
-          <w:tcPr>
-            <w:tcW w:type="dxa" w:w="2700"/>
-            <w:gridSpan w:val="1"/>
-            <w:tcBorders>
-              <w:top w:val="single" w:color="000000" w:sz="4"/>
-              <w:left w:val="single" w:color="000000" w:sz="4"/>
-              <w:bottom w:val="single" w:color="000000" w:sz="4"/>
-              <w:right w:val="single" w:color="000000" w:sz="4"/>
-            </w:tcBorders>
-            <w:vAlign w:val="center"/>
-          </w:tcPr>
-          <w:p>
-            <w:pPr>
-              <w:spacing w:after="50" w:before="50"/>
-              <w:jc w:val="left"/>
-            </w:pPr>
-            <w:r>
-              <w:rPr>
-                <w:rFonts w:ascii="Arial" w:cs="Arial" w:eastAsia="Arial" w:hAnsi="Arial"/>
-                <w:b/>
-                <w:bCs/>
-                <w:color w:val="000000"/>
-                <w:sz w:val="17"/>
-                <w:szCs w:val="17"/>
-              </w:rPr>
-              <w:t xml:space="preserve">Chaleco reflectivo </w:t>
-            </w:r>
-            <w:r>
-              <w:rPr>
-                <w:rFonts w:ascii="Arial" w:cs="Arial" w:eastAsia="Arial" w:hAnsi="Arial"/>
-                <w:color w:val="000000"/>
-                <w:sz w:val="17"/>
-                <w:szCs w:val="17"/>
-              </w:rPr>
-              <w:t xml:space="preserve">□</w:t>
-            </w:r>
-          </w:p>
-        </w:tc>
-        <w:tc>
-          <w:tcPr>
-            <w:tcW w:type="dxa" w:w="2700"/>
-            <w:gridSpan w:val="1"/>
-            <w:tcBorders>
-              <w:top w:val="single" w:color="000000" w:sz="4"/>
-              <w:left w:val="single" w:color="000000" w:sz="4"/>
-              <w:bottom w:val="single" w:color="000000" w:sz="4"/>
-              <w:right w:val="single" w:color="000000" w:sz="4"/>
-            </w:tcBorders>
-            <w:vAlign w:val="center"/>
-          </w:tcPr>
-          <w:p>
-            <w:pPr>
-              <w:spacing w:after="50" w:before="50"/>
-              <w:jc w:val="left"/>
-            </w:pPr>
-            <w:r>
-              <w:rPr>
-                <w:rFonts w:ascii="Arial" w:cs="Arial" w:eastAsia="Arial" w:hAnsi="Arial"/>
-                <w:b/>
-                <w:bCs/>
-                <w:color w:val="000000"/>
-                <w:sz w:val="17"/>
-                <w:szCs w:val="17"/>
-              </w:rPr>
-              <w:t xml:space="preserve">Gafas de seguridad </w:t>
-            </w:r>
-            <w:r>
-              <w:rPr>
-                <w:rFonts w:ascii="Arial" w:cs="Arial" w:eastAsia="Arial" w:hAnsi="Arial"/>
-                <w:color w:val="000000"/>
-                <w:sz w:val="17"/>
-                <w:szCs w:val="17"/>
-              </w:rPr>
-              <w:t xml:space="preserve">□</w:t>
-            </w:r>
-          </w:p>
-        </w:tc>
-      </w:tr>
-      <w:tr>
-        <w:tc>
-          <w:tcPr>
-            <w:tcW w:type="dxa" w:w="2700"/>
-            <w:gridSpan w:val="1"/>
-            <w:tcBorders>
-              <w:top w:val="single" w:color="000000" w:sz="4"/>
-              <w:left w:val="single" w:color="000000" w:sz="4"/>
-              <w:bottom w:val="single" w:color="000000" w:sz="4"/>
-              <w:right w:val="single" w:color="000000" w:sz="4"/>
-            </w:tcBorders>
-            <w:vAlign w:val="center"/>
-          </w:tcPr>
-          <w:p>
-            <w:pPr>
-              <w:spacing w:after="50" w:before="50"/>
-              <w:jc w:val="left"/>
-            </w:pPr>
-            <w:r>
-              <w:rPr>
-                <w:rFonts w:ascii="Arial" w:cs="Arial" w:eastAsia="Arial" w:hAnsi="Arial"/>
-                <w:b/>
-                <w:bCs/>
-                <w:color w:val="000000"/>
-                <w:sz w:val="17"/>
-                <w:szCs w:val="17"/>
-              </w:rPr>
-              <w:t xml:space="preserve">Guantes </w:t>
-            </w:r>
-            <w:r>
-              <w:rPr>
-                <w:rFonts w:ascii="Arial" w:cs="Arial" w:eastAsia="Arial" w:hAnsi="Arial"/>
-                <w:color w:val="000000"/>
-                <w:sz w:val="17"/>
-                <w:szCs w:val="17"/>
-              </w:rPr>
-              <w:t xml:space="preserve">□</w:t>
-            </w:r>
-          </w:p>
-        </w:tc>
-        <w:tc>
-          <w:tcPr>
-            <w:tcW w:type="dxa" w:w="2700"/>
-            <w:gridSpan w:val="1"/>
-            <w:tcBorders>
-              <w:top w:val="single" w:color="000000" w:sz="4"/>
-              <w:left w:val="single" w:color="000000" w:sz="4"/>
-              <w:bottom w:val="single" w:color="000000" w:sz="4"/>
-              <w:right w:val="single" w:color="000000" w:sz="4"/>
-            </w:tcBorders>
-            <w:vAlign w:val="center"/>
-          </w:tcPr>
-          <w:p>
-            <w:pPr>
-              <w:spacing w:after="50" w:before="50"/>
-              <w:jc w:val="left"/>
-            </w:pPr>
-            <w:r>
-              <w:rPr>
-                <w:rFonts w:ascii="Arial" w:cs="Arial" w:eastAsia="Arial" w:hAnsi="Arial"/>
-                <w:b/>
-                <w:bCs/>
-                <w:color w:val="000000"/>
-                <w:sz w:val="17"/>
-                <w:szCs w:val="17"/>
-              </w:rPr>
-              <w:t xml:space="preserve">Mascarilla </w:t>
-            </w:r>
-            <w:r>
-              <w:rPr>
-                <w:rFonts w:ascii="Arial" w:cs="Arial" w:eastAsia="Arial" w:hAnsi="Arial"/>
-                <w:color w:val="000000"/>
-                <w:sz w:val="17"/>
-                <w:szCs w:val="17"/>
-              </w:rPr>
-              <w:t xml:space="preserve">□</w:t>
-            </w:r>
-          </w:p>
-        </w:tc>
-        <w:tc>
-          <w:tcPr>
-            <w:tcW w:type="dxa" w:w="2700"/>
-            <w:gridSpan w:val="1"/>
-            <w:tcBorders>
-              <w:top w:val="single" w:color="000000" w:sz="4"/>
-              <w:left w:val="single" w:color="000000" w:sz="4"/>
-              <w:bottom w:val="single" w:color="000000" w:sz="4"/>
-              <w:right w:val="single" w:color="000000" w:sz="4"/>
-            </w:tcBorders>
-            <w:vAlign w:val="center"/>
-          </w:tcPr>
-          <w:p>
-            <w:pPr>
-              <w:spacing w:after="50" w:before="50"/>
-              <w:jc w:val="left"/>
-            </w:pPr>
-            <w:r>
-              <w:rPr>
-                <w:rFonts w:ascii="Arial" w:cs="Arial" w:eastAsia="Arial" w:hAnsi="Arial"/>
-                <w:b/>
-                <w:bCs/>
-                <w:color w:val="000000"/>
-                <w:sz w:val="17"/>
-                <w:szCs w:val="17"/>
-              </w:rPr>
-              <w:t xml:space="preserve">Arnés / Línea de vida </w:t>
-            </w:r>
-            <w:r>
-              <w:rPr>
-                <w:rFonts w:ascii="Arial" w:cs="Arial" w:eastAsia="Arial" w:hAnsi="Arial"/>
-                <w:color w:val="000000"/>
-                <w:sz w:val="17"/>
-                <w:szCs w:val="17"/>
-              </w:rPr>
-              <w:t xml:space="preserve">□</w:t>
-            </w:r>
-          </w:p>
-        </w:tc>
-        <w:tc>
-          <w:tcPr>
-            <w:tcW w:type="dxa" w:w="2700"/>
-            <w:gridSpan w:val="1"/>
-            <w:tcBorders>
-              <w:top w:val="single" w:color="000000" w:sz="4"/>
-              <w:left w:val="single" w:color="000000" w:sz="4"/>
-              <w:bottom w:val="single" w:color="000000" w:sz="4"/>
-              <w:right w:val="single" w:color="000000" w:sz="4"/>
-            </w:tcBorders>
-            <w:vAlign w:val="center"/>
-          </w:tcPr>
-          <w:p>
-            <w:pPr>
-              <w:spacing w:after="50" w:before="50"/>
-              <w:jc w:val="left"/>
-            </w:pPr>
-            <w:r>
-              <w:rPr>
-                <w:rFonts w:ascii="Arial" w:cs="Arial" w:eastAsia="Arial" w:hAnsi="Arial"/>
-                <w:b/>
-                <w:bCs/>
-                <w:color w:val="000000"/>
-                <w:sz w:val="17"/>
-                <w:szCs w:val="17"/>
-              </w:rPr>
-              <w:t xml:space="preserve">Protección auditiva </w:t>
-            </w:r>
-            <w:r>
-              <w:rPr>
-                <w:rFonts w:ascii="Arial" w:cs="Arial" w:eastAsia="Arial" w:hAnsi="Arial"/>
-                <w:color w:val="000000"/>
-                <w:sz w:val="17"/>
-                <w:szCs w:val="17"/>
-              </w:rPr>
-              <w:t xml:space="preserve">□</w:t>
-            </w:r>
-          </w:p>
-        </w:tc>
-      </w:tr>
-    </w:tbl>
-    <w:p>
-      <w:pPr>
-        <w:spacing w:after="0" w:before="80"/>
-      </w:pPr>
-    </w:p>
-    <w:tbl>
-      <w:tblPr>
-        <w:tblW w:type="dxa" w:w="10800"/>
-        <w:tblBorders>
-          <w:top w:val="single" w:color="auto" w:sz="4"/>
-          <w:left w:val="single" w:color="auto" w:sz="4"/>
-          <w:bottom w:val="single" w:color="auto" w:sz="4"/>
-          <w:right w:val="single" w:color="auto" w:sz="4"/>
-          <w:insideH w:val="single" w:color="auto" w:sz="4"/>
-          <w:insideV w:val="single" w:color="auto" w:sz="4"/>
-        </w:tblBorders>
-      </w:tblPr>
-      <w:tblGrid>
-        <w:gridCol w:w="10800"/>
-      </w:tblGrid>
-      <w:tr>
-        <w:tc>
-          <w:tcPr>
-            <w:tcW w:type="dxa" w:w="10800"/>
-            <w:gridSpan w:val="1"/>
-            <w:tcBorders>
-              <w:top w:val="single" w:color="000000" w:sz="8"/>
-              <w:left w:val="single" w:color="000000" w:sz="8"/>
-              <w:bottom w:val="single" w:color="000000" w:sz="8"/>
-              <w:right w:val="single" w:color="000000" w:sz="8"/>
-            </w:tcBorders>
-            <w:shd w:fill="1A3A6B" w:val="clear"/>
-            <w:vAlign w:val="center"/>
-          </w:tcPr>
-          <w:p>
-            <w:pPr>
-              <w:spacing w:after="60" w:before="60"/>
-              <w:jc w:val="center"/>
-            </w:pPr>
-            <w:r>
-              <w:rPr>
-                <w:rFonts w:ascii="Arial" w:cs="Arial" w:eastAsia="Arial" w:hAnsi="Arial"/>
-                <w:b/>
-                <w:bCs/>
-                <w:color w:val="FFFFFF"/>
-                <w:sz w:val="19"/>
-                <w:szCs w:val="19"/>
-              </w:rPr>
-              <w:t xml:space="preserve">OBSERVACIONES</w:t>
-            </w:r>
-          </w:p>
-        </w:tc>
-      </w:tr>
-    </w:tbl>
-    <w:tbl>
-      <w:tblPr>
-        <w:tblW w:type="dxa" w:w="10800"/>
-        <w:tblBorders>
-          <w:top w:val="single" w:color="auto" w:sz="4"/>
-          <w:left w:val="single" w:color="auto" w:sz="4"/>
-          <w:bottom w:val="single" w:color="auto" w:sz="4"/>
-          <w:right w:val="single" w:color="auto" w:sz="4"/>
-          <w:insideH w:val="single" w:color="auto" w:sz="4"/>
-          <w:insideV w:val="single" w:color="auto" w:sz="4"/>
-        </w:tblBorders>
-      </w:tblPr>
-      <w:tblGrid>
-        <w:gridCol w:w="10800"/>
-      </w:tblGrid>
-      <w:tr>
-        <w:tc>
-          <w:tcPr>
-            <w:tcW w:type="dxa" w:w="10800"/>
-            <w:gridSpan w:val="1"/>
-            <w:tcBorders>
-              <w:top w:val="single" w:color="000000" w:sz="4"/>
-              <w:left w:val="single" w:color="000000" w:sz="4"/>
-              <w:bottom w:val="single" w:color="000000" w:sz="4"/>
-              <w:right w:val="single" w:color="000000" w:sz="4"/>
-            </w:tcBorders>
-            <w:vAlign w:val="center"/>
-          </w:tcPr>
-          <w:p>
-            <w:pPr>
-              <w:spacing w:after="50" w:before="50"/>
-              <w:jc w:val="left"/>
-            </w:pPr>
-            <w:r>
-              <w:rPr>
-                <w:rFonts w:ascii="Arial" w:cs="Arial" w:eastAsia="Arial" w:hAnsi="Arial"/>
-                <w:color w:val="000000"/>
-                <w:sz w:val="18"/>
-                <w:szCs w:val="18"/>
-              </w:rPr>
-              <w:t xml:space="preserve"/>
-            </w:r>
-          </w:p>
-          <w:p>
-            <w:pPr>
-              <w:spacing w:after="50" w:before="50"/>
-              <w:jc w:val="left"/>
-            </w:pPr>
-            <w:r>
-              <w:rPr>
-                <w:rFonts w:ascii="Arial" w:cs="Arial" w:eastAsia="Arial" w:hAnsi="Arial"/>
-                <w:color w:val="000000"/>
-                <w:sz w:val="18"/>
-                <w:szCs w:val="18"/>
-              </w:rPr>
-              <w:t xml:space="preserve"/>
-            </w:r>
-          </w:p>
-          <w:p>
-            <w:pPr>
-              <w:spacing w:after="50" w:before="50"/>
-              <w:jc w:val="left"/>
-            </w:pPr>
-            <w:r>
-              <w:rPr>
-                <w:rFonts w:ascii="Arial" w:cs="Arial" w:eastAsia="Arial" w:hAnsi="Arial"/>
-                <w:color w:val="000000"/>
-                <w:sz w:val="18"/>
-                <w:szCs w:val="18"/>
-              </w:rPr>
-              <w:t xml:space="preserve"/>
-            </w:r>
-          </w:p>
-        </w:tc>
-      </w:tr>
-    </w:tbl>
-    <w:p>
-      <w:pPr>
-        <w:spacing w:after="0" w:before="80"/>
-      </w:pPr>
-    </w:p>
-    <w:tbl>
-      <w:tblPr>
-        <w:tblW w:type="dxa" w:w="10800"/>
-        <w:tblBorders>
-          <w:top w:val="single" w:color="auto" w:sz="4"/>
-          <w:left w:val="single" w:color="auto" w:sz="4"/>
-          <w:bottom w:val="single" w:color="auto" w:sz="4"/>
-          <w:right w:val="single" w:color="auto" w:sz="4"/>
-          <w:insideH w:val="single" w:color="auto" w:sz="4"/>
-          <w:insideV w:val="single" w:color="auto" w:sz="4"/>
-        </w:tblBorders>
-      </w:tblPr>
-      <w:tblGrid>
-        <w:gridCol w:w="10800"/>
-      </w:tblGrid>
-      <w:tr>
-        <w:tc>
-          <w:tcPr>
-            <w:tcW w:type="dxa" w:w="10800"/>
-            <w:gridSpan w:val="1"/>
-            <w:tcBorders>
-              <w:top w:val="single" w:color="000000" w:sz="8"/>
-              <w:left w:val="single" w:color="000000" w:sz="8"/>
-              <w:bottom w:val="single" w:color="000000" w:sz="8"/>
-              <w:right w:val="single" w:color="000000" w:sz="8"/>
-            </w:tcBorders>
-            <w:shd w:fill="1A3A6B" w:val="clear"/>
-            <w:vAlign w:val="center"/>
-          </w:tcPr>
-          <w:p>
-            <w:pPr>
-              <w:spacing w:after="60" w:before="60"/>
-              <w:jc w:val="center"/>
-            </w:pPr>
-            <w:r>
-              <w:rPr>
-                <w:rFonts w:ascii="Arial" w:cs="Arial" w:eastAsia="Arial" w:hAnsi="Arial"/>
-                <w:b/>
-                <w:bCs/>
-                <w:color w:val="FFFFFF"/>
-                <w:sz w:val="19"/>
-                <w:szCs w:val="19"/>
-              </w:rPr>
-              <w:t xml:space="preserve">AUTORIZACION DE INGRESO</w:t>
-            </w:r>
-          </w:p>
-        </w:tc>
-      </w:tr>
-    </w:tbl>
-    <w:tbl>
-      <w:tblPr>
-        <w:tblW w:type="dxa" w:w="10800"/>
-        <w:tblBorders>
-          <w:top w:val="single" w:color="auto" w:sz="4"/>
-          <w:left w:val="single" w:color="auto" w:sz="4"/>
-          <w:bottom w:val="single" w:color="auto" w:sz="4"/>
-          <w:right w:val="single" w:color="auto" w:sz="4"/>
-          <w:insideH w:val="single" w:color="auto" w:sz="4"/>
-          <w:insideV w:val="single" w:color="auto" w:sz="4"/>
-        </w:tblBorders>
-      </w:tblPr>
-      <w:tblGrid>
-        <w:gridCol w:w="3600"/>
-        <w:gridCol w:w="3600"/>
-        <w:gridCol w:w="3600"/>
-      </w:tblGrid>
-      <w:tr>
-        <w:tc>
-          <w:tcPr>
-            <w:tcW w:type="dxa" w:w="3600"/>
-            <w:gridSpan w:val="1"/>
-            <w:tcBorders>
-              <w:top w:val="single" w:color="000000" w:sz="4"/>
-              <w:left w:val="single" w:color="000000" w:sz="4"/>
-              <w:bottom w:val="single" w:color="000000" w:sz="4"/>
-              <w:right w:val="single" w:color="000000" w:sz="4"/>
-            </w:tcBorders>
-            <w:vAlign w:val="center"/>
-          </w:tcPr>
-          <w:p>
-            <w:pPr>
-              <w:spacing w:after="80" w:before="40"/>
-              <w:jc w:val="center"/>
-            </w:pPr>
-            <w:r>
-              <w:rPr>
-                <w:rFonts w:ascii="Arial" w:cs="Arial" w:eastAsia="Arial" w:hAnsi="Arial"/>
-                <w:b/>
-                <w:bCs/>
-                <w:color w:val="000000"/>
-                <w:sz w:val="17"/>
-                <w:szCs w:val="17"/>
-              </w:rPr>
-              <w:t xml:space="preserve">ÁREA SOLICITANTE</w:t>
-            </w:r>
-          </w:p>
-          <w:p>
-            <w:pPr>
-              <w:spacing w:after="0" w:before="60"/>
-              <w:jc w:val="center"/>
-            </w:pPr>
-            <w:r>
-              <w:rPr>
-                <w:rFonts w:ascii="Arial" w:cs="Arial" w:eastAsia="Arial" w:hAnsi="Arial"/>
-                <w:color w:val="000000"/>
-                <w:sz w:val="18"/>
-                <w:szCs w:val="18"/>
-              </w:rPr>
-              <w:t xml:space="preserve"/>
-            </w:r>
-          </w:p>
-          <w:p>
-            <w:pPr>
-              <w:spacing w:after="20" w:before="80"/>
-              <w:jc w:val="center"/>
-            </w:pPr>
-            <w:r>
-              <w:rPr>
-                <w:rFonts w:ascii="Arial" w:cs="Arial" w:eastAsia="Arial" w:hAnsi="Arial"/>
-                <w:color w:val="000000"/>
-                <w:sz w:val="17"/>
-                <w:szCs w:val="17"/>
-              </w:rPr>
-              <w:t xml:space="preserve">_________________________________</w:t>
-            </w:r>
-          </w:p>
-          <w:p>
-            <w:pPr>
-              <w:spacing w:after="40" w:before="10"/>
-              <w:jc w:val="center"/>
-            </w:pPr>
-            <w:r>
-              <w:rPr>
-                <w:rFonts w:ascii="Arial" w:cs="Arial" w:eastAsia="Arial" w:hAnsi="Arial"/>
-                <w:color w:val="000000"/>
-                <w:sz w:val="15"/>
-                <w:szCs w:val="15"/>
-              </w:rPr>
-              <w:t xml:space="preserve">Firma / Nombre / Fecha</w:t>
-            </w:r>
-          </w:p>
-        </w:tc>
-        <w:tc>
-          <w:tcPr>
-            <w:tcW w:type="dxa" w:w="3600"/>
-            <w:gridSpan w:val="1"/>
-            <w:tcBorders>
-              <w:top w:val="single" w:color="000000" w:sz="4"/>
-              <w:left w:val="single" w:color="000000" w:sz="4"/>
-              <w:bottom w:val="single" w:color="000000" w:sz="4"/>
-              <w:right w:val="single" w:color="000000" w:sz="4"/>
-            </w:tcBorders>
-            <w:vAlign w:val="center"/>
-          </w:tcPr>
-          <w:p>
-            <w:pPr>
-              <w:spacing w:after="80" w:before="40"/>
-              <w:jc w:val="center"/>
-            </w:pPr>
-            <w:r>
-              <w:rPr>
-                <w:rFonts w:ascii="Arial" w:cs="Arial" w:eastAsia="Arial" w:hAnsi="Arial"/>
-                <w:b/>
-                <w:bCs/>
-                <w:color w:val="000000"/>
-                <w:sz w:val="17"/>
-                <w:szCs w:val="17"/>
-              </w:rPr>
-              <w:t xml:space="preserve">SEGURIDAD Y AMBIENTE</w:t>
-            </w:r>
-          </w:p>
-          <w:p>
-            <w:pPr>
-              <w:spacing w:after="0" w:before="60"/>
-              <w:jc w:val="center"/>
-            </w:pPr>
-            <w:r>
-              <w:rPr>
-                <w:rFonts w:ascii="Arial" w:cs="Arial" w:eastAsia="Arial" w:hAnsi="Arial"/>
-                <w:color w:val="000000"/>
-                <w:sz w:val="18"/>
-                <w:szCs w:val="18"/>
-              </w:rPr>
-              <w:t xml:space="preserve"/>
-            </w:r>
-          </w:p>
-          <w:p>
-            <w:pPr>
-              <w:spacing w:after="20" w:before="80"/>
-              <w:jc w:val="center"/>
-            </w:pPr>
-            <w:r>
-              <w:rPr>
-                <w:rFonts w:ascii="Arial" w:cs="Arial" w:eastAsia="Arial" w:hAnsi="Arial"/>
-                <w:color w:val="000000"/>
-                <w:sz w:val="17"/>
-                <w:szCs w:val="17"/>
-              </w:rPr>
-              <w:t xml:space="preserve">_________________________________</w:t>
-            </w:r>
-          </w:p>
-          <w:p>
-            <w:pPr>
-              <w:spacing w:after="40" w:before="10"/>
-              <w:jc w:val="center"/>
-            </w:pPr>
-            <w:r>
-              <w:rPr>
-                <w:rFonts w:ascii="Arial" w:cs="Arial" w:eastAsia="Arial" w:hAnsi="Arial"/>
-                <w:color w:val="000000"/>
-                <w:sz w:val="15"/>
-                <w:szCs w:val="15"/>
-              </w:rPr>
-              <w:t xml:space="preserve">Firma / Nombre / Fecha</w:t>
-            </w:r>
-          </w:p>
-        </w:tc>
-        <w:tc>
-          <w:tcPr>
-            <w:tcW w:type="dxa" w:w="3600"/>
-            <w:gridSpan w:val="1"/>
-            <w:tcBorders>
-              <w:top w:val="single" w:color="000000" w:sz="4"/>
-              <w:left w:val="single" w:color="000000" w:sz="4"/>
-              <w:bottom w:val="single" w:color="000000" w:sz="4"/>
-              <w:right w:val="single" w:color="000000" w:sz="4"/>
-            </w:tcBorders>
-            <w:vAlign w:val="center"/>
-          </w:tcPr>
-          <w:p>
-            <w:pPr>
-              <w:spacing w:after="80" w:before="40"/>
-              <w:jc w:val="center"/>
-            </w:pPr>
-            <w:r>
-              <w:rPr>
-                <w:rFonts w:ascii="Arial" w:cs="Arial" w:eastAsia="Arial" w:hAnsi="Arial"/>
-                <w:b/>
-                <w:bCs/>
-                <w:color w:val="000000"/>
-                <w:sz w:val="17"/>
-                <w:szCs w:val="17"/>
-              </w:rPr>
-              <w:t xml:space="preserve">GUARDIA DE SEGURIDAD</w:t>
-            </w:r>
-          </w:p>
-          <w:p>
-            <w:pPr>
-              <w:spacing w:after="0" w:before="60"/>
-              <w:jc w:val="center"/>
-            </w:pPr>
-            <w:r>
-              <w:rPr>
-                <w:rFonts w:ascii="Arial" w:cs="Arial" w:eastAsia="Arial" w:hAnsi="Arial"/>
-                <w:color w:val="000000"/>
-                <w:sz w:val="18"/>
-                <w:szCs w:val="18"/>
-              </w:rPr>
-              <w:t xml:space="preserve"/>
-            </w:r>
-          </w:p>
-          <w:p>
-            <w:pPr>
-              <w:spacing w:after="20" w:before="80"/>
-              <w:jc w:val="center"/>
-            </w:pPr>
-            <w:r>
-              <w:rPr>
-                <w:rFonts w:ascii="Arial" w:cs="Arial" w:eastAsia="Arial" w:hAnsi="Arial"/>
-                <w:color w:val="000000"/>
-                <w:sz w:val="17"/>
-                <w:szCs w:val="17"/>
-              </w:rPr>
-              <w:t xml:space="preserve">_________________________________</w:t>
-            </w:r>
-          </w:p>
-          <w:p>
-            <w:pPr>
-              <w:spacing w:after="40" w:before="10"/>
-              <w:jc w:val="center"/>
-            </w:pPr>
-            <w:r>
-              <w:rPr>
-                <w:rFonts w:ascii="Arial" w:cs="Arial" w:eastAsia="Arial" w:hAnsi="Arial"/>
-                <w:color w:val="000000"/>
-                <w:sz w:val="15"/>
-                <w:szCs w:val="15"/>
-              </w:rPr>
-              <w:t xml:space="preserve">Firma / Nombre / Fecha</w:t>
-            </w:r>
-          </w:p>
-        </w:tc>
-      </w:tr>
-    </w:tbl>
-    <w:p>
-      <w:pPr>
-        <w:spacing w:after="0" w:before="0"/>
-      </w:pPr>
-      <w:r>
-        <w:br w:type="page"/>
-      </w:r>
-    </w:p>
-    <w:tbl>
-      <w:tblPr>
-        <w:tblW w:type="dxa" w:w="10800"/>
-        <w:tblBorders>
-          <w:top w:val="single" w:color="auto" w:sz="4"/>
-          <w:left w:val="single" w:color="auto" w:sz="4"/>
-          <w:bottom w:val="single" w:color="auto" w:sz="4"/>
-          <w:right w:val="single" w:color="auto" w:sz="4"/>
-          <w:insideH w:val="single" w:color="auto" w:sz="4"/>
-          <w:insideV w:val="single" w:color="auto" w:sz="4"/>
-        </w:tblBorders>
-      </w:tblPr>
-      <w:tblGrid>
-        <w:gridCol w:w="1800"/>
-        <w:gridCol w:w="7000"/>
-        <w:gridCol w:w="2000"/>
-      </w:tblGrid>
-      <w:tr>
-        <w:tc>
-          <w:tcPr>
-            <w:tcW w:type="dxa" w:w="1800"/>
-            <w:gridSpan w:val="1"/>
-            <w:tcBorders>
-              <w:top w:val="single" w:color="000000" w:sz="8"/>
-              <w:left w:val="single" w:color="000000" w:sz="8"/>
-              <w:bottom w:val="single" w:color="000000" w:sz="8"/>
-              <w:right w:val="single" w:color="000000" w:sz="8"/>
-            </w:tcBorders>
-            <w:shd w:fill="FFFFFF" w:val="clear"/>
-            <w:vAlign w:val="center"/>
-          </w:tcPr>
-          <w:p>
-            <w:pPr>
-              <w:spacing w:after="30" w:before="30"/>
-              <w:jc w:val="center"/>
-            </w:pPr>
-            <w:r>
-              <w:drawing>
-                <wp:inline distT="0" distB="0" distL="0" distR="0">
-                  <wp:extent cx="1047750" cy="476250"/>
-                  <wp:effectExtent t="0" r="0" b="0" l="0"/>
-                  <wp:docPr id="1" name="" descr="" title=""/>
-                  <wp:cNvGraphicFramePr>
-                    <a:graphicFrameLocks xmlns:a="http://schemas.openxmlformats.org/drawingml/2006/main" noChangeAspect="1"/>
-                  </wp:cNvGraphicFramePr>
-                  <a:graphic xmlns:a="http://schemas.openxmlformats.org/drawingml/2006/main">
-                    <a:graphicData uri="http://schemas.openxmlformats.org/drawingml/2006/picture">
-                      <pic:pic xmlns:pic="http://schemas.openxmlformats.org/drawingml/2006/picture">
-                        <pic:nvPicPr>
-                          <pic:cNvPr id="0" name="" descr=""/>
-                          <pic:cNvPicPr>
-                            <a:picLocks noChangeAspect="1" noChangeArrowheads="1"/>
-                          </pic:cNvPicPr>
-                        </pic:nvPicPr>
-                        <pic:blipFill>
-                          <a:blip r:embed="rId7" cstate="none"/>
-                          <a:srcRect/>
-                          <a:stretch>
-                            <a:fillRect/>
-                          </a:stretch>
-                        </pic:blipFill>
-                        <pic:spPr bwMode="auto">
-                          <a:xfrm>
-                            <a:off x="0" y="0"/>
-                            <a:ext cx="1047750" cy="476250"/>
-                          </a:xfrm>
-                          <a:prstGeom prst="rect">
-                            <a:avLst/>
-                          </a:prstGeom>
-                        </pic:spPr>
-                      </pic:pic>
-                    </a:graphicData>
-                  </a:graphic>
-                </wp:inline>
-              </w:drawing>
-            </w:r>
-          </w:p>
-        </w:tc>
-        <w:tc>
-          <w:tcPr>
-            <w:tcW w:type="dxa" w:w="7000"/>
-            <w:gridSpan w:val="1"/>
-            <w:tcBorders>
-              <w:top w:val="single" w:color="000000" w:sz="8"/>
-              <w:left w:val="single" w:color="000000" w:sz="8"/>
-              <w:bottom w:val="single" w:color="000000" w:sz="8"/>
-              <w:right w:val="single" w:color="000000" w:sz="8"/>
-            </w:tcBorders>
-            <w:shd w:fill="1A3A6B" w:val="clear"/>
-            <w:vAlign w:val="center"/>
-          </w:tcPr>
-          <w:p>
-            <w:pPr>
-              <w:spacing w:after="40" w:before="40"/>
-              <w:jc w:val="center"/>
-            </w:pPr>
-            <w:r>
-              <w:rPr>
-                <w:rFonts w:ascii="Arial" w:cs="Arial" w:eastAsia="Arial" w:hAnsi="Arial"/>
-                <w:b/>
-                <w:bCs/>
-                <w:color w:val="FFFFFF"/>
-                <w:sz w:val="24"/>
-                <w:szCs w:val="24"/>
-              </w:rPr>
-              <w:t xml:space="preserve">LISTADO DE PERSONAL AUTORIZADO
-ANEXO GE-SO-R34</w:t>
-            </w:r>
-          </w:p>
-        </w:tc>
-        <w:tc>
-          <w:tcPr>
-            <w:tcW w:type="dxa" w:w="2000"/>
-            <w:gridSpan w:val="1"/>
-            <w:tcBorders>
-              <w:top w:val="single" w:color="000000" w:sz="8"/>
-              <w:left w:val="single" w:color="000000" w:sz="8"/>
-              <w:bottom w:val="single" w:color="000000" w:sz="8"/>
-              <w:right w:val="single" w:color="000000" w:sz="8"/>
-            </w:tcBorders>
-            <w:vAlign w:val="center"/>
-          </w:tcPr>
-          <w:p>
-            <w:pPr>
-              <w:spacing w:after="10" w:before="40"/>
-              <w:jc w:val="center"/>
-            </w:pPr>
-            <w:r>
-              <w:rPr>
-                <w:rFonts w:ascii="Arial" w:cs="Arial" w:eastAsia="Arial" w:hAnsi="Arial"/>
-                <w:b/>
-                <w:bCs/>
-                <w:color w:val="000000"/>
-                <w:sz w:val="20"/>
-                <w:szCs w:val="20"/>
-              </w:rPr>
-              <w:t xml:space="preserve">GE-SO-R34</w:t>
-            </w:r>
-          </w:p>
-          <w:p>
-            <w:pPr>
-              <w:spacing w:after="40" w:before="10"/>
-              <w:jc w:val="center"/>
-            </w:pPr>
-            <w:r>
-              <w:rPr>
-                <w:rFonts w:ascii="Arial" w:cs="Arial" w:eastAsia="Arial" w:hAnsi="Arial"/>
-                <w:b/>
-                <w:bCs/>
-                <w:color w:val="000000"/>
-                <w:sz w:val="18"/>
-                <w:szCs w:val="18"/>
-              </w:rPr>
-              <w:t xml:space="preserve">Versión: 04</w:t>
-            </w:r>
-          </w:p>
-        </w:tc>
-      </w:tr>
-    </w:tbl>
-    <w:p>
-      <w:pPr>
-        <w:spacing w:after="0" w:before="80"/>
-      </w:pPr>
-    </w:p>
-    <w:tbl>
-      <w:tblPr>
-        <w:tblW w:type="dxa" w:w="10800"/>
-        <w:tblBorders>
-          <w:top w:val="single" w:color="auto" w:sz="4"/>
-          <w:left w:val="single" w:color="auto" w:sz="4"/>
-          <w:bottom w:val="single" w:color="auto" w:sz="4"/>
-          <w:right w:val="single" w:color="auto" w:sz="4"/>
-          <w:insideH w:val="single" w:color="auto" w:sz="4"/>
-          <w:insideV w:val="single" w:color="auto" w:sz="4"/>
-        </w:tblBorders>
-      </w:tblPr>
-      <w:tblGrid>
-        <w:gridCol w:w="2200"/>
-        <w:gridCol w:w="8600"/>
-      </w:tblGrid>
-      <w:tr>
-        <w:tc>
-          <w:tcPr>
-            <w:tcW w:type="dxa" w:w="2200"/>
-            <w:gridSpan w:val="1"/>
-            <w:tcBorders>
-              <w:top w:val="single" w:color="000000" w:sz="4"/>
-              <w:left w:val="single" w:color="000000" w:sz="4"/>
-              <w:bottom w:val="single" w:color="000000" w:sz="4"/>
-              <w:right w:val="single" w:color="000000" w:sz="4"/>
-            </w:tcBorders>
-            <w:vAlign w:val="center"/>
-          </w:tcPr>
-          <w:p>
-            <w:pPr>
-              <w:spacing w:after="60" w:before="60"/>
-              <w:jc w:val="left"/>
-            </w:pPr>
-            <w:r>
-              <w:rPr>
-                <w:rFonts w:ascii="Arial" w:cs="Arial" w:eastAsia="Arial" w:hAnsi="Arial"/>
-                <w:b/>
-                <w:bCs/>
-                <w:color w:val="000000"/>
-                <w:sz w:val="18"/>
-                <w:szCs w:val="18"/>
-              </w:rPr>
-              <w:t xml:space="preserve">EMPRESA CONTRATISTA:</w:t>
-            </w:r>
-          </w:p>
-        </w:tc>
-        <w:tc>
-          <w:tcPr>
-            <w:tcW w:type="dxa" w:w="8600"/>
-            <w:gridSpan w:val="1"/>
-            <w:tcBorders>
-              <w:top w:val="single" w:color="000000" w:sz="4"/>
-              <w:left w:val="single" w:color="000000" w:sz="4"/>
-              <w:bottom w:val="single" w:color="000000" w:sz="4"/>
-              <w:right w:val="single" w:color="000000" w:sz="4"/>
-            </w:tcBorders>
-            <w:vAlign w:val="center"/>
-          </w:tcPr>
-          <w:p>
-            <w:pPr>
-              <w:spacing w:after="50" w:before="50"/>
-              <w:jc w:val="left"/>
-            </w:pPr>
-            <w:r>
-              <w:rPr>
-                <w:rFonts w:ascii="Arial" w:cs="Arial" w:eastAsia="Arial" w:hAnsi="Arial"/>
-                <w:color w:val="000000"/>
-                <w:sz w:val="18"/>
-                <w:szCs w:val="18"/>
-              </w:rPr>
-              <w:t xml:space="preserve"/>
-            </w:r>
-          </w:p>
-        </w:tc>
-      </w:tr>
-      <w:tr>
-        <w:tc>
-          <w:tcPr>
-            <w:tcW w:type="dxa" w:w="2200"/>
-            <w:gridSpan w:val="1"/>
-            <w:tcBorders>
-              <w:top w:val="single" w:color="000000" w:sz="4"/>
-              <w:left w:val="single" w:color="000000" w:sz="4"/>
-              <w:bottom w:val="single" w:color="000000" w:sz="4"/>
-              <w:right w:val="single" w:color="000000" w:sz="4"/>
-            </w:tcBorders>
-            <w:vAlign w:val="center"/>
-          </w:tcPr>
-          <w:p>
-            <w:pPr>
-              <w:spacing w:after="60" w:before="60"/>
-              <w:jc w:val="left"/>
-            </w:pPr>
-            <w:r>
-              <w:rPr>
-                <w:rFonts w:ascii="Arial" w:cs="Arial" w:eastAsia="Arial" w:hAnsi="Arial"/>
-                <w:b/>
-                <w:bCs/>
-                <w:color w:val="000000"/>
-                <w:sz w:val="18"/>
-                <w:szCs w:val="18"/>
-              </w:rPr>
-              <w:t xml:space="preserve">TRABAJO / SERVICIO:</w:t>
-            </w:r>
-          </w:p>
-        </w:tc>
-        <w:tc>
-          <w:tcPr>
-            <w:tcW w:type="dxa" w:w="8600"/>
-            <w:gridSpan w:val="1"/>
-            <w:tcBorders>
-              <w:top w:val="single" w:color="000000" w:sz="4"/>
-              <w:left w:val="single" w:color="000000" w:sz="4"/>
-              <w:bottom w:val="single" w:color="000000" w:sz="4"/>
-              <w:right w:val="single" w:color="000000" w:sz="4"/>
-            </w:tcBorders>
-            <w:vAlign w:val="center"/>
-          </w:tcPr>
-          <w:p>
-            <w:pPr>
-              <w:spacing w:after="50" w:before="50"/>
-              <w:jc w:val="left"/>
-            </w:pPr>
-            <w:r>
-              <w:rPr>
-                <w:rFonts w:ascii="Arial" w:cs="Arial" w:eastAsia="Arial" w:hAnsi="Arial"/>
-                <w:color w:val="000000"/>
-                <w:sz w:val="18"/>
-                <w:szCs w:val="18"/>
-              </w:rPr>
-              <w:t xml:space="preserve"/>
-            </w:r>
-          </w:p>
-        </w:tc>
-      </w:tr>
-      <w:tr>
-        <w:tc>
-          <w:tcPr>
-            <w:tcW w:type="dxa" w:w="2200"/>
-            <w:gridSpan w:val="1"/>
-            <w:tcBorders>
-              <w:top w:val="single" w:color="000000" w:sz="4"/>
-              <w:left w:val="single" w:color="000000" w:sz="4"/>
-              <w:bottom w:val="single" w:color="000000" w:sz="4"/>
-              <w:right w:val="single" w:color="000000" w:sz="4"/>
-            </w:tcBorders>
-            <w:vAlign w:val="center"/>
-          </w:tcPr>
-          <w:p>
-            <w:pPr>
-              <w:spacing w:after="60" w:before="60"/>
-              <w:jc w:val="left"/>
-            </w:pPr>
-            <w:r>
-              <w:rPr>
-                <w:rFonts w:ascii="Arial" w:cs="Arial" w:eastAsia="Arial" w:hAnsi="Arial"/>
-                <w:b/>
-                <w:bCs/>
-                <w:color w:val="000000"/>
-                <w:sz w:val="18"/>
-                <w:szCs w:val="18"/>
-              </w:rPr>
-              <w:t xml:space="preserve">FECHA DE INGRESO:</w:t>
-            </w:r>
-          </w:p>
-        </w:tc>
-        <w:tc>
-          <w:tcPr>
-            <w:tcW w:type="dxa" w:w="8600"/>
-            <w:gridSpan w:val="1"/>
-            <w:tcBorders>
-              <w:top w:val="single" w:color="000000" w:sz="4"/>
-              <w:left w:val="single" w:color="000000" w:sz="4"/>
-              <w:bottom w:val="single" w:color="000000" w:sz="4"/>
-              <w:right w:val="single" w:color="000000" w:sz="4"/>
-            </w:tcBorders>
-            <w:vAlign w:val="center"/>
-          </w:tcPr>
-          <w:p>
-            <w:pPr>
-              <w:spacing w:after="50" w:before="50"/>
-              <w:jc w:val="left"/>
-            </w:pPr>
-            <w:r>
-              <w:rPr>
-                <w:rFonts w:ascii="Arial" w:cs="Arial" w:eastAsia="Arial" w:hAnsi="Arial"/>
-                <w:color w:val="000000"/>
-                <w:sz w:val="18"/>
-                <w:szCs w:val="18"/>
-              </w:rPr>
-              <w:t xml:space="preserve"/>
-            </w:r>
-          </w:p>
-        </w:tc>
-      </w:tr>
-    </w:tbl>
-    <w:p>
-      <w:pPr>
-        <w:spacing w:after="0" w:before="80"/>
-      </w:pPr>
-    </w:p>
-    <w:tbl>
-      <w:tblPr>
-        <w:tblW w:type="dxa" w:w="10800"/>
-        <w:tblBorders>
-          <w:top w:val="single" w:color="auto" w:sz="4"/>
-          <w:left w:val="single" w:color="auto" w:sz="4"/>
-          <w:bottom w:val="single" w:color="auto" w:sz="4"/>
-          <w:right w:val="single" w:color="auto" w:sz="4"/>
-          <w:insideH w:val="single" w:color="auto" w:sz="4"/>
-          <w:insideV w:val="single" w:color="auto" w:sz="4"/>
-        </w:tblBorders>
-      </w:tblPr>
-      <w:tblGrid>
-        <w:gridCol w:w="10800"/>
-      </w:tblGrid>
-      <w:tr>
-        <w:tc>
-          <w:tcPr>
-            <w:tcW w:type="dxa" w:w="10800"/>
-            <w:gridSpan w:val="1"/>
-            <w:tcBorders>
-              <w:top w:val="single" w:color="000000" w:sz="8"/>
-              <w:left w:val="single" w:color="000000" w:sz="8"/>
-              <w:bottom w:val="single" w:color="000000" w:sz="8"/>
-              <w:right w:val="single" w:color="000000" w:sz="8"/>
-            </w:tcBorders>
-            <w:shd w:fill="1A3A6B" w:val="clear"/>
-            <w:vAlign w:val="center"/>
-          </w:tcPr>
-          <w:p>
-            <w:pPr>
-              <w:spacing w:after="60" w:before="60"/>
-              <w:jc w:val="center"/>
-            </w:pPr>
-            <w:r>
-              <w:rPr>
-                <w:rFonts w:ascii="Arial" w:cs="Arial" w:eastAsia="Arial" w:hAnsi="Arial"/>
-                <w:b/>
-                <w:bCs/>
-                <w:color w:val="FFFFFF"/>
-                <w:sz w:val="19"/>
-                <w:szCs w:val="19"/>
-              </w:rPr>
-              <w:t xml:space="preserve">PERSONAL HABILITADO PARA EL INGRESO</w:t>
+              <w:t xml:space="preserve">2.  PERSONAL AUTORIZADO PARA EL INGRESO</w:t>
             </w:r>
           </w:p>
         </w:tc>
@@ -9014,26 +5827,26 @@
         </w:tblBorders>
       </w:tblPr>
       <w:tblGrid>
-        <w:gridCol w:w="5400"/>
-        <w:gridCol w:w="5400"/>
+        <w:gridCol w:w="2200"/>
+        <w:gridCol w:w="8600"/>
       </w:tblGrid>
       <w:tr>
         <w:tc>
           <w:tcPr>
-            <w:tcW w:type="dxa" w:w="5400"/>
-            <w:gridSpan w:val="1"/>
-            <w:tcBorders>
-              <w:top w:val="single" w:color="000000" w:sz="4"/>
-              <w:left w:val="single" w:color="000000" w:sz="4"/>
-              <w:bottom w:val="single" w:color="000000" w:sz="4"/>
-              <w:right w:val="single" w:color="000000" w:sz="4"/>
-            </w:tcBorders>
-            <w:vAlign w:val="center"/>
-          </w:tcPr>
-          <w:p>
-            <w:pPr>
-              <w:spacing w:after="100" w:before="40"/>
-              <w:jc w:val="center"/>
+            <w:tcW w:type="dxa" w:w="2200"/>
+            <w:gridSpan w:val="1"/>
+            <w:tcBorders>
+              <w:top w:val="single" w:color="000000" w:sz="4"/>
+              <w:left w:val="single" w:color="000000" w:sz="4"/>
+              <w:bottom w:val="single" w:color="000000" w:sz="4"/>
+              <w:right w:val="single" w:color="000000" w:sz="4"/>
+            </w:tcBorders>
+            <w:vAlign w:val="center"/>
+          </w:tcPr>
+          <w:p>
+            <w:pPr>
+              <w:spacing w:after="60" w:before="60"/>
+              <w:jc w:val="left"/>
             </w:pPr>
             <w:r>
               <w:rPr>
@@ -9041,10 +5854,736 @@
                 <w:b/>
                 <w:bCs/>
                 <w:color w:val="000000"/>
+                <w:sz w:val="18"/>
+                <w:szCs w:val="18"/>
+              </w:rPr>
+              <w:t xml:space="preserve">EMPRESA / CONTRATISTA:</w:t>
+            </w:r>
+          </w:p>
+        </w:tc>
+        <w:tc>
+          <w:tcPr>
+            <w:tcW w:type="dxa" w:w="8600"/>
+            <w:gridSpan w:val="1"/>
+            <w:tcBorders>
+              <w:top w:val="single" w:color="000000" w:sz="4"/>
+              <w:left w:val="single" w:color="000000" w:sz="4"/>
+              <w:bottom w:val="single" w:color="000000" w:sz="4"/>
+              <w:right w:val="single" w:color="000000" w:sz="4"/>
+            </w:tcBorders>
+            <w:vAlign w:val="center"/>
+          </w:tcPr>
+          <w:p>
+            <w:pPr>
+              <w:spacing w:after="50" w:before="50"/>
+              <w:jc w:val="left"/>
+            </w:pPr>
+            <w:r>
+              <w:rPr>
+                <w:rFonts w:ascii="Arial" w:cs="Arial" w:eastAsia="Arial" w:hAnsi="Arial"/>
+                <w:color w:val="000000"/>
+                <w:sz w:val="18"/>
+                <w:szCs w:val="18"/>
+              </w:rPr>
+              <w:t xml:space="preserve"/>
+            </w:r>
+          </w:p>
+        </w:tc>
+      </w:tr>
+      <w:tr>
+        <w:tc>
+          <w:tcPr>
+            <w:tcW w:type="dxa" w:w="2200"/>
+            <w:gridSpan w:val="1"/>
+            <w:tcBorders>
+              <w:top w:val="single" w:color="000000" w:sz="4"/>
+              <w:left w:val="single" w:color="000000" w:sz="4"/>
+              <w:bottom w:val="single" w:color="000000" w:sz="4"/>
+              <w:right w:val="single" w:color="000000" w:sz="4"/>
+            </w:tcBorders>
+            <w:vAlign w:val="center"/>
+          </w:tcPr>
+          <w:p>
+            <w:pPr>
+              <w:spacing w:after="60" w:before="60"/>
+              <w:jc w:val="left"/>
+            </w:pPr>
+            <w:r>
+              <w:rPr>
+                <w:rFonts w:ascii="Arial" w:cs="Arial" w:eastAsia="Arial" w:hAnsi="Arial"/>
+                <w:b/>
+                <w:bCs/>
+                <w:color w:val="000000"/>
+                <w:sz w:val="18"/>
+                <w:szCs w:val="18"/>
+              </w:rPr>
+              <w:t xml:space="preserve">NOMBRE DE CONTACTO</w:t>
+            </w:r>
+          </w:p>
+        </w:tc>
+        <w:tc>
+          <w:tcPr>
+            <w:tcW w:type="dxa" w:w="8600"/>
+            <w:gridSpan w:val="1"/>
+            <w:tcBorders>
+              <w:top w:val="single" w:color="000000" w:sz="4"/>
+              <w:left w:val="single" w:color="000000" w:sz="4"/>
+              <w:bottom w:val="single" w:color="000000" w:sz="4"/>
+              <w:right w:val="single" w:color="000000" w:sz="4"/>
+            </w:tcBorders>
+            <w:vAlign w:val="center"/>
+          </w:tcPr>
+          <w:p>
+            <w:pPr>
+              <w:spacing w:after="50" w:before="50"/>
+              <w:jc w:val="left"/>
+            </w:pPr>
+            <w:r>
+              <w:rPr>
+                <w:rFonts w:ascii="Arial" w:cs="Arial" w:eastAsia="Arial" w:hAnsi="Arial"/>
+                <w:color w:val="000000"/>
+                <w:sz w:val="18"/>
+                <w:szCs w:val="18"/>
+              </w:rPr>
+              <w:t xml:space="preserve"/>
+            </w:r>
+          </w:p>
+        </w:tc>
+      </w:tr>
+    </w:tbl>
+    <w:p>
+      <w:pPr>
+        <w:spacing w:after="0" w:before="80"/>
+      </w:pPr>
+    </w:p>
+    <w:tbl>
+      <w:tblPr>
+        <w:tblW w:type="dxa" w:w="10800"/>
+        <w:tblBorders>
+          <w:top w:val="single" w:color="auto" w:sz="4"/>
+          <w:left w:val="single" w:color="auto" w:sz="4"/>
+          <w:bottom w:val="single" w:color="auto" w:sz="4"/>
+          <w:right w:val="single" w:color="auto" w:sz="4"/>
+          <w:insideH w:val="single" w:color="auto" w:sz="4"/>
+          <w:insideV w:val="single" w:color="auto" w:sz="4"/>
+        </w:tblBorders>
+      </w:tblPr>
+      <w:tblGrid>
+        <w:gridCol w:w="10800"/>
+      </w:tblGrid>
+      <w:tr>
+        <w:tc>
+          <w:tcPr>
+            <w:tcW w:type="dxa" w:w="10800"/>
+            <w:gridSpan w:val="1"/>
+            <w:tcBorders>
+              <w:top w:val="single" w:color="000000" w:sz="8"/>
+              <w:left w:val="single" w:color="000000" w:sz="8"/>
+              <w:bottom w:val="single" w:color="000000" w:sz="8"/>
+              <w:right w:val="single" w:color="000000" w:sz="8"/>
+            </w:tcBorders>
+            <w:shd w:fill="1A3A6B" w:val="clear"/>
+            <w:vAlign w:val="center"/>
+          </w:tcPr>
+          <w:p>
+            <w:pPr>
+              <w:spacing w:after="60" w:before="60"/>
+              <w:jc w:val="center"/>
+            </w:pPr>
+            <w:r>
+              <w:rPr>
+                <w:rFonts w:ascii="Arial" w:cs="Arial" w:eastAsia="Arial" w:hAnsi="Arial"/>
+                <w:b/>
+                <w:bCs/>
+                <w:color w:val="FFFFFF"/>
+                <w:sz w:val="19"/>
+                <w:szCs w:val="19"/>
+              </w:rPr>
+              <w:t xml:space="preserve">AUTORIZADO A INGRESAR CON</w:t>
+            </w:r>
+          </w:p>
+        </w:tc>
+      </w:tr>
+    </w:tbl>
+    <w:tbl>
+      <w:tblPr>
+        <w:tblW w:type="dxa" w:w="10800"/>
+        <w:tblBorders>
+          <w:top w:val="single" w:color="auto" w:sz="4"/>
+          <w:left w:val="single" w:color="auto" w:sz="4"/>
+          <w:bottom w:val="single" w:color="auto" w:sz="4"/>
+          <w:right w:val="single" w:color="auto" w:sz="4"/>
+          <w:insideH w:val="single" w:color="auto" w:sz="4"/>
+          <w:insideV w:val="single" w:color="auto" w:sz="4"/>
+        </w:tblBorders>
+      </w:tblPr>
+      <w:tblGrid>
+        <w:gridCol w:w="2700"/>
+        <w:gridCol w:w="2700"/>
+        <w:gridCol w:w="2700"/>
+        <w:gridCol w:w="2700"/>
+      </w:tblGrid>
+      <w:tr>
+        <w:tc>
+          <w:tcPr>
+            <w:tcW w:type="dxa" w:w="2700"/>
+            <w:gridSpan w:val="1"/>
+            <w:tcBorders>
+              <w:top w:val="single" w:color="000000" w:sz="4"/>
+              <w:left w:val="single" w:color="000000" w:sz="4"/>
+              <w:bottom w:val="single" w:color="000000" w:sz="4"/>
+              <w:right w:val="single" w:color="000000" w:sz="4"/>
+            </w:tcBorders>
+            <w:vAlign w:val="center"/>
+          </w:tcPr>
+          <w:p>
+            <w:pPr>
+              <w:spacing w:after="50" w:before="50"/>
+              <w:jc w:val="left"/>
+            </w:pPr>
+            <w:r>
+              <w:rPr>
+                <w:rFonts w:ascii="Arial" w:cs="Arial" w:eastAsia="Arial" w:hAnsi="Arial"/>
+                <w:b/>
+                <w:bCs/>
+                <w:color w:val="000000"/>
                 <w:sz w:val="17"/>
                 <w:szCs w:val="17"/>
               </w:rPr>
-              <w:t xml:space="preserve">TÉCNICO(A) E&amp;S</w:t>
+              <w:t xml:space="preserve">Casco de seguridad </w:t>
+            </w:r>
+            <w:r>
+              <w:rPr>
+                <w:rFonts w:ascii="Arial" w:cs="Arial" w:eastAsia="Arial" w:hAnsi="Arial"/>
+                <w:color w:val="000000"/>
+                <w:sz w:val="17"/>
+                <w:szCs w:val="17"/>
+              </w:rPr>
+              <w:t xml:space="preserve">□</w:t>
+            </w:r>
+          </w:p>
+        </w:tc>
+        <w:tc>
+          <w:tcPr>
+            <w:tcW w:type="dxa" w:w="2700"/>
+            <w:gridSpan w:val="1"/>
+            <w:tcBorders>
+              <w:top w:val="single" w:color="000000" w:sz="4"/>
+              <w:left w:val="single" w:color="000000" w:sz="4"/>
+              <w:bottom w:val="single" w:color="000000" w:sz="4"/>
+              <w:right w:val="single" w:color="000000" w:sz="4"/>
+            </w:tcBorders>
+            <w:vAlign w:val="center"/>
+          </w:tcPr>
+          <w:p>
+            <w:pPr>
+              <w:spacing w:after="50" w:before="50"/>
+              <w:jc w:val="left"/>
+            </w:pPr>
+            <w:r>
+              <w:rPr>
+                <w:rFonts w:ascii="Arial" w:cs="Arial" w:eastAsia="Arial" w:hAnsi="Arial"/>
+                <w:b/>
+                <w:bCs/>
+                <w:color w:val="000000"/>
+                <w:sz w:val="17"/>
+                <w:szCs w:val="17"/>
+              </w:rPr>
+              <w:t xml:space="preserve">Calzado de seguridad </w:t>
+            </w:r>
+            <w:r>
+              <w:rPr>
+                <w:rFonts w:ascii="Arial" w:cs="Arial" w:eastAsia="Arial" w:hAnsi="Arial"/>
+                <w:color w:val="000000"/>
+                <w:sz w:val="17"/>
+                <w:szCs w:val="17"/>
+              </w:rPr>
+              <w:t xml:space="preserve">□</w:t>
+            </w:r>
+          </w:p>
+        </w:tc>
+        <w:tc>
+          <w:tcPr>
+            <w:tcW w:type="dxa" w:w="2700"/>
+            <w:gridSpan w:val="1"/>
+            <w:tcBorders>
+              <w:top w:val="single" w:color="000000" w:sz="4"/>
+              <w:left w:val="single" w:color="000000" w:sz="4"/>
+              <w:bottom w:val="single" w:color="000000" w:sz="4"/>
+              <w:right w:val="single" w:color="000000" w:sz="4"/>
+            </w:tcBorders>
+            <w:vAlign w:val="center"/>
+          </w:tcPr>
+          <w:p>
+            <w:pPr>
+              <w:spacing w:after="50" w:before="50"/>
+              <w:jc w:val="left"/>
+            </w:pPr>
+            <w:r>
+              <w:rPr>
+                <w:rFonts w:ascii="Arial" w:cs="Arial" w:eastAsia="Arial" w:hAnsi="Arial"/>
+                <w:b/>
+                <w:bCs/>
+                <w:color w:val="000000"/>
+                <w:sz w:val="17"/>
+                <w:szCs w:val="17"/>
+              </w:rPr>
+              <w:t xml:space="preserve">Chaleco reflectivo </w:t>
+            </w:r>
+            <w:r>
+              <w:rPr>
+                <w:rFonts w:ascii="Arial" w:cs="Arial" w:eastAsia="Arial" w:hAnsi="Arial"/>
+                <w:color w:val="000000"/>
+                <w:sz w:val="17"/>
+                <w:szCs w:val="17"/>
+              </w:rPr>
+              <w:t xml:space="preserve">□</w:t>
+            </w:r>
+          </w:p>
+        </w:tc>
+        <w:tc>
+          <w:tcPr>
+            <w:tcW w:type="dxa" w:w="2700"/>
+            <w:gridSpan w:val="1"/>
+            <w:tcBorders>
+              <w:top w:val="single" w:color="000000" w:sz="4"/>
+              <w:left w:val="single" w:color="000000" w:sz="4"/>
+              <w:bottom w:val="single" w:color="000000" w:sz="4"/>
+              <w:right w:val="single" w:color="000000" w:sz="4"/>
+            </w:tcBorders>
+            <w:vAlign w:val="center"/>
+          </w:tcPr>
+          <w:p>
+            <w:pPr>
+              <w:spacing w:after="50" w:before="50"/>
+              <w:jc w:val="left"/>
+            </w:pPr>
+            <w:r>
+              <w:rPr>
+                <w:rFonts w:ascii="Arial" w:cs="Arial" w:eastAsia="Arial" w:hAnsi="Arial"/>
+                <w:b/>
+                <w:bCs/>
+                <w:color w:val="000000"/>
+                <w:sz w:val="17"/>
+                <w:szCs w:val="17"/>
+              </w:rPr>
+              <w:t xml:space="preserve">Gafas de seguridad </w:t>
+            </w:r>
+            <w:r>
+              <w:rPr>
+                <w:rFonts w:ascii="Arial" w:cs="Arial" w:eastAsia="Arial" w:hAnsi="Arial"/>
+                <w:color w:val="000000"/>
+                <w:sz w:val="17"/>
+                <w:szCs w:val="17"/>
+              </w:rPr>
+              <w:t xml:space="preserve">□</w:t>
+            </w:r>
+          </w:p>
+        </w:tc>
+      </w:tr>
+      <w:tr>
+        <w:tc>
+          <w:tcPr>
+            <w:tcW w:type="dxa" w:w="2700"/>
+            <w:gridSpan w:val="1"/>
+            <w:tcBorders>
+              <w:top w:val="single" w:color="000000" w:sz="4"/>
+              <w:left w:val="single" w:color="000000" w:sz="4"/>
+              <w:bottom w:val="single" w:color="000000" w:sz="4"/>
+              <w:right w:val="single" w:color="000000" w:sz="4"/>
+            </w:tcBorders>
+            <w:vAlign w:val="center"/>
+          </w:tcPr>
+          <w:p>
+            <w:pPr>
+              <w:spacing w:after="50" w:before="50"/>
+              <w:jc w:val="left"/>
+            </w:pPr>
+            <w:r>
+              <w:rPr>
+                <w:rFonts w:ascii="Arial" w:cs="Arial" w:eastAsia="Arial" w:hAnsi="Arial"/>
+                <w:b/>
+                <w:bCs/>
+                <w:color w:val="000000"/>
+                <w:sz w:val="17"/>
+                <w:szCs w:val="17"/>
+              </w:rPr>
+              <w:t xml:space="preserve">Guantes </w:t>
+            </w:r>
+            <w:r>
+              <w:rPr>
+                <w:rFonts w:ascii="Arial" w:cs="Arial" w:eastAsia="Arial" w:hAnsi="Arial"/>
+                <w:color w:val="000000"/>
+                <w:sz w:val="17"/>
+                <w:szCs w:val="17"/>
+              </w:rPr>
+              <w:t xml:space="preserve">□</w:t>
+            </w:r>
+          </w:p>
+        </w:tc>
+        <w:tc>
+          <w:tcPr>
+            <w:tcW w:type="dxa" w:w="2700"/>
+            <w:gridSpan w:val="1"/>
+            <w:tcBorders>
+              <w:top w:val="single" w:color="000000" w:sz="4"/>
+              <w:left w:val="single" w:color="000000" w:sz="4"/>
+              <w:bottom w:val="single" w:color="000000" w:sz="4"/>
+              <w:right w:val="single" w:color="000000" w:sz="4"/>
+            </w:tcBorders>
+            <w:vAlign w:val="center"/>
+          </w:tcPr>
+          <w:p>
+            <w:pPr>
+              <w:spacing w:after="50" w:before="50"/>
+              <w:jc w:val="left"/>
+            </w:pPr>
+            <w:r>
+              <w:rPr>
+                <w:rFonts w:ascii="Arial" w:cs="Arial" w:eastAsia="Arial" w:hAnsi="Arial"/>
+                <w:b/>
+                <w:bCs/>
+                <w:color w:val="000000"/>
+                <w:sz w:val="17"/>
+                <w:szCs w:val="17"/>
+              </w:rPr>
+              <w:t xml:space="preserve">Mascarilla </w:t>
+            </w:r>
+            <w:r>
+              <w:rPr>
+                <w:rFonts w:ascii="Arial" w:cs="Arial" w:eastAsia="Arial" w:hAnsi="Arial"/>
+                <w:color w:val="000000"/>
+                <w:sz w:val="17"/>
+                <w:szCs w:val="17"/>
+              </w:rPr>
+              <w:t xml:space="preserve">□</w:t>
+            </w:r>
+          </w:p>
+        </w:tc>
+        <w:tc>
+          <w:tcPr>
+            <w:tcW w:type="dxa" w:w="2700"/>
+            <w:gridSpan w:val="1"/>
+            <w:tcBorders>
+              <w:top w:val="single" w:color="000000" w:sz="4"/>
+              <w:left w:val="single" w:color="000000" w:sz="4"/>
+              <w:bottom w:val="single" w:color="000000" w:sz="4"/>
+              <w:right w:val="single" w:color="000000" w:sz="4"/>
+            </w:tcBorders>
+            <w:vAlign w:val="center"/>
+          </w:tcPr>
+          <w:p>
+            <w:pPr>
+              <w:spacing w:after="50" w:before="50"/>
+              <w:jc w:val="left"/>
+            </w:pPr>
+            <w:r>
+              <w:rPr>
+                <w:rFonts w:ascii="Arial" w:cs="Arial" w:eastAsia="Arial" w:hAnsi="Arial"/>
+                <w:b/>
+                <w:bCs/>
+                <w:color w:val="000000"/>
+                <w:sz w:val="17"/>
+                <w:szCs w:val="17"/>
+              </w:rPr>
+              <w:t xml:space="preserve">Arnés / Línea de vida </w:t>
+            </w:r>
+            <w:r>
+              <w:rPr>
+                <w:rFonts w:ascii="Arial" w:cs="Arial" w:eastAsia="Arial" w:hAnsi="Arial"/>
+                <w:color w:val="000000"/>
+                <w:sz w:val="17"/>
+                <w:szCs w:val="17"/>
+              </w:rPr>
+              <w:t xml:space="preserve">□</w:t>
+            </w:r>
+          </w:p>
+        </w:tc>
+        <w:tc>
+          <w:tcPr>
+            <w:tcW w:type="dxa" w:w="2700"/>
+            <w:gridSpan w:val="1"/>
+            <w:tcBorders>
+              <w:top w:val="single" w:color="000000" w:sz="4"/>
+              <w:left w:val="single" w:color="000000" w:sz="4"/>
+              <w:bottom w:val="single" w:color="000000" w:sz="4"/>
+              <w:right w:val="single" w:color="000000" w:sz="4"/>
+            </w:tcBorders>
+            <w:vAlign w:val="center"/>
+          </w:tcPr>
+          <w:p>
+            <w:pPr>
+              <w:spacing w:after="50" w:before="50"/>
+              <w:jc w:val="left"/>
+            </w:pPr>
+            <w:r>
+              <w:rPr>
+                <w:rFonts w:ascii="Arial" w:cs="Arial" w:eastAsia="Arial" w:hAnsi="Arial"/>
+                <w:b/>
+                <w:bCs/>
+                <w:color w:val="000000"/>
+                <w:sz w:val="17"/>
+                <w:szCs w:val="17"/>
+              </w:rPr>
+              <w:t xml:space="preserve">Protección auditiva </w:t>
+            </w:r>
+            <w:r>
+              <w:rPr>
+                <w:rFonts w:ascii="Arial" w:cs="Arial" w:eastAsia="Arial" w:hAnsi="Arial"/>
+                <w:color w:val="000000"/>
+                <w:sz w:val="17"/>
+                <w:szCs w:val="17"/>
+              </w:rPr>
+              <w:t xml:space="preserve">□</w:t>
+            </w:r>
+          </w:p>
+        </w:tc>
+      </w:tr>
+    </w:tbl>
+    <w:p>
+      <w:pPr>
+        <w:spacing w:after="0" w:before="80"/>
+      </w:pPr>
+    </w:p>
+    <w:tbl>
+      <w:tblPr>
+        <w:tblW w:type="dxa" w:w="10800"/>
+        <w:tblBorders>
+          <w:top w:val="single" w:color="auto" w:sz="4"/>
+          <w:left w:val="single" w:color="auto" w:sz="4"/>
+          <w:bottom w:val="single" w:color="auto" w:sz="4"/>
+          <w:right w:val="single" w:color="auto" w:sz="4"/>
+          <w:insideH w:val="single" w:color="auto" w:sz="4"/>
+          <w:insideV w:val="single" w:color="auto" w:sz="4"/>
+        </w:tblBorders>
+      </w:tblPr>
+      <w:tblGrid>
+        <w:gridCol w:w="10800"/>
+      </w:tblGrid>
+      <w:tr>
+        <w:tc>
+          <w:tcPr>
+            <w:tcW w:type="dxa" w:w="10800"/>
+            <w:gridSpan w:val="1"/>
+            <w:tcBorders>
+              <w:top w:val="single" w:color="000000" w:sz="8"/>
+              <w:left w:val="single" w:color="000000" w:sz="8"/>
+              <w:bottom w:val="single" w:color="000000" w:sz="8"/>
+              <w:right w:val="single" w:color="000000" w:sz="8"/>
+            </w:tcBorders>
+            <w:shd w:fill="1A3A6B" w:val="clear"/>
+            <w:vAlign w:val="center"/>
+          </w:tcPr>
+          <w:p>
+            <w:pPr>
+              <w:spacing w:after="60" w:before="60"/>
+              <w:jc w:val="center"/>
+            </w:pPr>
+            <w:r>
+              <w:rPr>
+                <w:rFonts w:ascii="Arial" w:cs="Arial" w:eastAsia="Arial" w:hAnsi="Arial"/>
+                <w:b/>
+                <w:bCs/>
+                <w:color w:val="FFFFFF"/>
+                <w:sz w:val="19"/>
+                <w:szCs w:val="19"/>
+              </w:rPr>
+              <w:t xml:space="preserve">OBSERVACIONES</w:t>
+            </w:r>
+          </w:p>
+        </w:tc>
+      </w:tr>
+    </w:tbl>
+    <w:tbl>
+      <w:tblPr>
+        <w:tblW w:type="dxa" w:w="10800"/>
+        <w:tblBorders>
+          <w:top w:val="single" w:color="auto" w:sz="4"/>
+          <w:left w:val="single" w:color="auto" w:sz="4"/>
+          <w:bottom w:val="single" w:color="auto" w:sz="4"/>
+          <w:right w:val="single" w:color="auto" w:sz="4"/>
+          <w:insideH w:val="single" w:color="auto" w:sz="4"/>
+          <w:insideV w:val="single" w:color="auto" w:sz="4"/>
+        </w:tblBorders>
+      </w:tblPr>
+      <w:tblGrid>
+        <w:gridCol w:w="10800"/>
+      </w:tblGrid>
+      <w:tr>
+        <w:tc>
+          <w:tcPr>
+            <w:tcW w:type="dxa" w:w="10800"/>
+            <w:gridSpan w:val="1"/>
+            <w:tcBorders>
+              <w:top w:val="single" w:color="000000" w:sz="4"/>
+              <w:left w:val="single" w:color="000000" w:sz="4"/>
+              <w:bottom w:val="single" w:color="000000" w:sz="4"/>
+              <w:right w:val="single" w:color="000000" w:sz="4"/>
+            </w:tcBorders>
+            <w:vAlign w:val="center"/>
+          </w:tcPr>
+          <w:p>
+            <w:pPr>
+              <w:spacing w:after="50" w:before="50"/>
+              <w:jc w:val="left"/>
+            </w:pPr>
+            <w:r>
+              <w:rPr>
+                <w:rFonts w:ascii="Arial" w:cs="Arial" w:eastAsia="Arial" w:hAnsi="Arial"/>
+                <w:color w:val="000000"/>
+                <w:sz w:val="18"/>
+                <w:szCs w:val="18"/>
+              </w:rPr>
+              <w:t xml:space="preserve"/>
+            </w:r>
+          </w:p>
+          <w:p>
+            <w:pPr>
+              <w:spacing w:after="50" w:before="50"/>
+              <w:jc w:val="left"/>
+            </w:pPr>
+            <w:r>
+              <w:rPr>
+                <w:rFonts w:ascii="Arial" w:cs="Arial" w:eastAsia="Arial" w:hAnsi="Arial"/>
+                <w:color w:val="000000"/>
+                <w:sz w:val="18"/>
+                <w:szCs w:val="18"/>
+              </w:rPr>
+              <w:t xml:space="preserve"/>
+            </w:r>
+          </w:p>
+          <w:p>
+            <w:pPr>
+              <w:spacing w:after="50" w:before="50"/>
+              <w:jc w:val="left"/>
+            </w:pPr>
+            <w:r>
+              <w:rPr>
+                <w:rFonts w:ascii="Arial" w:cs="Arial" w:eastAsia="Arial" w:hAnsi="Arial"/>
+                <w:color w:val="000000"/>
+                <w:sz w:val="18"/>
+                <w:szCs w:val="18"/>
+              </w:rPr>
+              <w:t xml:space="preserve"/>
+            </w:r>
+          </w:p>
+        </w:tc>
+      </w:tr>
+    </w:tbl>
+    <w:p>
+      <w:pPr>
+        <w:spacing w:after="0" w:before="80"/>
+      </w:pPr>
+    </w:p>
+    <w:tbl>
+      <w:tblPr>
+        <w:tblW w:type="dxa" w:w="10800"/>
+        <w:tblBorders>
+          <w:top w:val="single" w:color="auto" w:sz="4"/>
+          <w:left w:val="single" w:color="auto" w:sz="4"/>
+          <w:bottom w:val="single" w:color="auto" w:sz="4"/>
+          <w:right w:val="single" w:color="auto" w:sz="4"/>
+          <w:insideH w:val="single" w:color="auto" w:sz="4"/>
+          <w:insideV w:val="single" w:color="auto" w:sz="4"/>
+        </w:tblBorders>
+      </w:tblPr>
+      <w:tblGrid>
+        <w:gridCol w:w="10800"/>
+      </w:tblGrid>
+      <w:tr>
+        <w:tc>
+          <w:tcPr>
+            <w:tcW w:type="dxa" w:w="10800"/>
+            <w:gridSpan w:val="1"/>
+            <w:tcBorders>
+              <w:top w:val="single" w:color="000000" w:sz="8"/>
+              <w:left w:val="single" w:color="000000" w:sz="8"/>
+              <w:bottom w:val="single" w:color="000000" w:sz="8"/>
+              <w:right w:val="single" w:color="000000" w:sz="8"/>
+            </w:tcBorders>
+            <w:shd w:fill="1A3A6B" w:val="clear"/>
+            <w:vAlign w:val="center"/>
+          </w:tcPr>
+          <w:p>
+            <w:pPr>
+              <w:spacing w:after="60" w:before="60"/>
+              <w:jc w:val="center"/>
+            </w:pPr>
+            <w:r>
+              <w:rPr>
+                <w:rFonts w:ascii="Arial" w:cs="Arial" w:eastAsia="Arial" w:hAnsi="Arial"/>
+                <w:b/>
+                <w:bCs/>
+                <w:color w:val="FFFFFF"/>
+                <w:sz w:val="19"/>
+                <w:szCs w:val="19"/>
+              </w:rPr>
+              <w:t xml:space="preserve">AUTORIZACION DE INGRESO</w:t>
+            </w:r>
+          </w:p>
+        </w:tc>
+      </w:tr>
+    </w:tbl>
+    <w:tbl>
+      <w:tblPr>
+        <w:tblW w:type="dxa" w:w="10800"/>
+        <w:tblBorders>
+          <w:top w:val="single" w:color="auto" w:sz="4"/>
+          <w:left w:val="single" w:color="auto" w:sz="4"/>
+          <w:bottom w:val="single" w:color="auto" w:sz="4"/>
+          <w:right w:val="single" w:color="auto" w:sz="4"/>
+          <w:insideH w:val="single" w:color="auto" w:sz="4"/>
+          <w:insideV w:val="single" w:color="auto" w:sz="4"/>
+        </w:tblBorders>
+      </w:tblPr>
+      <w:tblGrid>
+        <w:gridCol w:w="3600"/>
+        <w:gridCol w:w="3600"/>
+        <w:gridCol w:w="3600"/>
+      </w:tblGrid>
+      <w:tr>
+        <w:tc>
+          <w:tcPr>
+            <w:tcW w:type="dxa" w:w="3600"/>
+            <w:gridSpan w:val="1"/>
+            <w:tcBorders>
+              <w:top w:val="single" w:color="000000" w:sz="4"/>
+              <w:left w:val="single" w:color="000000" w:sz="4"/>
+              <w:bottom w:val="single" w:color="000000" w:sz="4"/>
+              <w:right w:val="single" w:color="000000" w:sz="4"/>
+            </w:tcBorders>
+            <w:vAlign w:val="center"/>
+          </w:tcPr>
+          <w:p>
+            <w:pPr>
+              <w:spacing w:after="80" w:before="40"/>
+              <w:jc w:val="center"/>
+            </w:pPr>
+            <w:r>
+              <w:rPr>
+                <w:rFonts w:ascii="Arial" w:cs="Arial" w:eastAsia="Arial" w:hAnsi="Arial"/>
+                <w:b/>
+                <w:bCs/>
+                <w:color w:val="000000"/>
+                <w:sz w:val="17"/>
+                <w:szCs w:val="17"/>
+              </w:rPr>
+              <w:t xml:space="preserve">ÁREA SOLICITANTE</w:t>
+            </w:r>
+          </w:p>
+          <w:p>
+            <w:pPr>
+              <w:spacing w:after="0" w:before="60"/>
+              <w:jc w:val="center"/>
+            </w:pPr>
+            <w:r>
+              <w:rPr>
+                <w:rFonts w:ascii="Arial" w:cs="Arial" w:eastAsia="Arial" w:hAnsi="Arial"/>
+                <w:color w:val="000000"/>
+                <w:sz w:val="18"/>
+                <w:szCs w:val="18"/>
+              </w:rPr>
+              <w:t xml:space="preserve"/>
             </w:r>
           </w:p>
           <w:p>
@@ -9074,25 +6613,25 @@
                 <w:sz w:val="15"/>
                 <w:szCs w:val="15"/>
               </w:rPr>
-              <w:t xml:space="preserve">Verifica documentación</w:t>
-            </w:r>
-          </w:p>
-        </w:tc>
-        <w:tc>
-          <w:tcPr>
-            <w:tcW w:type="dxa" w:w="5400"/>
-            <w:gridSpan w:val="1"/>
-            <w:tcBorders>
-              <w:top w:val="single" w:color="000000" w:sz="4"/>
-              <w:left w:val="single" w:color="000000" w:sz="4"/>
-              <w:bottom w:val="single" w:color="000000" w:sz="4"/>
-              <w:right w:val="single" w:color="000000" w:sz="4"/>
-            </w:tcBorders>
-            <w:vAlign w:val="center"/>
-          </w:tcPr>
-          <w:p>
-            <w:pPr>
-              <w:spacing w:after="100" w:before="40"/>
+              <w:t xml:space="preserve">Firma / Nombre / Fecha</w:t>
+            </w:r>
+          </w:p>
+        </w:tc>
+        <w:tc>
+          <w:tcPr>
+            <w:tcW w:type="dxa" w:w="3600"/>
+            <w:gridSpan w:val="1"/>
+            <w:tcBorders>
+              <w:top w:val="single" w:color="000000" w:sz="4"/>
+              <w:left w:val="single" w:color="000000" w:sz="4"/>
+              <w:bottom w:val="single" w:color="000000" w:sz="4"/>
+              <w:right w:val="single" w:color="000000" w:sz="4"/>
+            </w:tcBorders>
+            <w:vAlign w:val="center"/>
+          </w:tcPr>
+          <w:p>
+            <w:pPr>
+              <w:spacing w:after="80" w:before="40"/>
               <w:jc w:val="center"/>
             </w:pPr>
             <w:r>
@@ -9104,7 +6643,22 @@
                 <w:sz w:val="17"/>
                 <w:szCs w:val="17"/>
               </w:rPr>
-              <w:t xml:space="preserve">REPRESENTANTE EMPRESA CONTRATISTA</w:t>
+              <w:t xml:space="preserve">SEGURIDAD Y AMBIENTE</w:t>
+            </w:r>
+          </w:p>
+          <w:p>
+            <w:pPr>
+              <w:spacing w:after="0" w:before="60"/>
+              <w:jc w:val="center"/>
+            </w:pPr>
+            <w:r>
+              <w:rPr>
+                <w:rFonts w:ascii="Arial" w:cs="Arial" w:eastAsia="Arial" w:hAnsi="Arial"/>
+                <w:color w:val="000000"/>
+                <w:sz w:val="18"/>
+                <w:szCs w:val="18"/>
+              </w:rPr>
+              <w:t xml:space="preserve"/>
             </w:r>
           </w:p>
           <w:p>
@@ -9134,7 +6688,82 @@
                 <w:sz w:val="15"/>
                 <w:szCs w:val="15"/>
               </w:rPr>
-              <w:t xml:space="preserve">Confirma nómina / Firma</w:t>
+              <w:t xml:space="preserve">Firma / Nombre / Fecha</w:t>
+            </w:r>
+          </w:p>
+        </w:tc>
+        <w:tc>
+          <w:tcPr>
+            <w:tcW w:type="dxa" w:w="3600"/>
+            <w:gridSpan w:val="1"/>
+            <w:tcBorders>
+              <w:top w:val="single" w:color="000000" w:sz="4"/>
+              <w:left w:val="single" w:color="000000" w:sz="4"/>
+              <w:bottom w:val="single" w:color="000000" w:sz="4"/>
+              <w:right w:val="single" w:color="000000" w:sz="4"/>
+            </w:tcBorders>
+            <w:vAlign w:val="center"/>
+          </w:tcPr>
+          <w:p>
+            <w:pPr>
+              <w:spacing w:after="80" w:before="40"/>
+              <w:jc w:val="center"/>
+            </w:pPr>
+            <w:r>
+              <w:rPr>
+                <w:rFonts w:ascii="Arial" w:cs="Arial" w:eastAsia="Arial" w:hAnsi="Arial"/>
+                <w:b/>
+                <w:bCs/>
+                <w:color w:val="000000"/>
+                <w:sz w:val="17"/>
+                <w:szCs w:val="17"/>
+              </w:rPr>
+              <w:t xml:space="preserve">GUARDIA DE SEGURIDAD</w:t>
+            </w:r>
+          </w:p>
+          <w:p>
+            <w:pPr>
+              <w:spacing w:after="0" w:before="60"/>
+              <w:jc w:val="center"/>
+            </w:pPr>
+            <w:r>
+              <w:rPr>
+                <w:rFonts w:ascii="Arial" w:cs="Arial" w:eastAsia="Arial" w:hAnsi="Arial"/>
+                <w:color w:val="000000"/>
+                <w:sz w:val="18"/>
+                <w:szCs w:val="18"/>
+              </w:rPr>
+              <w:t xml:space="preserve"/>
+            </w:r>
+          </w:p>
+          <w:p>
+            <w:pPr>
+              <w:spacing w:after="20" w:before="80"/>
+              <w:jc w:val="center"/>
+            </w:pPr>
+            <w:r>
+              <w:rPr>
+                <w:rFonts w:ascii="Arial" w:cs="Arial" w:eastAsia="Arial" w:hAnsi="Arial"/>
+                <w:color w:val="000000"/>
+                <w:sz w:val="17"/>
+                <w:szCs w:val="17"/>
+              </w:rPr>
+              <w:t xml:space="preserve">_________________________________</w:t>
+            </w:r>
+          </w:p>
+          <w:p>
+            <w:pPr>
+              <w:spacing w:after="40" w:before="10"/>
+              <w:jc w:val="center"/>
+            </w:pPr>
+            <w:r>
+              <w:rPr>
+                <w:rFonts w:ascii="Arial" w:cs="Arial" w:eastAsia="Arial" w:hAnsi="Arial"/>
+                <w:color w:val="000000"/>
+                <w:sz w:val="15"/>
+                <w:szCs w:val="15"/>
+              </w:rPr>
+              <w:t xml:space="preserve">Firma / Nombre / Fecha</w:t>
             </w:r>
           </w:p>
         </w:tc>

</xml_diff>

<commit_message>
feat(r34): remove sections 2 & 3 from portrait form
Main R34 page now goes directly from Actividades de Riesgo to
EPP/Observaciones/Firmas. Sections 2 & 3 content is handled by
the landscape Listado page instead.

Co-Authored-By: Claude Sonnet 4.6 <noreply@anthropic.com>
Claude-Session: https://claude.ai/code/session_01Mu84mNMmRhshwom6voaTeY
</commit_message>
<xml_diff>
--- a/GE-SO-R34_Rev05_Autorizacion_Ingreso_Contratistas.docx
+++ b/GE-SO-R34_Rev05_Autorizacion_Ingreso_Contratistas.docx
@@ -1496,1864 +1496,6 @@
                 <w:szCs w:val="18"/>
               </w:rPr>
               <w:t xml:space="preserve"/>
-            </w:r>
-          </w:p>
-        </w:tc>
-      </w:tr>
-    </w:tbl>
-    <w:p>
-      <w:pPr>
-        <w:spacing w:after="0" w:before="80"/>
-      </w:pPr>
-    </w:p>
-    <w:tbl>
-      <w:tblPr>
-        <w:tblW w:type="dxa" w:w="10800"/>
-        <w:tblBorders>
-          <w:top w:val="single" w:color="auto" w:sz="4"/>
-          <w:left w:val="single" w:color="auto" w:sz="4"/>
-          <w:bottom w:val="single" w:color="auto" w:sz="4"/>
-          <w:right w:val="single" w:color="auto" w:sz="4"/>
-          <w:insideH w:val="single" w:color="auto" w:sz="4"/>
-          <w:insideV w:val="single" w:color="auto" w:sz="4"/>
-        </w:tblBorders>
-      </w:tblPr>
-      <w:tblGrid>
-        <w:gridCol w:w="10800"/>
-      </w:tblGrid>
-      <w:tr>
-        <w:tc>
-          <w:tcPr>
-            <w:tcW w:type="dxa" w:w="10800"/>
-            <w:gridSpan w:val="1"/>
-            <w:tcBorders>
-              <w:top w:val="single" w:color="000000" w:sz="8"/>
-              <w:left w:val="single" w:color="000000" w:sz="8"/>
-              <w:bottom w:val="single" w:color="000000" w:sz="8"/>
-              <w:right w:val="single" w:color="000000" w:sz="8"/>
-            </w:tcBorders>
-            <w:shd w:fill="1A3A6B" w:val="clear"/>
-            <w:vAlign w:val="center"/>
-          </w:tcPr>
-          <w:p>
-            <w:pPr>
-              <w:spacing w:after="60" w:before="60"/>
-              <w:jc w:val="center"/>
-            </w:pPr>
-            <w:r>
-              <w:rPr>
-                <w:rFonts w:ascii="Arial" w:cs="Arial" w:eastAsia="Arial" w:hAnsi="Arial"/>
-                <w:b/>
-                <w:bCs/>
-                <w:color w:val="FFFFFF"/>
-                <w:sz w:val="19"/>
-                <w:szCs w:val="19"/>
-              </w:rPr>
-              <w:t xml:space="preserve">2.  VERIFICACIÓN DE REQUISITOS DE ACCESO GENERAL</w:t>
-            </w:r>
-          </w:p>
-        </w:tc>
-      </w:tr>
-    </w:tbl>
-    <w:tbl>
-      <w:tblPr>
-        <w:tblW w:type="dxa" w:w="10800"/>
-        <w:tblBorders>
-          <w:top w:val="single" w:color="auto" w:sz="4"/>
-          <w:left w:val="single" w:color="auto" w:sz="4"/>
-          <w:bottom w:val="single" w:color="auto" w:sz="4"/>
-          <w:right w:val="single" w:color="auto" w:sz="4"/>
-          <w:insideH w:val="single" w:color="auto" w:sz="4"/>
-          <w:insideV w:val="single" w:color="auto" w:sz="4"/>
-        </w:tblBorders>
-      </w:tblPr>
-      <w:tblGrid>
-        <w:gridCol w:w="400"/>
-        <w:gridCol w:w="2800"/>
-        <w:gridCol w:w="1800"/>
-        <w:gridCol w:w="1600"/>
-        <w:gridCol w:w="4200"/>
-      </w:tblGrid>
-      <w:tr>
-        <w:tc>
-          <w:tcPr>
-            <w:tcW w:type="dxa" w:w="400"/>
-            <w:gridSpan w:val="1"/>
-            <w:tcBorders>
-              <w:top w:val="single" w:color="000000" w:sz="4"/>
-              <w:left w:val="single" w:color="000000" w:sz="4"/>
-              <w:bottom w:val="single" w:color="000000" w:sz="4"/>
-              <w:right w:val="single" w:color="000000" w:sz="4"/>
-            </w:tcBorders>
-            <w:shd w:fill="2E6DB4" w:val="clear"/>
-            <w:vAlign w:val="center"/>
-          </w:tcPr>
-          <w:p>
-            <w:pPr>
-              <w:spacing w:after="50" w:before="50"/>
-              <w:jc w:val="center"/>
-            </w:pPr>
-            <w:r>
-              <w:rPr>
-                <w:rFonts w:ascii="Arial" w:cs="Arial" w:eastAsia="Arial" w:hAnsi="Arial"/>
-                <w:b/>
-                <w:bCs/>
-                <w:color w:val="FFFFFF"/>
-                <w:sz w:val="18"/>
-                <w:szCs w:val="18"/>
-              </w:rPr>
-              <w:t xml:space="preserve">#</w:t>
-            </w:r>
-          </w:p>
-        </w:tc>
-        <w:tc>
-          <w:tcPr>
-            <w:tcW w:type="dxa" w:w="2800"/>
-            <w:gridSpan w:val="1"/>
-            <w:tcBorders>
-              <w:top w:val="single" w:color="000000" w:sz="4"/>
-              <w:left w:val="single" w:color="000000" w:sz="4"/>
-              <w:bottom w:val="single" w:color="000000" w:sz="4"/>
-              <w:right w:val="single" w:color="000000" w:sz="4"/>
-            </w:tcBorders>
-            <w:shd w:fill="2E6DB4" w:val="clear"/>
-            <w:vAlign w:val="center"/>
-          </w:tcPr>
-          <w:p>
-            <w:pPr>
-              <w:spacing w:after="50" w:before="50"/>
-              <w:jc w:val="center"/>
-            </w:pPr>
-            <w:r>
-              <w:rPr>
-                <w:rFonts w:ascii="Arial" w:cs="Arial" w:eastAsia="Arial" w:hAnsi="Arial"/>
-                <w:b/>
-                <w:bCs/>
-                <w:color w:val="FFFFFF"/>
-                <w:sz w:val="18"/>
-                <w:szCs w:val="18"/>
-              </w:rPr>
-              <w:t xml:space="preserve">REQUISITO</w:t>
-            </w:r>
-          </w:p>
-        </w:tc>
-        <w:tc>
-          <w:tcPr>
-            <w:tcW w:type="dxa" w:w="1800"/>
-            <w:gridSpan w:val="1"/>
-            <w:tcBorders>
-              <w:top w:val="single" w:color="000000" w:sz="4"/>
-              <w:left w:val="single" w:color="000000" w:sz="4"/>
-              <w:bottom w:val="single" w:color="000000" w:sz="4"/>
-              <w:right w:val="single" w:color="000000" w:sz="4"/>
-            </w:tcBorders>
-            <w:shd w:fill="2E6DB4" w:val="clear"/>
-            <w:vAlign w:val="center"/>
-          </w:tcPr>
-          <w:p>
-            <w:pPr>
-              <w:spacing w:after="50" w:before="50"/>
-              <w:jc w:val="center"/>
-            </w:pPr>
-            <w:r>
-              <w:rPr>
-                <w:rFonts w:ascii="Arial" w:cs="Arial" w:eastAsia="Arial" w:hAnsi="Arial"/>
-                <w:b/>
-                <w:bCs/>
-                <w:color w:val="FFFFFF"/>
-                <w:sz w:val="18"/>
-                <w:szCs w:val="18"/>
-              </w:rPr>
-              <w:t xml:space="preserve">DETALLE /
-VIGENCIA</w:t>
-            </w:r>
-          </w:p>
-        </w:tc>
-        <w:tc>
-          <w:tcPr>
-            <w:tcW w:type="dxa" w:w="1600"/>
-            <w:gridSpan w:val="1"/>
-            <w:tcBorders>
-              <w:top w:val="single" w:color="000000" w:sz="4"/>
-              <w:left w:val="single" w:color="000000" w:sz="4"/>
-              <w:bottom w:val="single" w:color="000000" w:sz="4"/>
-              <w:right w:val="single" w:color="000000" w:sz="4"/>
-            </w:tcBorders>
-            <w:shd w:fill="2E6DB4" w:val="clear"/>
-            <w:vAlign w:val="center"/>
-          </w:tcPr>
-          <w:p>
-            <w:pPr>
-              <w:spacing w:after="50" w:before="50"/>
-              <w:jc w:val="center"/>
-            </w:pPr>
-            <w:r>
-              <w:rPr>
-                <w:rFonts w:ascii="Arial" w:cs="Arial" w:eastAsia="Arial" w:hAnsi="Arial"/>
-                <w:b/>
-                <w:bCs/>
-                <w:color w:val="FFFFFF"/>
-                <w:sz w:val="18"/>
-                <w:szCs w:val="18"/>
-              </w:rPr>
-              <w:t xml:space="preserve">FECHA /
-ESTADO</w:t>
-            </w:r>
-          </w:p>
-        </w:tc>
-        <w:tc>
-          <w:tcPr>
-            <w:tcW w:type="dxa" w:w="4200"/>
-            <w:gridSpan w:val="1"/>
-            <w:tcBorders>
-              <w:top w:val="single" w:color="000000" w:sz="4"/>
-              <w:left w:val="single" w:color="000000" w:sz="4"/>
-              <w:bottom w:val="single" w:color="000000" w:sz="4"/>
-              <w:right w:val="single" w:color="000000" w:sz="4"/>
-            </w:tcBorders>
-            <w:shd w:fill="2E6DB4" w:val="clear"/>
-            <w:vAlign w:val="center"/>
-          </w:tcPr>
-          <w:p>
-            <w:pPr>
-              <w:spacing w:after="50" w:before="50"/>
-              <w:jc w:val="center"/>
-            </w:pPr>
-            <w:r>
-              <w:rPr>
-                <w:rFonts w:ascii="Arial" w:cs="Arial" w:eastAsia="Arial" w:hAnsi="Arial"/>
-                <w:b/>
-                <w:bCs/>
-                <w:color w:val="FFFFFF"/>
-                <w:sz w:val="18"/>
-                <w:szCs w:val="18"/>
-              </w:rPr>
-              <w:t xml:space="preserve">OBSERVACIONES</w:t>
-            </w:r>
-          </w:p>
-        </w:tc>
-      </w:tr>
-      <w:tr>
-        <w:tc>
-          <w:tcPr>
-            <w:tcW w:type="dxa" w:w="400"/>
-            <w:gridSpan w:val="1"/>
-            <w:tcBorders>
-              <w:top w:val="single" w:color="000000" w:sz="4"/>
-              <w:left w:val="single" w:color="000000" w:sz="4"/>
-              <w:bottom w:val="single" w:color="000000" w:sz="4"/>
-              <w:right w:val="single" w:color="000000" w:sz="4"/>
-            </w:tcBorders>
-            <w:shd w:fill="EBF5FB" w:val="clear"/>
-            <w:vAlign w:val="center"/>
-          </w:tcPr>
-          <w:p>
-            <w:pPr>
-              <w:spacing w:after="60" w:before="60"/>
-              <w:jc w:val="center"/>
-            </w:pPr>
-            <w:r>
-              <w:rPr>
-                <w:rFonts w:ascii="Arial" w:cs="Arial" w:eastAsia="Arial" w:hAnsi="Arial"/>
-                <w:b/>
-                <w:bCs/>
-                <w:color w:val="000000"/>
-                <w:sz w:val="18"/>
-                <w:szCs w:val="18"/>
-              </w:rPr>
-              <w:t xml:space="preserve">1</w:t>
-            </w:r>
-          </w:p>
-        </w:tc>
-        <w:tc>
-          <w:tcPr>
-            <w:tcW w:type="dxa" w:w="2800"/>
-            <w:gridSpan w:val="1"/>
-            <w:tcBorders>
-              <w:top w:val="single" w:color="000000" w:sz="4"/>
-              <w:left w:val="single" w:color="000000" w:sz="4"/>
-              <w:bottom w:val="single" w:color="000000" w:sz="4"/>
-              <w:right w:val="single" w:color="000000" w:sz="4"/>
-            </w:tcBorders>
-            <w:vAlign w:val="center"/>
-          </w:tcPr>
-          <w:p>
-            <w:pPr>
-              <w:spacing w:after="60" w:before="60"/>
-              <w:jc w:val="left"/>
-            </w:pPr>
-            <w:r>
-              <w:rPr>
-                <w:rFonts w:ascii="Arial" w:cs="Arial" w:eastAsia="Arial" w:hAnsi="Arial"/>
-                <w:b/>
-                <w:bCs/>
-                <w:color w:val="000000"/>
-                <w:sz w:val="18"/>
-                <w:szCs w:val="18"/>
-              </w:rPr>
-              <w:t xml:space="preserve">Inducción de Seguridad Plantabal</w:t>
-            </w:r>
-          </w:p>
-        </w:tc>
-        <w:tc>
-          <w:tcPr>
-            <w:tcW w:type="dxa" w:w="1800"/>
-            <w:gridSpan w:val="1"/>
-            <w:tcBorders>
-              <w:top w:val="single" w:color="000000" w:sz="4"/>
-              <w:left w:val="single" w:color="000000" w:sz="4"/>
-              <w:bottom w:val="single" w:color="000000" w:sz="4"/>
-              <w:right w:val="single" w:color="000000" w:sz="4"/>
-            </w:tcBorders>
-            <w:vAlign w:val="center"/>
-          </w:tcPr>
-          <w:p>
-            <w:pPr>
-              <w:spacing w:after="60" w:before="60"/>
-              <w:jc w:val="left"/>
-            </w:pPr>
-            <w:r>
-              <w:rPr>
-                <w:rFonts w:ascii="Arial" w:cs="Arial" w:eastAsia="Arial" w:hAnsi="Arial"/>
-                <w:color w:val="000000"/>
-                <w:sz w:val="17"/>
-                <w:szCs w:val="17"/>
-              </w:rPr>
-              <w:t xml:space="preserve">1 año desde la recepción</w:t>
-            </w:r>
-          </w:p>
-        </w:tc>
-        <w:tc>
-          <w:tcPr>
-            <w:tcW w:type="dxa" w:w="1600"/>
-            <w:gridSpan w:val="1"/>
-            <w:tcBorders>
-              <w:top w:val="single" w:color="000000" w:sz="4"/>
-              <w:left w:val="single" w:color="000000" w:sz="4"/>
-              <w:bottom w:val="single" w:color="000000" w:sz="4"/>
-              <w:right w:val="single" w:color="000000" w:sz="4"/>
-            </w:tcBorders>
-            <w:vAlign w:val="center"/>
-          </w:tcPr>
-          <w:p>
-            <w:pPr>
-              <w:spacing w:after="60" w:before="60"/>
-              <w:jc w:val="center"/>
-            </w:pPr>
-            <w:r>
-              <w:rPr>
-                <w:rFonts w:ascii="Arial" w:cs="Arial" w:eastAsia="Arial" w:hAnsi="Arial"/>
-                <w:color w:val="000000"/>
-                <w:sz w:val="17"/>
-                <w:szCs w:val="17"/>
-              </w:rPr>
-              <w:t xml:space="preserve">__/__/____</w:t>
-            </w:r>
-          </w:p>
-        </w:tc>
-        <w:tc>
-          <w:tcPr>
-            <w:tcW w:type="dxa" w:w="4200"/>
-            <w:gridSpan w:val="1"/>
-            <w:tcBorders>
-              <w:top w:val="single" w:color="000000" w:sz="4"/>
-              <w:left w:val="single" w:color="000000" w:sz="4"/>
-              <w:bottom w:val="single" w:color="000000" w:sz="4"/>
-              <w:right w:val="single" w:color="000000" w:sz="4"/>
-            </w:tcBorders>
-            <w:vAlign w:val="center"/>
-          </w:tcPr>
-          <w:p>
-            <w:pPr>
-              <w:spacing w:after="50" w:before="50"/>
-              <w:jc w:val="left"/>
-            </w:pPr>
-            <w:r>
-              <w:rPr>
-                <w:rFonts w:ascii="Arial" w:cs="Arial" w:eastAsia="Arial" w:hAnsi="Arial"/>
-                <w:color w:val="000000"/>
-                <w:sz w:val="18"/>
-                <w:szCs w:val="18"/>
-              </w:rPr>
-              <w:t xml:space="preserve"/>
-            </w:r>
-          </w:p>
-        </w:tc>
-      </w:tr>
-      <w:tr>
-        <w:tc>
-          <w:tcPr>
-            <w:tcW w:type="dxa" w:w="400"/>
-            <w:gridSpan w:val="1"/>
-            <w:tcBorders>
-              <w:top w:val="single" w:color="000000" w:sz="4"/>
-              <w:left w:val="single" w:color="000000" w:sz="4"/>
-              <w:bottom w:val="single" w:color="000000" w:sz="4"/>
-              <w:right w:val="single" w:color="000000" w:sz="4"/>
-            </w:tcBorders>
-            <w:shd w:fill="EBF5FB" w:val="clear"/>
-            <w:vAlign w:val="center"/>
-          </w:tcPr>
-          <w:p>
-            <w:pPr>
-              <w:spacing w:after="60" w:before="60"/>
-              <w:jc w:val="center"/>
-            </w:pPr>
-            <w:r>
-              <w:rPr>
-                <w:rFonts w:ascii="Arial" w:cs="Arial" w:eastAsia="Arial" w:hAnsi="Arial"/>
-                <w:b/>
-                <w:bCs/>
-                <w:color w:val="000000"/>
-                <w:sz w:val="18"/>
-                <w:szCs w:val="18"/>
-              </w:rPr>
-              <w:t xml:space="preserve">2</w:t>
-            </w:r>
-          </w:p>
-        </w:tc>
-        <w:tc>
-          <w:tcPr>
-            <w:tcW w:type="dxa" w:w="2800"/>
-            <w:gridSpan w:val="1"/>
-            <w:tcBorders>
-              <w:top w:val="single" w:color="000000" w:sz="4"/>
-              <w:left w:val="single" w:color="000000" w:sz="4"/>
-              <w:bottom w:val="single" w:color="000000" w:sz="4"/>
-              <w:right w:val="single" w:color="000000" w:sz="4"/>
-            </w:tcBorders>
-            <w:vAlign w:val="center"/>
-          </w:tcPr>
-          <w:p>
-            <w:pPr>
-              <w:spacing w:after="20" w:before="50"/>
-              <w:jc w:val="left"/>
-            </w:pPr>
-            <w:r>
-              <w:rPr>
-                <w:rFonts w:ascii="Arial" w:cs="Arial" w:eastAsia="Arial" w:hAnsi="Arial"/>
-                <w:b/>
-                <w:bCs/>
-                <w:color w:val="000000"/>
-                <w:sz w:val="18"/>
-                <w:szCs w:val="18"/>
-              </w:rPr>
-              <w:t xml:space="preserve">Afiliación al IESS</w:t>
-            </w:r>
-          </w:p>
-          <w:p>
-            <w:pPr>
-              <w:spacing w:after="50" w:before="0"/>
-              <w:jc w:val="left"/>
-            </w:pPr>
-            <w:r>
-              <w:rPr>
-                <w:rFonts w:ascii="Arial" w:cs="Arial" w:eastAsia="Arial" w:hAnsi="Arial"/>
-                <w:i/>
-                <w:iCs/>
-                <w:color w:val="444444"/>
-                <w:sz w:val="15"/>
-                <w:szCs w:val="15"/>
-              </w:rPr>
-              <w:t xml:space="preserve">Planilla del mes inmediato anterior o Aviso de entrada</w:t>
-            </w:r>
-          </w:p>
-        </w:tc>
-        <w:tc>
-          <w:tcPr>
-            <w:tcW w:type="dxa" w:w="1800"/>
-            <w:gridSpan w:val="1"/>
-            <w:tcBorders>
-              <w:top w:val="single" w:color="000000" w:sz="4"/>
-              <w:left w:val="single" w:color="000000" w:sz="4"/>
-              <w:bottom w:val="single" w:color="000000" w:sz="4"/>
-              <w:right w:val="single" w:color="000000" w:sz="4"/>
-            </w:tcBorders>
-            <w:vAlign w:val="center"/>
-          </w:tcPr>
-          <w:p>
-            <w:pPr>
-              <w:spacing w:after="60" w:before="60"/>
-              <w:jc w:val="left"/>
-            </w:pPr>
-            <w:r>
-              <w:rPr>
-                <w:rFonts w:ascii="Arial" w:cs="Arial" w:eastAsia="Arial" w:hAnsi="Arial"/>
-                <w:color w:val="000000"/>
-                <w:sz w:val="17"/>
-                <w:szCs w:val="17"/>
-              </w:rPr>
-              <w:t xml:space="preserve">Mensual</w:t>
-            </w:r>
-          </w:p>
-        </w:tc>
-        <w:tc>
-          <w:tcPr>
-            <w:tcW w:type="dxa" w:w="1600"/>
-            <w:gridSpan w:val="1"/>
-            <w:tcBorders>
-              <w:top w:val="single" w:color="000000" w:sz="4"/>
-              <w:left w:val="single" w:color="000000" w:sz="4"/>
-              <w:bottom w:val="single" w:color="000000" w:sz="4"/>
-              <w:right w:val="single" w:color="000000" w:sz="4"/>
-            </w:tcBorders>
-            <w:vAlign w:val="center"/>
-          </w:tcPr>
-          <w:p>
-            <w:pPr>
-              <w:spacing w:after="60" w:before="60"/>
-              <w:jc w:val="center"/>
-            </w:pPr>
-            <w:r>
-              <w:rPr>
-                <w:rFonts w:ascii="Arial" w:cs="Arial" w:eastAsia="Arial" w:hAnsi="Arial"/>
-                <w:color w:val="000000"/>
-                <w:sz w:val="17"/>
-                <w:szCs w:val="17"/>
-              </w:rPr>
-              <w:t xml:space="preserve">__/__/____</w:t>
-            </w:r>
-          </w:p>
-        </w:tc>
-        <w:tc>
-          <w:tcPr>
-            <w:tcW w:type="dxa" w:w="4200"/>
-            <w:gridSpan w:val="1"/>
-            <w:tcBorders>
-              <w:top w:val="single" w:color="000000" w:sz="4"/>
-              <w:left w:val="single" w:color="000000" w:sz="4"/>
-              <w:bottom w:val="single" w:color="000000" w:sz="4"/>
-              <w:right w:val="single" w:color="000000" w:sz="4"/>
-            </w:tcBorders>
-            <w:vAlign w:val="center"/>
-          </w:tcPr>
-          <w:p>
-            <w:pPr>
-              <w:spacing w:after="60" w:before="60"/>
-              <w:jc w:val="left"/>
-            </w:pPr>
-            <w:r>
-              <w:rPr>
-                <w:rFonts w:ascii="Arial" w:cs="Arial" w:eastAsia="Arial" w:hAnsi="Arial"/>
-                <w:i/>
-                <w:iCs/>
-                <w:color w:val="444444"/>
-                <w:sz w:val="15"/>
-                <w:szCs w:val="15"/>
-              </w:rPr>
-              <w:t xml:space="preserve">Si aplica aviso de entrada, registrar aquí</w:t>
-            </w:r>
-          </w:p>
-        </w:tc>
-      </w:tr>
-      <w:tr>
-        <w:tc>
-          <w:tcPr>
-            <w:tcW w:type="dxa" w:w="400"/>
-            <w:gridSpan w:val="1"/>
-            <w:tcBorders>
-              <w:top w:val="single" w:color="000000" w:sz="4"/>
-              <w:left w:val="single" w:color="000000" w:sz="4"/>
-              <w:bottom w:val="single" w:color="000000" w:sz="4"/>
-              <w:right w:val="single" w:color="000000" w:sz="4"/>
-            </w:tcBorders>
-            <w:shd w:fill="EBF5FB" w:val="clear"/>
-            <w:vAlign w:val="center"/>
-          </w:tcPr>
-          <w:p>
-            <w:pPr>
-              <w:spacing w:after="60" w:before="60"/>
-              <w:jc w:val="center"/>
-            </w:pPr>
-            <w:r>
-              <w:rPr>
-                <w:rFonts w:ascii="Arial" w:cs="Arial" w:eastAsia="Arial" w:hAnsi="Arial"/>
-                <w:b/>
-                <w:bCs/>
-                <w:color w:val="000000"/>
-                <w:sz w:val="18"/>
-                <w:szCs w:val="18"/>
-              </w:rPr>
-              <w:t xml:space="preserve">3</w:t>
-            </w:r>
-          </w:p>
-        </w:tc>
-        <w:tc>
-          <w:tcPr>
-            <w:tcW w:type="dxa" w:w="2800"/>
-            <w:gridSpan w:val="1"/>
-            <w:tcBorders>
-              <w:top w:val="single" w:color="000000" w:sz="4"/>
-              <w:left w:val="single" w:color="000000" w:sz="4"/>
-              <w:bottom w:val="single" w:color="000000" w:sz="4"/>
-              <w:right w:val="single" w:color="000000" w:sz="4"/>
-            </w:tcBorders>
-            <w:vAlign w:val="center"/>
-          </w:tcPr>
-          <w:p>
-            <w:pPr>
-              <w:spacing w:after="20" w:before="50"/>
-              <w:jc w:val="left"/>
-            </w:pPr>
-            <w:r>
-              <w:rPr>
-                <w:rFonts w:ascii="Arial" w:cs="Arial" w:eastAsia="Arial" w:hAnsi="Arial"/>
-                <w:b/>
-                <w:bCs/>
-                <w:color w:val="000000"/>
-                <w:sz w:val="18"/>
-                <w:szCs w:val="18"/>
-              </w:rPr>
-              <w:t xml:space="preserve">Certificado Médico Laboral</w:t>
-            </w:r>
-          </w:p>
-          <w:p>
-            <w:pPr>
-              <w:spacing w:after="50" w:before="0"/>
-              <w:jc w:val="left"/>
-            </w:pPr>
-            <w:r>
-              <w:rPr>
-                <w:rFonts w:ascii="Arial" w:cs="Arial" w:eastAsia="Arial" w:hAnsi="Arial"/>
-                <w:i/>
-                <w:iCs/>
-                <w:color w:val="444444"/>
-                <w:sz w:val="15"/>
-                <w:szCs w:val="15"/>
-              </w:rPr>
-              <w:t xml:space="preserve">Aptitud ocupacional emitida por médico de planta</w:t>
-            </w:r>
-          </w:p>
-        </w:tc>
-        <w:tc>
-          <w:tcPr>
-            <w:tcW w:type="dxa" w:w="1800"/>
-            <w:gridSpan w:val="1"/>
-            <w:tcBorders>
-              <w:top w:val="single" w:color="000000" w:sz="4"/>
-              <w:left w:val="single" w:color="000000" w:sz="4"/>
-              <w:bottom w:val="single" w:color="000000" w:sz="4"/>
-              <w:right w:val="single" w:color="000000" w:sz="4"/>
-            </w:tcBorders>
-            <w:vAlign w:val="center"/>
-          </w:tcPr>
-          <w:p>
-            <w:pPr>
-              <w:spacing w:after="60" w:before="60"/>
-              <w:jc w:val="left"/>
-            </w:pPr>
-            <w:r>
-              <w:rPr>
-                <w:rFonts w:ascii="Arial" w:cs="Arial" w:eastAsia="Arial" w:hAnsi="Arial"/>
-                <w:color w:val="000000"/>
-                <w:sz w:val="17"/>
-                <w:szCs w:val="17"/>
-              </w:rPr>
-              <w:t xml:space="preserve">Según criterio Médico de Planta</w:t>
-            </w:r>
-          </w:p>
-        </w:tc>
-        <w:tc>
-          <w:tcPr>
-            <w:tcW w:type="dxa" w:w="1600"/>
-            <w:gridSpan w:val="1"/>
-            <w:tcBorders>
-              <w:top w:val="single" w:color="000000" w:sz="4"/>
-              <w:left w:val="single" w:color="000000" w:sz="4"/>
-              <w:bottom w:val="single" w:color="000000" w:sz="4"/>
-              <w:right w:val="single" w:color="000000" w:sz="4"/>
-            </w:tcBorders>
-            <w:vAlign w:val="center"/>
-          </w:tcPr>
-          <w:p>
-            <w:pPr>
-              <w:spacing w:after="20" w:before="40"/>
-              <w:jc w:val="left"/>
-            </w:pPr>
-            <w:r>
-              <w:rPr>
-                <w:rFonts w:ascii="Arial" w:cs="Arial" w:eastAsia="Arial" w:hAnsi="Arial"/>
-                <w:color w:val="000000"/>
-                <w:sz w:val="17"/>
-                <w:szCs w:val="17"/>
-              </w:rPr>
-              <w:t xml:space="preserve">Vence: __/__/____</w:t>
-            </w:r>
-          </w:p>
-          <w:p>
-            <w:pPr>
-              <w:spacing w:after="40" w:before="20"/>
-              <w:jc w:val="left"/>
-            </w:pPr>
-            <w:r>
-              <w:rPr>
-                <w:rFonts w:ascii="Arial" w:cs="Arial" w:eastAsia="Arial" w:hAnsi="Arial"/>
-                <w:b/>
-                <w:bCs/>
-                <w:color w:val="000000"/>
-                <w:sz w:val="17"/>
-                <w:szCs w:val="17"/>
-              </w:rPr>
-              <w:t xml:space="preserve">□ APTO   □ NO APTO</w:t>
-            </w:r>
-          </w:p>
-        </w:tc>
-        <w:tc>
-          <w:tcPr>
-            <w:tcW w:type="dxa" w:w="4200"/>
-            <w:gridSpan w:val="1"/>
-            <w:tcBorders>
-              <w:top w:val="single" w:color="000000" w:sz="4"/>
-              <w:left w:val="single" w:color="000000" w:sz="4"/>
-              <w:bottom w:val="single" w:color="000000" w:sz="4"/>
-              <w:right w:val="single" w:color="000000" w:sz="4"/>
-            </w:tcBorders>
-            <w:vAlign w:val="center"/>
-          </w:tcPr>
-          <w:p>
-            <w:pPr>
-              <w:spacing w:after="50" w:before="50"/>
-              <w:jc w:val="left"/>
-            </w:pPr>
-            <w:r>
-              <w:rPr>
-                <w:rFonts w:ascii="Arial" w:cs="Arial" w:eastAsia="Arial" w:hAnsi="Arial"/>
-                <w:color w:val="000000"/>
-                <w:sz w:val="18"/>
-                <w:szCs w:val="18"/>
-              </w:rPr>
-              <w:t xml:space="preserve"/>
-            </w:r>
-          </w:p>
-        </w:tc>
-      </w:tr>
-      <w:tr>
-        <w:tc>
-          <w:tcPr>
-            <w:tcW w:type="dxa" w:w="10800"/>
-            <w:gridSpan w:val="5"/>
-            <w:tcBorders>
-              <w:top w:val="single" w:color="000000" w:sz="4"/>
-              <w:left w:val="single" w:color="000000" w:sz="4"/>
-              <w:bottom w:val="single" w:color="000000" w:sz="4"/>
-              <w:right w:val="single" w:color="000000" w:sz="4"/>
-            </w:tcBorders>
-            <w:shd w:fill="EBF5FB" w:val="clear"/>
-            <w:vAlign w:val="center"/>
-          </w:tcPr>
-          <w:p>
-            <w:pPr>
-              <w:spacing w:after="60" w:before="60"/>
-              <w:jc w:val="center"/>
-            </w:pPr>
-            <w:r>
-              <w:rPr>
-                <w:rFonts w:ascii="Arial" w:cs="Arial" w:eastAsia="Arial" w:hAnsi="Arial"/>
-                <w:b/>
-                <w:bCs/>
-                <w:color w:val="000000"/>
-                <w:sz w:val="18"/>
-                <w:szCs w:val="18"/>
-              </w:rPr>
-              <w:t xml:space="preserve">ACCESO GENERAL:  □ HABILITADO     □ NO HABILITADO</w:t>
-            </w:r>
-          </w:p>
-        </w:tc>
-      </w:tr>
-    </w:tbl>
-    <w:p>
-      <w:pPr>
-        <w:spacing w:after="0" w:before="80"/>
-      </w:pPr>
-    </w:p>
-    <w:tbl>
-      <w:tblPr>
-        <w:tblW w:type="dxa" w:w="10800"/>
-        <w:tblBorders>
-          <w:top w:val="single" w:color="auto" w:sz="4"/>
-          <w:left w:val="single" w:color="auto" w:sz="4"/>
-          <w:bottom w:val="single" w:color="auto" w:sz="4"/>
-          <w:right w:val="single" w:color="auto" w:sz="4"/>
-          <w:insideH w:val="single" w:color="auto" w:sz="4"/>
-          <w:insideV w:val="single" w:color="auto" w:sz="4"/>
-        </w:tblBorders>
-      </w:tblPr>
-      <w:tblGrid>
-        <w:gridCol w:w="10800"/>
-      </w:tblGrid>
-      <w:tr>
-        <w:tc>
-          <w:tcPr>
-            <w:tcW w:type="dxa" w:w="10800"/>
-            <w:gridSpan w:val="1"/>
-            <w:tcBorders>
-              <w:top w:val="single" w:color="000000" w:sz="8"/>
-              <w:left w:val="single" w:color="000000" w:sz="8"/>
-              <w:bottom w:val="single" w:color="000000" w:sz="8"/>
-              <w:right w:val="single" w:color="000000" w:sz="8"/>
-            </w:tcBorders>
-            <w:shd w:fill="1A3A6B" w:val="clear"/>
-            <w:vAlign w:val="center"/>
-          </w:tcPr>
-          <w:p>
-            <w:pPr>
-              <w:spacing w:after="60" w:before="60"/>
-              <w:jc w:val="center"/>
-            </w:pPr>
-            <w:r>
-              <w:rPr>
-                <w:rFonts w:ascii="Arial" w:cs="Arial" w:eastAsia="Arial" w:hAnsi="Arial"/>
-                <w:b/>
-                <w:bCs/>
-                <w:color w:val="FFFFFF"/>
-                <w:sz w:val="19"/>
-                <w:szCs w:val="19"/>
-              </w:rPr>
-              <w:t xml:space="preserve">3.  CERTIFICADOS PARA TRABAJOS DE ALTO RIESGO  (completar solo si aplica)</w:t>
-            </w:r>
-          </w:p>
-        </w:tc>
-      </w:tr>
-    </w:tbl>
-    <w:p>
-      <w:pPr>
-        <w:spacing w:after="60" w:before="60"/>
-        <w:jc w:val="left"/>
-      </w:pPr>
-      <w:r>
-        <w:rPr>
-          <w:rFonts w:ascii="Arial" w:cs="Arial" w:eastAsia="Arial" w:hAnsi="Arial"/>
-          <w:color w:val="000000"/>
-          <w:sz w:val="17"/>
-          <w:szCs w:val="17"/>
-        </w:rPr>
-        <w:t xml:space="preserve">Marque los tipos de trabajo que ejecutará el contratista y verifique la vigencia del certificado emitido por entidad reconocida (MDT o SENESCYT).</w:t>
-      </w:r>
-    </w:p>
-    <w:tbl>
-      <w:tblPr>
-        <w:tblW w:type="dxa" w:w="10800"/>
-        <w:tblBorders>
-          <w:top w:val="single" w:color="auto" w:sz="4"/>
-          <w:left w:val="single" w:color="auto" w:sz="4"/>
-          <w:bottom w:val="single" w:color="auto" w:sz="4"/>
-          <w:right w:val="single" w:color="auto" w:sz="4"/>
-          <w:insideH w:val="single" w:color="auto" w:sz="4"/>
-          <w:insideV w:val="single" w:color="auto" w:sz="4"/>
-        </w:tblBorders>
-      </w:tblPr>
-      <w:tblGrid>
-        <w:gridCol w:w="400"/>
-        <w:gridCol w:w="2600"/>
-        <w:gridCol w:w="2400"/>
-        <w:gridCol w:w="1600"/>
-        <w:gridCol w:w="3800"/>
-      </w:tblGrid>
-      <w:tr>
-        <w:tc>
-          <w:tcPr>
-            <w:tcW w:type="dxa" w:w="400"/>
-            <w:gridSpan w:val="1"/>
-            <w:tcBorders>
-              <w:top w:val="single" w:color="000000" w:sz="4"/>
-              <w:left w:val="single" w:color="000000" w:sz="4"/>
-              <w:bottom w:val="single" w:color="000000" w:sz="4"/>
-              <w:right w:val="single" w:color="000000" w:sz="4"/>
-            </w:tcBorders>
-            <w:shd w:fill="2E6DB4" w:val="clear"/>
-            <w:vAlign w:val="center"/>
-          </w:tcPr>
-          <w:p>
-            <w:pPr>
-              <w:spacing w:after="50" w:before="50"/>
-              <w:jc w:val="center"/>
-            </w:pPr>
-            <w:r>
-              <w:rPr>
-                <w:rFonts w:ascii="Arial" w:cs="Arial" w:eastAsia="Arial" w:hAnsi="Arial"/>
-                <w:b/>
-                <w:bCs/>
-                <w:color w:val="FFFFFF"/>
-                <w:sz w:val="18"/>
-                <w:szCs w:val="18"/>
-              </w:rPr>
-              <w:t xml:space="preserve">✓</w:t>
-            </w:r>
-          </w:p>
-        </w:tc>
-        <w:tc>
-          <w:tcPr>
-            <w:tcW w:type="dxa" w:w="2600"/>
-            <w:gridSpan w:val="1"/>
-            <w:tcBorders>
-              <w:top w:val="single" w:color="000000" w:sz="4"/>
-              <w:left w:val="single" w:color="000000" w:sz="4"/>
-              <w:bottom w:val="single" w:color="000000" w:sz="4"/>
-              <w:right w:val="single" w:color="000000" w:sz="4"/>
-            </w:tcBorders>
-            <w:shd w:fill="2E6DB4" w:val="clear"/>
-            <w:vAlign w:val="center"/>
-          </w:tcPr>
-          <w:p>
-            <w:pPr>
-              <w:spacing w:after="50" w:before="50"/>
-              <w:jc w:val="center"/>
-            </w:pPr>
-            <w:r>
-              <w:rPr>
-                <w:rFonts w:ascii="Arial" w:cs="Arial" w:eastAsia="Arial" w:hAnsi="Arial"/>
-                <w:b/>
-                <w:bCs/>
-                <w:color w:val="FFFFFF"/>
-                <w:sz w:val="18"/>
-                <w:szCs w:val="18"/>
-              </w:rPr>
-              <w:t xml:space="preserve">TIPO DE TRABAJO</w:t>
-            </w:r>
-          </w:p>
-        </w:tc>
-        <w:tc>
-          <w:tcPr>
-            <w:tcW w:type="dxa" w:w="2400"/>
-            <w:gridSpan w:val="1"/>
-            <w:tcBorders>
-              <w:top w:val="single" w:color="000000" w:sz="4"/>
-              <w:left w:val="single" w:color="000000" w:sz="4"/>
-              <w:bottom w:val="single" w:color="000000" w:sz="4"/>
-              <w:right w:val="single" w:color="000000" w:sz="4"/>
-            </w:tcBorders>
-            <w:shd w:fill="2E6DB4" w:val="clear"/>
-            <w:vAlign w:val="center"/>
-          </w:tcPr>
-          <w:p>
-            <w:pPr>
-              <w:spacing w:after="50" w:before="50"/>
-              <w:jc w:val="center"/>
-            </w:pPr>
-            <w:r>
-              <w:rPr>
-                <w:rFonts w:ascii="Arial" w:cs="Arial" w:eastAsia="Arial" w:hAnsi="Arial"/>
-                <w:b/>
-                <w:bCs/>
-                <w:color w:val="FFFFFF"/>
-                <w:sz w:val="18"/>
-                <w:szCs w:val="18"/>
-              </w:rPr>
-              <w:t xml:space="preserve">ENTIDAD EMISORA</w:t>
-            </w:r>
-          </w:p>
-        </w:tc>
-        <w:tc>
-          <w:tcPr>
-            <w:tcW w:type="dxa" w:w="1600"/>
-            <w:gridSpan w:val="1"/>
-            <w:tcBorders>
-              <w:top w:val="single" w:color="000000" w:sz="4"/>
-              <w:left w:val="single" w:color="000000" w:sz="4"/>
-              <w:bottom w:val="single" w:color="000000" w:sz="4"/>
-              <w:right w:val="single" w:color="000000" w:sz="4"/>
-            </w:tcBorders>
-            <w:shd w:fill="2E6DB4" w:val="clear"/>
-            <w:vAlign w:val="center"/>
-          </w:tcPr>
-          <w:p>
-            <w:pPr>
-              <w:spacing w:after="50" w:before="50"/>
-              <w:jc w:val="center"/>
-            </w:pPr>
-            <w:r>
-              <w:rPr>
-                <w:rFonts w:ascii="Arial" w:cs="Arial" w:eastAsia="Arial" w:hAnsi="Arial"/>
-                <w:b/>
-                <w:bCs/>
-                <w:color w:val="FFFFFF"/>
-                <w:sz w:val="18"/>
-                <w:szCs w:val="18"/>
-              </w:rPr>
-              <w:t xml:space="preserve">FECHA EMISIÓN</w:t>
-            </w:r>
-          </w:p>
-        </w:tc>
-        <w:tc>
-          <w:tcPr>
-            <w:tcW w:type="dxa" w:w="3800"/>
-            <w:gridSpan w:val="1"/>
-            <w:tcBorders>
-              <w:top w:val="single" w:color="000000" w:sz="4"/>
-              <w:left w:val="single" w:color="000000" w:sz="4"/>
-              <w:bottom w:val="single" w:color="000000" w:sz="4"/>
-              <w:right w:val="single" w:color="000000" w:sz="4"/>
-            </w:tcBorders>
-            <w:shd w:fill="2E6DB4" w:val="clear"/>
-            <w:vAlign w:val="center"/>
-          </w:tcPr>
-          <w:p>
-            <w:pPr>
-              <w:spacing w:after="50" w:before="50"/>
-              <w:jc w:val="center"/>
-            </w:pPr>
-            <w:r>
-              <w:rPr>
-                <w:rFonts w:ascii="Arial" w:cs="Arial" w:eastAsia="Arial" w:hAnsi="Arial"/>
-                <w:b/>
-                <w:bCs/>
-                <w:color w:val="FFFFFF"/>
-                <w:sz w:val="18"/>
-                <w:szCs w:val="18"/>
-              </w:rPr>
-              <w:t xml:space="preserve">FECHA VENCIMIENTO</w:t>
-            </w:r>
-          </w:p>
-        </w:tc>
-      </w:tr>
-      <w:tr>
-        <w:tc>
-          <w:tcPr>
-            <w:tcW w:type="dxa" w:w="400"/>
-            <w:gridSpan w:val="1"/>
-            <w:tcBorders>
-              <w:top w:val="single" w:color="000000" w:sz="4"/>
-              <w:left w:val="single" w:color="000000" w:sz="4"/>
-              <w:bottom w:val="single" w:color="000000" w:sz="4"/>
-              <w:right w:val="single" w:color="000000" w:sz="4"/>
-            </w:tcBorders>
-            <w:vAlign w:val="center"/>
-          </w:tcPr>
-          <w:p>
-            <w:pPr>
-              <w:spacing w:after="50" w:before="50"/>
-              <w:jc w:val="center"/>
-            </w:pPr>
-            <w:r>
-              <w:rPr>
-                <w:rFonts w:ascii="Arial" w:cs="Arial" w:eastAsia="Arial" w:hAnsi="Arial"/>
-                <w:color w:val="000000"/>
-                <w:sz w:val="18"/>
-                <w:szCs w:val="18"/>
-              </w:rPr>
-              <w:t xml:space="preserve">□</w:t>
-            </w:r>
-          </w:p>
-        </w:tc>
-        <w:tc>
-          <w:tcPr>
-            <w:tcW w:type="dxa" w:w="2600"/>
-            <w:gridSpan w:val="1"/>
-            <w:tcBorders>
-              <w:top w:val="single" w:color="000000" w:sz="4"/>
-              <w:left w:val="single" w:color="000000" w:sz="4"/>
-              <w:bottom w:val="single" w:color="000000" w:sz="4"/>
-              <w:right w:val="single" w:color="000000" w:sz="4"/>
-            </w:tcBorders>
-            <w:vAlign w:val="center"/>
-          </w:tcPr>
-          <w:p>
-            <w:pPr>
-              <w:spacing w:after="50" w:before="50"/>
-              <w:jc w:val="left"/>
-            </w:pPr>
-            <w:r>
-              <w:rPr>
-                <w:rFonts w:ascii="Arial" w:cs="Arial" w:eastAsia="Arial" w:hAnsi="Arial"/>
-                <w:color w:val="000000"/>
-                <w:sz w:val="18"/>
-                <w:szCs w:val="18"/>
-              </w:rPr>
-              <w:t xml:space="preserve">Trabajo en Caliente</w:t>
-            </w:r>
-          </w:p>
-        </w:tc>
-        <w:tc>
-          <w:tcPr>
-            <w:tcW w:type="dxa" w:w="2400"/>
-            <w:gridSpan w:val="1"/>
-            <w:tcBorders>
-              <w:top w:val="single" w:color="000000" w:sz="4"/>
-              <w:left w:val="single" w:color="000000" w:sz="4"/>
-              <w:bottom w:val="single" w:color="000000" w:sz="4"/>
-              <w:right w:val="single" w:color="000000" w:sz="4"/>
-            </w:tcBorders>
-            <w:vAlign w:val="center"/>
-          </w:tcPr>
-          <w:p>
-            <w:pPr>
-              <w:spacing w:after="50" w:before="50"/>
-              <w:jc w:val="left"/>
-            </w:pPr>
-            <w:r>
-              <w:rPr>
-                <w:rFonts w:ascii="Arial" w:cs="Arial" w:eastAsia="Arial" w:hAnsi="Arial"/>
-                <w:color w:val="000000"/>
-                <w:sz w:val="17"/>
-                <w:szCs w:val="17"/>
-              </w:rPr>
-              <w:t xml:space="preserve">MDT / SENESCYT</w:t>
-            </w:r>
-          </w:p>
-        </w:tc>
-        <w:tc>
-          <w:tcPr>
-            <w:tcW w:type="dxa" w:w="1600"/>
-            <w:gridSpan w:val="1"/>
-            <w:tcBorders>
-              <w:top w:val="single" w:color="000000" w:sz="4"/>
-              <w:left w:val="single" w:color="000000" w:sz="4"/>
-              <w:bottom w:val="single" w:color="000000" w:sz="4"/>
-              <w:right w:val="single" w:color="000000" w:sz="4"/>
-            </w:tcBorders>
-            <w:vAlign w:val="center"/>
-          </w:tcPr>
-          <w:p>
-            <w:pPr>
-              <w:spacing w:after="50" w:before="50"/>
-              <w:jc w:val="center"/>
-            </w:pPr>
-            <w:r>
-              <w:rPr>
-                <w:rFonts w:ascii="Arial" w:cs="Arial" w:eastAsia="Arial" w:hAnsi="Arial"/>
-                <w:color w:val="000000"/>
-                <w:sz w:val="17"/>
-                <w:szCs w:val="17"/>
-              </w:rPr>
-              <w:t xml:space="preserve">__/__/____</w:t>
-            </w:r>
-          </w:p>
-        </w:tc>
-        <w:tc>
-          <w:tcPr>
-            <w:tcW w:type="dxa" w:w="3800"/>
-            <w:gridSpan w:val="1"/>
-            <w:tcBorders>
-              <w:top w:val="single" w:color="000000" w:sz="4"/>
-              <w:left w:val="single" w:color="000000" w:sz="4"/>
-              <w:bottom w:val="single" w:color="000000" w:sz="4"/>
-              <w:right w:val="single" w:color="000000" w:sz="4"/>
-            </w:tcBorders>
-            <w:vAlign w:val="center"/>
-          </w:tcPr>
-          <w:p>
-            <w:pPr>
-              <w:spacing w:after="50" w:before="50"/>
-              <w:jc w:val="center"/>
-            </w:pPr>
-            <w:r>
-              <w:rPr>
-                <w:rFonts w:ascii="Arial" w:cs="Arial" w:eastAsia="Arial" w:hAnsi="Arial"/>
-                <w:color w:val="000000"/>
-                <w:sz w:val="17"/>
-                <w:szCs w:val="17"/>
-              </w:rPr>
-              <w:t xml:space="preserve">__/__/____</w:t>
-            </w:r>
-          </w:p>
-        </w:tc>
-      </w:tr>
-      <w:tr>
-        <w:tc>
-          <w:tcPr>
-            <w:tcW w:type="dxa" w:w="400"/>
-            <w:gridSpan w:val="1"/>
-            <w:tcBorders>
-              <w:top w:val="single" w:color="000000" w:sz="4"/>
-              <w:left w:val="single" w:color="000000" w:sz="4"/>
-              <w:bottom w:val="single" w:color="000000" w:sz="4"/>
-              <w:right w:val="single" w:color="000000" w:sz="4"/>
-            </w:tcBorders>
-            <w:vAlign w:val="center"/>
-          </w:tcPr>
-          <w:p>
-            <w:pPr>
-              <w:spacing w:after="50" w:before="50"/>
-              <w:jc w:val="center"/>
-            </w:pPr>
-            <w:r>
-              <w:rPr>
-                <w:rFonts w:ascii="Arial" w:cs="Arial" w:eastAsia="Arial" w:hAnsi="Arial"/>
-                <w:color w:val="000000"/>
-                <w:sz w:val="18"/>
-                <w:szCs w:val="18"/>
-              </w:rPr>
-              <w:t xml:space="preserve">□</w:t>
-            </w:r>
-          </w:p>
-        </w:tc>
-        <w:tc>
-          <w:tcPr>
-            <w:tcW w:type="dxa" w:w="2600"/>
-            <w:gridSpan w:val="1"/>
-            <w:tcBorders>
-              <w:top w:val="single" w:color="000000" w:sz="4"/>
-              <w:left w:val="single" w:color="000000" w:sz="4"/>
-              <w:bottom w:val="single" w:color="000000" w:sz="4"/>
-              <w:right w:val="single" w:color="000000" w:sz="4"/>
-            </w:tcBorders>
-            <w:vAlign w:val="center"/>
-          </w:tcPr>
-          <w:p>
-            <w:pPr>
-              <w:spacing w:after="50" w:before="50"/>
-              <w:jc w:val="left"/>
-            </w:pPr>
-            <w:r>
-              <w:rPr>
-                <w:rFonts w:ascii="Arial" w:cs="Arial" w:eastAsia="Arial" w:hAnsi="Arial"/>
-                <w:color w:val="000000"/>
-                <w:sz w:val="18"/>
-                <w:szCs w:val="18"/>
-              </w:rPr>
-              <w:t xml:space="preserve">Trabajo en Altura  (≥ 1,80 m)</w:t>
-            </w:r>
-          </w:p>
-        </w:tc>
-        <w:tc>
-          <w:tcPr>
-            <w:tcW w:type="dxa" w:w="2400"/>
-            <w:gridSpan w:val="1"/>
-            <w:tcBorders>
-              <w:top w:val="single" w:color="000000" w:sz="4"/>
-              <w:left w:val="single" w:color="000000" w:sz="4"/>
-              <w:bottom w:val="single" w:color="000000" w:sz="4"/>
-              <w:right w:val="single" w:color="000000" w:sz="4"/>
-            </w:tcBorders>
-            <w:vAlign w:val="center"/>
-          </w:tcPr>
-          <w:p>
-            <w:pPr>
-              <w:spacing w:after="50" w:before="50"/>
-              <w:jc w:val="left"/>
-            </w:pPr>
-            <w:r>
-              <w:rPr>
-                <w:rFonts w:ascii="Arial" w:cs="Arial" w:eastAsia="Arial" w:hAnsi="Arial"/>
-                <w:color w:val="000000"/>
-                <w:sz w:val="17"/>
-                <w:szCs w:val="17"/>
-              </w:rPr>
-              <w:t xml:space="preserve">MDT / SENESCYT</w:t>
-            </w:r>
-          </w:p>
-        </w:tc>
-        <w:tc>
-          <w:tcPr>
-            <w:tcW w:type="dxa" w:w="1600"/>
-            <w:gridSpan w:val="1"/>
-            <w:tcBorders>
-              <w:top w:val="single" w:color="000000" w:sz="4"/>
-              <w:left w:val="single" w:color="000000" w:sz="4"/>
-              <w:bottom w:val="single" w:color="000000" w:sz="4"/>
-              <w:right w:val="single" w:color="000000" w:sz="4"/>
-            </w:tcBorders>
-            <w:vAlign w:val="center"/>
-          </w:tcPr>
-          <w:p>
-            <w:pPr>
-              <w:spacing w:after="50" w:before="50"/>
-              <w:jc w:val="center"/>
-            </w:pPr>
-            <w:r>
-              <w:rPr>
-                <w:rFonts w:ascii="Arial" w:cs="Arial" w:eastAsia="Arial" w:hAnsi="Arial"/>
-                <w:color w:val="000000"/>
-                <w:sz w:val="17"/>
-                <w:szCs w:val="17"/>
-              </w:rPr>
-              <w:t xml:space="preserve">__/__/____</w:t>
-            </w:r>
-          </w:p>
-        </w:tc>
-        <w:tc>
-          <w:tcPr>
-            <w:tcW w:type="dxa" w:w="3800"/>
-            <w:gridSpan w:val="1"/>
-            <w:tcBorders>
-              <w:top w:val="single" w:color="000000" w:sz="4"/>
-              <w:left w:val="single" w:color="000000" w:sz="4"/>
-              <w:bottom w:val="single" w:color="000000" w:sz="4"/>
-              <w:right w:val="single" w:color="000000" w:sz="4"/>
-            </w:tcBorders>
-            <w:vAlign w:val="center"/>
-          </w:tcPr>
-          <w:p>
-            <w:pPr>
-              <w:spacing w:after="50" w:before="50"/>
-              <w:jc w:val="center"/>
-            </w:pPr>
-            <w:r>
-              <w:rPr>
-                <w:rFonts w:ascii="Arial" w:cs="Arial" w:eastAsia="Arial" w:hAnsi="Arial"/>
-                <w:color w:val="000000"/>
-                <w:sz w:val="17"/>
-                <w:szCs w:val="17"/>
-              </w:rPr>
-              <w:t xml:space="preserve">__/__/____</w:t>
-            </w:r>
-          </w:p>
-        </w:tc>
-      </w:tr>
-      <w:tr>
-        <w:tc>
-          <w:tcPr>
-            <w:tcW w:type="dxa" w:w="400"/>
-            <w:gridSpan w:val="1"/>
-            <w:tcBorders>
-              <w:top w:val="single" w:color="000000" w:sz="4"/>
-              <w:left w:val="single" w:color="000000" w:sz="4"/>
-              <w:bottom w:val="single" w:color="000000" w:sz="4"/>
-              <w:right w:val="single" w:color="000000" w:sz="4"/>
-            </w:tcBorders>
-            <w:vAlign w:val="center"/>
-          </w:tcPr>
-          <w:p>
-            <w:pPr>
-              <w:spacing w:after="50" w:before="50"/>
-              <w:jc w:val="center"/>
-            </w:pPr>
-            <w:r>
-              <w:rPr>
-                <w:rFonts w:ascii="Arial" w:cs="Arial" w:eastAsia="Arial" w:hAnsi="Arial"/>
-                <w:color w:val="000000"/>
-                <w:sz w:val="18"/>
-                <w:szCs w:val="18"/>
-              </w:rPr>
-              <w:t xml:space="preserve">□</w:t>
-            </w:r>
-          </w:p>
-        </w:tc>
-        <w:tc>
-          <w:tcPr>
-            <w:tcW w:type="dxa" w:w="2600"/>
-            <w:gridSpan w:val="1"/>
-            <w:tcBorders>
-              <w:top w:val="single" w:color="000000" w:sz="4"/>
-              <w:left w:val="single" w:color="000000" w:sz="4"/>
-              <w:bottom w:val="single" w:color="000000" w:sz="4"/>
-              <w:right w:val="single" w:color="000000" w:sz="4"/>
-            </w:tcBorders>
-            <w:vAlign w:val="center"/>
-          </w:tcPr>
-          <w:p>
-            <w:pPr>
-              <w:spacing w:after="50" w:before="50"/>
-              <w:jc w:val="left"/>
-            </w:pPr>
-            <w:r>
-              <w:rPr>
-                <w:rFonts w:ascii="Arial" w:cs="Arial" w:eastAsia="Arial" w:hAnsi="Arial"/>
-                <w:color w:val="000000"/>
-                <w:sz w:val="18"/>
-                <w:szCs w:val="18"/>
-              </w:rPr>
-              <w:t xml:space="preserve">Espacios Confinados</w:t>
-            </w:r>
-          </w:p>
-        </w:tc>
-        <w:tc>
-          <w:tcPr>
-            <w:tcW w:type="dxa" w:w="2400"/>
-            <w:gridSpan w:val="1"/>
-            <w:tcBorders>
-              <w:top w:val="single" w:color="000000" w:sz="4"/>
-              <w:left w:val="single" w:color="000000" w:sz="4"/>
-              <w:bottom w:val="single" w:color="000000" w:sz="4"/>
-              <w:right w:val="single" w:color="000000" w:sz="4"/>
-            </w:tcBorders>
-            <w:vAlign w:val="center"/>
-          </w:tcPr>
-          <w:p>
-            <w:pPr>
-              <w:spacing w:after="50" w:before="50"/>
-              <w:jc w:val="left"/>
-            </w:pPr>
-            <w:r>
-              <w:rPr>
-                <w:rFonts w:ascii="Arial" w:cs="Arial" w:eastAsia="Arial" w:hAnsi="Arial"/>
-                <w:color w:val="000000"/>
-                <w:sz w:val="17"/>
-                <w:szCs w:val="17"/>
-              </w:rPr>
-              <w:t xml:space="preserve">MDT / SENESCYT</w:t>
-            </w:r>
-          </w:p>
-        </w:tc>
-        <w:tc>
-          <w:tcPr>
-            <w:tcW w:type="dxa" w:w="1600"/>
-            <w:gridSpan w:val="1"/>
-            <w:tcBorders>
-              <w:top w:val="single" w:color="000000" w:sz="4"/>
-              <w:left w:val="single" w:color="000000" w:sz="4"/>
-              <w:bottom w:val="single" w:color="000000" w:sz="4"/>
-              <w:right w:val="single" w:color="000000" w:sz="4"/>
-            </w:tcBorders>
-            <w:vAlign w:val="center"/>
-          </w:tcPr>
-          <w:p>
-            <w:pPr>
-              <w:spacing w:after="50" w:before="50"/>
-              <w:jc w:val="center"/>
-            </w:pPr>
-            <w:r>
-              <w:rPr>
-                <w:rFonts w:ascii="Arial" w:cs="Arial" w:eastAsia="Arial" w:hAnsi="Arial"/>
-                <w:color w:val="000000"/>
-                <w:sz w:val="17"/>
-                <w:szCs w:val="17"/>
-              </w:rPr>
-              <w:t xml:space="preserve">__/__/____</w:t>
-            </w:r>
-          </w:p>
-        </w:tc>
-        <w:tc>
-          <w:tcPr>
-            <w:tcW w:type="dxa" w:w="3800"/>
-            <w:gridSpan w:val="1"/>
-            <w:tcBorders>
-              <w:top w:val="single" w:color="000000" w:sz="4"/>
-              <w:left w:val="single" w:color="000000" w:sz="4"/>
-              <w:bottom w:val="single" w:color="000000" w:sz="4"/>
-              <w:right w:val="single" w:color="000000" w:sz="4"/>
-            </w:tcBorders>
-            <w:vAlign w:val="center"/>
-          </w:tcPr>
-          <w:p>
-            <w:pPr>
-              <w:spacing w:after="50" w:before="50"/>
-              <w:jc w:val="center"/>
-            </w:pPr>
-            <w:r>
-              <w:rPr>
-                <w:rFonts w:ascii="Arial" w:cs="Arial" w:eastAsia="Arial" w:hAnsi="Arial"/>
-                <w:color w:val="000000"/>
-                <w:sz w:val="17"/>
-                <w:szCs w:val="17"/>
-              </w:rPr>
-              <w:t xml:space="preserve">__/__/____</w:t>
-            </w:r>
-          </w:p>
-        </w:tc>
-      </w:tr>
-      <w:tr>
-        <w:tc>
-          <w:tcPr>
-            <w:tcW w:type="dxa" w:w="400"/>
-            <w:gridSpan w:val="1"/>
-            <w:tcBorders>
-              <w:top w:val="single" w:color="000000" w:sz="4"/>
-              <w:left w:val="single" w:color="000000" w:sz="4"/>
-              <w:bottom w:val="single" w:color="000000" w:sz="4"/>
-              <w:right w:val="single" w:color="000000" w:sz="4"/>
-            </w:tcBorders>
-            <w:vAlign w:val="center"/>
-          </w:tcPr>
-          <w:p>
-            <w:pPr>
-              <w:spacing w:after="50" w:before="50"/>
-              <w:jc w:val="center"/>
-            </w:pPr>
-            <w:r>
-              <w:rPr>
-                <w:rFonts w:ascii="Arial" w:cs="Arial" w:eastAsia="Arial" w:hAnsi="Arial"/>
-                <w:color w:val="000000"/>
-                <w:sz w:val="18"/>
-                <w:szCs w:val="18"/>
-              </w:rPr>
-              <w:t xml:space="preserve">□</w:t>
-            </w:r>
-          </w:p>
-        </w:tc>
-        <w:tc>
-          <w:tcPr>
-            <w:tcW w:type="dxa" w:w="2600"/>
-            <w:gridSpan w:val="1"/>
-            <w:tcBorders>
-              <w:top w:val="single" w:color="000000" w:sz="4"/>
-              <w:left w:val="single" w:color="000000" w:sz="4"/>
-              <w:bottom w:val="single" w:color="000000" w:sz="4"/>
-              <w:right w:val="single" w:color="000000" w:sz="4"/>
-            </w:tcBorders>
-            <w:vAlign w:val="center"/>
-          </w:tcPr>
-          <w:p>
-            <w:pPr>
-              <w:spacing w:after="50" w:before="50"/>
-              <w:jc w:val="left"/>
-            </w:pPr>
-            <w:r>
-              <w:rPr>
-                <w:rFonts w:ascii="Arial" w:cs="Arial" w:eastAsia="Arial" w:hAnsi="Arial"/>
-                <w:color w:val="000000"/>
-                <w:sz w:val="18"/>
-                <w:szCs w:val="18"/>
-              </w:rPr>
-              <w:t xml:space="preserve">Trabajos Eléctricos  (media y alta tensión)</w:t>
-            </w:r>
-          </w:p>
-        </w:tc>
-        <w:tc>
-          <w:tcPr>
-            <w:tcW w:type="dxa" w:w="2400"/>
-            <w:gridSpan w:val="1"/>
-            <w:tcBorders>
-              <w:top w:val="single" w:color="000000" w:sz="4"/>
-              <w:left w:val="single" w:color="000000" w:sz="4"/>
-              <w:bottom w:val="single" w:color="000000" w:sz="4"/>
-              <w:right w:val="single" w:color="000000" w:sz="4"/>
-            </w:tcBorders>
-            <w:vAlign w:val="center"/>
-          </w:tcPr>
-          <w:p>
-            <w:pPr>
-              <w:spacing w:after="50" w:before="50"/>
-              <w:jc w:val="left"/>
-            </w:pPr>
-            <w:r>
-              <w:rPr>
-                <w:rFonts w:ascii="Arial" w:cs="Arial" w:eastAsia="Arial" w:hAnsi="Arial"/>
-                <w:color w:val="000000"/>
-                <w:sz w:val="17"/>
-                <w:szCs w:val="17"/>
-              </w:rPr>
-              <w:t xml:space="preserve">MDT / SENESCYT</w:t>
-            </w:r>
-          </w:p>
-        </w:tc>
-        <w:tc>
-          <w:tcPr>
-            <w:tcW w:type="dxa" w:w="1600"/>
-            <w:gridSpan w:val="1"/>
-            <w:tcBorders>
-              <w:top w:val="single" w:color="000000" w:sz="4"/>
-              <w:left w:val="single" w:color="000000" w:sz="4"/>
-              <w:bottom w:val="single" w:color="000000" w:sz="4"/>
-              <w:right w:val="single" w:color="000000" w:sz="4"/>
-            </w:tcBorders>
-            <w:vAlign w:val="center"/>
-          </w:tcPr>
-          <w:p>
-            <w:pPr>
-              <w:spacing w:after="50" w:before="50"/>
-              <w:jc w:val="center"/>
-            </w:pPr>
-            <w:r>
-              <w:rPr>
-                <w:rFonts w:ascii="Arial" w:cs="Arial" w:eastAsia="Arial" w:hAnsi="Arial"/>
-                <w:color w:val="000000"/>
-                <w:sz w:val="17"/>
-                <w:szCs w:val="17"/>
-              </w:rPr>
-              <w:t xml:space="preserve">__/__/____</w:t>
-            </w:r>
-          </w:p>
-        </w:tc>
-        <w:tc>
-          <w:tcPr>
-            <w:tcW w:type="dxa" w:w="3800"/>
-            <w:gridSpan w:val="1"/>
-            <w:tcBorders>
-              <w:top w:val="single" w:color="000000" w:sz="4"/>
-              <w:left w:val="single" w:color="000000" w:sz="4"/>
-              <w:bottom w:val="single" w:color="000000" w:sz="4"/>
-              <w:right w:val="single" w:color="000000" w:sz="4"/>
-            </w:tcBorders>
-            <w:vAlign w:val="center"/>
-          </w:tcPr>
-          <w:p>
-            <w:pPr>
-              <w:spacing w:after="50" w:before="50"/>
-              <w:jc w:val="center"/>
-            </w:pPr>
-            <w:r>
-              <w:rPr>
-                <w:rFonts w:ascii="Arial" w:cs="Arial" w:eastAsia="Arial" w:hAnsi="Arial"/>
-                <w:color w:val="000000"/>
-                <w:sz w:val="17"/>
-                <w:szCs w:val="17"/>
-              </w:rPr>
-              <w:t xml:space="preserve">__/__/____</w:t>
-            </w:r>
-          </w:p>
-        </w:tc>
-      </w:tr>
-      <w:tr>
-        <w:tc>
-          <w:tcPr>
-            <w:tcW w:type="dxa" w:w="400"/>
-            <w:gridSpan w:val="1"/>
-            <w:tcBorders>
-              <w:top w:val="single" w:color="000000" w:sz="4"/>
-              <w:left w:val="single" w:color="000000" w:sz="4"/>
-              <w:bottom w:val="single" w:color="000000" w:sz="4"/>
-              <w:right w:val="single" w:color="000000" w:sz="4"/>
-            </w:tcBorders>
-            <w:vAlign w:val="center"/>
-          </w:tcPr>
-          <w:p>
-            <w:pPr>
-              <w:spacing w:after="50" w:before="50"/>
-              <w:jc w:val="center"/>
-            </w:pPr>
-            <w:r>
-              <w:rPr>
-                <w:rFonts w:ascii="Arial" w:cs="Arial" w:eastAsia="Arial" w:hAnsi="Arial"/>
-                <w:color w:val="000000"/>
-                <w:sz w:val="18"/>
-                <w:szCs w:val="18"/>
-              </w:rPr>
-              <w:t xml:space="preserve">□</w:t>
-            </w:r>
-          </w:p>
-        </w:tc>
-        <w:tc>
-          <w:tcPr>
-            <w:tcW w:type="dxa" w:w="2600"/>
-            <w:gridSpan w:val="1"/>
-            <w:tcBorders>
-              <w:top w:val="single" w:color="000000" w:sz="4"/>
-              <w:left w:val="single" w:color="000000" w:sz="4"/>
-              <w:bottom w:val="single" w:color="000000" w:sz="4"/>
-              <w:right w:val="single" w:color="000000" w:sz="4"/>
-            </w:tcBorders>
-            <w:vAlign w:val="center"/>
-          </w:tcPr>
-          <w:p>
-            <w:pPr>
-              <w:spacing w:after="50" w:before="50"/>
-              <w:jc w:val="left"/>
-            </w:pPr>
-            <w:r>
-              <w:rPr>
-                <w:rFonts w:ascii="Arial" w:cs="Arial" w:eastAsia="Arial" w:hAnsi="Arial"/>
-                <w:color w:val="000000"/>
-                <w:sz w:val="18"/>
-                <w:szCs w:val="18"/>
-              </w:rPr>
-              <w:t xml:space="preserve">Izaje de Cargas</w:t>
-            </w:r>
-          </w:p>
-        </w:tc>
-        <w:tc>
-          <w:tcPr>
-            <w:tcW w:type="dxa" w:w="2400"/>
-            <w:gridSpan w:val="1"/>
-            <w:tcBorders>
-              <w:top w:val="single" w:color="000000" w:sz="4"/>
-              <w:left w:val="single" w:color="000000" w:sz="4"/>
-              <w:bottom w:val="single" w:color="000000" w:sz="4"/>
-              <w:right w:val="single" w:color="000000" w:sz="4"/>
-            </w:tcBorders>
-            <w:vAlign w:val="center"/>
-          </w:tcPr>
-          <w:p>
-            <w:pPr>
-              <w:spacing w:after="50" w:before="50"/>
-              <w:jc w:val="left"/>
-            </w:pPr>
-            <w:r>
-              <w:rPr>
-                <w:rFonts w:ascii="Arial" w:cs="Arial" w:eastAsia="Arial" w:hAnsi="Arial"/>
-                <w:color w:val="000000"/>
-                <w:sz w:val="17"/>
-                <w:szCs w:val="17"/>
-              </w:rPr>
-              <w:t xml:space="preserve">MDT / SENESCYT</w:t>
-            </w:r>
-          </w:p>
-        </w:tc>
-        <w:tc>
-          <w:tcPr>
-            <w:tcW w:type="dxa" w:w="1600"/>
-            <w:gridSpan w:val="1"/>
-            <w:tcBorders>
-              <w:top w:val="single" w:color="000000" w:sz="4"/>
-              <w:left w:val="single" w:color="000000" w:sz="4"/>
-              <w:bottom w:val="single" w:color="000000" w:sz="4"/>
-              <w:right w:val="single" w:color="000000" w:sz="4"/>
-            </w:tcBorders>
-            <w:vAlign w:val="center"/>
-          </w:tcPr>
-          <w:p>
-            <w:pPr>
-              <w:spacing w:after="50" w:before="50"/>
-              <w:jc w:val="center"/>
-            </w:pPr>
-            <w:r>
-              <w:rPr>
-                <w:rFonts w:ascii="Arial" w:cs="Arial" w:eastAsia="Arial" w:hAnsi="Arial"/>
-                <w:color w:val="000000"/>
-                <w:sz w:val="17"/>
-                <w:szCs w:val="17"/>
-              </w:rPr>
-              <w:t xml:space="preserve">__/__/____</w:t>
-            </w:r>
-          </w:p>
-        </w:tc>
-        <w:tc>
-          <w:tcPr>
-            <w:tcW w:type="dxa" w:w="3800"/>
-            <w:gridSpan w:val="1"/>
-            <w:tcBorders>
-              <w:top w:val="single" w:color="000000" w:sz="4"/>
-              <w:left w:val="single" w:color="000000" w:sz="4"/>
-              <w:bottom w:val="single" w:color="000000" w:sz="4"/>
-              <w:right w:val="single" w:color="000000" w:sz="4"/>
-            </w:tcBorders>
-            <w:vAlign w:val="center"/>
-          </w:tcPr>
-          <w:p>
-            <w:pPr>
-              <w:spacing w:after="50" w:before="50"/>
-              <w:jc w:val="center"/>
-            </w:pPr>
-            <w:r>
-              <w:rPr>
-                <w:rFonts w:ascii="Arial" w:cs="Arial" w:eastAsia="Arial" w:hAnsi="Arial"/>
-                <w:color w:val="000000"/>
-                <w:sz w:val="17"/>
-                <w:szCs w:val="17"/>
-              </w:rPr>
-              <w:t xml:space="preserve">__/__/____</w:t>
-            </w:r>
-          </w:p>
-        </w:tc>
-      </w:tr>
-      <w:tr>
-        <w:tc>
-          <w:tcPr>
-            <w:tcW w:type="dxa" w:w="400"/>
-            <w:gridSpan w:val="1"/>
-            <w:tcBorders>
-              <w:top w:val="single" w:color="000000" w:sz="4"/>
-              <w:left w:val="single" w:color="000000" w:sz="4"/>
-              <w:bottom w:val="single" w:color="000000" w:sz="4"/>
-              <w:right w:val="single" w:color="000000" w:sz="4"/>
-            </w:tcBorders>
-            <w:vAlign w:val="center"/>
-          </w:tcPr>
-          <w:p>
-            <w:pPr>
-              <w:spacing w:after="50" w:before="50"/>
-              <w:jc w:val="center"/>
-            </w:pPr>
-            <w:r>
-              <w:rPr>
-                <w:rFonts w:ascii="Arial" w:cs="Arial" w:eastAsia="Arial" w:hAnsi="Arial"/>
-                <w:color w:val="000000"/>
-                <w:sz w:val="18"/>
-                <w:szCs w:val="18"/>
-              </w:rPr>
-              <w:t xml:space="preserve">□</w:t>
-            </w:r>
-          </w:p>
-        </w:tc>
-        <w:tc>
-          <w:tcPr>
-            <w:tcW w:type="dxa" w:w="2600"/>
-            <w:gridSpan w:val="1"/>
-            <w:tcBorders>
-              <w:top w:val="single" w:color="000000" w:sz="4"/>
-              <w:left w:val="single" w:color="000000" w:sz="4"/>
-              <w:bottom w:val="single" w:color="000000" w:sz="4"/>
-              <w:right w:val="single" w:color="000000" w:sz="4"/>
-            </w:tcBorders>
-            <w:vAlign w:val="center"/>
-          </w:tcPr>
-          <w:p>
-            <w:pPr>
-              <w:spacing w:after="50" w:before="50"/>
-              <w:jc w:val="left"/>
-            </w:pPr>
-            <w:r>
-              <w:rPr>
-                <w:rFonts w:ascii="Arial" w:cs="Arial" w:eastAsia="Arial" w:hAnsi="Arial"/>
-                <w:color w:val="000000"/>
-                <w:sz w:val="18"/>
-                <w:szCs w:val="18"/>
-              </w:rPr>
-              <w:t xml:space="preserve">Excavaciones</w:t>
-            </w:r>
-          </w:p>
-        </w:tc>
-        <w:tc>
-          <w:tcPr>
-            <w:tcW w:type="dxa" w:w="2400"/>
-            <w:gridSpan w:val="1"/>
-            <w:tcBorders>
-              <w:top w:val="single" w:color="000000" w:sz="4"/>
-              <w:left w:val="single" w:color="000000" w:sz="4"/>
-              <w:bottom w:val="single" w:color="000000" w:sz="4"/>
-              <w:right w:val="single" w:color="000000" w:sz="4"/>
-            </w:tcBorders>
-            <w:vAlign w:val="center"/>
-          </w:tcPr>
-          <w:p>
-            <w:pPr>
-              <w:spacing w:after="50" w:before="50"/>
-              <w:jc w:val="left"/>
-            </w:pPr>
-            <w:r>
-              <w:rPr>
-                <w:rFonts w:ascii="Arial" w:cs="Arial" w:eastAsia="Arial" w:hAnsi="Arial"/>
-                <w:color w:val="000000"/>
-                <w:sz w:val="17"/>
-                <w:szCs w:val="17"/>
-              </w:rPr>
-              <w:t xml:space="preserve">MDT / SENESCYT</w:t>
-            </w:r>
-          </w:p>
-        </w:tc>
-        <w:tc>
-          <w:tcPr>
-            <w:tcW w:type="dxa" w:w="1600"/>
-            <w:gridSpan w:val="1"/>
-            <w:tcBorders>
-              <w:top w:val="single" w:color="000000" w:sz="4"/>
-              <w:left w:val="single" w:color="000000" w:sz="4"/>
-              <w:bottom w:val="single" w:color="000000" w:sz="4"/>
-              <w:right w:val="single" w:color="000000" w:sz="4"/>
-            </w:tcBorders>
-            <w:vAlign w:val="center"/>
-          </w:tcPr>
-          <w:p>
-            <w:pPr>
-              <w:spacing w:after="50" w:before="50"/>
-              <w:jc w:val="center"/>
-            </w:pPr>
-            <w:r>
-              <w:rPr>
-                <w:rFonts w:ascii="Arial" w:cs="Arial" w:eastAsia="Arial" w:hAnsi="Arial"/>
-                <w:color w:val="000000"/>
-                <w:sz w:val="17"/>
-                <w:szCs w:val="17"/>
-              </w:rPr>
-              <w:t xml:space="preserve">__/__/____</w:t>
-            </w:r>
-          </w:p>
-        </w:tc>
-        <w:tc>
-          <w:tcPr>
-            <w:tcW w:type="dxa" w:w="3800"/>
-            <w:gridSpan w:val="1"/>
-            <w:tcBorders>
-              <w:top w:val="single" w:color="000000" w:sz="4"/>
-              <w:left w:val="single" w:color="000000" w:sz="4"/>
-              <w:bottom w:val="single" w:color="000000" w:sz="4"/>
-              <w:right w:val="single" w:color="000000" w:sz="4"/>
-            </w:tcBorders>
-            <w:vAlign w:val="center"/>
-          </w:tcPr>
-          <w:p>
-            <w:pPr>
-              <w:spacing w:after="50" w:before="50"/>
-              <w:jc w:val="center"/>
-            </w:pPr>
-            <w:r>
-              <w:rPr>
-                <w:rFonts w:ascii="Arial" w:cs="Arial" w:eastAsia="Arial" w:hAnsi="Arial"/>
-                <w:color w:val="000000"/>
-                <w:sz w:val="17"/>
-                <w:szCs w:val="17"/>
-              </w:rPr>
-              <w:t xml:space="preserve">__/__/____</w:t>
             </w:r>
           </w:p>
         </w:tc>

</xml_diff>

<commit_message>
Listado: split Caducidad → Fecha + Vigente en Inducción y Cert. Médico
- "Inducción Seguridad (Caducidad)" → "Inducción Seguridad (Fecha)" + "Vigente S/N"
- "Cert. Médico Laboral (Caducidad)" → "Cert. Médico Laboral (Fecha)" + "Vigente S/N"
- 17 columnas → 19 columnas (misma anchura total)

Co-Authored-By: Claude Sonnet 4.6 <noreply@anthropic.com>
Claude-Session: https://claude.ai/code/session_01Mu84mNMmRhshwom6voaTeY
</commit_message>
<xml_diff>
--- a/GE-SO-R34_Rev05_Autorizacion_Ingreso_Contratistas.docx
+++ b/GE-SO-R34_Rev05_Autorizacion_Ingreso_Contratistas.docx
@@ -2900,9 +2900,11 @@
         <w:gridCol w:w="1100"/>
         <w:gridCol w:w="1100"/>
         <w:gridCol w:w="950"/>
+        <w:gridCol w:w="500"/>
+        <w:gridCol w:w="230"/>
         <w:gridCol w:w="730"/>
-        <w:gridCol w:w="730"/>
-        <w:gridCol w:w="730"/>
+        <w:gridCol w:w="500"/>
+        <w:gridCol w:w="230"/>
         <w:gridCol w:w="620"/>
         <w:gridCol w:w="620"/>
         <w:gridCol w:w="700"/>
@@ -3072,7 +3074,7 @@
         </w:tc>
         <w:tc>
           <w:tcPr>
-            <w:tcW w:type="dxa" w:w="730"/>
+            <w:tcW w:type="dxa" w:w="500"/>
             <w:gridSpan w:val="1"/>
             <w:tcBorders>
               <w:top w:val="single" w:color="000000" w:sz="4"/>
@@ -3099,7 +3101,39 @@
               </w:rPr>
               <w:t xml:space="preserve">Inducción
 Seguridad
-(Caducidad)</w:t>
+(Fecha)</w:t>
+            </w:r>
+          </w:p>
+        </w:tc>
+        <w:tc>
+          <w:tcPr>
+            <w:tcW w:type="dxa" w:w="230"/>
+            <w:gridSpan w:val="1"/>
+            <w:tcBorders>
+              <w:top w:val="single" w:color="000000" w:sz="4"/>
+              <w:left w:val="single" w:color="000000" w:sz="4"/>
+              <w:bottom w:val="single" w:color="000000" w:sz="4"/>
+              <w:right w:val="single" w:color="000000" w:sz="4"/>
+            </w:tcBorders>
+            <w:shd w:fill="D9D9D9" w:val="clear"/>
+            <w:vAlign w:val="center"/>
+          </w:tcPr>
+          <w:p>
+            <w:pPr>
+              <w:spacing w:after="30" w:before="30"/>
+              <w:jc w:val="center"/>
+            </w:pPr>
+            <w:r>
+              <w:rPr>
+                <w:rFonts w:ascii="Arial" w:cs="Arial" w:eastAsia="Arial" w:hAnsi="Arial"/>
+                <w:b/>
+                <w:bCs/>
+                <w:color w:val="000000"/>
+                <w:sz w:val="13"/>
+                <w:szCs w:val="13"/>
+              </w:rPr>
+              <w:t xml:space="preserve">Vigente
+S/N</w:t>
             </w:r>
           </w:p>
         </w:tc>
@@ -3138,7 +3172,7 @@
         </w:tc>
         <w:tc>
           <w:tcPr>
-            <w:tcW w:type="dxa" w:w="730"/>
+            <w:tcW w:type="dxa" w:w="500"/>
             <w:gridSpan w:val="1"/>
             <w:tcBorders>
               <w:top w:val="single" w:color="000000" w:sz="4"/>
@@ -3165,7 +3199,39 @@
               </w:rPr>
               <w:t xml:space="preserve">Cert. Médico
 Laboral
-(Caducidad)</w:t>
+(Fecha)</w:t>
+            </w:r>
+          </w:p>
+        </w:tc>
+        <w:tc>
+          <w:tcPr>
+            <w:tcW w:type="dxa" w:w="230"/>
+            <w:gridSpan w:val="1"/>
+            <w:tcBorders>
+              <w:top w:val="single" w:color="000000" w:sz="4"/>
+              <w:left w:val="single" w:color="000000" w:sz="4"/>
+              <w:bottom w:val="single" w:color="000000" w:sz="4"/>
+              <w:right w:val="single" w:color="000000" w:sz="4"/>
+            </w:tcBorders>
+            <w:shd w:fill="D9D9D9" w:val="clear"/>
+            <w:vAlign w:val="center"/>
+          </w:tcPr>
+          <w:p>
+            <w:pPr>
+              <w:spacing w:after="30" w:before="30"/>
+              <w:jc w:val="center"/>
+            </w:pPr>
+            <w:r>
+              <w:rPr>
+                <w:rFonts w:ascii="Arial" w:cs="Arial" w:eastAsia="Arial" w:hAnsi="Arial"/>
+                <w:b/>
+                <w:bCs/>
+                <w:color w:val="000000"/>
+                <w:sz w:val="13"/>
+                <w:szCs w:val="13"/>
+              </w:rPr>
+              <w:t xml:space="preserve">Vigente
+S/N</w:t>
             </w:r>
           </w:p>
         </w:tc>
@@ -3617,6 +3683,64 @@
         </w:tc>
         <w:tc>
           <w:tcPr>
+            <w:tcW w:type="dxa" w:w="500"/>
+            <w:gridSpan w:val="1"/>
+            <w:tcBorders>
+              <w:top w:val="single" w:color="000000" w:sz="4"/>
+              <w:left w:val="single" w:color="000000" w:sz="4"/>
+              <w:bottom w:val="single" w:color="000000" w:sz="4"/>
+              <w:right w:val="single" w:color="000000" w:sz="4"/>
+            </w:tcBorders>
+            <w:shd w:fill="F2F2F2" w:val="clear"/>
+            <w:vAlign w:val="center"/>
+          </w:tcPr>
+          <w:p>
+            <w:pPr>
+              <w:spacing w:after="20" w:before="20"/>
+              <w:jc w:val="left"/>
+            </w:pPr>
+            <w:r>
+              <w:rPr>
+                <w:rFonts w:ascii="Arial" w:cs="Arial" w:eastAsia="Arial" w:hAnsi="Arial"/>
+                <w:color w:val="000000"/>
+                <w:sz w:val="14"/>
+                <w:szCs w:val="14"/>
+              </w:rPr>
+              <w:t xml:space="preserve"/>
+            </w:r>
+          </w:p>
+        </w:tc>
+        <w:tc>
+          <w:tcPr>
+            <w:tcW w:type="dxa" w:w="230"/>
+            <w:gridSpan w:val="1"/>
+            <w:tcBorders>
+              <w:top w:val="single" w:color="000000" w:sz="4"/>
+              <w:left w:val="single" w:color="000000" w:sz="4"/>
+              <w:bottom w:val="single" w:color="000000" w:sz="4"/>
+              <w:right w:val="single" w:color="000000" w:sz="4"/>
+            </w:tcBorders>
+            <w:shd w:fill="F2F2F2" w:val="clear"/>
+            <w:vAlign w:val="center"/>
+          </w:tcPr>
+          <w:p>
+            <w:pPr>
+              <w:spacing w:after="20" w:before="20"/>
+              <w:jc w:val="left"/>
+            </w:pPr>
+            <w:r>
+              <w:rPr>
+                <w:rFonts w:ascii="Arial" w:cs="Arial" w:eastAsia="Arial" w:hAnsi="Arial"/>
+                <w:color w:val="000000"/>
+                <w:sz w:val="14"/>
+                <w:szCs w:val="14"/>
+              </w:rPr>
+              <w:t xml:space="preserve"/>
+            </w:r>
+          </w:p>
+        </w:tc>
+        <w:tc>
+          <w:tcPr>
             <w:tcW w:type="dxa" w:w="730"/>
             <w:gridSpan w:val="1"/>
             <w:tcBorders>
@@ -3646,36 +3770,36 @@
         </w:tc>
         <w:tc>
           <w:tcPr>
-            <w:tcW w:type="dxa" w:w="730"/>
-            <w:gridSpan w:val="1"/>
-            <w:tcBorders>
-              <w:top w:val="single" w:color="000000" w:sz="4"/>
-              <w:left w:val="single" w:color="000000" w:sz="4"/>
-              <w:bottom w:val="single" w:color="000000" w:sz="4"/>
-              <w:right w:val="single" w:color="000000" w:sz="4"/>
-            </w:tcBorders>
-            <w:shd w:fill="F2F2F2" w:val="clear"/>
-            <w:vAlign w:val="center"/>
-          </w:tcPr>
-          <w:p>
-            <w:pPr>
-              <w:spacing w:after="20" w:before="20"/>
-              <w:jc w:val="left"/>
-            </w:pPr>
-            <w:r>
-              <w:rPr>
-                <w:rFonts w:ascii="Arial" w:cs="Arial" w:eastAsia="Arial" w:hAnsi="Arial"/>
-                <w:color w:val="000000"/>
-                <w:sz w:val="14"/>
-                <w:szCs w:val="14"/>
-              </w:rPr>
-              <w:t xml:space="preserve"/>
-            </w:r>
-          </w:p>
-        </w:tc>
-        <w:tc>
-          <w:tcPr>
-            <w:tcW w:type="dxa" w:w="730"/>
+            <w:tcW w:type="dxa" w:w="500"/>
+            <w:gridSpan w:val="1"/>
+            <w:tcBorders>
+              <w:top w:val="single" w:color="000000" w:sz="4"/>
+              <w:left w:val="single" w:color="000000" w:sz="4"/>
+              <w:bottom w:val="single" w:color="000000" w:sz="4"/>
+              <w:right w:val="single" w:color="000000" w:sz="4"/>
+            </w:tcBorders>
+            <w:shd w:fill="F2F2F2" w:val="clear"/>
+            <w:vAlign w:val="center"/>
+          </w:tcPr>
+          <w:p>
+            <w:pPr>
+              <w:spacing w:after="20" w:before="20"/>
+              <w:jc w:val="left"/>
+            </w:pPr>
+            <w:r>
+              <w:rPr>
+                <w:rFonts w:ascii="Arial" w:cs="Arial" w:eastAsia="Arial" w:hAnsi="Arial"/>
+                <w:color w:val="000000"/>
+                <w:sz w:val="14"/>
+                <w:szCs w:val="14"/>
+              </w:rPr>
+              <w:t xml:space="preserve"/>
+            </w:r>
+          </w:p>
+        </w:tc>
+        <w:tc>
+          <w:tcPr>
+            <w:tcW w:type="dxa" w:w="230"/>
             <w:gridSpan w:val="1"/>
             <w:tcBorders>
               <w:top w:val="single" w:color="000000" w:sz="4"/>
@@ -4110,6 +4234,62 @@
         </w:tc>
         <w:tc>
           <w:tcPr>
+            <w:tcW w:type="dxa" w:w="500"/>
+            <w:gridSpan w:val="1"/>
+            <w:tcBorders>
+              <w:top w:val="single" w:color="000000" w:sz="4"/>
+              <w:left w:val="single" w:color="000000" w:sz="4"/>
+              <w:bottom w:val="single" w:color="000000" w:sz="4"/>
+              <w:right w:val="single" w:color="000000" w:sz="4"/>
+            </w:tcBorders>
+            <w:vAlign w:val="center"/>
+          </w:tcPr>
+          <w:p>
+            <w:pPr>
+              <w:spacing w:after="20" w:before="20"/>
+              <w:jc w:val="left"/>
+            </w:pPr>
+            <w:r>
+              <w:rPr>
+                <w:rFonts w:ascii="Arial" w:cs="Arial" w:eastAsia="Arial" w:hAnsi="Arial"/>
+                <w:color w:val="000000"/>
+                <w:sz w:val="14"/>
+                <w:szCs w:val="14"/>
+              </w:rPr>
+              <w:t xml:space="preserve"/>
+            </w:r>
+          </w:p>
+        </w:tc>
+        <w:tc>
+          <w:tcPr>
+            <w:tcW w:type="dxa" w:w="230"/>
+            <w:gridSpan w:val="1"/>
+            <w:tcBorders>
+              <w:top w:val="single" w:color="000000" w:sz="4"/>
+              <w:left w:val="single" w:color="000000" w:sz="4"/>
+              <w:bottom w:val="single" w:color="000000" w:sz="4"/>
+              <w:right w:val="single" w:color="000000" w:sz="4"/>
+            </w:tcBorders>
+            <w:vAlign w:val="center"/>
+          </w:tcPr>
+          <w:p>
+            <w:pPr>
+              <w:spacing w:after="20" w:before="20"/>
+              <w:jc w:val="left"/>
+            </w:pPr>
+            <w:r>
+              <w:rPr>
+                <w:rFonts w:ascii="Arial" w:cs="Arial" w:eastAsia="Arial" w:hAnsi="Arial"/>
+                <w:color w:val="000000"/>
+                <w:sz w:val="14"/>
+                <w:szCs w:val="14"/>
+              </w:rPr>
+              <w:t xml:space="preserve"/>
+            </w:r>
+          </w:p>
+        </w:tc>
+        <w:tc>
+          <w:tcPr>
             <w:tcW w:type="dxa" w:w="730"/>
             <w:gridSpan w:val="1"/>
             <w:tcBorders>
@@ -4138,35 +4318,35 @@
         </w:tc>
         <w:tc>
           <w:tcPr>
-            <w:tcW w:type="dxa" w:w="730"/>
-            <w:gridSpan w:val="1"/>
-            <w:tcBorders>
-              <w:top w:val="single" w:color="000000" w:sz="4"/>
-              <w:left w:val="single" w:color="000000" w:sz="4"/>
-              <w:bottom w:val="single" w:color="000000" w:sz="4"/>
-              <w:right w:val="single" w:color="000000" w:sz="4"/>
-            </w:tcBorders>
-            <w:vAlign w:val="center"/>
-          </w:tcPr>
-          <w:p>
-            <w:pPr>
-              <w:spacing w:after="20" w:before="20"/>
-              <w:jc w:val="left"/>
-            </w:pPr>
-            <w:r>
-              <w:rPr>
-                <w:rFonts w:ascii="Arial" w:cs="Arial" w:eastAsia="Arial" w:hAnsi="Arial"/>
-                <w:color w:val="000000"/>
-                <w:sz w:val="14"/>
-                <w:szCs w:val="14"/>
-              </w:rPr>
-              <w:t xml:space="preserve"/>
-            </w:r>
-          </w:p>
-        </w:tc>
-        <w:tc>
-          <w:tcPr>
-            <w:tcW w:type="dxa" w:w="730"/>
+            <w:tcW w:type="dxa" w:w="500"/>
+            <w:gridSpan w:val="1"/>
+            <w:tcBorders>
+              <w:top w:val="single" w:color="000000" w:sz="4"/>
+              <w:left w:val="single" w:color="000000" w:sz="4"/>
+              <w:bottom w:val="single" w:color="000000" w:sz="4"/>
+              <w:right w:val="single" w:color="000000" w:sz="4"/>
+            </w:tcBorders>
+            <w:vAlign w:val="center"/>
+          </w:tcPr>
+          <w:p>
+            <w:pPr>
+              <w:spacing w:after="20" w:before="20"/>
+              <w:jc w:val="left"/>
+            </w:pPr>
+            <w:r>
+              <w:rPr>
+                <w:rFonts w:ascii="Arial" w:cs="Arial" w:eastAsia="Arial" w:hAnsi="Arial"/>
+                <w:color w:val="000000"/>
+                <w:sz w:val="14"/>
+                <w:szCs w:val="14"/>
+              </w:rPr>
+              <w:t xml:space="preserve"/>
+            </w:r>
+          </w:p>
+        </w:tc>
+        <w:tc>
+          <w:tcPr>
+            <w:tcW w:type="dxa" w:w="230"/>
             <w:gridSpan w:val="1"/>
             <w:tcBorders>
               <w:top w:val="single" w:color="000000" w:sz="4"/>
@@ -4596,6 +4776,64 @@
         </w:tc>
         <w:tc>
           <w:tcPr>
+            <w:tcW w:type="dxa" w:w="500"/>
+            <w:gridSpan w:val="1"/>
+            <w:tcBorders>
+              <w:top w:val="single" w:color="000000" w:sz="4"/>
+              <w:left w:val="single" w:color="000000" w:sz="4"/>
+              <w:bottom w:val="single" w:color="000000" w:sz="4"/>
+              <w:right w:val="single" w:color="000000" w:sz="4"/>
+            </w:tcBorders>
+            <w:shd w:fill="F2F2F2" w:val="clear"/>
+            <w:vAlign w:val="center"/>
+          </w:tcPr>
+          <w:p>
+            <w:pPr>
+              <w:spacing w:after="20" w:before="20"/>
+              <w:jc w:val="left"/>
+            </w:pPr>
+            <w:r>
+              <w:rPr>
+                <w:rFonts w:ascii="Arial" w:cs="Arial" w:eastAsia="Arial" w:hAnsi="Arial"/>
+                <w:color w:val="000000"/>
+                <w:sz w:val="14"/>
+                <w:szCs w:val="14"/>
+              </w:rPr>
+              <w:t xml:space="preserve"/>
+            </w:r>
+          </w:p>
+        </w:tc>
+        <w:tc>
+          <w:tcPr>
+            <w:tcW w:type="dxa" w:w="230"/>
+            <w:gridSpan w:val="1"/>
+            <w:tcBorders>
+              <w:top w:val="single" w:color="000000" w:sz="4"/>
+              <w:left w:val="single" w:color="000000" w:sz="4"/>
+              <w:bottom w:val="single" w:color="000000" w:sz="4"/>
+              <w:right w:val="single" w:color="000000" w:sz="4"/>
+            </w:tcBorders>
+            <w:shd w:fill="F2F2F2" w:val="clear"/>
+            <w:vAlign w:val="center"/>
+          </w:tcPr>
+          <w:p>
+            <w:pPr>
+              <w:spacing w:after="20" w:before="20"/>
+              <w:jc w:val="left"/>
+            </w:pPr>
+            <w:r>
+              <w:rPr>
+                <w:rFonts w:ascii="Arial" w:cs="Arial" w:eastAsia="Arial" w:hAnsi="Arial"/>
+                <w:color w:val="000000"/>
+                <w:sz w:val="14"/>
+                <w:szCs w:val="14"/>
+              </w:rPr>
+              <w:t xml:space="preserve"/>
+            </w:r>
+          </w:p>
+        </w:tc>
+        <w:tc>
+          <w:tcPr>
             <w:tcW w:type="dxa" w:w="730"/>
             <w:gridSpan w:val="1"/>
             <w:tcBorders>
@@ -4625,36 +4863,36 @@
         </w:tc>
         <w:tc>
           <w:tcPr>
-            <w:tcW w:type="dxa" w:w="730"/>
-            <w:gridSpan w:val="1"/>
-            <w:tcBorders>
-              <w:top w:val="single" w:color="000000" w:sz="4"/>
-              <w:left w:val="single" w:color="000000" w:sz="4"/>
-              <w:bottom w:val="single" w:color="000000" w:sz="4"/>
-              <w:right w:val="single" w:color="000000" w:sz="4"/>
-            </w:tcBorders>
-            <w:shd w:fill="F2F2F2" w:val="clear"/>
-            <w:vAlign w:val="center"/>
-          </w:tcPr>
-          <w:p>
-            <w:pPr>
-              <w:spacing w:after="20" w:before="20"/>
-              <w:jc w:val="left"/>
-            </w:pPr>
-            <w:r>
-              <w:rPr>
-                <w:rFonts w:ascii="Arial" w:cs="Arial" w:eastAsia="Arial" w:hAnsi="Arial"/>
-                <w:color w:val="000000"/>
-                <w:sz w:val="14"/>
-                <w:szCs w:val="14"/>
-              </w:rPr>
-              <w:t xml:space="preserve"/>
-            </w:r>
-          </w:p>
-        </w:tc>
-        <w:tc>
-          <w:tcPr>
-            <w:tcW w:type="dxa" w:w="730"/>
+            <w:tcW w:type="dxa" w:w="500"/>
+            <w:gridSpan w:val="1"/>
+            <w:tcBorders>
+              <w:top w:val="single" w:color="000000" w:sz="4"/>
+              <w:left w:val="single" w:color="000000" w:sz="4"/>
+              <w:bottom w:val="single" w:color="000000" w:sz="4"/>
+              <w:right w:val="single" w:color="000000" w:sz="4"/>
+            </w:tcBorders>
+            <w:shd w:fill="F2F2F2" w:val="clear"/>
+            <w:vAlign w:val="center"/>
+          </w:tcPr>
+          <w:p>
+            <w:pPr>
+              <w:spacing w:after="20" w:before="20"/>
+              <w:jc w:val="left"/>
+            </w:pPr>
+            <w:r>
+              <w:rPr>
+                <w:rFonts w:ascii="Arial" w:cs="Arial" w:eastAsia="Arial" w:hAnsi="Arial"/>
+                <w:color w:val="000000"/>
+                <w:sz w:val="14"/>
+                <w:szCs w:val="14"/>
+              </w:rPr>
+              <w:t xml:space="preserve"/>
+            </w:r>
+          </w:p>
+        </w:tc>
+        <w:tc>
+          <w:tcPr>
+            <w:tcW w:type="dxa" w:w="230"/>
             <w:gridSpan w:val="1"/>
             <w:tcBorders>
               <w:top w:val="single" w:color="000000" w:sz="4"/>
@@ -5089,6 +5327,62 @@
         </w:tc>
         <w:tc>
           <w:tcPr>
+            <w:tcW w:type="dxa" w:w="500"/>
+            <w:gridSpan w:val="1"/>
+            <w:tcBorders>
+              <w:top w:val="single" w:color="000000" w:sz="4"/>
+              <w:left w:val="single" w:color="000000" w:sz="4"/>
+              <w:bottom w:val="single" w:color="000000" w:sz="4"/>
+              <w:right w:val="single" w:color="000000" w:sz="4"/>
+            </w:tcBorders>
+            <w:vAlign w:val="center"/>
+          </w:tcPr>
+          <w:p>
+            <w:pPr>
+              <w:spacing w:after="20" w:before="20"/>
+              <w:jc w:val="left"/>
+            </w:pPr>
+            <w:r>
+              <w:rPr>
+                <w:rFonts w:ascii="Arial" w:cs="Arial" w:eastAsia="Arial" w:hAnsi="Arial"/>
+                <w:color w:val="000000"/>
+                <w:sz w:val="14"/>
+                <w:szCs w:val="14"/>
+              </w:rPr>
+              <w:t xml:space="preserve"/>
+            </w:r>
+          </w:p>
+        </w:tc>
+        <w:tc>
+          <w:tcPr>
+            <w:tcW w:type="dxa" w:w="230"/>
+            <w:gridSpan w:val="1"/>
+            <w:tcBorders>
+              <w:top w:val="single" w:color="000000" w:sz="4"/>
+              <w:left w:val="single" w:color="000000" w:sz="4"/>
+              <w:bottom w:val="single" w:color="000000" w:sz="4"/>
+              <w:right w:val="single" w:color="000000" w:sz="4"/>
+            </w:tcBorders>
+            <w:vAlign w:val="center"/>
+          </w:tcPr>
+          <w:p>
+            <w:pPr>
+              <w:spacing w:after="20" w:before="20"/>
+              <w:jc w:val="left"/>
+            </w:pPr>
+            <w:r>
+              <w:rPr>
+                <w:rFonts w:ascii="Arial" w:cs="Arial" w:eastAsia="Arial" w:hAnsi="Arial"/>
+                <w:color w:val="000000"/>
+                <w:sz w:val="14"/>
+                <w:szCs w:val="14"/>
+              </w:rPr>
+              <w:t xml:space="preserve"/>
+            </w:r>
+          </w:p>
+        </w:tc>
+        <w:tc>
+          <w:tcPr>
             <w:tcW w:type="dxa" w:w="730"/>
             <w:gridSpan w:val="1"/>
             <w:tcBorders>
@@ -5117,35 +5411,35 @@
         </w:tc>
         <w:tc>
           <w:tcPr>
-            <w:tcW w:type="dxa" w:w="730"/>
-            <w:gridSpan w:val="1"/>
-            <w:tcBorders>
-              <w:top w:val="single" w:color="000000" w:sz="4"/>
-              <w:left w:val="single" w:color="000000" w:sz="4"/>
-              <w:bottom w:val="single" w:color="000000" w:sz="4"/>
-              <w:right w:val="single" w:color="000000" w:sz="4"/>
-            </w:tcBorders>
-            <w:vAlign w:val="center"/>
-          </w:tcPr>
-          <w:p>
-            <w:pPr>
-              <w:spacing w:after="20" w:before="20"/>
-              <w:jc w:val="left"/>
-            </w:pPr>
-            <w:r>
-              <w:rPr>
-                <w:rFonts w:ascii="Arial" w:cs="Arial" w:eastAsia="Arial" w:hAnsi="Arial"/>
-                <w:color w:val="000000"/>
-                <w:sz w:val="14"/>
-                <w:szCs w:val="14"/>
-              </w:rPr>
-              <w:t xml:space="preserve"/>
-            </w:r>
-          </w:p>
-        </w:tc>
-        <w:tc>
-          <w:tcPr>
-            <w:tcW w:type="dxa" w:w="730"/>
+            <w:tcW w:type="dxa" w:w="500"/>
+            <w:gridSpan w:val="1"/>
+            <w:tcBorders>
+              <w:top w:val="single" w:color="000000" w:sz="4"/>
+              <w:left w:val="single" w:color="000000" w:sz="4"/>
+              <w:bottom w:val="single" w:color="000000" w:sz="4"/>
+              <w:right w:val="single" w:color="000000" w:sz="4"/>
+            </w:tcBorders>
+            <w:vAlign w:val="center"/>
+          </w:tcPr>
+          <w:p>
+            <w:pPr>
+              <w:spacing w:after="20" w:before="20"/>
+              <w:jc w:val="left"/>
+            </w:pPr>
+            <w:r>
+              <w:rPr>
+                <w:rFonts w:ascii="Arial" w:cs="Arial" w:eastAsia="Arial" w:hAnsi="Arial"/>
+                <w:color w:val="000000"/>
+                <w:sz w:val="14"/>
+                <w:szCs w:val="14"/>
+              </w:rPr>
+              <w:t xml:space="preserve"/>
+            </w:r>
+          </w:p>
+        </w:tc>
+        <w:tc>
+          <w:tcPr>
+            <w:tcW w:type="dxa" w:w="230"/>
             <w:gridSpan w:val="1"/>
             <w:tcBorders>
               <w:top w:val="single" w:color="000000" w:sz="4"/>
@@ -5575,6 +5869,64 @@
         </w:tc>
         <w:tc>
           <w:tcPr>
+            <w:tcW w:type="dxa" w:w="500"/>
+            <w:gridSpan w:val="1"/>
+            <w:tcBorders>
+              <w:top w:val="single" w:color="000000" w:sz="4"/>
+              <w:left w:val="single" w:color="000000" w:sz="4"/>
+              <w:bottom w:val="single" w:color="000000" w:sz="4"/>
+              <w:right w:val="single" w:color="000000" w:sz="4"/>
+            </w:tcBorders>
+            <w:shd w:fill="F2F2F2" w:val="clear"/>
+            <w:vAlign w:val="center"/>
+          </w:tcPr>
+          <w:p>
+            <w:pPr>
+              <w:spacing w:after="20" w:before="20"/>
+              <w:jc w:val="left"/>
+            </w:pPr>
+            <w:r>
+              <w:rPr>
+                <w:rFonts w:ascii="Arial" w:cs="Arial" w:eastAsia="Arial" w:hAnsi="Arial"/>
+                <w:color w:val="000000"/>
+                <w:sz w:val="14"/>
+                <w:szCs w:val="14"/>
+              </w:rPr>
+              <w:t xml:space="preserve"/>
+            </w:r>
+          </w:p>
+        </w:tc>
+        <w:tc>
+          <w:tcPr>
+            <w:tcW w:type="dxa" w:w="230"/>
+            <w:gridSpan w:val="1"/>
+            <w:tcBorders>
+              <w:top w:val="single" w:color="000000" w:sz="4"/>
+              <w:left w:val="single" w:color="000000" w:sz="4"/>
+              <w:bottom w:val="single" w:color="000000" w:sz="4"/>
+              <w:right w:val="single" w:color="000000" w:sz="4"/>
+            </w:tcBorders>
+            <w:shd w:fill="F2F2F2" w:val="clear"/>
+            <w:vAlign w:val="center"/>
+          </w:tcPr>
+          <w:p>
+            <w:pPr>
+              <w:spacing w:after="20" w:before="20"/>
+              <w:jc w:val="left"/>
+            </w:pPr>
+            <w:r>
+              <w:rPr>
+                <w:rFonts w:ascii="Arial" w:cs="Arial" w:eastAsia="Arial" w:hAnsi="Arial"/>
+                <w:color w:val="000000"/>
+                <w:sz w:val="14"/>
+                <w:szCs w:val="14"/>
+              </w:rPr>
+              <w:t xml:space="preserve"/>
+            </w:r>
+          </w:p>
+        </w:tc>
+        <w:tc>
+          <w:tcPr>
             <w:tcW w:type="dxa" w:w="730"/>
             <w:gridSpan w:val="1"/>
             <w:tcBorders>
@@ -5604,36 +5956,36 @@
         </w:tc>
         <w:tc>
           <w:tcPr>
-            <w:tcW w:type="dxa" w:w="730"/>
-            <w:gridSpan w:val="1"/>
-            <w:tcBorders>
-              <w:top w:val="single" w:color="000000" w:sz="4"/>
-              <w:left w:val="single" w:color="000000" w:sz="4"/>
-              <w:bottom w:val="single" w:color="000000" w:sz="4"/>
-              <w:right w:val="single" w:color="000000" w:sz="4"/>
-            </w:tcBorders>
-            <w:shd w:fill="F2F2F2" w:val="clear"/>
-            <w:vAlign w:val="center"/>
-          </w:tcPr>
-          <w:p>
-            <w:pPr>
-              <w:spacing w:after="20" w:before="20"/>
-              <w:jc w:val="left"/>
-            </w:pPr>
-            <w:r>
-              <w:rPr>
-                <w:rFonts w:ascii="Arial" w:cs="Arial" w:eastAsia="Arial" w:hAnsi="Arial"/>
-                <w:color w:val="000000"/>
-                <w:sz w:val="14"/>
-                <w:szCs w:val="14"/>
-              </w:rPr>
-              <w:t xml:space="preserve"/>
-            </w:r>
-          </w:p>
-        </w:tc>
-        <w:tc>
-          <w:tcPr>
-            <w:tcW w:type="dxa" w:w="730"/>
+            <w:tcW w:type="dxa" w:w="500"/>
+            <w:gridSpan w:val="1"/>
+            <w:tcBorders>
+              <w:top w:val="single" w:color="000000" w:sz="4"/>
+              <w:left w:val="single" w:color="000000" w:sz="4"/>
+              <w:bottom w:val="single" w:color="000000" w:sz="4"/>
+              <w:right w:val="single" w:color="000000" w:sz="4"/>
+            </w:tcBorders>
+            <w:shd w:fill="F2F2F2" w:val="clear"/>
+            <w:vAlign w:val="center"/>
+          </w:tcPr>
+          <w:p>
+            <w:pPr>
+              <w:spacing w:after="20" w:before="20"/>
+              <w:jc w:val="left"/>
+            </w:pPr>
+            <w:r>
+              <w:rPr>
+                <w:rFonts w:ascii="Arial" w:cs="Arial" w:eastAsia="Arial" w:hAnsi="Arial"/>
+                <w:color w:val="000000"/>
+                <w:sz w:val="14"/>
+                <w:szCs w:val="14"/>
+              </w:rPr>
+              <w:t xml:space="preserve"/>
+            </w:r>
+          </w:p>
+        </w:tc>
+        <w:tc>
+          <w:tcPr>
+            <w:tcW w:type="dxa" w:w="230"/>
             <w:gridSpan w:val="1"/>
             <w:tcBorders>
               <w:top w:val="single" w:color="000000" w:sz="4"/>
@@ -6068,6 +6420,62 @@
         </w:tc>
         <w:tc>
           <w:tcPr>
+            <w:tcW w:type="dxa" w:w="500"/>
+            <w:gridSpan w:val="1"/>
+            <w:tcBorders>
+              <w:top w:val="single" w:color="000000" w:sz="4"/>
+              <w:left w:val="single" w:color="000000" w:sz="4"/>
+              <w:bottom w:val="single" w:color="000000" w:sz="4"/>
+              <w:right w:val="single" w:color="000000" w:sz="4"/>
+            </w:tcBorders>
+            <w:vAlign w:val="center"/>
+          </w:tcPr>
+          <w:p>
+            <w:pPr>
+              <w:spacing w:after="20" w:before="20"/>
+              <w:jc w:val="left"/>
+            </w:pPr>
+            <w:r>
+              <w:rPr>
+                <w:rFonts w:ascii="Arial" w:cs="Arial" w:eastAsia="Arial" w:hAnsi="Arial"/>
+                <w:color w:val="000000"/>
+                <w:sz w:val="14"/>
+                <w:szCs w:val="14"/>
+              </w:rPr>
+              <w:t xml:space="preserve"/>
+            </w:r>
+          </w:p>
+        </w:tc>
+        <w:tc>
+          <w:tcPr>
+            <w:tcW w:type="dxa" w:w="230"/>
+            <w:gridSpan w:val="1"/>
+            <w:tcBorders>
+              <w:top w:val="single" w:color="000000" w:sz="4"/>
+              <w:left w:val="single" w:color="000000" w:sz="4"/>
+              <w:bottom w:val="single" w:color="000000" w:sz="4"/>
+              <w:right w:val="single" w:color="000000" w:sz="4"/>
+            </w:tcBorders>
+            <w:vAlign w:val="center"/>
+          </w:tcPr>
+          <w:p>
+            <w:pPr>
+              <w:spacing w:after="20" w:before="20"/>
+              <w:jc w:val="left"/>
+            </w:pPr>
+            <w:r>
+              <w:rPr>
+                <w:rFonts w:ascii="Arial" w:cs="Arial" w:eastAsia="Arial" w:hAnsi="Arial"/>
+                <w:color w:val="000000"/>
+                <w:sz w:val="14"/>
+                <w:szCs w:val="14"/>
+              </w:rPr>
+              <w:t xml:space="preserve"/>
+            </w:r>
+          </w:p>
+        </w:tc>
+        <w:tc>
+          <w:tcPr>
             <w:tcW w:type="dxa" w:w="730"/>
             <w:gridSpan w:val="1"/>
             <w:tcBorders>
@@ -6096,35 +6504,35 @@
         </w:tc>
         <w:tc>
           <w:tcPr>
-            <w:tcW w:type="dxa" w:w="730"/>
-            <w:gridSpan w:val="1"/>
-            <w:tcBorders>
-              <w:top w:val="single" w:color="000000" w:sz="4"/>
-              <w:left w:val="single" w:color="000000" w:sz="4"/>
-              <w:bottom w:val="single" w:color="000000" w:sz="4"/>
-              <w:right w:val="single" w:color="000000" w:sz="4"/>
-            </w:tcBorders>
-            <w:vAlign w:val="center"/>
-          </w:tcPr>
-          <w:p>
-            <w:pPr>
-              <w:spacing w:after="20" w:before="20"/>
-              <w:jc w:val="left"/>
-            </w:pPr>
-            <w:r>
-              <w:rPr>
-                <w:rFonts w:ascii="Arial" w:cs="Arial" w:eastAsia="Arial" w:hAnsi="Arial"/>
-                <w:color w:val="000000"/>
-                <w:sz w:val="14"/>
-                <w:szCs w:val="14"/>
-              </w:rPr>
-              <w:t xml:space="preserve"/>
-            </w:r>
-          </w:p>
-        </w:tc>
-        <w:tc>
-          <w:tcPr>
-            <w:tcW w:type="dxa" w:w="730"/>
+            <w:tcW w:type="dxa" w:w="500"/>
+            <w:gridSpan w:val="1"/>
+            <w:tcBorders>
+              <w:top w:val="single" w:color="000000" w:sz="4"/>
+              <w:left w:val="single" w:color="000000" w:sz="4"/>
+              <w:bottom w:val="single" w:color="000000" w:sz="4"/>
+              <w:right w:val="single" w:color="000000" w:sz="4"/>
+            </w:tcBorders>
+            <w:vAlign w:val="center"/>
+          </w:tcPr>
+          <w:p>
+            <w:pPr>
+              <w:spacing w:after="20" w:before="20"/>
+              <w:jc w:val="left"/>
+            </w:pPr>
+            <w:r>
+              <w:rPr>
+                <w:rFonts w:ascii="Arial" w:cs="Arial" w:eastAsia="Arial" w:hAnsi="Arial"/>
+                <w:color w:val="000000"/>
+                <w:sz w:val="14"/>
+                <w:szCs w:val="14"/>
+              </w:rPr>
+              <w:t xml:space="preserve"/>
+            </w:r>
+          </w:p>
+        </w:tc>
+        <w:tc>
+          <w:tcPr>
+            <w:tcW w:type="dxa" w:w="230"/>
             <w:gridSpan w:val="1"/>
             <w:tcBorders>
               <w:top w:val="single" w:color="000000" w:sz="4"/>
@@ -6554,6 +6962,64 @@
         </w:tc>
         <w:tc>
           <w:tcPr>
+            <w:tcW w:type="dxa" w:w="500"/>
+            <w:gridSpan w:val="1"/>
+            <w:tcBorders>
+              <w:top w:val="single" w:color="000000" w:sz="4"/>
+              <w:left w:val="single" w:color="000000" w:sz="4"/>
+              <w:bottom w:val="single" w:color="000000" w:sz="4"/>
+              <w:right w:val="single" w:color="000000" w:sz="4"/>
+            </w:tcBorders>
+            <w:shd w:fill="F2F2F2" w:val="clear"/>
+            <w:vAlign w:val="center"/>
+          </w:tcPr>
+          <w:p>
+            <w:pPr>
+              <w:spacing w:after="20" w:before="20"/>
+              <w:jc w:val="left"/>
+            </w:pPr>
+            <w:r>
+              <w:rPr>
+                <w:rFonts w:ascii="Arial" w:cs="Arial" w:eastAsia="Arial" w:hAnsi="Arial"/>
+                <w:color w:val="000000"/>
+                <w:sz w:val="14"/>
+                <w:szCs w:val="14"/>
+              </w:rPr>
+              <w:t xml:space="preserve"/>
+            </w:r>
+          </w:p>
+        </w:tc>
+        <w:tc>
+          <w:tcPr>
+            <w:tcW w:type="dxa" w:w="230"/>
+            <w:gridSpan w:val="1"/>
+            <w:tcBorders>
+              <w:top w:val="single" w:color="000000" w:sz="4"/>
+              <w:left w:val="single" w:color="000000" w:sz="4"/>
+              <w:bottom w:val="single" w:color="000000" w:sz="4"/>
+              <w:right w:val="single" w:color="000000" w:sz="4"/>
+            </w:tcBorders>
+            <w:shd w:fill="F2F2F2" w:val="clear"/>
+            <w:vAlign w:val="center"/>
+          </w:tcPr>
+          <w:p>
+            <w:pPr>
+              <w:spacing w:after="20" w:before="20"/>
+              <w:jc w:val="left"/>
+            </w:pPr>
+            <w:r>
+              <w:rPr>
+                <w:rFonts w:ascii="Arial" w:cs="Arial" w:eastAsia="Arial" w:hAnsi="Arial"/>
+                <w:color w:val="000000"/>
+                <w:sz w:val="14"/>
+                <w:szCs w:val="14"/>
+              </w:rPr>
+              <w:t xml:space="preserve"/>
+            </w:r>
+          </w:p>
+        </w:tc>
+        <w:tc>
+          <w:tcPr>
             <w:tcW w:type="dxa" w:w="730"/>
             <w:gridSpan w:val="1"/>
             <w:tcBorders>
@@ -6583,36 +7049,36 @@
         </w:tc>
         <w:tc>
           <w:tcPr>
-            <w:tcW w:type="dxa" w:w="730"/>
-            <w:gridSpan w:val="1"/>
-            <w:tcBorders>
-              <w:top w:val="single" w:color="000000" w:sz="4"/>
-              <w:left w:val="single" w:color="000000" w:sz="4"/>
-              <w:bottom w:val="single" w:color="000000" w:sz="4"/>
-              <w:right w:val="single" w:color="000000" w:sz="4"/>
-            </w:tcBorders>
-            <w:shd w:fill="F2F2F2" w:val="clear"/>
-            <w:vAlign w:val="center"/>
-          </w:tcPr>
-          <w:p>
-            <w:pPr>
-              <w:spacing w:after="20" w:before="20"/>
-              <w:jc w:val="left"/>
-            </w:pPr>
-            <w:r>
-              <w:rPr>
-                <w:rFonts w:ascii="Arial" w:cs="Arial" w:eastAsia="Arial" w:hAnsi="Arial"/>
-                <w:color w:val="000000"/>
-                <w:sz w:val="14"/>
-                <w:szCs w:val="14"/>
-              </w:rPr>
-              <w:t xml:space="preserve"/>
-            </w:r>
-          </w:p>
-        </w:tc>
-        <w:tc>
-          <w:tcPr>
-            <w:tcW w:type="dxa" w:w="730"/>
+            <w:tcW w:type="dxa" w:w="500"/>
+            <w:gridSpan w:val="1"/>
+            <w:tcBorders>
+              <w:top w:val="single" w:color="000000" w:sz="4"/>
+              <w:left w:val="single" w:color="000000" w:sz="4"/>
+              <w:bottom w:val="single" w:color="000000" w:sz="4"/>
+              <w:right w:val="single" w:color="000000" w:sz="4"/>
+            </w:tcBorders>
+            <w:shd w:fill="F2F2F2" w:val="clear"/>
+            <w:vAlign w:val="center"/>
+          </w:tcPr>
+          <w:p>
+            <w:pPr>
+              <w:spacing w:after="20" w:before="20"/>
+              <w:jc w:val="left"/>
+            </w:pPr>
+            <w:r>
+              <w:rPr>
+                <w:rFonts w:ascii="Arial" w:cs="Arial" w:eastAsia="Arial" w:hAnsi="Arial"/>
+                <w:color w:val="000000"/>
+                <w:sz w:val="14"/>
+                <w:szCs w:val="14"/>
+              </w:rPr>
+              <w:t xml:space="preserve"/>
+            </w:r>
+          </w:p>
+        </w:tc>
+        <w:tc>
+          <w:tcPr>
+            <w:tcW w:type="dxa" w:w="230"/>
             <w:gridSpan w:val="1"/>
             <w:tcBorders>
               <w:top w:val="single" w:color="000000" w:sz="4"/>
@@ -7047,6 +7513,62 @@
         </w:tc>
         <w:tc>
           <w:tcPr>
+            <w:tcW w:type="dxa" w:w="500"/>
+            <w:gridSpan w:val="1"/>
+            <w:tcBorders>
+              <w:top w:val="single" w:color="000000" w:sz="4"/>
+              <w:left w:val="single" w:color="000000" w:sz="4"/>
+              <w:bottom w:val="single" w:color="000000" w:sz="4"/>
+              <w:right w:val="single" w:color="000000" w:sz="4"/>
+            </w:tcBorders>
+            <w:vAlign w:val="center"/>
+          </w:tcPr>
+          <w:p>
+            <w:pPr>
+              <w:spacing w:after="20" w:before="20"/>
+              <w:jc w:val="left"/>
+            </w:pPr>
+            <w:r>
+              <w:rPr>
+                <w:rFonts w:ascii="Arial" w:cs="Arial" w:eastAsia="Arial" w:hAnsi="Arial"/>
+                <w:color w:val="000000"/>
+                <w:sz w:val="14"/>
+                <w:szCs w:val="14"/>
+              </w:rPr>
+              <w:t xml:space="preserve"/>
+            </w:r>
+          </w:p>
+        </w:tc>
+        <w:tc>
+          <w:tcPr>
+            <w:tcW w:type="dxa" w:w="230"/>
+            <w:gridSpan w:val="1"/>
+            <w:tcBorders>
+              <w:top w:val="single" w:color="000000" w:sz="4"/>
+              <w:left w:val="single" w:color="000000" w:sz="4"/>
+              <w:bottom w:val="single" w:color="000000" w:sz="4"/>
+              <w:right w:val="single" w:color="000000" w:sz="4"/>
+            </w:tcBorders>
+            <w:vAlign w:val="center"/>
+          </w:tcPr>
+          <w:p>
+            <w:pPr>
+              <w:spacing w:after="20" w:before="20"/>
+              <w:jc w:val="left"/>
+            </w:pPr>
+            <w:r>
+              <w:rPr>
+                <w:rFonts w:ascii="Arial" w:cs="Arial" w:eastAsia="Arial" w:hAnsi="Arial"/>
+                <w:color w:val="000000"/>
+                <w:sz w:val="14"/>
+                <w:szCs w:val="14"/>
+              </w:rPr>
+              <w:t xml:space="preserve"/>
+            </w:r>
+          </w:p>
+        </w:tc>
+        <w:tc>
+          <w:tcPr>
             <w:tcW w:type="dxa" w:w="730"/>
             <w:gridSpan w:val="1"/>
             <w:tcBorders>
@@ -7075,35 +7597,35 @@
         </w:tc>
         <w:tc>
           <w:tcPr>
-            <w:tcW w:type="dxa" w:w="730"/>
-            <w:gridSpan w:val="1"/>
-            <w:tcBorders>
-              <w:top w:val="single" w:color="000000" w:sz="4"/>
-              <w:left w:val="single" w:color="000000" w:sz="4"/>
-              <w:bottom w:val="single" w:color="000000" w:sz="4"/>
-              <w:right w:val="single" w:color="000000" w:sz="4"/>
-            </w:tcBorders>
-            <w:vAlign w:val="center"/>
-          </w:tcPr>
-          <w:p>
-            <w:pPr>
-              <w:spacing w:after="20" w:before="20"/>
-              <w:jc w:val="left"/>
-            </w:pPr>
-            <w:r>
-              <w:rPr>
-                <w:rFonts w:ascii="Arial" w:cs="Arial" w:eastAsia="Arial" w:hAnsi="Arial"/>
-                <w:color w:val="000000"/>
-                <w:sz w:val="14"/>
-                <w:szCs w:val="14"/>
-              </w:rPr>
-              <w:t xml:space="preserve"/>
-            </w:r>
-          </w:p>
-        </w:tc>
-        <w:tc>
-          <w:tcPr>
-            <w:tcW w:type="dxa" w:w="730"/>
+            <w:tcW w:type="dxa" w:w="500"/>
+            <w:gridSpan w:val="1"/>
+            <w:tcBorders>
+              <w:top w:val="single" w:color="000000" w:sz="4"/>
+              <w:left w:val="single" w:color="000000" w:sz="4"/>
+              <w:bottom w:val="single" w:color="000000" w:sz="4"/>
+              <w:right w:val="single" w:color="000000" w:sz="4"/>
+            </w:tcBorders>
+            <w:vAlign w:val="center"/>
+          </w:tcPr>
+          <w:p>
+            <w:pPr>
+              <w:spacing w:after="20" w:before="20"/>
+              <w:jc w:val="left"/>
+            </w:pPr>
+            <w:r>
+              <w:rPr>
+                <w:rFonts w:ascii="Arial" w:cs="Arial" w:eastAsia="Arial" w:hAnsi="Arial"/>
+                <w:color w:val="000000"/>
+                <w:sz w:val="14"/>
+                <w:szCs w:val="14"/>
+              </w:rPr>
+              <w:t xml:space="preserve"/>
+            </w:r>
+          </w:p>
+        </w:tc>
+        <w:tc>
+          <w:tcPr>
+            <w:tcW w:type="dxa" w:w="230"/>
             <w:gridSpan w:val="1"/>
             <w:tcBorders>
               <w:top w:val="single" w:color="000000" w:sz="4"/>
@@ -7533,6 +8055,64 @@
         </w:tc>
         <w:tc>
           <w:tcPr>
+            <w:tcW w:type="dxa" w:w="500"/>
+            <w:gridSpan w:val="1"/>
+            <w:tcBorders>
+              <w:top w:val="single" w:color="000000" w:sz="4"/>
+              <w:left w:val="single" w:color="000000" w:sz="4"/>
+              <w:bottom w:val="single" w:color="000000" w:sz="4"/>
+              <w:right w:val="single" w:color="000000" w:sz="4"/>
+            </w:tcBorders>
+            <w:shd w:fill="F2F2F2" w:val="clear"/>
+            <w:vAlign w:val="center"/>
+          </w:tcPr>
+          <w:p>
+            <w:pPr>
+              <w:spacing w:after="20" w:before="20"/>
+              <w:jc w:val="left"/>
+            </w:pPr>
+            <w:r>
+              <w:rPr>
+                <w:rFonts w:ascii="Arial" w:cs="Arial" w:eastAsia="Arial" w:hAnsi="Arial"/>
+                <w:color w:val="000000"/>
+                <w:sz w:val="14"/>
+                <w:szCs w:val="14"/>
+              </w:rPr>
+              <w:t xml:space="preserve"/>
+            </w:r>
+          </w:p>
+        </w:tc>
+        <w:tc>
+          <w:tcPr>
+            <w:tcW w:type="dxa" w:w="230"/>
+            <w:gridSpan w:val="1"/>
+            <w:tcBorders>
+              <w:top w:val="single" w:color="000000" w:sz="4"/>
+              <w:left w:val="single" w:color="000000" w:sz="4"/>
+              <w:bottom w:val="single" w:color="000000" w:sz="4"/>
+              <w:right w:val="single" w:color="000000" w:sz="4"/>
+            </w:tcBorders>
+            <w:shd w:fill="F2F2F2" w:val="clear"/>
+            <w:vAlign w:val="center"/>
+          </w:tcPr>
+          <w:p>
+            <w:pPr>
+              <w:spacing w:after="20" w:before="20"/>
+              <w:jc w:val="left"/>
+            </w:pPr>
+            <w:r>
+              <w:rPr>
+                <w:rFonts w:ascii="Arial" w:cs="Arial" w:eastAsia="Arial" w:hAnsi="Arial"/>
+                <w:color w:val="000000"/>
+                <w:sz w:val="14"/>
+                <w:szCs w:val="14"/>
+              </w:rPr>
+              <w:t xml:space="preserve"/>
+            </w:r>
+          </w:p>
+        </w:tc>
+        <w:tc>
+          <w:tcPr>
             <w:tcW w:type="dxa" w:w="730"/>
             <w:gridSpan w:val="1"/>
             <w:tcBorders>
@@ -7562,36 +8142,36 @@
         </w:tc>
         <w:tc>
           <w:tcPr>
-            <w:tcW w:type="dxa" w:w="730"/>
-            <w:gridSpan w:val="1"/>
-            <w:tcBorders>
-              <w:top w:val="single" w:color="000000" w:sz="4"/>
-              <w:left w:val="single" w:color="000000" w:sz="4"/>
-              <w:bottom w:val="single" w:color="000000" w:sz="4"/>
-              <w:right w:val="single" w:color="000000" w:sz="4"/>
-            </w:tcBorders>
-            <w:shd w:fill="F2F2F2" w:val="clear"/>
-            <w:vAlign w:val="center"/>
-          </w:tcPr>
-          <w:p>
-            <w:pPr>
-              <w:spacing w:after="20" w:before="20"/>
-              <w:jc w:val="left"/>
-            </w:pPr>
-            <w:r>
-              <w:rPr>
-                <w:rFonts w:ascii="Arial" w:cs="Arial" w:eastAsia="Arial" w:hAnsi="Arial"/>
-                <w:color w:val="000000"/>
-                <w:sz w:val="14"/>
-                <w:szCs w:val="14"/>
-              </w:rPr>
-              <w:t xml:space="preserve"/>
-            </w:r>
-          </w:p>
-        </w:tc>
-        <w:tc>
-          <w:tcPr>
-            <w:tcW w:type="dxa" w:w="730"/>
+            <w:tcW w:type="dxa" w:w="500"/>
+            <w:gridSpan w:val="1"/>
+            <w:tcBorders>
+              <w:top w:val="single" w:color="000000" w:sz="4"/>
+              <w:left w:val="single" w:color="000000" w:sz="4"/>
+              <w:bottom w:val="single" w:color="000000" w:sz="4"/>
+              <w:right w:val="single" w:color="000000" w:sz="4"/>
+            </w:tcBorders>
+            <w:shd w:fill="F2F2F2" w:val="clear"/>
+            <w:vAlign w:val="center"/>
+          </w:tcPr>
+          <w:p>
+            <w:pPr>
+              <w:spacing w:after="20" w:before="20"/>
+              <w:jc w:val="left"/>
+            </w:pPr>
+            <w:r>
+              <w:rPr>
+                <w:rFonts w:ascii="Arial" w:cs="Arial" w:eastAsia="Arial" w:hAnsi="Arial"/>
+                <w:color w:val="000000"/>
+                <w:sz w:val="14"/>
+                <w:szCs w:val="14"/>
+              </w:rPr>
+              <w:t xml:space="preserve"/>
+            </w:r>
+          </w:p>
+        </w:tc>
+        <w:tc>
+          <w:tcPr>
+            <w:tcW w:type="dxa" w:w="230"/>
             <w:gridSpan w:val="1"/>
             <w:tcBorders>
               <w:top w:val="single" w:color="000000" w:sz="4"/>
@@ -8026,6 +8606,62 @@
         </w:tc>
         <w:tc>
           <w:tcPr>
+            <w:tcW w:type="dxa" w:w="500"/>
+            <w:gridSpan w:val="1"/>
+            <w:tcBorders>
+              <w:top w:val="single" w:color="000000" w:sz="4"/>
+              <w:left w:val="single" w:color="000000" w:sz="4"/>
+              <w:bottom w:val="single" w:color="000000" w:sz="4"/>
+              <w:right w:val="single" w:color="000000" w:sz="4"/>
+            </w:tcBorders>
+            <w:vAlign w:val="center"/>
+          </w:tcPr>
+          <w:p>
+            <w:pPr>
+              <w:spacing w:after="20" w:before="20"/>
+              <w:jc w:val="left"/>
+            </w:pPr>
+            <w:r>
+              <w:rPr>
+                <w:rFonts w:ascii="Arial" w:cs="Arial" w:eastAsia="Arial" w:hAnsi="Arial"/>
+                <w:color w:val="000000"/>
+                <w:sz w:val="14"/>
+                <w:szCs w:val="14"/>
+              </w:rPr>
+              <w:t xml:space="preserve"/>
+            </w:r>
+          </w:p>
+        </w:tc>
+        <w:tc>
+          <w:tcPr>
+            <w:tcW w:type="dxa" w:w="230"/>
+            <w:gridSpan w:val="1"/>
+            <w:tcBorders>
+              <w:top w:val="single" w:color="000000" w:sz="4"/>
+              <w:left w:val="single" w:color="000000" w:sz="4"/>
+              <w:bottom w:val="single" w:color="000000" w:sz="4"/>
+              <w:right w:val="single" w:color="000000" w:sz="4"/>
+            </w:tcBorders>
+            <w:vAlign w:val="center"/>
+          </w:tcPr>
+          <w:p>
+            <w:pPr>
+              <w:spacing w:after="20" w:before="20"/>
+              <w:jc w:val="left"/>
+            </w:pPr>
+            <w:r>
+              <w:rPr>
+                <w:rFonts w:ascii="Arial" w:cs="Arial" w:eastAsia="Arial" w:hAnsi="Arial"/>
+                <w:color w:val="000000"/>
+                <w:sz w:val="14"/>
+                <w:szCs w:val="14"/>
+              </w:rPr>
+              <w:t xml:space="preserve"/>
+            </w:r>
+          </w:p>
+        </w:tc>
+        <w:tc>
+          <w:tcPr>
             <w:tcW w:type="dxa" w:w="730"/>
             <w:gridSpan w:val="1"/>
             <w:tcBorders>
@@ -8054,35 +8690,35 @@
         </w:tc>
         <w:tc>
           <w:tcPr>
-            <w:tcW w:type="dxa" w:w="730"/>
-            <w:gridSpan w:val="1"/>
-            <w:tcBorders>
-              <w:top w:val="single" w:color="000000" w:sz="4"/>
-              <w:left w:val="single" w:color="000000" w:sz="4"/>
-              <w:bottom w:val="single" w:color="000000" w:sz="4"/>
-              <w:right w:val="single" w:color="000000" w:sz="4"/>
-            </w:tcBorders>
-            <w:vAlign w:val="center"/>
-          </w:tcPr>
-          <w:p>
-            <w:pPr>
-              <w:spacing w:after="20" w:before="20"/>
-              <w:jc w:val="left"/>
-            </w:pPr>
-            <w:r>
-              <w:rPr>
-                <w:rFonts w:ascii="Arial" w:cs="Arial" w:eastAsia="Arial" w:hAnsi="Arial"/>
-                <w:color w:val="000000"/>
-                <w:sz w:val="14"/>
-                <w:szCs w:val="14"/>
-              </w:rPr>
-              <w:t xml:space="preserve"/>
-            </w:r>
-          </w:p>
-        </w:tc>
-        <w:tc>
-          <w:tcPr>
-            <w:tcW w:type="dxa" w:w="730"/>
+            <w:tcW w:type="dxa" w:w="500"/>
+            <w:gridSpan w:val="1"/>
+            <w:tcBorders>
+              <w:top w:val="single" w:color="000000" w:sz="4"/>
+              <w:left w:val="single" w:color="000000" w:sz="4"/>
+              <w:bottom w:val="single" w:color="000000" w:sz="4"/>
+              <w:right w:val="single" w:color="000000" w:sz="4"/>
+            </w:tcBorders>
+            <w:vAlign w:val="center"/>
+          </w:tcPr>
+          <w:p>
+            <w:pPr>
+              <w:spacing w:after="20" w:before="20"/>
+              <w:jc w:val="left"/>
+            </w:pPr>
+            <w:r>
+              <w:rPr>
+                <w:rFonts w:ascii="Arial" w:cs="Arial" w:eastAsia="Arial" w:hAnsi="Arial"/>
+                <w:color w:val="000000"/>
+                <w:sz w:val="14"/>
+                <w:szCs w:val="14"/>
+              </w:rPr>
+              <w:t xml:space="preserve"/>
+            </w:r>
+          </w:p>
+        </w:tc>
+        <w:tc>
+          <w:tcPr>
+            <w:tcW w:type="dxa" w:w="230"/>
             <w:gridSpan w:val="1"/>
             <w:tcBorders>
               <w:top w:val="single" w:color="000000" w:sz="4"/>
@@ -8512,6 +9148,64 @@
         </w:tc>
         <w:tc>
           <w:tcPr>
+            <w:tcW w:type="dxa" w:w="500"/>
+            <w:gridSpan w:val="1"/>
+            <w:tcBorders>
+              <w:top w:val="single" w:color="000000" w:sz="4"/>
+              <w:left w:val="single" w:color="000000" w:sz="4"/>
+              <w:bottom w:val="single" w:color="000000" w:sz="4"/>
+              <w:right w:val="single" w:color="000000" w:sz="4"/>
+            </w:tcBorders>
+            <w:shd w:fill="F2F2F2" w:val="clear"/>
+            <w:vAlign w:val="center"/>
+          </w:tcPr>
+          <w:p>
+            <w:pPr>
+              <w:spacing w:after="20" w:before="20"/>
+              <w:jc w:val="left"/>
+            </w:pPr>
+            <w:r>
+              <w:rPr>
+                <w:rFonts w:ascii="Arial" w:cs="Arial" w:eastAsia="Arial" w:hAnsi="Arial"/>
+                <w:color w:val="000000"/>
+                <w:sz w:val="14"/>
+                <w:szCs w:val="14"/>
+              </w:rPr>
+              <w:t xml:space="preserve"/>
+            </w:r>
+          </w:p>
+        </w:tc>
+        <w:tc>
+          <w:tcPr>
+            <w:tcW w:type="dxa" w:w="230"/>
+            <w:gridSpan w:val="1"/>
+            <w:tcBorders>
+              <w:top w:val="single" w:color="000000" w:sz="4"/>
+              <w:left w:val="single" w:color="000000" w:sz="4"/>
+              <w:bottom w:val="single" w:color="000000" w:sz="4"/>
+              <w:right w:val="single" w:color="000000" w:sz="4"/>
+            </w:tcBorders>
+            <w:shd w:fill="F2F2F2" w:val="clear"/>
+            <w:vAlign w:val="center"/>
+          </w:tcPr>
+          <w:p>
+            <w:pPr>
+              <w:spacing w:after="20" w:before="20"/>
+              <w:jc w:val="left"/>
+            </w:pPr>
+            <w:r>
+              <w:rPr>
+                <w:rFonts w:ascii="Arial" w:cs="Arial" w:eastAsia="Arial" w:hAnsi="Arial"/>
+                <w:color w:val="000000"/>
+                <w:sz w:val="14"/>
+                <w:szCs w:val="14"/>
+              </w:rPr>
+              <w:t xml:space="preserve"/>
+            </w:r>
+          </w:p>
+        </w:tc>
+        <w:tc>
+          <w:tcPr>
             <w:tcW w:type="dxa" w:w="730"/>
             <w:gridSpan w:val="1"/>
             <w:tcBorders>
@@ -8541,36 +9235,36 @@
         </w:tc>
         <w:tc>
           <w:tcPr>
-            <w:tcW w:type="dxa" w:w="730"/>
-            <w:gridSpan w:val="1"/>
-            <w:tcBorders>
-              <w:top w:val="single" w:color="000000" w:sz="4"/>
-              <w:left w:val="single" w:color="000000" w:sz="4"/>
-              <w:bottom w:val="single" w:color="000000" w:sz="4"/>
-              <w:right w:val="single" w:color="000000" w:sz="4"/>
-            </w:tcBorders>
-            <w:shd w:fill="F2F2F2" w:val="clear"/>
-            <w:vAlign w:val="center"/>
-          </w:tcPr>
-          <w:p>
-            <w:pPr>
-              <w:spacing w:after="20" w:before="20"/>
-              <w:jc w:val="left"/>
-            </w:pPr>
-            <w:r>
-              <w:rPr>
-                <w:rFonts w:ascii="Arial" w:cs="Arial" w:eastAsia="Arial" w:hAnsi="Arial"/>
-                <w:color w:val="000000"/>
-                <w:sz w:val="14"/>
-                <w:szCs w:val="14"/>
-              </w:rPr>
-              <w:t xml:space="preserve"/>
-            </w:r>
-          </w:p>
-        </w:tc>
-        <w:tc>
-          <w:tcPr>
-            <w:tcW w:type="dxa" w:w="730"/>
+            <w:tcW w:type="dxa" w:w="500"/>
+            <w:gridSpan w:val="1"/>
+            <w:tcBorders>
+              <w:top w:val="single" w:color="000000" w:sz="4"/>
+              <w:left w:val="single" w:color="000000" w:sz="4"/>
+              <w:bottom w:val="single" w:color="000000" w:sz="4"/>
+              <w:right w:val="single" w:color="000000" w:sz="4"/>
+            </w:tcBorders>
+            <w:shd w:fill="F2F2F2" w:val="clear"/>
+            <w:vAlign w:val="center"/>
+          </w:tcPr>
+          <w:p>
+            <w:pPr>
+              <w:spacing w:after="20" w:before="20"/>
+              <w:jc w:val="left"/>
+            </w:pPr>
+            <w:r>
+              <w:rPr>
+                <w:rFonts w:ascii="Arial" w:cs="Arial" w:eastAsia="Arial" w:hAnsi="Arial"/>
+                <w:color w:val="000000"/>
+                <w:sz w:val="14"/>
+                <w:szCs w:val="14"/>
+              </w:rPr>
+              <w:t xml:space="preserve"/>
+            </w:r>
+          </w:p>
+        </w:tc>
+        <w:tc>
+          <w:tcPr>
+            <w:tcW w:type="dxa" w:w="230"/>
             <w:gridSpan w:val="1"/>
             <w:tcBorders>
               <w:top w:val="single" w:color="000000" w:sz="4"/>
@@ -9005,6 +9699,62 @@
         </w:tc>
         <w:tc>
           <w:tcPr>
+            <w:tcW w:type="dxa" w:w="500"/>
+            <w:gridSpan w:val="1"/>
+            <w:tcBorders>
+              <w:top w:val="single" w:color="000000" w:sz="4"/>
+              <w:left w:val="single" w:color="000000" w:sz="4"/>
+              <w:bottom w:val="single" w:color="000000" w:sz="4"/>
+              <w:right w:val="single" w:color="000000" w:sz="4"/>
+            </w:tcBorders>
+            <w:vAlign w:val="center"/>
+          </w:tcPr>
+          <w:p>
+            <w:pPr>
+              <w:spacing w:after="20" w:before="20"/>
+              <w:jc w:val="left"/>
+            </w:pPr>
+            <w:r>
+              <w:rPr>
+                <w:rFonts w:ascii="Arial" w:cs="Arial" w:eastAsia="Arial" w:hAnsi="Arial"/>
+                <w:color w:val="000000"/>
+                <w:sz w:val="14"/>
+                <w:szCs w:val="14"/>
+              </w:rPr>
+              <w:t xml:space="preserve"/>
+            </w:r>
+          </w:p>
+        </w:tc>
+        <w:tc>
+          <w:tcPr>
+            <w:tcW w:type="dxa" w:w="230"/>
+            <w:gridSpan w:val="1"/>
+            <w:tcBorders>
+              <w:top w:val="single" w:color="000000" w:sz="4"/>
+              <w:left w:val="single" w:color="000000" w:sz="4"/>
+              <w:bottom w:val="single" w:color="000000" w:sz="4"/>
+              <w:right w:val="single" w:color="000000" w:sz="4"/>
+            </w:tcBorders>
+            <w:vAlign w:val="center"/>
+          </w:tcPr>
+          <w:p>
+            <w:pPr>
+              <w:spacing w:after="20" w:before="20"/>
+              <w:jc w:val="left"/>
+            </w:pPr>
+            <w:r>
+              <w:rPr>
+                <w:rFonts w:ascii="Arial" w:cs="Arial" w:eastAsia="Arial" w:hAnsi="Arial"/>
+                <w:color w:val="000000"/>
+                <w:sz w:val="14"/>
+                <w:szCs w:val="14"/>
+              </w:rPr>
+              <w:t xml:space="preserve"/>
+            </w:r>
+          </w:p>
+        </w:tc>
+        <w:tc>
+          <w:tcPr>
             <w:tcW w:type="dxa" w:w="730"/>
             <w:gridSpan w:val="1"/>
             <w:tcBorders>
@@ -9033,35 +9783,35 @@
         </w:tc>
         <w:tc>
           <w:tcPr>
-            <w:tcW w:type="dxa" w:w="730"/>
-            <w:gridSpan w:val="1"/>
-            <w:tcBorders>
-              <w:top w:val="single" w:color="000000" w:sz="4"/>
-              <w:left w:val="single" w:color="000000" w:sz="4"/>
-              <w:bottom w:val="single" w:color="000000" w:sz="4"/>
-              <w:right w:val="single" w:color="000000" w:sz="4"/>
-            </w:tcBorders>
-            <w:vAlign w:val="center"/>
-          </w:tcPr>
-          <w:p>
-            <w:pPr>
-              <w:spacing w:after="20" w:before="20"/>
-              <w:jc w:val="left"/>
-            </w:pPr>
-            <w:r>
-              <w:rPr>
-                <w:rFonts w:ascii="Arial" w:cs="Arial" w:eastAsia="Arial" w:hAnsi="Arial"/>
-                <w:color w:val="000000"/>
-                <w:sz w:val="14"/>
-                <w:szCs w:val="14"/>
-              </w:rPr>
-              <w:t xml:space="preserve"/>
-            </w:r>
-          </w:p>
-        </w:tc>
-        <w:tc>
-          <w:tcPr>
-            <w:tcW w:type="dxa" w:w="730"/>
+            <w:tcW w:type="dxa" w:w="500"/>
+            <w:gridSpan w:val="1"/>
+            <w:tcBorders>
+              <w:top w:val="single" w:color="000000" w:sz="4"/>
+              <w:left w:val="single" w:color="000000" w:sz="4"/>
+              <w:bottom w:val="single" w:color="000000" w:sz="4"/>
+              <w:right w:val="single" w:color="000000" w:sz="4"/>
+            </w:tcBorders>
+            <w:vAlign w:val="center"/>
+          </w:tcPr>
+          <w:p>
+            <w:pPr>
+              <w:spacing w:after="20" w:before="20"/>
+              <w:jc w:val="left"/>
+            </w:pPr>
+            <w:r>
+              <w:rPr>
+                <w:rFonts w:ascii="Arial" w:cs="Arial" w:eastAsia="Arial" w:hAnsi="Arial"/>
+                <w:color w:val="000000"/>
+                <w:sz w:val="14"/>
+                <w:szCs w:val="14"/>
+              </w:rPr>
+              <w:t xml:space="preserve"/>
+            </w:r>
+          </w:p>
+        </w:tc>
+        <w:tc>
+          <w:tcPr>
+            <w:tcW w:type="dxa" w:w="230"/>
             <w:gridSpan w:val="1"/>
             <w:tcBorders>
               <w:top w:val="single" w:color="000000" w:sz="4"/>
@@ -9491,6 +10241,64 @@
         </w:tc>
         <w:tc>
           <w:tcPr>
+            <w:tcW w:type="dxa" w:w="500"/>
+            <w:gridSpan w:val="1"/>
+            <w:tcBorders>
+              <w:top w:val="single" w:color="000000" w:sz="4"/>
+              <w:left w:val="single" w:color="000000" w:sz="4"/>
+              <w:bottom w:val="single" w:color="000000" w:sz="4"/>
+              <w:right w:val="single" w:color="000000" w:sz="4"/>
+            </w:tcBorders>
+            <w:shd w:fill="F2F2F2" w:val="clear"/>
+            <w:vAlign w:val="center"/>
+          </w:tcPr>
+          <w:p>
+            <w:pPr>
+              <w:spacing w:after="20" w:before="20"/>
+              <w:jc w:val="left"/>
+            </w:pPr>
+            <w:r>
+              <w:rPr>
+                <w:rFonts w:ascii="Arial" w:cs="Arial" w:eastAsia="Arial" w:hAnsi="Arial"/>
+                <w:color w:val="000000"/>
+                <w:sz w:val="14"/>
+                <w:szCs w:val="14"/>
+              </w:rPr>
+              <w:t xml:space="preserve"/>
+            </w:r>
+          </w:p>
+        </w:tc>
+        <w:tc>
+          <w:tcPr>
+            <w:tcW w:type="dxa" w:w="230"/>
+            <w:gridSpan w:val="1"/>
+            <w:tcBorders>
+              <w:top w:val="single" w:color="000000" w:sz="4"/>
+              <w:left w:val="single" w:color="000000" w:sz="4"/>
+              <w:bottom w:val="single" w:color="000000" w:sz="4"/>
+              <w:right w:val="single" w:color="000000" w:sz="4"/>
+            </w:tcBorders>
+            <w:shd w:fill="F2F2F2" w:val="clear"/>
+            <w:vAlign w:val="center"/>
+          </w:tcPr>
+          <w:p>
+            <w:pPr>
+              <w:spacing w:after="20" w:before="20"/>
+              <w:jc w:val="left"/>
+            </w:pPr>
+            <w:r>
+              <w:rPr>
+                <w:rFonts w:ascii="Arial" w:cs="Arial" w:eastAsia="Arial" w:hAnsi="Arial"/>
+                <w:color w:val="000000"/>
+                <w:sz w:val="14"/>
+                <w:szCs w:val="14"/>
+              </w:rPr>
+              <w:t xml:space="preserve"/>
+            </w:r>
+          </w:p>
+        </w:tc>
+        <w:tc>
+          <w:tcPr>
             <w:tcW w:type="dxa" w:w="730"/>
             <w:gridSpan w:val="1"/>
             <w:tcBorders>
@@ -9520,36 +10328,36 @@
         </w:tc>
         <w:tc>
           <w:tcPr>
-            <w:tcW w:type="dxa" w:w="730"/>
-            <w:gridSpan w:val="1"/>
-            <w:tcBorders>
-              <w:top w:val="single" w:color="000000" w:sz="4"/>
-              <w:left w:val="single" w:color="000000" w:sz="4"/>
-              <w:bottom w:val="single" w:color="000000" w:sz="4"/>
-              <w:right w:val="single" w:color="000000" w:sz="4"/>
-            </w:tcBorders>
-            <w:shd w:fill="F2F2F2" w:val="clear"/>
-            <w:vAlign w:val="center"/>
-          </w:tcPr>
-          <w:p>
-            <w:pPr>
-              <w:spacing w:after="20" w:before="20"/>
-              <w:jc w:val="left"/>
-            </w:pPr>
-            <w:r>
-              <w:rPr>
-                <w:rFonts w:ascii="Arial" w:cs="Arial" w:eastAsia="Arial" w:hAnsi="Arial"/>
-                <w:color w:val="000000"/>
-                <w:sz w:val="14"/>
-                <w:szCs w:val="14"/>
-              </w:rPr>
-              <w:t xml:space="preserve"/>
-            </w:r>
-          </w:p>
-        </w:tc>
-        <w:tc>
-          <w:tcPr>
-            <w:tcW w:type="dxa" w:w="730"/>
+            <w:tcW w:type="dxa" w:w="500"/>
+            <w:gridSpan w:val="1"/>
+            <w:tcBorders>
+              <w:top w:val="single" w:color="000000" w:sz="4"/>
+              <w:left w:val="single" w:color="000000" w:sz="4"/>
+              <w:bottom w:val="single" w:color="000000" w:sz="4"/>
+              <w:right w:val="single" w:color="000000" w:sz="4"/>
+            </w:tcBorders>
+            <w:shd w:fill="F2F2F2" w:val="clear"/>
+            <w:vAlign w:val="center"/>
+          </w:tcPr>
+          <w:p>
+            <w:pPr>
+              <w:spacing w:after="20" w:before="20"/>
+              <w:jc w:val="left"/>
+            </w:pPr>
+            <w:r>
+              <w:rPr>
+                <w:rFonts w:ascii="Arial" w:cs="Arial" w:eastAsia="Arial" w:hAnsi="Arial"/>
+                <w:color w:val="000000"/>
+                <w:sz w:val="14"/>
+                <w:szCs w:val="14"/>
+              </w:rPr>
+              <w:t xml:space="preserve"/>
+            </w:r>
+          </w:p>
+        </w:tc>
+        <w:tc>
+          <w:tcPr>
+            <w:tcW w:type="dxa" w:w="230"/>
             <w:gridSpan w:val="1"/>
             <w:tcBorders>
               <w:top w:val="single" w:color="000000" w:sz="4"/>
@@ -9984,6 +10792,62 @@
         </w:tc>
         <w:tc>
           <w:tcPr>
+            <w:tcW w:type="dxa" w:w="500"/>
+            <w:gridSpan w:val="1"/>
+            <w:tcBorders>
+              <w:top w:val="single" w:color="000000" w:sz="4"/>
+              <w:left w:val="single" w:color="000000" w:sz="4"/>
+              <w:bottom w:val="single" w:color="000000" w:sz="4"/>
+              <w:right w:val="single" w:color="000000" w:sz="4"/>
+            </w:tcBorders>
+            <w:vAlign w:val="center"/>
+          </w:tcPr>
+          <w:p>
+            <w:pPr>
+              <w:spacing w:after="20" w:before="20"/>
+              <w:jc w:val="left"/>
+            </w:pPr>
+            <w:r>
+              <w:rPr>
+                <w:rFonts w:ascii="Arial" w:cs="Arial" w:eastAsia="Arial" w:hAnsi="Arial"/>
+                <w:color w:val="000000"/>
+                <w:sz w:val="14"/>
+                <w:szCs w:val="14"/>
+              </w:rPr>
+              <w:t xml:space="preserve"/>
+            </w:r>
+          </w:p>
+        </w:tc>
+        <w:tc>
+          <w:tcPr>
+            <w:tcW w:type="dxa" w:w="230"/>
+            <w:gridSpan w:val="1"/>
+            <w:tcBorders>
+              <w:top w:val="single" w:color="000000" w:sz="4"/>
+              <w:left w:val="single" w:color="000000" w:sz="4"/>
+              <w:bottom w:val="single" w:color="000000" w:sz="4"/>
+              <w:right w:val="single" w:color="000000" w:sz="4"/>
+            </w:tcBorders>
+            <w:vAlign w:val="center"/>
+          </w:tcPr>
+          <w:p>
+            <w:pPr>
+              <w:spacing w:after="20" w:before="20"/>
+              <w:jc w:val="left"/>
+            </w:pPr>
+            <w:r>
+              <w:rPr>
+                <w:rFonts w:ascii="Arial" w:cs="Arial" w:eastAsia="Arial" w:hAnsi="Arial"/>
+                <w:color w:val="000000"/>
+                <w:sz w:val="14"/>
+                <w:szCs w:val="14"/>
+              </w:rPr>
+              <w:t xml:space="preserve"/>
+            </w:r>
+          </w:p>
+        </w:tc>
+        <w:tc>
+          <w:tcPr>
             <w:tcW w:type="dxa" w:w="730"/>
             <w:gridSpan w:val="1"/>
             <w:tcBorders>
@@ -10012,35 +10876,35 @@
         </w:tc>
         <w:tc>
           <w:tcPr>
-            <w:tcW w:type="dxa" w:w="730"/>
-            <w:gridSpan w:val="1"/>
-            <w:tcBorders>
-              <w:top w:val="single" w:color="000000" w:sz="4"/>
-              <w:left w:val="single" w:color="000000" w:sz="4"/>
-              <w:bottom w:val="single" w:color="000000" w:sz="4"/>
-              <w:right w:val="single" w:color="000000" w:sz="4"/>
-            </w:tcBorders>
-            <w:vAlign w:val="center"/>
-          </w:tcPr>
-          <w:p>
-            <w:pPr>
-              <w:spacing w:after="20" w:before="20"/>
-              <w:jc w:val="left"/>
-            </w:pPr>
-            <w:r>
-              <w:rPr>
-                <w:rFonts w:ascii="Arial" w:cs="Arial" w:eastAsia="Arial" w:hAnsi="Arial"/>
-                <w:color w:val="000000"/>
-                <w:sz w:val="14"/>
-                <w:szCs w:val="14"/>
-              </w:rPr>
-              <w:t xml:space="preserve"/>
-            </w:r>
-          </w:p>
-        </w:tc>
-        <w:tc>
-          <w:tcPr>
-            <w:tcW w:type="dxa" w:w="730"/>
+            <w:tcW w:type="dxa" w:w="500"/>
+            <w:gridSpan w:val="1"/>
+            <w:tcBorders>
+              <w:top w:val="single" w:color="000000" w:sz="4"/>
+              <w:left w:val="single" w:color="000000" w:sz="4"/>
+              <w:bottom w:val="single" w:color="000000" w:sz="4"/>
+              <w:right w:val="single" w:color="000000" w:sz="4"/>
+            </w:tcBorders>
+            <w:vAlign w:val="center"/>
+          </w:tcPr>
+          <w:p>
+            <w:pPr>
+              <w:spacing w:after="20" w:before="20"/>
+              <w:jc w:val="left"/>
+            </w:pPr>
+            <w:r>
+              <w:rPr>
+                <w:rFonts w:ascii="Arial" w:cs="Arial" w:eastAsia="Arial" w:hAnsi="Arial"/>
+                <w:color w:val="000000"/>
+                <w:sz w:val="14"/>
+                <w:szCs w:val="14"/>
+              </w:rPr>
+              <w:t xml:space="preserve"/>
+            </w:r>
+          </w:p>
+        </w:tc>
+        <w:tc>
+          <w:tcPr>
+            <w:tcW w:type="dxa" w:w="230"/>
             <w:gridSpan w:val="1"/>
             <w:tcBorders>
               <w:top w:val="single" w:color="000000" w:sz="4"/>
@@ -10470,6 +11334,64 @@
         </w:tc>
         <w:tc>
           <w:tcPr>
+            <w:tcW w:type="dxa" w:w="500"/>
+            <w:gridSpan w:val="1"/>
+            <w:tcBorders>
+              <w:top w:val="single" w:color="000000" w:sz="4"/>
+              <w:left w:val="single" w:color="000000" w:sz="4"/>
+              <w:bottom w:val="single" w:color="000000" w:sz="4"/>
+              <w:right w:val="single" w:color="000000" w:sz="4"/>
+            </w:tcBorders>
+            <w:shd w:fill="F2F2F2" w:val="clear"/>
+            <w:vAlign w:val="center"/>
+          </w:tcPr>
+          <w:p>
+            <w:pPr>
+              <w:spacing w:after="20" w:before="20"/>
+              <w:jc w:val="left"/>
+            </w:pPr>
+            <w:r>
+              <w:rPr>
+                <w:rFonts w:ascii="Arial" w:cs="Arial" w:eastAsia="Arial" w:hAnsi="Arial"/>
+                <w:color w:val="000000"/>
+                <w:sz w:val="14"/>
+                <w:szCs w:val="14"/>
+              </w:rPr>
+              <w:t xml:space="preserve"/>
+            </w:r>
+          </w:p>
+        </w:tc>
+        <w:tc>
+          <w:tcPr>
+            <w:tcW w:type="dxa" w:w="230"/>
+            <w:gridSpan w:val="1"/>
+            <w:tcBorders>
+              <w:top w:val="single" w:color="000000" w:sz="4"/>
+              <w:left w:val="single" w:color="000000" w:sz="4"/>
+              <w:bottom w:val="single" w:color="000000" w:sz="4"/>
+              <w:right w:val="single" w:color="000000" w:sz="4"/>
+            </w:tcBorders>
+            <w:shd w:fill="F2F2F2" w:val="clear"/>
+            <w:vAlign w:val="center"/>
+          </w:tcPr>
+          <w:p>
+            <w:pPr>
+              <w:spacing w:after="20" w:before="20"/>
+              <w:jc w:val="left"/>
+            </w:pPr>
+            <w:r>
+              <w:rPr>
+                <w:rFonts w:ascii="Arial" w:cs="Arial" w:eastAsia="Arial" w:hAnsi="Arial"/>
+                <w:color w:val="000000"/>
+                <w:sz w:val="14"/>
+                <w:szCs w:val="14"/>
+              </w:rPr>
+              <w:t xml:space="preserve"/>
+            </w:r>
+          </w:p>
+        </w:tc>
+        <w:tc>
+          <w:tcPr>
             <w:tcW w:type="dxa" w:w="730"/>
             <w:gridSpan w:val="1"/>
             <w:tcBorders>
@@ -10499,36 +11421,36 @@
         </w:tc>
         <w:tc>
           <w:tcPr>
-            <w:tcW w:type="dxa" w:w="730"/>
-            <w:gridSpan w:val="1"/>
-            <w:tcBorders>
-              <w:top w:val="single" w:color="000000" w:sz="4"/>
-              <w:left w:val="single" w:color="000000" w:sz="4"/>
-              <w:bottom w:val="single" w:color="000000" w:sz="4"/>
-              <w:right w:val="single" w:color="000000" w:sz="4"/>
-            </w:tcBorders>
-            <w:shd w:fill="F2F2F2" w:val="clear"/>
-            <w:vAlign w:val="center"/>
-          </w:tcPr>
-          <w:p>
-            <w:pPr>
-              <w:spacing w:after="20" w:before="20"/>
-              <w:jc w:val="left"/>
-            </w:pPr>
-            <w:r>
-              <w:rPr>
-                <w:rFonts w:ascii="Arial" w:cs="Arial" w:eastAsia="Arial" w:hAnsi="Arial"/>
-                <w:color w:val="000000"/>
-                <w:sz w:val="14"/>
-                <w:szCs w:val="14"/>
-              </w:rPr>
-              <w:t xml:space="preserve"/>
-            </w:r>
-          </w:p>
-        </w:tc>
-        <w:tc>
-          <w:tcPr>
-            <w:tcW w:type="dxa" w:w="730"/>
+            <w:tcW w:type="dxa" w:w="500"/>
+            <w:gridSpan w:val="1"/>
+            <w:tcBorders>
+              <w:top w:val="single" w:color="000000" w:sz="4"/>
+              <w:left w:val="single" w:color="000000" w:sz="4"/>
+              <w:bottom w:val="single" w:color="000000" w:sz="4"/>
+              <w:right w:val="single" w:color="000000" w:sz="4"/>
+            </w:tcBorders>
+            <w:shd w:fill="F2F2F2" w:val="clear"/>
+            <w:vAlign w:val="center"/>
+          </w:tcPr>
+          <w:p>
+            <w:pPr>
+              <w:spacing w:after="20" w:before="20"/>
+              <w:jc w:val="left"/>
+            </w:pPr>
+            <w:r>
+              <w:rPr>
+                <w:rFonts w:ascii="Arial" w:cs="Arial" w:eastAsia="Arial" w:hAnsi="Arial"/>
+                <w:color w:val="000000"/>
+                <w:sz w:val="14"/>
+                <w:szCs w:val="14"/>
+              </w:rPr>
+              <w:t xml:space="preserve"/>
+            </w:r>
+          </w:p>
+        </w:tc>
+        <w:tc>
+          <w:tcPr>
+            <w:tcW w:type="dxa" w:w="230"/>
             <w:gridSpan w:val="1"/>
             <w:tcBorders>
               <w:top w:val="single" w:color="000000" w:sz="4"/>

</xml_diff>